<commit_message>
Acrescenta objetivos, hipóteses e variáveis ao cronograma
Troca a seção de entregas da orientação por três seções iniciais: estrutura
e objetivos, pressupostos e hipóteses, e variáveis e instrumentos de coleta.
As datas das entregas passam para a introdução do cronograma semanal.
Corrige a largura das tabelas no .docx, que usava a largura errada da página
A4 em paisagem.

Co-Authored-By: Claude Opus 5 <noreply@anthropic.com>
</commit_message>
<xml_diff>
--- a/textos/cronograma_luderia.docx
+++ b/textos/cronograma_luderia.docx
@@ -29,20 +29,7 @@
           <w:sz w:val="20"/>
           <w:szCs w:val="20"/>
         </w:rPr>
-        <w:t xml:space="preserve">Atualizado em 17/09/2026.</w:t>
-      </w:r>
-    </w:p>
-    <w:p>
-      <w:pPr>
-        <w:spacing w:after="120"/>
-      </w:pPr>
-      <w:r>
-        <w:rPr>
-          <w:rFonts w:ascii="Arial" w:cs="Arial" w:eastAsia="Arial" w:hAnsi="Arial"/>
-          <w:sz w:val="20"/>
-          <w:szCs w:val="20"/>
-        </w:rPr>
-        <w:t xml:space="preserve">As semanas vão de sábado a sexta-feira. Assim, cada entrega definida pela orientação cai no último dia de uma semana.</w:t>
+        <w:t xml:space="preserve">Atualizado em 18/09/2026.</w:t>
       </w:r>
     </w:p>
     <w:p>
@@ -58,850 +45,8 @@
           <w:sz w:val="24"/>
           <w:szCs w:val="24"/>
         </w:rPr>
-        <w:t xml:space="preserve">Entregas definidas pela orientação</w:t>
+        <w:t xml:space="preserve">Estrutura e objetivos</w:t>
       </w:r>
-    </w:p>
-    <w:tbl>
-      <w:tblPr>
-        <w:tblW w:type="dxa" w:w="13130"/>
-        <w:tblBorders>
-          <w:top w:val="single" w:color="auto" w:sz="4"/>
-          <w:left w:val="single" w:color="auto" w:sz="4"/>
-          <w:bottom w:val="single" w:color="auto" w:sz="4"/>
-          <w:right w:val="single" w:color="auto" w:sz="4"/>
-          <w:insideH w:val="single" w:color="auto" w:sz="4"/>
-          <w:insideV w:val="single" w:color="auto" w:sz="4"/>
-        </w:tblBorders>
-      </w:tblPr>
-      <w:tblGrid>
-        <w:gridCol w:w="4595"/>
-        <w:gridCol w:w="3282"/>
-        <w:gridCol w:w="5253"/>
-      </w:tblGrid>
-      <w:tr>
-        <w:trPr>
-          <w:cantSplit/>
-          <w:tblHeader/>
-        </w:trPr>
-        <w:tc>
-          <w:tcPr>
-            <w:tcW w:type="dxa" w:w="4595"/>
-            <w:tcBorders>
-              <w:top w:val="single" w:color="000000" w:sz="4"/>
-              <w:left w:val="single" w:color="000000" w:sz="4"/>
-              <w:bottom w:val="single" w:color="000000" w:sz="4"/>
-              <w:right w:val="single" w:color="000000" w:sz="4"/>
-            </w:tcBorders>
-            <w:shd w:fill="E7E6E6" w:color="auto" w:val="clear"/>
-            <w:tcMar>
-              <w:top w:type="dxa" w:w="60"/>
-              <w:left w:type="dxa" w:w="100"/>
-              <w:bottom w:type="dxa" w:w="60"/>
-              <w:right w:type="dxa" w:w="100"/>
-            </w:tcMar>
-          </w:tcPr>
-          <w:p>
-            <w:pPr>
-              <w:spacing w:after="40"/>
-            </w:pPr>
-            <w:r>
-              <w:rPr>
-                <w:rFonts w:ascii="Arial" w:cs="Arial" w:eastAsia="Arial" w:hAnsi="Arial"/>
-                <w:b/>
-                <w:bCs/>
-                <w:sz w:val="20"/>
-                <w:szCs w:val="20"/>
-              </w:rPr>
-              <w:t xml:space="preserve">Data</w:t>
-            </w:r>
-          </w:p>
-        </w:tc>
-        <w:tc>
-          <w:tcPr>
-            <w:tcW w:type="dxa" w:w="3282"/>
-            <w:tcBorders>
-              <w:top w:val="single" w:color="000000" w:sz="4"/>
-              <w:left w:val="single" w:color="000000" w:sz="4"/>
-              <w:bottom w:val="single" w:color="000000" w:sz="4"/>
-              <w:right w:val="single" w:color="000000" w:sz="4"/>
-            </w:tcBorders>
-            <w:shd w:fill="E7E6E6" w:color="auto" w:val="clear"/>
-            <w:tcMar>
-              <w:top w:type="dxa" w:w="60"/>
-              <w:left w:type="dxa" w:w="100"/>
-              <w:bottom w:type="dxa" w:w="60"/>
-              <w:right w:type="dxa" w:w="100"/>
-            </w:tcMar>
-          </w:tcPr>
-          <w:p>
-            <w:pPr>
-              <w:spacing w:after="40"/>
-            </w:pPr>
-            <w:r>
-              <w:rPr>
-                <w:rFonts w:ascii="Arial" w:cs="Arial" w:eastAsia="Arial" w:hAnsi="Arial"/>
-                <w:b/>
-                <w:bCs/>
-                <w:sz w:val="20"/>
-                <w:szCs w:val="20"/>
-              </w:rPr>
-              <w:t xml:space="preserve">Dia</w:t>
-            </w:r>
-          </w:p>
-        </w:tc>
-        <w:tc>
-          <w:tcPr>
-            <w:tcW w:type="dxa" w:w="5253"/>
-            <w:tcBorders>
-              <w:top w:val="single" w:color="000000" w:sz="4"/>
-              <w:left w:val="single" w:color="000000" w:sz="4"/>
-              <w:bottom w:val="single" w:color="000000" w:sz="4"/>
-              <w:right w:val="single" w:color="000000" w:sz="4"/>
-            </w:tcBorders>
-            <w:shd w:fill="E7E6E6" w:color="auto" w:val="clear"/>
-            <w:tcMar>
-              <w:top w:type="dxa" w:w="60"/>
-              <w:left w:type="dxa" w:w="100"/>
-              <w:bottom w:type="dxa" w:w="60"/>
-              <w:right w:type="dxa" w:w="100"/>
-            </w:tcMar>
-          </w:tcPr>
-          <w:p>
-            <w:pPr>
-              <w:spacing w:after="40"/>
-            </w:pPr>
-            <w:r>
-              <w:rPr>
-                <w:rFonts w:ascii="Arial" w:cs="Arial" w:eastAsia="Arial" w:hAnsi="Arial"/>
-                <w:b/>
-                <w:bCs/>
-                <w:sz w:val="20"/>
-                <w:szCs w:val="20"/>
-              </w:rPr>
-              <w:t xml:space="preserve">Entrega</w:t>
-            </w:r>
-          </w:p>
-        </w:tc>
-      </w:tr>
-      <w:tr>
-        <w:trPr>
-          <w:cantSplit/>
-          <w:tblHeader w:val="false"/>
-        </w:trPr>
-        <w:tc>
-          <w:tcPr>
-            <w:tcW w:type="dxa" w:w="4595"/>
-            <w:tcBorders>
-              <w:top w:val="single" w:color="000000" w:sz="4"/>
-              <w:left w:val="single" w:color="000000" w:sz="4"/>
-              <w:bottom w:val="single" w:color="000000" w:sz="4"/>
-              <w:right w:val="single" w:color="000000" w:sz="4"/>
-            </w:tcBorders>
-            <w:tcMar>
-              <w:top w:type="dxa" w:w="60"/>
-              <w:left w:type="dxa" w:w="100"/>
-              <w:bottom w:type="dxa" w:w="60"/>
-              <w:right w:type="dxa" w:w="100"/>
-            </w:tcMar>
-          </w:tcPr>
-          <w:p>
-            <w:pPr>
-              <w:spacing w:after="40"/>
-            </w:pPr>
-            <w:r>
-              <w:rPr>
-                <w:rFonts w:ascii="Arial" w:cs="Arial" w:eastAsia="Arial" w:hAnsi="Arial"/>
-                <w:b w:val="false"/>
-                <w:bCs w:val="false"/>
-                <w:sz w:val="20"/>
-                <w:szCs w:val="20"/>
-              </w:rPr>
-              <w:t xml:space="preserve">18/09/2026</w:t>
-            </w:r>
-          </w:p>
-        </w:tc>
-        <w:tc>
-          <w:tcPr>
-            <w:tcW w:type="dxa" w:w="3282"/>
-            <w:tcBorders>
-              <w:top w:val="single" w:color="000000" w:sz="4"/>
-              <w:left w:val="single" w:color="000000" w:sz="4"/>
-              <w:bottom w:val="single" w:color="000000" w:sz="4"/>
-              <w:right w:val="single" w:color="000000" w:sz="4"/>
-            </w:tcBorders>
-            <w:tcMar>
-              <w:top w:type="dxa" w:w="60"/>
-              <w:left w:type="dxa" w:w="100"/>
-              <w:bottom w:type="dxa" w:w="60"/>
-              <w:right w:type="dxa" w:w="100"/>
-            </w:tcMar>
-          </w:tcPr>
-          <w:p>
-            <w:pPr>
-              <w:spacing w:after="40"/>
-            </w:pPr>
-            <w:r>
-              <w:rPr>
-                <w:rFonts w:ascii="Arial" w:cs="Arial" w:eastAsia="Arial" w:hAnsi="Arial"/>
-                <w:b w:val="false"/>
-                <w:bCs w:val="false"/>
-                <w:sz w:val="20"/>
-                <w:szCs w:val="20"/>
-              </w:rPr>
-              <w:t xml:space="preserve">sexta</w:t>
-            </w:r>
-          </w:p>
-        </w:tc>
-        <w:tc>
-          <w:tcPr>
-            <w:tcW w:type="dxa" w:w="5253"/>
-            <w:tcBorders>
-              <w:top w:val="single" w:color="000000" w:sz="4"/>
-              <w:left w:val="single" w:color="000000" w:sz="4"/>
-              <w:bottom w:val="single" w:color="000000" w:sz="4"/>
-              <w:right w:val="single" w:color="000000" w:sz="4"/>
-            </w:tcBorders>
-            <w:tcMar>
-              <w:top w:type="dxa" w:w="60"/>
-              <w:left w:type="dxa" w:w="100"/>
-              <w:bottom w:type="dxa" w:w="60"/>
-              <w:right w:type="dxa" w:w="100"/>
-            </w:tcMar>
-          </w:tcPr>
-          <w:p>
-            <w:pPr>
-              <w:spacing w:after="40"/>
-            </w:pPr>
-            <w:r>
-              <w:rPr>
-                <w:rFonts w:ascii="Arial" w:cs="Arial" w:eastAsia="Arial" w:hAnsi="Arial"/>
-                <w:b w:val="false"/>
-                <w:bCs w:val="false"/>
-                <w:sz w:val="20"/>
-                <w:szCs w:val="20"/>
-              </w:rPr>
-              <w:t xml:space="preserve">Cronograma individual</w:t>
-            </w:r>
-          </w:p>
-        </w:tc>
-      </w:tr>
-      <w:tr>
-        <w:trPr>
-          <w:cantSplit/>
-          <w:tblHeader w:val="false"/>
-        </w:trPr>
-        <w:tc>
-          <w:tcPr>
-            <w:tcW w:type="dxa" w:w="4595"/>
-            <w:tcBorders>
-              <w:top w:val="single" w:color="000000" w:sz="4"/>
-              <w:left w:val="single" w:color="000000" w:sz="4"/>
-              <w:bottom w:val="single" w:color="000000" w:sz="4"/>
-              <w:right w:val="single" w:color="000000" w:sz="4"/>
-            </w:tcBorders>
-            <w:tcMar>
-              <w:top w:type="dxa" w:w="60"/>
-              <w:left w:type="dxa" w:w="100"/>
-              <w:bottom w:type="dxa" w:w="60"/>
-              <w:right w:type="dxa" w:w="100"/>
-            </w:tcMar>
-          </w:tcPr>
-          <w:p>
-            <w:pPr>
-              <w:spacing w:after="40"/>
-            </w:pPr>
-            <w:r>
-              <w:rPr>
-                <w:rFonts w:ascii="Arial" w:cs="Arial" w:eastAsia="Arial" w:hAnsi="Arial"/>
-                <w:b w:val="false"/>
-                <w:bCs w:val="false"/>
-                <w:sz w:val="20"/>
-                <w:szCs w:val="20"/>
-              </w:rPr>
-              <w:t xml:space="preserve">02/10/2026</w:t>
-            </w:r>
-          </w:p>
-        </w:tc>
-        <w:tc>
-          <w:tcPr>
-            <w:tcW w:type="dxa" w:w="3282"/>
-            <w:tcBorders>
-              <w:top w:val="single" w:color="000000" w:sz="4"/>
-              <w:left w:val="single" w:color="000000" w:sz="4"/>
-              <w:bottom w:val="single" w:color="000000" w:sz="4"/>
-              <w:right w:val="single" w:color="000000" w:sz="4"/>
-            </w:tcBorders>
-            <w:tcMar>
-              <w:top w:type="dxa" w:w="60"/>
-              <w:left w:type="dxa" w:w="100"/>
-              <w:bottom w:type="dxa" w:w="60"/>
-              <w:right w:type="dxa" w:w="100"/>
-            </w:tcMar>
-          </w:tcPr>
-          <w:p>
-            <w:pPr>
-              <w:spacing w:after="40"/>
-            </w:pPr>
-            <w:r>
-              <w:rPr>
-                <w:rFonts w:ascii="Arial" w:cs="Arial" w:eastAsia="Arial" w:hAnsi="Arial"/>
-                <w:b w:val="false"/>
-                <w:bCs w:val="false"/>
-                <w:sz w:val="20"/>
-                <w:szCs w:val="20"/>
-              </w:rPr>
-              <w:t xml:space="preserve">sexta</w:t>
-            </w:r>
-          </w:p>
-        </w:tc>
-        <w:tc>
-          <w:tcPr>
-            <w:tcW w:type="dxa" w:w="5253"/>
-            <w:tcBorders>
-              <w:top w:val="single" w:color="000000" w:sz="4"/>
-              <w:left w:val="single" w:color="000000" w:sz="4"/>
-              <w:bottom w:val="single" w:color="000000" w:sz="4"/>
-              <w:right w:val="single" w:color="000000" w:sz="4"/>
-            </w:tcBorders>
-            <w:tcMar>
-              <w:top w:type="dxa" w:w="60"/>
-              <w:left w:type="dxa" w:w="100"/>
-              <w:bottom w:type="dxa" w:w="60"/>
-              <w:right w:type="dxa" w:w="100"/>
-            </w:tcMar>
-          </w:tcPr>
-          <w:p>
-            <w:pPr>
-              <w:spacing w:after="40"/>
-            </w:pPr>
-            <w:r>
-              <w:rPr>
-                <w:rFonts w:ascii="Arial" w:cs="Arial" w:eastAsia="Arial" w:hAnsi="Arial"/>
-                <w:b w:val="false"/>
-                <w:bCs w:val="false"/>
-                <w:sz w:val="20"/>
-                <w:szCs w:val="20"/>
-              </w:rPr>
-              <w:t xml:space="preserve">Projeto consolidado</w:t>
-            </w:r>
-          </w:p>
-        </w:tc>
-      </w:tr>
-      <w:tr>
-        <w:trPr>
-          <w:cantSplit/>
-          <w:tblHeader w:val="false"/>
-        </w:trPr>
-        <w:tc>
-          <w:tcPr>
-            <w:tcW w:type="dxa" w:w="4595"/>
-            <w:tcBorders>
-              <w:top w:val="single" w:color="000000" w:sz="4"/>
-              <w:left w:val="single" w:color="000000" w:sz="4"/>
-              <w:bottom w:val="single" w:color="000000" w:sz="4"/>
-              <w:right w:val="single" w:color="000000" w:sz="4"/>
-            </w:tcBorders>
-            <w:tcMar>
-              <w:top w:type="dxa" w:w="60"/>
-              <w:left w:type="dxa" w:w="100"/>
-              <w:bottom w:type="dxa" w:w="60"/>
-              <w:right w:type="dxa" w:w="100"/>
-            </w:tcMar>
-          </w:tcPr>
-          <w:p>
-            <w:pPr>
-              <w:spacing w:after="40"/>
-            </w:pPr>
-            <w:r>
-              <w:rPr>
-                <w:rFonts w:ascii="Arial" w:cs="Arial" w:eastAsia="Arial" w:hAnsi="Arial"/>
-                <w:b w:val="false"/>
-                <w:bCs w:val="false"/>
-                <w:sz w:val="20"/>
-                <w:szCs w:val="20"/>
-              </w:rPr>
-              <w:t xml:space="preserve">16/10/2026</w:t>
-            </w:r>
-          </w:p>
-        </w:tc>
-        <w:tc>
-          <w:tcPr>
-            <w:tcW w:type="dxa" w:w="3282"/>
-            <w:tcBorders>
-              <w:top w:val="single" w:color="000000" w:sz="4"/>
-              <w:left w:val="single" w:color="000000" w:sz="4"/>
-              <w:bottom w:val="single" w:color="000000" w:sz="4"/>
-              <w:right w:val="single" w:color="000000" w:sz="4"/>
-            </w:tcBorders>
-            <w:tcMar>
-              <w:top w:type="dxa" w:w="60"/>
-              <w:left w:type="dxa" w:w="100"/>
-              <w:bottom w:type="dxa" w:w="60"/>
-              <w:right w:type="dxa" w:w="100"/>
-            </w:tcMar>
-          </w:tcPr>
-          <w:p>
-            <w:pPr>
-              <w:spacing w:after="40"/>
-            </w:pPr>
-            <w:r>
-              <w:rPr>
-                <w:rFonts w:ascii="Arial" w:cs="Arial" w:eastAsia="Arial" w:hAnsi="Arial"/>
-                <w:b w:val="false"/>
-                <w:bCs w:val="false"/>
-                <w:sz w:val="20"/>
-                <w:szCs w:val="20"/>
-              </w:rPr>
-              <w:t xml:space="preserve">sexta</w:t>
-            </w:r>
-          </w:p>
-        </w:tc>
-        <w:tc>
-          <w:tcPr>
-            <w:tcW w:type="dxa" w:w="5253"/>
-            <w:tcBorders>
-              <w:top w:val="single" w:color="000000" w:sz="4"/>
-              <w:left w:val="single" w:color="000000" w:sz="4"/>
-              <w:bottom w:val="single" w:color="000000" w:sz="4"/>
-              <w:right w:val="single" w:color="000000" w:sz="4"/>
-            </w:tcBorders>
-            <w:tcMar>
-              <w:top w:type="dxa" w:w="60"/>
-              <w:left w:type="dxa" w:w="100"/>
-              <w:bottom w:type="dxa" w:w="60"/>
-              <w:right w:type="dxa" w:w="100"/>
-            </w:tcMar>
-          </w:tcPr>
-          <w:p>
-            <w:pPr>
-              <w:spacing w:after="40"/>
-            </w:pPr>
-            <w:r>
-              <w:rPr>
-                <w:rFonts w:ascii="Arial" w:cs="Arial" w:eastAsia="Arial" w:hAnsi="Arial"/>
-                <w:b w:val="false"/>
-                <w:bCs w:val="false"/>
-                <w:sz w:val="20"/>
-                <w:szCs w:val="20"/>
-              </w:rPr>
-              <w:t xml:space="preserve">Coleta e organização dos dados em estágio avançado</w:t>
-            </w:r>
-          </w:p>
-        </w:tc>
-      </w:tr>
-      <w:tr>
-        <w:trPr>
-          <w:cantSplit/>
-          <w:tblHeader w:val="false"/>
-        </w:trPr>
-        <w:tc>
-          <w:tcPr>
-            <w:tcW w:type="dxa" w:w="4595"/>
-            <w:tcBorders>
-              <w:top w:val="single" w:color="000000" w:sz="4"/>
-              <w:left w:val="single" w:color="000000" w:sz="4"/>
-              <w:bottom w:val="single" w:color="000000" w:sz="4"/>
-              <w:right w:val="single" w:color="000000" w:sz="4"/>
-            </w:tcBorders>
-            <w:tcMar>
-              <w:top w:type="dxa" w:w="60"/>
-              <w:left w:type="dxa" w:w="100"/>
-              <w:bottom w:type="dxa" w:w="60"/>
-              <w:right w:type="dxa" w:w="100"/>
-            </w:tcMar>
-          </w:tcPr>
-          <w:p>
-            <w:pPr>
-              <w:spacing w:after="40"/>
-            </w:pPr>
-            <w:r>
-              <w:rPr>
-                <w:rFonts w:ascii="Arial" w:cs="Arial" w:eastAsia="Arial" w:hAnsi="Arial"/>
-                <w:b w:val="false"/>
-                <w:bCs w:val="false"/>
-                <w:sz w:val="20"/>
-                <w:szCs w:val="20"/>
-              </w:rPr>
-              <w:t xml:space="preserve">30/10/2026</w:t>
-            </w:r>
-          </w:p>
-        </w:tc>
-        <w:tc>
-          <w:tcPr>
-            <w:tcW w:type="dxa" w:w="3282"/>
-            <w:tcBorders>
-              <w:top w:val="single" w:color="000000" w:sz="4"/>
-              <w:left w:val="single" w:color="000000" w:sz="4"/>
-              <w:bottom w:val="single" w:color="000000" w:sz="4"/>
-              <w:right w:val="single" w:color="000000" w:sz="4"/>
-            </w:tcBorders>
-            <w:tcMar>
-              <w:top w:type="dxa" w:w="60"/>
-              <w:left w:type="dxa" w:w="100"/>
-              <w:bottom w:type="dxa" w:w="60"/>
-              <w:right w:type="dxa" w:w="100"/>
-            </w:tcMar>
-          </w:tcPr>
-          <w:p>
-            <w:pPr>
-              <w:spacing w:after="40"/>
-            </w:pPr>
-            <w:r>
-              <w:rPr>
-                <w:rFonts w:ascii="Arial" w:cs="Arial" w:eastAsia="Arial" w:hAnsi="Arial"/>
-                <w:b w:val="false"/>
-                <w:bCs w:val="false"/>
-                <w:sz w:val="20"/>
-                <w:szCs w:val="20"/>
-              </w:rPr>
-              <w:t xml:space="preserve">sexta</w:t>
-            </w:r>
-          </w:p>
-        </w:tc>
-        <w:tc>
-          <w:tcPr>
-            <w:tcW w:type="dxa" w:w="5253"/>
-            <w:tcBorders>
-              <w:top w:val="single" w:color="000000" w:sz="4"/>
-              <w:left w:val="single" w:color="000000" w:sz="4"/>
-              <w:bottom w:val="single" w:color="000000" w:sz="4"/>
-              <w:right w:val="single" w:color="000000" w:sz="4"/>
-            </w:tcBorders>
-            <w:tcMar>
-              <w:top w:type="dxa" w:w="60"/>
-              <w:left w:type="dxa" w:w="100"/>
-              <w:bottom w:type="dxa" w:w="60"/>
-              <w:right w:type="dxa" w:w="100"/>
-            </w:tcMar>
-          </w:tcPr>
-          <w:p>
-            <w:pPr>
-              <w:spacing w:after="40"/>
-            </w:pPr>
-            <w:r>
-              <w:rPr>
-                <w:rFonts w:ascii="Arial" w:cs="Arial" w:eastAsia="Arial" w:hAnsi="Arial"/>
-                <w:b w:val="false"/>
-                <w:bCs w:val="false"/>
-                <w:sz w:val="20"/>
-                <w:szCs w:val="20"/>
-              </w:rPr>
-              <w:t xml:space="preserve">Primeira versão dos resultados e análises</w:t>
-            </w:r>
-          </w:p>
-        </w:tc>
-      </w:tr>
-      <w:tr>
-        <w:trPr>
-          <w:cantSplit/>
-          <w:tblHeader w:val="false"/>
-        </w:trPr>
-        <w:tc>
-          <w:tcPr>
-            <w:tcW w:type="dxa" w:w="4595"/>
-            <w:tcBorders>
-              <w:top w:val="single" w:color="000000" w:sz="4"/>
-              <w:left w:val="single" w:color="000000" w:sz="4"/>
-              <w:bottom w:val="single" w:color="000000" w:sz="4"/>
-              <w:right w:val="single" w:color="000000" w:sz="4"/>
-            </w:tcBorders>
-            <w:tcMar>
-              <w:top w:type="dxa" w:w="60"/>
-              <w:left w:type="dxa" w:w="100"/>
-              <w:bottom w:type="dxa" w:w="60"/>
-              <w:right w:type="dxa" w:w="100"/>
-            </w:tcMar>
-          </w:tcPr>
-          <w:p>
-            <w:pPr>
-              <w:spacing w:after="40"/>
-            </w:pPr>
-            <w:r>
-              <w:rPr>
-                <w:rFonts w:ascii="Arial" w:cs="Arial" w:eastAsia="Arial" w:hAnsi="Arial"/>
-                <w:b w:val="false"/>
-                <w:bCs w:val="false"/>
-                <w:sz w:val="20"/>
-                <w:szCs w:val="20"/>
-              </w:rPr>
-              <w:t xml:space="preserve">06/11/2026</w:t>
-            </w:r>
-          </w:p>
-        </w:tc>
-        <w:tc>
-          <w:tcPr>
-            <w:tcW w:type="dxa" w:w="3282"/>
-            <w:tcBorders>
-              <w:top w:val="single" w:color="000000" w:sz="4"/>
-              <w:left w:val="single" w:color="000000" w:sz="4"/>
-              <w:bottom w:val="single" w:color="000000" w:sz="4"/>
-              <w:right w:val="single" w:color="000000" w:sz="4"/>
-            </w:tcBorders>
-            <w:tcMar>
-              <w:top w:type="dxa" w:w="60"/>
-              <w:left w:type="dxa" w:w="100"/>
-              <w:bottom w:type="dxa" w:w="60"/>
-              <w:right w:type="dxa" w:w="100"/>
-            </w:tcMar>
-          </w:tcPr>
-          <w:p>
-            <w:pPr>
-              <w:spacing w:after="40"/>
-            </w:pPr>
-            <w:r>
-              <w:rPr>
-                <w:rFonts w:ascii="Arial" w:cs="Arial" w:eastAsia="Arial" w:hAnsi="Arial"/>
-                <w:b w:val="false"/>
-                <w:bCs w:val="false"/>
-                <w:sz w:val="20"/>
-                <w:szCs w:val="20"/>
-              </w:rPr>
-              <w:t xml:space="preserve">sexta</w:t>
-            </w:r>
-          </w:p>
-        </w:tc>
-        <w:tc>
-          <w:tcPr>
-            <w:tcW w:type="dxa" w:w="5253"/>
-            <w:tcBorders>
-              <w:top w:val="single" w:color="000000" w:sz="4"/>
-              <w:left w:val="single" w:color="000000" w:sz="4"/>
-              <w:bottom w:val="single" w:color="000000" w:sz="4"/>
-              <w:right w:val="single" w:color="000000" w:sz="4"/>
-            </w:tcBorders>
-            <w:tcMar>
-              <w:top w:type="dxa" w:w="60"/>
-              <w:left w:type="dxa" w:w="100"/>
-              <w:bottom w:type="dxa" w:w="60"/>
-              <w:right w:type="dxa" w:w="100"/>
-            </w:tcMar>
-          </w:tcPr>
-          <w:p>
-            <w:pPr>
-              <w:spacing w:after="40"/>
-            </w:pPr>
-            <w:r>
-              <w:rPr>
-                <w:rFonts w:ascii="Arial" w:cs="Arial" w:eastAsia="Arial" w:hAnsi="Arial"/>
-                <w:b w:val="false"/>
-                <w:bCs w:val="false"/>
-                <w:sz w:val="20"/>
-                <w:szCs w:val="20"/>
-              </w:rPr>
-              <w:t xml:space="preserve">Versão completa para leitura da orientação</w:t>
-            </w:r>
-          </w:p>
-        </w:tc>
-      </w:tr>
-      <w:tr>
-        <w:trPr>
-          <w:cantSplit/>
-          <w:tblHeader w:val="false"/>
-        </w:trPr>
-        <w:tc>
-          <w:tcPr>
-            <w:tcW w:type="dxa" w:w="4595"/>
-            <w:tcBorders>
-              <w:top w:val="single" w:color="000000" w:sz="4"/>
-              <w:left w:val="single" w:color="000000" w:sz="4"/>
-              <w:bottom w:val="single" w:color="000000" w:sz="4"/>
-              <w:right w:val="single" w:color="000000" w:sz="4"/>
-            </w:tcBorders>
-            <w:tcMar>
-              <w:top w:type="dxa" w:w="60"/>
-              <w:left w:type="dxa" w:w="100"/>
-              <w:bottom w:type="dxa" w:w="60"/>
-              <w:right w:type="dxa" w:w="100"/>
-            </w:tcMar>
-          </w:tcPr>
-          <w:p>
-            <w:pPr>
-              <w:spacing w:after="40"/>
-            </w:pPr>
-            <w:r>
-              <w:rPr>
-                <w:rFonts w:ascii="Arial" w:cs="Arial" w:eastAsia="Arial" w:hAnsi="Arial"/>
-                <w:b w:val="false"/>
-                <w:bCs w:val="false"/>
-                <w:sz w:val="20"/>
-                <w:szCs w:val="20"/>
-              </w:rPr>
-              <w:t xml:space="preserve">16/11/2026</w:t>
-            </w:r>
-          </w:p>
-        </w:tc>
-        <w:tc>
-          <w:tcPr>
-            <w:tcW w:type="dxa" w:w="3282"/>
-            <w:tcBorders>
-              <w:top w:val="single" w:color="000000" w:sz="4"/>
-              <w:left w:val="single" w:color="000000" w:sz="4"/>
-              <w:bottom w:val="single" w:color="000000" w:sz="4"/>
-              <w:right w:val="single" w:color="000000" w:sz="4"/>
-            </w:tcBorders>
-            <w:tcMar>
-              <w:top w:type="dxa" w:w="60"/>
-              <w:left w:type="dxa" w:w="100"/>
-              <w:bottom w:type="dxa" w:w="60"/>
-              <w:right w:type="dxa" w:w="100"/>
-            </w:tcMar>
-          </w:tcPr>
-          <w:p>
-            <w:pPr>
-              <w:spacing w:after="40"/>
-            </w:pPr>
-            <w:r>
-              <w:rPr>
-                <w:rFonts w:ascii="Arial" w:cs="Arial" w:eastAsia="Arial" w:hAnsi="Arial"/>
-                <w:b w:val="false"/>
-                <w:bCs w:val="false"/>
-                <w:sz w:val="20"/>
-                <w:szCs w:val="20"/>
-              </w:rPr>
-              <w:t xml:space="preserve">segunda</w:t>
-            </w:r>
-          </w:p>
-        </w:tc>
-        <w:tc>
-          <w:tcPr>
-            <w:tcW w:type="dxa" w:w="5253"/>
-            <w:tcBorders>
-              <w:top w:val="single" w:color="000000" w:sz="4"/>
-              <w:left w:val="single" w:color="000000" w:sz="4"/>
-              <w:bottom w:val="single" w:color="000000" w:sz="4"/>
-              <w:right w:val="single" w:color="000000" w:sz="4"/>
-            </w:tcBorders>
-            <w:tcMar>
-              <w:top w:type="dxa" w:w="60"/>
-              <w:left w:type="dxa" w:w="100"/>
-              <w:bottom w:type="dxa" w:w="60"/>
-              <w:right w:type="dxa" w:w="100"/>
-            </w:tcMar>
-          </w:tcPr>
-          <w:p>
-            <w:pPr>
-              <w:spacing w:after="40"/>
-            </w:pPr>
-            <w:r>
-              <w:rPr>
-                <w:rFonts w:ascii="Arial" w:cs="Arial" w:eastAsia="Arial" w:hAnsi="Arial"/>
-                <w:b w:val="false"/>
-                <w:bCs w:val="false"/>
-                <w:sz w:val="20"/>
-                <w:szCs w:val="20"/>
-              </w:rPr>
-              <w:t xml:space="preserve">Versão final para a banca (data de referência)</w:t>
-            </w:r>
-          </w:p>
-        </w:tc>
-      </w:tr>
-      <w:tr>
-        <w:trPr>
-          <w:cantSplit/>
-          <w:tblHeader w:val="false"/>
-        </w:trPr>
-        <w:tc>
-          <w:tcPr>
-            <w:tcW w:type="dxa" w:w="4595"/>
-            <w:tcBorders>
-              <w:top w:val="single" w:color="000000" w:sz="4"/>
-              <w:left w:val="single" w:color="000000" w:sz="4"/>
-              <w:bottom w:val="single" w:color="000000" w:sz="4"/>
-              <w:right w:val="single" w:color="000000" w:sz="4"/>
-            </w:tcBorders>
-            <w:tcMar>
-              <w:top w:type="dxa" w:w="60"/>
-              <w:left w:type="dxa" w:w="100"/>
-              <w:bottom w:type="dxa" w:w="60"/>
-              <w:right w:type="dxa" w:w="100"/>
-            </w:tcMar>
-          </w:tcPr>
-          <w:p>
-            <w:pPr>
-              <w:spacing w:after="40"/>
-            </w:pPr>
-            <w:r>
-              <w:rPr>
-                <w:rFonts w:ascii="Arial" w:cs="Arial" w:eastAsia="Arial" w:hAnsi="Arial"/>
-                <w:b w:val="false"/>
-                <w:bCs w:val="false"/>
-                <w:sz w:val="20"/>
-                <w:szCs w:val="20"/>
-              </w:rPr>
-              <w:t xml:space="preserve">Final de novembro</w:t>
-            </w:r>
-          </w:p>
-        </w:tc>
-        <w:tc>
-          <w:tcPr>
-            <w:tcW w:type="dxa" w:w="3282"/>
-            <w:tcBorders>
-              <w:top w:val="single" w:color="000000" w:sz="4"/>
-              <w:left w:val="single" w:color="000000" w:sz="4"/>
-              <w:bottom w:val="single" w:color="000000" w:sz="4"/>
-              <w:right w:val="single" w:color="000000" w:sz="4"/>
-            </w:tcBorders>
-            <w:tcMar>
-              <w:top w:type="dxa" w:w="60"/>
-              <w:left w:type="dxa" w:w="100"/>
-              <w:bottom w:type="dxa" w:w="60"/>
-              <w:right w:type="dxa" w:w="100"/>
-            </w:tcMar>
-          </w:tcPr>
-          <w:p>
-            <w:pPr>
-              <w:spacing w:after="40"/>
-            </w:pPr>
-            <w:r>
-              <w:rPr>
-                <w:rFonts w:ascii="Arial" w:cs="Arial" w:eastAsia="Arial" w:hAnsi="Arial"/>
-                <w:b w:val="false"/>
-                <w:bCs w:val="false"/>
-                <w:sz w:val="20"/>
-                <w:szCs w:val="20"/>
-              </w:rPr>
-              <w:t xml:space="preserve">-</w:t>
-            </w:r>
-          </w:p>
-        </w:tc>
-        <w:tc>
-          <w:tcPr>
-            <w:tcW w:type="dxa" w:w="5253"/>
-            <w:tcBorders>
-              <w:top w:val="single" w:color="000000" w:sz="4"/>
-              <w:left w:val="single" w:color="000000" w:sz="4"/>
-              <w:bottom w:val="single" w:color="000000" w:sz="4"/>
-              <w:right w:val="single" w:color="000000" w:sz="4"/>
-            </w:tcBorders>
-            <w:tcMar>
-              <w:top w:type="dxa" w:w="60"/>
-              <w:left w:type="dxa" w:w="100"/>
-              <w:bottom w:type="dxa" w:w="60"/>
-              <w:right w:type="dxa" w:w="100"/>
-            </w:tcMar>
-          </w:tcPr>
-          <w:p>
-            <w:pPr>
-              <w:spacing w:after="40"/>
-            </w:pPr>
-            <w:r>
-              <w:rPr>
-                <w:rFonts w:ascii="Arial" w:cs="Arial" w:eastAsia="Arial" w:hAnsi="Arial"/>
-                <w:b w:val="false"/>
-                <w:bCs w:val="false"/>
-                <w:sz w:val="20"/>
-                <w:szCs w:val="20"/>
-              </w:rPr>
-              <w:t xml:space="preserve">Defesa</w:t>
-            </w:r>
-          </w:p>
-        </w:tc>
-      </w:tr>
-    </w:tbl>
-    <w:p>
-      <w:pPr>
-        <w:spacing w:after="120"/>
-      </w:pPr>
     </w:p>
     <w:p>
       <w:pPr>
@@ -913,8 +58,2804 @@
           <w:sz w:val="20"/>
           <w:szCs w:val="20"/>
         </w:rPr>
-        <w:t xml:space="preserve">Feriados nacionais no período: 12/10 (segunda), 02/11 (segunda) e 20/11 (sexta).</w:t>
+        <w:t xml:space="preserve">O trabalho é um plano de negócios baseado em evidências. Ele segue a estrutura de um plano de negócios: análise de mercado, marketing, operação, aspectos jurídicos, finanças e riscos. A diferença está no método: cada decisão do plano é ligada a um dado, e cada dado a uma fonte e a um nível de confiança.</w:t>
       </w:r>
+    </w:p>
+    <w:p>
+      <w:pPr>
+        <w:spacing w:after="120"/>
+      </w:pPr>
+      <w:r>
+        <w:rPr>
+          <w:rFonts w:ascii="Arial" w:cs="Arial" w:eastAsia="Arial" w:hAnsi="Arial"/>
+          <w:sz w:val="20"/>
+          <w:szCs w:val="20"/>
+        </w:rPr>
+        <w:t xml:space="preserve">O negócio analisado é uma luderia, estabelecimento que combina comida, bebida e um acervo de jogos de tabuleiro. O plano mira o público casual: pessoas que usam o jogo como forma de socializar, e não como hobby.</w:t>
+      </w:r>
+    </w:p>
+    <w:p>
+      <w:pPr>
+        <w:spacing w:after="120"/>
+      </w:pPr>
+      <w:r>
+        <w:rPr>
+          <w:rFonts w:ascii="Arial" w:cs="Arial" w:eastAsia="Arial" w:hAnsi="Arial"/>
+          <w:b/>
+          <w:bCs/>
+          <w:sz w:val="20"/>
+          <w:szCs w:val="20"/>
+        </w:rPr>
+        <w:t xml:space="preserve">Objetivo geral:</w:t>
+      </w:r>
+      <w:r>
+        <w:rPr>
+          <w:rFonts w:ascii="Arial" w:cs="Arial" w:eastAsia="Arial" w:hAnsi="Arial"/>
+          <w:sz w:val="20"/>
+          <w:szCs w:val="20"/>
+        </w:rPr>
+        <w:t xml:space="preserve"> avaliar se uma luderia voltada ao público casual é viável do ponto de vista de mercado, de operação e financeiro, com premissas sustentadas por dados públicos e por observação direta.</w:t>
+      </w:r>
+    </w:p>
+    <w:p>
+      <w:pPr>
+        <w:spacing w:after="120"/>
+      </w:pPr>
+      <w:r>
+        <w:rPr>
+          <w:rFonts w:ascii="Arial" w:cs="Arial" w:eastAsia="Arial" w:hAnsi="Arial"/>
+          <w:b/>
+          <w:bCs/>
+          <w:sz w:val="20"/>
+          <w:szCs w:val="20"/>
+        </w:rPr>
+        <w:t xml:space="preserve">Objetivos específicos:</w:t>
+      </w:r>
+    </w:p>
+    <w:p>
+      <w:pPr>
+        <w:pStyle w:val="ListParagraph"/>
+        <w:numPr>
+          <w:ilvl w:val="0"/>
+          <w:numId w:val="2"/>
+        </w:numPr>
+        <w:spacing w:after="60"/>
+      </w:pPr>
+      <w:r>
+        <w:rPr>
+          <w:rFonts w:ascii="Arial" w:cs="Arial" w:eastAsia="Arial" w:hAnsi="Arial"/>
+          <w:sz w:val="20"/>
+          <w:szCs w:val="20"/>
+        </w:rPr>
+        <w:t xml:space="preserve">Analisar o mercado e a concorrência de luderias nas 27 capitais: avaliação dos clientes, preço, cardápio e modelo de comida e bebida.</w:t>
+      </w:r>
+    </w:p>
+    <w:p>
+      <w:pPr>
+        <w:pStyle w:val="ListParagraph"/>
+        <w:numPr>
+          <w:ilvl w:val="0"/>
+          <w:numId w:val="2"/>
+        </w:numPr>
+        <w:spacing w:after="60"/>
+      </w:pPr>
+      <w:r>
+        <w:rPr>
+          <w:rFonts w:ascii="Arial" w:cs="Arial" w:eastAsia="Arial" w:hAnsi="Arial"/>
+          <w:sz w:val="20"/>
+          <w:szCs w:val="20"/>
+        </w:rPr>
+        <w:t xml:space="preserve">Caracterizar o comportamento de consumo do público das luderias.</w:t>
+      </w:r>
+    </w:p>
+    <w:p>
+      <w:pPr>
+        <w:pStyle w:val="ListParagraph"/>
+        <w:numPr>
+          <w:ilvl w:val="0"/>
+          <w:numId w:val="2"/>
+        </w:numPr>
+        <w:spacing w:after="60"/>
+      </w:pPr>
+      <w:r>
+        <w:rPr>
+          <w:rFonts w:ascii="Arial" w:cs="Arial" w:eastAsia="Arial" w:hAnsi="Arial"/>
+          <w:sz w:val="20"/>
+          <w:szCs w:val="20"/>
+        </w:rPr>
+        <w:t xml:space="preserve">Definir o posicionamento e o composto de marketing a partir dos aspectos que mais pesam na satisfação dos clientes.</w:t>
+      </w:r>
+    </w:p>
+    <w:p>
+      <w:pPr>
+        <w:pStyle w:val="ListParagraph"/>
+        <w:numPr>
+          <w:ilvl w:val="0"/>
+          <w:numId w:val="2"/>
+        </w:numPr>
+        <w:spacing w:after="60"/>
+      </w:pPr>
+      <w:r>
+        <w:rPr>
+          <w:rFonts w:ascii="Arial" w:cs="Arial" w:eastAsia="Arial" w:hAnsi="Arial"/>
+          <w:sz w:val="20"/>
+          <w:szCs w:val="20"/>
+        </w:rPr>
+        <w:t xml:space="preserve">Estimar a demanda, a taxa de ocupação e o giro de mesas.</w:t>
+      </w:r>
+    </w:p>
+    <w:p>
+      <w:pPr>
+        <w:pStyle w:val="ListParagraph"/>
+        <w:numPr>
+          <w:ilvl w:val="0"/>
+          <w:numId w:val="2"/>
+        </w:numPr>
+        <w:spacing w:after="60"/>
+      </w:pPr>
+      <w:r>
+        <w:rPr>
+          <w:rFonts w:ascii="Arial" w:cs="Arial" w:eastAsia="Arial" w:hAnsi="Arial"/>
+          <w:sz w:val="20"/>
+          <w:szCs w:val="20"/>
+        </w:rPr>
+        <w:t xml:space="preserve">Dimensionar a estrutura operacional e os requisitos jurídicos do negócio.</w:t>
+      </w:r>
+    </w:p>
+    <w:p>
+      <w:pPr>
+        <w:pStyle w:val="ListParagraph"/>
+        <w:numPr>
+          <w:ilvl w:val="0"/>
+          <w:numId w:val="2"/>
+        </w:numPr>
+        <w:spacing w:after="60"/>
+      </w:pPr>
+      <w:r>
+        <w:rPr>
+          <w:rFonts w:ascii="Arial" w:cs="Arial" w:eastAsia="Arial" w:hAnsi="Arial"/>
+          <w:sz w:val="20"/>
+          <w:szCs w:val="20"/>
+        </w:rPr>
+        <w:t xml:space="preserve">Projetar investimentos, receitas, custos e indicadores de viabilidade.</w:t>
+      </w:r>
+    </w:p>
+    <w:p>
+      <w:pPr>
+        <w:pStyle w:val="ListParagraph"/>
+        <w:numPr>
+          <w:ilvl w:val="0"/>
+          <w:numId w:val="2"/>
+        </w:numPr>
+        <w:spacing w:after="60"/>
+      </w:pPr>
+      <w:r>
+        <w:rPr>
+          <w:rFonts w:ascii="Arial" w:cs="Arial" w:eastAsia="Arial" w:hAnsi="Arial"/>
+          <w:sz w:val="20"/>
+          <w:szCs w:val="20"/>
+        </w:rPr>
+        <w:t xml:space="preserve">Identificar as premissas que mais afetam o resultado e os valores a partir dos quais o negócio deixa de ser viável.</w:t>
+      </w:r>
+    </w:p>
+    <w:p>
+      <w:pPr>
+        <w:pStyle w:val="ListParagraph"/>
+        <w:numPr>
+          <w:ilvl w:val="0"/>
+          <w:numId w:val="2"/>
+        </w:numPr>
+        <w:spacing w:after="60"/>
+      </w:pPr>
+      <w:r>
+        <w:rPr>
+          <w:rFonts w:ascii="Arial" w:cs="Arial" w:eastAsia="Arial" w:hAnsi="Arial"/>
+          <w:sz w:val="20"/>
+          <w:szCs w:val="20"/>
+        </w:rPr>
+        <w:t xml:space="preserve">Propor um plano de contingência e as validações necessárias antes do investimento.</w:t>
+      </w:r>
+    </w:p>
+    <w:p>
+      <w:pPr>
+        <w:pStyle w:val="Heading1"/>
+        <w:spacing w:after="120" w:before="240"/>
+      </w:pPr>
+      <w:r>
+        <w:rPr>
+          <w:rFonts w:ascii="Arial" w:cs="Arial" w:eastAsia="Arial" w:hAnsi="Arial"/>
+          <w:b/>
+          <w:bCs/>
+          <w:sz w:val="24"/>
+          <w:szCs w:val="24"/>
+        </w:rPr>
+        <w:t xml:space="preserve">Pressupostos e hipóteses</w:t>
+      </w:r>
+    </w:p>
+    <w:p>
+      <w:pPr>
+        <w:spacing w:after="120"/>
+      </w:pPr>
+      <w:r>
+        <w:rPr>
+          <w:rFonts w:ascii="Arial" w:cs="Arial" w:eastAsia="Arial" w:hAnsi="Arial"/>
+          <w:sz w:val="20"/>
+          <w:szCs w:val="20"/>
+        </w:rPr>
+        <w:t xml:space="preserve">Os pressupostos orientam o desenho da pesquisa e são verificados ao longo da análise:</w:t>
+      </w:r>
+    </w:p>
+    <w:p>
+      <w:pPr>
+        <w:pStyle w:val="ListParagraph"/>
+        <w:numPr>
+          <w:ilvl w:val="0"/>
+          <w:numId w:val="3"/>
+        </w:numPr>
+        <w:spacing w:after="60"/>
+      </w:pPr>
+      <w:r>
+        <w:rPr>
+          <w:rFonts w:ascii="Arial" w:cs="Arial" w:eastAsia="Arial" w:hAnsi="Arial"/>
+          <w:b/>
+          <w:bCs/>
+          <w:sz w:val="20"/>
+          <w:szCs w:val="20"/>
+        </w:rPr>
+        <w:t xml:space="preserve">P1:</w:t>
+      </w:r>
+      <w:r>
+        <w:rPr>
+          <w:rFonts w:ascii="Arial" w:cs="Arial" w:eastAsia="Arial" w:hAnsi="Arial"/>
+          <w:sz w:val="20"/>
+          <w:szCs w:val="20"/>
+        </w:rPr>
+        <w:t xml:space="preserve"> o público das luderias é majoritariamente casual. Quem tem o jogo como hobby tende a montar acervo e espaço de jogo em casa.</w:t>
+      </w:r>
+    </w:p>
+    <w:p>
+      <w:pPr>
+        <w:pStyle w:val="ListParagraph"/>
+        <w:numPr>
+          <w:ilvl w:val="0"/>
+          <w:numId w:val="3"/>
+        </w:numPr>
+        <w:spacing w:after="60"/>
+      </w:pPr>
+      <w:r>
+        <w:rPr>
+          <w:rFonts w:ascii="Arial" w:cs="Arial" w:eastAsia="Arial" w:hAnsi="Arial"/>
+          <w:b/>
+          <w:bCs/>
+          <w:sz w:val="20"/>
+          <w:szCs w:val="20"/>
+        </w:rPr>
+        <w:t xml:space="preserve">P2:</w:t>
+      </w:r>
+      <w:r>
+        <w:rPr>
+          <w:rFonts w:ascii="Arial" w:cs="Arial" w:eastAsia="Arial" w:hAnsi="Arial"/>
+          <w:sz w:val="20"/>
+          <w:szCs w:val="20"/>
+        </w:rPr>
+        <w:t xml:space="preserve"> a taxa de ocupação e o ticket médio concentram a maior parte da incerteza sobre o resultado financeiro.</w:t>
+      </w:r>
+    </w:p>
+    <w:p>
+      <w:pPr>
+        <w:pStyle w:val="ListParagraph"/>
+        <w:numPr>
+          <w:ilvl w:val="0"/>
+          <w:numId w:val="3"/>
+        </w:numPr>
+        <w:spacing w:after="60"/>
+      </w:pPr>
+      <w:r>
+        <w:rPr>
+          <w:rFonts w:ascii="Arial" w:cs="Arial" w:eastAsia="Arial" w:hAnsi="Arial"/>
+          <w:b/>
+          <w:bCs/>
+          <w:sz w:val="20"/>
+          <w:szCs w:val="20"/>
+        </w:rPr>
+        <w:t xml:space="preserve">P3:</w:t>
+      </w:r>
+      <w:r>
+        <w:rPr>
+          <w:rFonts w:ascii="Arial" w:cs="Arial" w:eastAsia="Arial" w:hAnsi="Arial"/>
+          <w:sz w:val="20"/>
+          <w:szCs w:val="20"/>
+        </w:rPr>
+        <w:t xml:space="preserve"> o ritmo de novas avaliações no Google, calibrado pela contagem de ocupação, estima o fluxo de clientes dos concorrentes com margem de erro aceitável para a decisão.</w:t>
+      </w:r>
+    </w:p>
+    <w:p>
+      <w:pPr>
+        <w:spacing w:after="120"/>
+      </w:pPr>
+      <w:r>
+        <w:rPr>
+          <w:rFonts w:ascii="Arial" w:cs="Arial" w:eastAsia="Arial" w:hAnsi="Arial"/>
+          <w:sz w:val="20"/>
+          <w:szCs w:val="20"/>
+        </w:rPr>
+        <w:t xml:space="preserve">As hipóteses foram registradas em 14/09/2026, antes da coleta das avaliações. Elas são testadas uma única vez, em uma parte da base separada para esse fim:</w:t>
+      </w:r>
+    </w:p>
+    <w:p>
+      <w:pPr>
+        <w:pStyle w:val="ListParagraph"/>
+        <w:numPr>
+          <w:ilvl w:val="0"/>
+          <w:numId w:val="3"/>
+        </w:numPr>
+        <w:spacing w:after="60"/>
+      </w:pPr>
+      <w:r>
+        <w:rPr>
+          <w:rFonts w:ascii="Arial" w:cs="Arial" w:eastAsia="Arial" w:hAnsi="Arial"/>
+          <w:b/>
+          <w:bCs/>
+          <w:sz w:val="20"/>
+          <w:szCs w:val="20"/>
+        </w:rPr>
+        <w:t xml:space="preserve">H1 - Atendimento:</w:t>
+      </w:r>
+      <w:r>
+        <w:rPr>
+          <w:rFonts w:ascii="Arial" w:cs="Arial" w:eastAsia="Arial" w:hAnsi="Arial"/>
+          <w:sz w:val="20"/>
+          <w:szCs w:val="20"/>
+        </w:rPr>
+        <w:t xml:space="preserve"> reclamações sobre atendimento e sobre a explicação dos jogos reduzem mais a nota do cliente do que reclamações sobre comida e bebida.</w:t>
+      </w:r>
+    </w:p>
+    <w:p>
+      <w:pPr>
+        <w:pStyle w:val="ListParagraph"/>
+        <w:numPr>
+          <w:ilvl w:val="0"/>
+          <w:numId w:val="3"/>
+        </w:numPr>
+        <w:spacing w:after="60"/>
+      </w:pPr>
+      <w:r>
+        <w:rPr>
+          <w:rFonts w:ascii="Arial" w:cs="Arial" w:eastAsia="Arial" w:hAnsi="Arial"/>
+          <w:b/>
+          <w:bCs/>
+          <w:sz w:val="20"/>
+          <w:szCs w:val="20"/>
+        </w:rPr>
+        <w:t xml:space="preserve">H2 - Comida:</w:t>
+      </w:r>
+      <w:r>
+        <w:rPr>
+          <w:rFonts w:ascii="Arial" w:cs="Arial" w:eastAsia="Arial" w:hAnsi="Arial"/>
+          <w:sz w:val="20"/>
+          <w:szCs w:val="20"/>
+        </w:rPr>
+        <w:t xml:space="preserve"> elogios à comida estão associados a notas mais altas, na comparação dentro de um mesmo estabelecimento.</w:t>
+      </w:r>
+    </w:p>
+    <w:p>
+      <w:pPr>
+        <w:pStyle w:val="ListParagraph"/>
+        <w:numPr>
+          <w:ilvl w:val="0"/>
+          <w:numId w:val="3"/>
+        </w:numPr>
+        <w:spacing w:after="60"/>
+      </w:pPr>
+      <w:r>
+        <w:rPr>
+          <w:rFonts w:ascii="Arial" w:cs="Arial" w:eastAsia="Arial" w:hAnsi="Arial"/>
+          <w:b/>
+          <w:bCs/>
+          <w:sz w:val="20"/>
+          <w:szCs w:val="20"/>
+        </w:rPr>
+        <w:t xml:space="preserve">H3 - Preço:</w:t>
+      </w:r>
+      <w:r>
+        <w:rPr>
+          <w:rFonts w:ascii="Arial" w:cs="Arial" w:eastAsia="Arial" w:hAnsi="Arial"/>
+          <w:sz w:val="20"/>
+          <w:szCs w:val="20"/>
+        </w:rPr>
+        <w:t xml:space="preserve"> a proporção de reclamações de preço muda conforme a forma de cobrança (couvert, cobrança por hora ou consumação mínima).</w:t>
+      </w:r>
+    </w:p>
+    <w:p>
+      <w:pPr>
+        <w:pStyle w:val="ListParagraph"/>
+        <w:numPr>
+          <w:ilvl w:val="0"/>
+          <w:numId w:val="3"/>
+        </w:numPr>
+        <w:spacing w:after="60"/>
+      </w:pPr>
+      <w:r>
+        <w:rPr>
+          <w:rFonts w:ascii="Arial" w:cs="Arial" w:eastAsia="Arial" w:hAnsi="Arial"/>
+          <w:b/>
+          <w:bCs/>
+          <w:sz w:val="20"/>
+          <w:szCs w:val="20"/>
+        </w:rPr>
+        <w:t xml:space="preserve">H4 - Roteiro da saída:</w:t>
+      </w:r>
+      <w:r>
+        <w:rPr>
+          <w:rFonts w:ascii="Arial" w:cs="Arial" w:eastAsia="Arial" w:hAnsi="Arial"/>
+          <w:sz w:val="20"/>
+          <w:szCs w:val="20"/>
+        </w:rPr>
+        <w:t xml:space="preserve"> nas luderias sem cozinha própria, é mais comum que o cliente avalie também um restaurante no mesmo dia.</w:t>
+      </w:r>
+    </w:p>
+    <w:p>
+      <w:pPr>
+        <w:pStyle w:val="ListParagraph"/>
+        <w:numPr>
+          <w:ilvl w:val="0"/>
+          <w:numId w:val="3"/>
+        </w:numPr>
+        <w:spacing w:after="60"/>
+      </w:pPr>
+      <w:r>
+        <w:rPr>
+          <w:rFonts w:ascii="Arial" w:cs="Arial" w:eastAsia="Arial" w:hAnsi="Arial"/>
+          <w:b/>
+          <w:bCs/>
+          <w:sz w:val="20"/>
+          <w:szCs w:val="20"/>
+        </w:rPr>
+        <w:t xml:space="preserve">H5 - Ticket:</w:t>
+      </w:r>
+      <w:r>
+        <w:rPr>
+          <w:rFonts w:ascii="Arial" w:cs="Arial" w:eastAsia="Arial" w:hAnsi="Arial"/>
+          <w:sz w:val="20"/>
+          <w:szCs w:val="20"/>
+        </w:rPr>
+        <w:t xml:space="preserve"> o gasto por pessoa citado nas avaliações fica dentro da faixa calculada a partir dos cardápios da mesma capital.</w:t>
+      </w:r>
+    </w:p>
+    <w:p>
+      <w:pPr>
+        <w:spacing w:after="120"/>
+      </w:pPr>
+      <w:r>
+        <w:rPr>
+          <w:rFonts w:ascii="Arial" w:cs="Arial" w:eastAsia="Arial" w:hAnsi="Arial"/>
+          <w:sz w:val="20"/>
+          <w:szCs w:val="20"/>
+        </w:rPr>
+        <w:t xml:space="preserve">A nota usada nas hipóteses é a nota centrada no avaliador: a nota dada à luderia menos a média das notas que a mesma pessoa dá a todos os lugares. Isso separa a experiência na luderia do grau de exigência de quem avalia.</w:t>
+      </w:r>
+    </w:p>
+    <w:p>
+      <w:pPr>
+        <w:pStyle w:val="Heading1"/>
+        <w:spacing w:after="120" w:before="240"/>
+      </w:pPr>
+      <w:r>
+        <w:rPr>
+          <w:rFonts w:ascii="Arial" w:cs="Arial" w:eastAsia="Arial" w:hAnsi="Arial"/>
+          <w:b/>
+          <w:bCs/>
+          <w:sz w:val="24"/>
+          <w:szCs w:val="24"/>
+        </w:rPr>
+        <w:t xml:space="preserve">Variáveis e instrumentos de coleta</w:t>
+      </w:r>
+    </w:p>
+    <w:tbl>
+      <w:tblPr>
+        <w:tblW w:type="dxa" w:w="14570"/>
+        <w:tblBorders>
+          <w:top w:val="single" w:color="auto" w:sz="4"/>
+          <w:left w:val="single" w:color="auto" w:sz="4"/>
+          <w:bottom w:val="single" w:color="auto" w:sz="4"/>
+          <w:right w:val="single" w:color="auto" w:sz="4"/>
+          <w:insideH w:val="single" w:color="auto" w:sz="4"/>
+          <w:insideV w:val="single" w:color="auto" w:sz="4"/>
+        </w:tblBorders>
+      </w:tblPr>
+      <w:tblGrid>
+        <w:gridCol w:w="3573"/>
+        <w:gridCol w:w="3848"/>
+        <w:gridCol w:w="3573"/>
+        <w:gridCol w:w="3576"/>
+      </w:tblGrid>
+      <w:tr>
+        <w:trPr>
+          <w:cantSplit/>
+          <w:tblHeader/>
+        </w:trPr>
+        <w:tc>
+          <w:tcPr>
+            <w:tcW w:type="dxa" w:w="3573"/>
+            <w:tcBorders>
+              <w:top w:val="single" w:color="000000" w:sz="4"/>
+              <w:left w:val="single" w:color="000000" w:sz="4"/>
+              <w:bottom w:val="single" w:color="000000" w:sz="4"/>
+              <w:right w:val="single" w:color="000000" w:sz="4"/>
+            </w:tcBorders>
+            <w:shd w:fill="E7E6E6" w:color="auto" w:val="clear"/>
+            <w:tcMar>
+              <w:top w:type="dxa" w:w="60"/>
+              <w:left w:type="dxa" w:w="100"/>
+              <w:bottom w:type="dxa" w:w="60"/>
+              <w:right w:type="dxa" w:w="100"/>
+            </w:tcMar>
+          </w:tcPr>
+          <w:p>
+            <w:pPr>
+              <w:spacing w:after="40"/>
+            </w:pPr>
+            <w:r>
+              <w:rPr>
+                <w:rFonts w:ascii="Arial" w:cs="Arial" w:eastAsia="Arial" w:hAnsi="Arial"/>
+                <w:b/>
+                <w:bCs/>
+                <w:sz w:val="20"/>
+                <w:szCs w:val="20"/>
+              </w:rPr>
+              <w:t xml:space="preserve">Variável</w:t>
+            </w:r>
+          </w:p>
+        </w:tc>
+        <w:tc>
+          <w:tcPr>
+            <w:tcW w:type="dxa" w:w="3848"/>
+            <w:tcBorders>
+              <w:top w:val="single" w:color="000000" w:sz="4"/>
+              <w:left w:val="single" w:color="000000" w:sz="4"/>
+              <w:bottom w:val="single" w:color="000000" w:sz="4"/>
+              <w:right w:val="single" w:color="000000" w:sz="4"/>
+            </w:tcBorders>
+            <w:shd w:fill="E7E6E6" w:color="auto" w:val="clear"/>
+            <w:tcMar>
+              <w:top w:type="dxa" w:w="60"/>
+              <w:left w:type="dxa" w:w="100"/>
+              <w:bottom w:type="dxa" w:w="60"/>
+              <w:right w:type="dxa" w:w="100"/>
+            </w:tcMar>
+          </w:tcPr>
+          <w:p>
+            <w:pPr>
+              <w:spacing w:after="40"/>
+            </w:pPr>
+            <w:r>
+              <w:rPr>
+                <w:rFonts w:ascii="Arial" w:cs="Arial" w:eastAsia="Arial" w:hAnsi="Arial"/>
+                <w:b/>
+                <w:bCs/>
+                <w:sz w:val="20"/>
+                <w:szCs w:val="20"/>
+              </w:rPr>
+              <w:t xml:space="preserve">Finalidade</w:t>
+            </w:r>
+          </w:p>
+        </w:tc>
+        <w:tc>
+          <w:tcPr>
+            <w:tcW w:type="dxa" w:w="3573"/>
+            <w:tcBorders>
+              <w:top w:val="single" w:color="000000" w:sz="4"/>
+              <w:left w:val="single" w:color="000000" w:sz="4"/>
+              <w:bottom w:val="single" w:color="000000" w:sz="4"/>
+              <w:right w:val="single" w:color="000000" w:sz="4"/>
+            </w:tcBorders>
+            <w:shd w:fill="E7E6E6" w:color="auto" w:val="clear"/>
+            <w:tcMar>
+              <w:top w:type="dxa" w:w="60"/>
+              <w:left w:type="dxa" w:w="100"/>
+              <w:bottom w:type="dxa" w:w="60"/>
+              <w:right w:type="dxa" w:w="100"/>
+            </w:tcMar>
+          </w:tcPr>
+          <w:p>
+            <w:pPr>
+              <w:spacing w:after="40"/>
+            </w:pPr>
+            <w:r>
+              <w:rPr>
+                <w:rFonts w:ascii="Arial" w:cs="Arial" w:eastAsia="Arial" w:hAnsi="Arial"/>
+                <w:b/>
+                <w:bCs/>
+                <w:sz w:val="20"/>
+                <w:szCs w:val="20"/>
+              </w:rPr>
+              <w:t xml:space="preserve">Fonte dos dados</w:t>
+            </w:r>
+          </w:p>
+        </w:tc>
+        <w:tc>
+          <w:tcPr>
+            <w:tcW w:type="dxa" w:w="3576"/>
+            <w:tcBorders>
+              <w:top w:val="single" w:color="000000" w:sz="4"/>
+              <w:left w:val="single" w:color="000000" w:sz="4"/>
+              <w:bottom w:val="single" w:color="000000" w:sz="4"/>
+              <w:right w:val="single" w:color="000000" w:sz="4"/>
+            </w:tcBorders>
+            <w:shd w:fill="E7E6E6" w:color="auto" w:val="clear"/>
+            <w:tcMar>
+              <w:top w:type="dxa" w:w="60"/>
+              <w:left w:type="dxa" w:w="100"/>
+              <w:bottom w:type="dxa" w:w="60"/>
+              <w:right w:type="dxa" w:w="100"/>
+            </w:tcMar>
+          </w:tcPr>
+          <w:p>
+            <w:pPr>
+              <w:spacing w:after="40"/>
+            </w:pPr>
+            <w:r>
+              <w:rPr>
+                <w:rFonts w:ascii="Arial" w:cs="Arial" w:eastAsia="Arial" w:hAnsi="Arial"/>
+                <w:b/>
+                <w:bCs/>
+                <w:sz w:val="20"/>
+                <w:szCs w:val="20"/>
+              </w:rPr>
+              <w:t xml:space="preserve">Instrumento de coleta</w:t>
+            </w:r>
+          </w:p>
+        </w:tc>
+      </w:tr>
+      <w:tr>
+        <w:trPr>
+          <w:cantSplit/>
+          <w:tblHeader w:val="false"/>
+        </w:trPr>
+        <w:tc>
+          <w:tcPr>
+            <w:tcW w:type="dxa" w:w="3573"/>
+            <w:tcBorders>
+              <w:top w:val="single" w:color="000000" w:sz="4"/>
+              <w:left w:val="single" w:color="000000" w:sz="4"/>
+              <w:bottom w:val="single" w:color="000000" w:sz="4"/>
+              <w:right w:val="single" w:color="000000" w:sz="4"/>
+            </w:tcBorders>
+            <w:tcMar>
+              <w:top w:type="dxa" w:w="60"/>
+              <w:left w:type="dxa" w:w="100"/>
+              <w:bottom w:type="dxa" w:w="60"/>
+              <w:right w:type="dxa" w:w="100"/>
+            </w:tcMar>
+          </w:tcPr>
+          <w:p>
+            <w:pPr>
+              <w:spacing w:after="40"/>
+            </w:pPr>
+            <w:r>
+              <w:rPr>
+                <w:rFonts w:ascii="Arial" w:cs="Arial" w:eastAsia="Arial" w:hAnsi="Arial"/>
+                <w:b w:val="false"/>
+                <w:bCs w:val="false"/>
+                <w:sz w:val="20"/>
+                <w:szCs w:val="20"/>
+              </w:rPr>
+              <w:t xml:space="preserve">Avaliação média e número de avaliações</w:t>
+            </w:r>
+          </w:p>
+        </w:tc>
+        <w:tc>
+          <w:tcPr>
+            <w:tcW w:type="dxa" w:w="3848"/>
+            <w:tcBorders>
+              <w:top w:val="single" w:color="000000" w:sz="4"/>
+              <w:left w:val="single" w:color="000000" w:sz="4"/>
+              <w:bottom w:val="single" w:color="000000" w:sz="4"/>
+              <w:right w:val="single" w:color="000000" w:sz="4"/>
+            </w:tcBorders>
+            <w:tcMar>
+              <w:top w:type="dxa" w:w="60"/>
+              <w:left w:type="dxa" w:w="100"/>
+              <w:bottom w:type="dxa" w:w="60"/>
+              <w:right w:type="dxa" w:w="100"/>
+            </w:tcMar>
+          </w:tcPr>
+          <w:p>
+            <w:pPr>
+              <w:spacing w:after="40"/>
+            </w:pPr>
+            <w:r>
+              <w:rPr>
+                <w:rFonts w:ascii="Arial" w:cs="Arial" w:eastAsia="Arial" w:hAnsi="Arial"/>
+                <w:b w:val="false"/>
+                <w:bCs w:val="false"/>
+                <w:sz w:val="20"/>
+                <w:szCs w:val="20"/>
+              </w:rPr>
+              <w:t xml:space="preserve">Medir a satisfação e o porte dos concorrentes</w:t>
+            </w:r>
+          </w:p>
+        </w:tc>
+        <w:tc>
+          <w:tcPr>
+            <w:tcW w:type="dxa" w:w="3573"/>
+            <w:tcBorders>
+              <w:top w:val="single" w:color="000000" w:sz="4"/>
+              <w:left w:val="single" w:color="000000" w:sz="4"/>
+              <w:bottom w:val="single" w:color="000000" w:sz="4"/>
+              <w:right w:val="single" w:color="000000" w:sz="4"/>
+            </w:tcBorders>
+            <w:tcMar>
+              <w:top w:type="dxa" w:w="60"/>
+              <w:left w:type="dxa" w:w="100"/>
+              <w:bottom w:type="dxa" w:w="60"/>
+              <w:right w:type="dxa" w:w="100"/>
+            </w:tcMar>
+          </w:tcPr>
+          <w:p>
+            <w:pPr>
+              <w:spacing w:after="40"/>
+            </w:pPr>
+            <w:r>
+              <w:rPr>
+                <w:rFonts w:ascii="Arial" w:cs="Arial" w:eastAsia="Arial" w:hAnsi="Arial"/>
+                <w:b w:val="false"/>
+                <w:bCs w:val="false"/>
+                <w:sz w:val="20"/>
+                <w:szCs w:val="20"/>
+              </w:rPr>
+              <w:t xml:space="preserve">Google Maps</w:t>
+            </w:r>
+          </w:p>
+        </w:tc>
+        <w:tc>
+          <w:tcPr>
+            <w:tcW w:type="dxa" w:w="3576"/>
+            <w:tcBorders>
+              <w:top w:val="single" w:color="000000" w:sz="4"/>
+              <w:left w:val="single" w:color="000000" w:sz="4"/>
+              <w:bottom w:val="single" w:color="000000" w:sz="4"/>
+              <w:right w:val="single" w:color="000000" w:sz="4"/>
+            </w:tcBorders>
+            <w:tcMar>
+              <w:top w:type="dxa" w:w="60"/>
+              <w:left w:type="dxa" w:w="100"/>
+              <w:bottom w:type="dxa" w:w="60"/>
+              <w:right w:type="dxa" w:w="100"/>
+            </w:tcMar>
+          </w:tcPr>
+          <w:p>
+            <w:pPr>
+              <w:spacing w:after="40"/>
+            </w:pPr>
+            <w:r>
+              <w:rPr>
+                <w:rFonts w:ascii="Arial" w:cs="Arial" w:eastAsia="Arial" w:hAnsi="Arial"/>
+                <w:b w:val="false"/>
+                <w:bCs w:val="false"/>
+                <w:sz w:val="20"/>
+                <w:szCs w:val="20"/>
+              </w:rPr>
+              <w:t xml:space="preserve">Google Places API</w:t>
+            </w:r>
+          </w:p>
+        </w:tc>
+      </w:tr>
+      <w:tr>
+        <w:trPr>
+          <w:cantSplit/>
+          <w:tblHeader w:val="false"/>
+        </w:trPr>
+        <w:tc>
+          <w:tcPr>
+            <w:tcW w:type="dxa" w:w="3573"/>
+            <w:tcBorders>
+              <w:top w:val="single" w:color="000000" w:sz="4"/>
+              <w:left w:val="single" w:color="000000" w:sz="4"/>
+              <w:bottom w:val="single" w:color="000000" w:sz="4"/>
+              <w:right w:val="single" w:color="000000" w:sz="4"/>
+            </w:tcBorders>
+            <w:tcMar>
+              <w:top w:type="dxa" w:w="60"/>
+              <w:left w:type="dxa" w:w="100"/>
+              <w:bottom w:type="dxa" w:w="60"/>
+              <w:right w:type="dxa" w:w="100"/>
+            </w:tcMar>
+          </w:tcPr>
+          <w:p>
+            <w:pPr>
+              <w:spacing w:after="40"/>
+            </w:pPr>
+            <w:r>
+              <w:rPr>
+                <w:rFonts w:ascii="Arial" w:cs="Arial" w:eastAsia="Arial" w:hAnsi="Arial"/>
+                <w:b w:val="false"/>
+                <w:bCs w:val="false"/>
+                <w:sz w:val="20"/>
+                <w:szCs w:val="20"/>
+              </w:rPr>
+              <w:t xml:space="preserve">Forma de cobrança, modelo de comida e bebida e acervo de jogos</w:t>
+            </w:r>
+          </w:p>
+        </w:tc>
+        <w:tc>
+          <w:tcPr>
+            <w:tcW w:type="dxa" w:w="3848"/>
+            <w:tcBorders>
+              <w:top w:val="single" w:color="000000" w:sz="4"/>
+              <w:left w:val="single" w:color="000000" w:sz="4"/>
+              <w:bottom w:val="single" w:color="000000" w:sz="4"/>
+              <w:right w:val="single" w:color="000000" w:sz="4"/>
+            </w:tcBorders>
+            <w:tcMar>
+              <w:top w:type="dxa" w:w="60"/>
+              <w:left w:type="dxa" w:w="100"/>
+              <w:bottom w:type="dxa" w:w="60"/>
+              <w:right w:type="dxa" w:w="100"/>
+            </w:tcMar>
+          </w:tcPr>
+          <w:p>
+            <w:pPr>
+              <w:spacing w:after="40"/>
+            </w:pPr>
+            <w:r>
+              <w:rPr>
+                <w:rFonts w:ascii="Arial" w:cs="Arial" w:eastAsia="Arial" w:hAnsi="Arial"/>
+                <w:b w:val="false"/>
+                <w:bCs w:val="false"/>
+                <w:sz w:val="20"/>
+                <w:szCs w:val="20"/>
+              </w:rPr>
+              <w:t xml:space="preserve">Comparar os formatos de negócio dos concorrentes</w:t>
+            </w:r>
+          </w:p>
+        </w:tc>
+        <w:tc>
+          <w:tcPr>
+            <w:tcW w:type="dxa" w:w="3573"/>
+            <w:tcBorders>
+              <w:top w:val="single" w:color="000000" w:sz="4"/>
+              <w:left w:val="single" w:color="000000" w:sz="4"/>
+              <w:bottom w:val="single" w:color="000000" w:sz="4"/>
+              <w:right w:val="single" w:color="000000" w:sz="4"/>
+            </w:tcBorders>
+            <w:tcMar>
+              <w:top w:type="dxa" w:w="60"/>
+              <w:left w:type="dxa" w:w="100"/>
+              <w:bottom w:type="dxa" w:w="60"/>
+              <w:right w:type="dxa" w:w="100"/>
+            </w:tcMar>
+          </w:tcPr>
+          <w:p>
+            <w:pPr>
+              <w:spacing w:after="40"/>
+            </w:pPr>
+            <w:r>
+              <w:rPr>
+                <w:rFonts w:ascii="Arial" w:cs="Arial" w:eastAsia="Arial" w:hAnsi="Arial"/>
+                <w:b w:val="false"/>
+                <w:bCs w:val="false"/>
+                <w:sz w:val="20"/>
+                <w:szCs w:val="20"/>
+              </w:rPr>
+              <w:t xml:space="preserve">Site, Instagram e cardápio de cada estabelecimento</w:t>
+            </w:r>
+          </w:p>
+        </w:tc>
+        <w:tc>
+          <w:tcPr>
+            <w:tcW w:type="dxa" w:w="3576"/>
+            <w:tcBorders>
+              <w:top w:val="single" w:color="000000" w:sz="4"/>
+              <w:left w:val="single" w:color="000000" w:sz="4"/>
+              <w:bottom w:val="single" w:color="000000" w:sz="4"/>
+              <w:right w:val="single" w:color="000000" w:sz="4"/>
+            </w:tcBorders>
+            <w:tcMar>
+              <w:top w:type="dxa" w:w="60"/>
+              <w:left w:type="dxa" w:w="100"/>
+              <w:bottom w:type="dxa" w:w="60"/>
+              <w:right w:type="dxa" w:w="100"/>
+            </w:tcMar>
+          </w:tcPr>
+          <w:p>
+            <w:pPr>
+              <w:spacing w:after="40"/>
+            </w:pPr>
+            <w:r>
+              <w:rPr>
+                <w:rFonts w:ascii="Arial" w:cs="Arial" w:eastAsia="Arial" w:hAnsi="Arial"/>
+                <w:b w:val="false"/>
+                <w:bCs w:val="false"/>
+                <w:sz w:val="20"/>
+                <w:szCs w:val="20"/>
+              </w:rPr>
+              <w:t xml:space="preserve">Registro manual em planilha</w:t>
+            </w:r>
+          </w:p>
+        </w:tc>
+      </w:tr>
+      <w:tr>
+        <w:trPr>
+          <w:cantSplit/>
+          <w:tblHeader w:val="false"/>
+        </w:trPr>
+        <w:tc>
+          <w:tcPr>
+            <w:tcW w:type="dxa" w:w="3573"/>
+            <w:tcBorders>
+              <w:top w:val="single" w:color="000000" w:sz="4"/>
+              <w:left w:val="single" w:color="000000" w:sz="4"/>
+              <w:bottom w:val="single" w:color="000000" w:sz="4"/>
+              <w:right w:val="single" w:color="000000" w:sz="4"/>
+            </w:tcBorders>
+            <w:tcMar>
+              <w:top w:type="dxa" w:w="60"/>
+              <w:left w:type="dxa" w:w="100"/>
+              <w:bottom w:type="dxa" w:w="60"/>
+              <w:right w:type="dxa" w:w="100"/>
+            </w:tcMar>
+          </w:tcPr>
+          <w:p>
+            <w:pPr>
+              <w:spacing w:after="40"/>
+            </w:pPr>
+            <w:r>
+              <w:rPr>
+                <w:rFonts w:ascii="Arial" w:cs="Arial" w:eastAsia="Arial" w:hAnsi="Arial"/>
+                <w:b w:val="false"/>
+                <w:bCs w:val="false"/>
+                <w:sz w:val="20"/>
+                <w:szCs w:val="20"/>
+              </w:rPr>
+              <w:t xml:space="preserve">Pontos de fluxo no entorno (parques e praias, shoppings, estações de metrô)</w:t>
+            </w:r>
+          </w:p>
+        </w:tc>
+        <w:tc>
+          <w:tcPr>
+            <w:tcW w:type="dxa" w:w="3848"/>
+            <w:tcBorders>
+              <w:top w:val="single" w:color="000000" w:sz="4"/>
+              <w:left w:val="single" w:color="000000" w:sz="4"/>
+              <w:bottom w:val="single" w:color="000000" w:sz="4"/>
+              <w:right w:val="single" w:color="000000" w:sz="4"/>
+            </w:tcBorders>
+            <w:tcMar>
+              <w:top w:type="dxa" w:w="60"/>
+              <w:left w:type="dxa" w:w="100"/>
+              <w:bottom w:type="dxa" w:w="60"/>
+              <w:right w:type="dxa" w:w="100"/>
+            </w:tcMar>
+          </w:tcPr>
+          <w:p>
+            <w:pPr>
+              <w:spacing w:after="40"/>
+            </w:pPr>
+            <w:r>
+              <w:rPr>
+                <w:rFonts w:ascii="Arial" w:cs="Arial" w:eastAsia="Arial" w:hAnsi="Arial"/>
+                <w:b w:val="false"/>
+                <w:bCs w:val="false"/>
+                <w:sz w:val="20"/>
+                <w:szCs w:val="20"/>
+              </w:rPr>
+              <w:t xml:space="preserve">Avaliar a localização dos concorrentes</w:t>
+            </w:r>
+          </w:p>
+        </w:tc>
+        <w:tc>
+          <w:tcPr>
+            <w:tcW w:type="dxa" w:w="3573"/>
+            <w:tcBorders>
+              <w:top w:val="single" w:color="000000" w:sz="4"/>
+              <w:left w:val="single" w:color="000000" w:sz="4"/>
+              <w:bottom w:val="single" w:color="000000" w:sz="4"/>
+              <w:right w:val="single" w:color="000000" w:sz="4"/>
+            </w:tcBorders>
+            <w:tcMar>
+              <w:top w:type="dxa" w:w="60"/>
+              <w:left w:type="dxa" w:w="100"/>
+              <w:bottom w:type="dxa" w:w="60"/>
+              <w:right w:type="dxa" w:w="100"/>
+            </w:tcMar>
+          </w:tcPr>
+          <w:p>
+            <w:pPr>
+              <w:spacing w:after="40"/>
+            </w:pPr>
+            <w:r>
+              <w:rPr>
+                <w:rFonts w:ascii="Arial" w:cs="Arial" w:eastAsia="Arial" w:hAnsi="Arial"/>
+                <w:b w:val="false"/>
+                <w:bCs w:val="false"/>
+                <w:sz w:val="20"/>
+                <w:szCs w:val="20"/>
+              </w:rPr>
+              <w:t xml:space="preserve">OpenStreetMap</w:t>
+            </w:r>
+          </w:p>
+        </w:tc>
+        <w:tc>
+          <w:tcPr>
+            <w:tcW w:type="dxa" w:w="3576"/>
+            <w:tcBorders>
+              <w:top w:val="single" w:color="000000" w:sz="4"/>
+              <w:left w:val="single" w:color="000000" w:sz="4"/>
+              <w:bottom w:val="single" w:color="000000" w:sz="4"/>
+              <w:right w:val="single" w:color="000000" w:sz="4"/>
+            </w:tcBorders>
+            <w:tcMar>
+              <w:top w:type="dxa" w:w="60"/>
+              <w:left w:type="dxa" w:w="100"/>
+              <w:bottom w:type="dxa" w:w="60"/>
+              <w:right w:type="dxa" w:w="100"/>
+            </w:tcMar>
+          </w:tcPr>
+          <w:p>
+            <w:pPr>
+              <w:spacing w:after="40"/>
+            </w:pPr>
+            <w:r>
+              <w:rPr>
+                <w:rFonts w:ascii="Arial" w:cs="Arial" w:eastAsia="Arial" w:hAnsi="Arial"/>
+                <w:b w:val="false"/>
+                <w:bCs w:val="false"/>
+                <w:sz w:val="20"/>
+                <w:szCs w:val="20"/>
+              </w:rPr>
+              <w:t xml:space="preserve">Contagem automática em raios de 500 m e 1.000 m</w:t>
+            </w:r>
+          </w:p>
+        </w:tc>
+      </w:tr>
+      <w:tr>
+        <w:trPr>
+          <w:cantSplit/>
+          <w:tblHeader w:val="false"/>
+        </w:trPr>
+        <w:tc>
+          <w:tcPr>
+            <w:tcW w:type="dxa" w:w="3573"/>
+            <w:tcBorders>
+              <w:top w:val="single" w:color="000000" w:sz="4"/>
+              <w:left w:val="single" w:color="000000" w:sz="4"/>
+              <w:bottom w:val="single" w:color="000000" w:sz="4"/>
+              <w:right w:val="single" w:color="000000" w:sz="4"/>
+            </w:tcBorders>
+            <w:tcMar>
+              <w:top w:type="dxa" w:w="60"/>
+              <w:left w:type="dxa" w:w="100"/>
+              <w:bottom w:type="dxa" w:w="60"/>
+              <w:right w:type="dxa" w:w="100"/>
+            </w:tcMar>
+          </w:tcPr>
+          <w:p>
+            <w:pPr>
+              <w:spacing w:after="40"/>
+            </w:pPr>
+            <w:r>
+              <w:rPr>
+                <w:rFonts w:ascii="Arial" w:cs="Arial" w:eastAsia="Arial" w:hAnsi="Arial"/>
+                <w:b w:val="false"/>
+                <w:bCs w:val="false"/>
+                <w:sz w:val="20"/>
+                <w:szCs w:val="20"/>
+              </w:rPr>
+              <w:t xml:space="preserve">Itens e preços do cardápio</w:t>
+            </w:r>
+          </w:p>
+        </w:tc>
+        <w:tc>
+          <w:tcPr>
+            <w:tcW w:type="dxa" w:w="3848"/>
+            <w:tcBorders>
+              <w:top w:val="single" w:color="000000" w:sz="4"/>
+              <w:left w:val="single" w:color="000000" w:sz="4"/>
+              <w:bottom w:val="single" w:color="000000" w:sz="4"/>
+              <w:right w:val="single" w:color="000000" w:sz="4"/>
+            </w:tcBorders>
+            <w:tcMar>
+              <w:top w:type="dxa" w:w="60"/>
+              <w:left w:type="dxa" w:w="100"/>
+              <w:bottom w:type="dxa" w:w="60"/>
+              <w:right w:type="dxa" w:w="100"/>
+            </w:tcMar>
+          </w:tcPr>
+          <w:p>
+            <w:pPr>
+              <w:spacing w:after="40"/>
+            </w:pPr>
+            <w:r>
+              <w:rPr>
+                <w:rFonts w:ascii="Arial" w:cs="Arial" w:eastAsia="Arial" w:hAnsi="Arial"/>
+                <w:b w:val="false"/>
+                <w:bCs w:val="false"/>
+                <w:sz w:val="20"/>
+                <w:szCs w:val="20"/>
+              </w:rPr>
+              <w:t xml:space="preserve">Definir o preço e estimar o ticket médio</w:t>
+            </w:r>
+          </w:p>
+        </w:tc>
+        <w:tc>
+          <w:tcPr>
+            <w:tcW w:type="dxa" w:w="3573"/>
+            <w:tcBorders>
+              <w:top w:val="single" w:color="000000" w:sz="4"/>
+              <w:left w:val="single" w:color="000000" w:sz="4"/>
+              <w:bottom w:val="single" w:color="000000" w:sz="4"/>
+              <w:right w:val="single" w:color="000000" w:sz="4"/>
+            </w:tcBorders>
+            <w:tcMar>
+              <w:top w:type="dxa" w:w="60"/>
+              <w:left w:type="dxa" w:w="100"/>
+              <w:bottom w:type="dxa" w:w="60"/>
+              <w:right w:type="dxa" w:w="100"/>
+            </w:tcMar>
+          </w:tcPr>
+          <w:p>
+            <w:pPr>
+              <w:spacing w:after="40"/>
+            </w:pPr>
+            <w:r>
+              <w:rPr>
+                <w:rFonts w:ascii="Arial" w:cs="Arial" w:eastAsia="Arial" w:hAnsi="Arial"/>
+                <w:b w:val="false"/>
+                <w:bCs w:val="false"/>
+                <w:sz w:val="20"/>
+                <w:szCs w:val="20"/>
+              </w:rPr>
+              <w:t xml:space="preserve">Cardápio digital de cada estabelecimento</w:t>
+            </w:r>
+          </w:p>
+        </w:tc>
+        <w:tc>
+          <w:tcPr>
+            <w:tcW w:type="dxa" w:w="3576"/>
+            <w:tcBorders>
+              <w:top w:val="single" w:color="000000" w:sz="4"/>
+              <w:left w:val="single" w:color="000000" w:sz="4"/>
+              <w:bottom w:val="single" w:color="000000" w:sz="4"/>
+              <w:right w:val="single" w:color="000000" w:sz="4"/>
+            </w:tcBorders>
+            <w:tcMar>
+              <w:top w:type="dxa" w:w="60"/>
+              <w:left w:type="dxa" w:w="100"/>
+              <w:bottom w:type="dxa" w:w="60"/>
+              <w:right w:type="dxa" w:w="100"/>
+            </w:tcMar>
+          </w:tcPr>
+          <w:p>
+            <w:pPr>
+              <w:spacing w:after="40"/>
+            </w:pPr>
+            <w:r>
+              <w:rPr>
+                <w:rFonts w:ascii="Arial" w:cs="Arial" w:eastAsia="Arial" w:hAnsi="Arial"/>
+                <w:b w:val="false"/>
+                <w:bCs w:val="false"/>
+                <w:sz w:val="20"/>
+                <w:szCs w:val="20"/>
+              </w:rPr>
+              <w:t xml:space="preserve">Registro manual em planilha</w:t>
+            </w:r>
+          </w:p>
+        </w:tc>
+      </w:tr>
+      <w:tr>
+        <w:trPr>
+          <w:cantSplit/>
+          <w:tblHeader w:val="false"/>
+        </w:trPr>
+        <w:tc>
+          <w:tcPr>
+            <w:tcW w:type="dxa" w:w="3573"/>
+            <w:tcBorders>
+              <w:top w:val="single" w:color="000000" w:sz="4"/>
+              <w:left w:val="single" w:color="000000" w:sz="4"/>
+              <w:bottom w:val="single" w:color="000000" w:sz="4"/>
+              <w:right w:val="single" w:color="000000" w:sz="4"/>
+            </w:tcBorders>
+            <w:tcMar>
+              <w:top w:type="dxa" w:w="60"/>
+              <w:left w:type="dxa" w:w="100"/>
+              <w:bottom w:type="dxa" w:w="60"/>
+              <w:right w:type="dxa" w:w="100"/>
+            </w:tcMar>
+          </w:tcPr>
+          <w:p>
+            <w:pPr>
+              <w:spacing w:after="40"/>
+            </w:pPr>
+            <w:r>
+              <w:rPr>
+                <w:rFonts w:ascii="Arial" w:cs="Arial" w:eastAsia="Arial" w:hAnsi="Arial"/>
+                <w:b w:val="false"/>
+                <w:bCs w:val="false"/>
+                <w:sz w:val="20"/>
+                <w:szCs w:val="20"/>
+              </w:rPr>
+              <w:t xml:space="preserve">Nota e texto de cada avaliação</w:t>
+            </w:r>
+          </w:p>
+        </w:tc>
+        <w:tc>
+          <w:tcPr>
+            <w:tcW w:type="dxa" w:w="3848"/>
+            <w:tcBorders>
+              <w:top w:val="single" w:color="000000" w:sz="4"/>
+              <w:left w:val="single" w:color="000000" w:sz="4"/>
+              <w:bottom w:val="single" w:color="000000" w:sz="4"/>
+              <w:right w:val="single" w:color="000000" w:sz="4"/>
+            </w:tcBorders>
+            <w:tcMar>
+              <w:top w:type="dxa" w:w="60"/>
+              <w:left w:type="dxa" w:w="100"/>
+              <w:bottom w:type="dxa" w:w="60"/>
+              <w:right w:type="dxa" w:w="100"/>
+            </w:tcMar>
+          </w:tcPr>
+          <w:p>
+            <w:pPr>
+              <w:spacing w:after="40"/>
+            </w:pPr>
+            <w:r>
+              <w:rPr>
+                <w:rFonts w:ascii="Arial" w:cs="Arial" w:eastAsia="Arial" w:hAnsi="Arial"/>
+                <w:b w:val="false"/>
+                <w:bCs w:val="false"/>
+                <w:sz w:val="20"/>
+                <w:szCs w:val="20"/>
+              </w:rPr>
+              <w:t xml:space="preserve">Identificar o que pesa na satisfação e as principais reclamações</w:t>
+            </w:r>
+          </w:p>
+        </w:tc>
+        <w:tc>
+          <w:tcPr>
+            <w:tcW w:type="dxa" w:w="3573"/>
+            <w:tcBorders>
+              <w:top w:val="single" w:color="000000" w:sz="4"/>
+              <w:left w:val="single" w:color="000000" w:sz="4"/>
+              <w:bottom w:val="single" w:color="000000" w:sz="4"/>
+              <w:right w:val="single" w:color="000000" w:sz="4"/>
+            </w:tcBorders>
+            <w:tcMar>
+              <w:top w:type="dxa" w:w="60"/>
+              <w:left w:type="dxa" w:w="100"/>
+              <w:bottom w:type="dxa" w:w="60"/>
+              <w:right w:type="dxa" w:w="100"/>
+            </w:tcMar>
+          </w:tcPr>
+          <w:p>
+            <w:pPr>
+              <w:spacing w:after="40"/>
+            </w:pPr>
+            <w:r>
+              <w:rPr>
+                <w:rFonts w:ascii="Arial" w:cs="Arial" w:eastAsia="Arial" w:hAnsi="Arial"/>
+                <w:b w:val="false"/>
+                <w:bCs w:val="false"/>
+                <w:sz w:val="20"/>
+                <w:szCs w:val="20"/>
+              </w:rPr>
+              <w:t xml:space="preserve">Google Maps (30 a 50 avaliações mais recentes com texto por estabelecimento)</w:t>
+            </w:r>
+          </w:p>
+        </w:tc>
+        <w:tc>
+          <w:tcPr>
+            <w:tcW w:type="dxa" w:w="3576"/>
+            <w:tcBorders>
+              <w:top w:val="single" w:color="000000" w:sz="4"/>
+              <w:left w:val="single" w:color="000000" w:sz="4"/>
+              <w:bottom w:val="single" w:color="000000" w:sz="4"/>
+              <w:right w:val="single" w:color="000000" w:sz="4"/>
+            </w:tcBorders>
+            <w:tcMar>
+              <w:top w:type="dxa" w:w="60"/>
+              <w:left w:type="dxa" w:w="100"/>
+              <w:bottom w:type="dxa" w:w="60"/>
+              <w:right w:type="dxa" w:w="100"/>
+            </w:tcMar>
+          </w:tcPr>
+          <w:p>
+            <w:pPr>
+              <w:spacing w:after="40"/>
+            </w:pPr>
+            <w:r>
+              <w:rPr>
+                <w:rFonts w:ascii="Arial" w:cs="Arial" w:eastAsia="Arial" w:hAnsi="Arial"/>
+                <w:b w:val="false"/>
+                <w:bCs w:val="false"/>
+                <w:sz w:val="20"/>
+                <w:szCs w:val="20"/>
+              </w:rPr>
+              <w:t xml:space="preserve">Cópia das avaliações e codificação por dicionário de termos validado</w:t>
+            </w:r>
+          </w:p>
+        </w:tc>
+      </w:tr>
+      <w:tr>
+        <w:trPr>
+          <w:cantSplit/>
+          <w:tblHeader w:val="false"/>
+        </w:trPr>
+        <w:tc>
+          <w:tcPr>
+            <w:tcW w:type="dxa" w:w="3573"/>
+            <w:tcBorders>
+              <w:top w:val="single" w:color="000000" w:sz="4"/>
+              <w:left w:val="single" w:color="000000" w:sz="4"/>
+              <w:bottom w:val="single" w:color="000000" w:sz="4"/>
+              <w:right w:val="single" w:color="000000" w:sz="4"/>
+            </w:tcBorders>
+            <w:tcMar>
+              <w:top w:type="dxa" w:w="60"/>
+              <w:left w:type="dxa" w:w="100"/>
+              <w:bottom w:type="dxa" w:w="60"/>
+              <w:right w:type="dxa" w:w="100"/>
+            </w:tcMar>
+          </w:tcPr>
+          <w:p>
+            <w:pPr>
+              <w:spacing w:after="40"/>
+            </w:pPr>
+            <w:r>
+              <w:rPr>
+                <w:rFonts w:ascii="Arial" w:cs="Arial" w:eastAsia="Arial" w:hAnsi="Arial"/>
+                <w:b w:val="false"/>
+                <w:bCs w:val="false"/>
+                <w:sz w:val="20"/>
+                <w:szCs w:val="20"/>
+              </w:rPr>
+              <w:t xml:space="preserve">Tamanho do grupo e valores em R$ citados nas avaliações</w:t>
+            </w:r>
+          </w:p>
+        </w:tc>
+        <w:tc>
+          <w:tcPr>
+            <w:tcW w:type="dxa" w:w="3848"/>
+            <w:tcBorders>
+              <w:top w:val="single" w:color="000000" w:sz="4"/>
+              <w:left w:val="single" w:color="000000" w:sz="4"/>
+              <w:bottom w:val="single" w:color="000000" w:sz="4"/>
+              <w:right w:val="single" w:color="000000" w:sz="4"/>
+            </w:tcBorders>
+            <w:tcMar>
+              <w:top w:type="dxa" w:w="60"/>
+              <w:left w:type="dxa" w:w="100"/>
+              <w:bottom w:type="dxa" w:w="60"/>
+              <w:right w:type="dxa" w:w="100"/>
+            </w:tcMar>
+          </w:tcPr>
+          <w:p>
+            <w:pPr>
+              <w:spacing w:after="40"/>
+            </w:pPr>
+            <w:r>
+              <w:rPr>
+                <w:rFonts w:ascii="Arial" w:cs="Arial" w:eastAsia="Arial" w:hAnsi="Arial"/>
+                <w:b w:val="false"/>
+                <w:bCs w:val="false"/>
+                <w:sz w:val="20"/>
+                <w:szCs w:val="20"/>
+              </w:rPr>
+              <w:t xml:space="preserve">Estimar pessoas por mesa e gasto por pessoa</w:t>
+            </w:r>
+          </w:p>
+        </w:tc>
+        <w:tc>
+          <w:tcPr>
+            <w:tcW w:type="dxa" w:w="3573"/>
+            <w:tcBorders>
+              <w:top w:val="single" w:color="000000" w:sz="4"/>
+              <w:left w:val="single" w:color="000000" w:sz="4"/>
+              <w:bottom w:val="single" w:color="000000" w:sz="4"/>
+              <w:right w:val="single" w:color="000000" w:sz="4"/>
+            </w:tcBorders>
+            <w:tcMar>
+              <w:top w:type="dxa" w:w="60"/>
+              <w:left w:type="dxa" w:w="100"/>
+              <w:bottom w:type="dxa" w:w="60"/>
+              <w:right w:type="dxa" w:w="100"/>
+            </w:tcMar>
+          </w:tcPr>
+          <w:p>
+            <w:pPr>
+              <w:spacing w:after="40"/>
+            </w:pPr>
+            <w:r>
+              <w:rPr>
+                <w:rFonts w:ascii="Arial" w:cs="Arial" w:eastAsia="Arial" w:hAnsi="Arial"/>
+                <w:b w:val="false"/>
+                <w:bCs w:val="false"/>
+                <w:sz w:val="20"/>
+                <w:szCs w:val="20"/>
+              </w:rPr>
+              <w:t xml:space="preserve">Texto das avaliações</w:t>
+            </w:r>
+          </w:p>
+        </w:tc>
+        <w:tc>
+          <w:tcPr>
+            <w:tcW w:type="dxa" w:w="3576"/>
+            <w:tcBorders>
+              <w:top w:val="single" w:color="000000" w:sz="4"/>
+              <w:left w:val="single" w:color="000000" w:sz="4"/>
+              <w:bottom w:val="single" w:color="000000" w:sz="4"/>
+              <w:right w:val="single" w:color="000000" w:sz="4"/>
+            </w:tcBorders>
+            <w:tcMar>
+              <w:top w:type="dxa" w:w="60"/>
+              <w:left w:type="dxa" w:w="100"/>
+              <w:bottom w:type="dxa" w:w="60"/>
+              <w:right w:type="dxa" w:w="100"/>
+            </w:tcMar>
+          </w:tcPr>
+          <w:p>
+            <w:pPr>
+              <w:spacing w:after="40"/>
+            </w:pPr>
+            <w:r>
+              <w:rPr>
+                <w:rFonts w:ascii="Arial" w:cs="Arial" w:eastAsia="Arial" w:hAnsi="Arial"/>
+                <w:b w:val="false"/>
+                <w:bCs w:val="false"/>
+                <w:sz w:val="20"/>
+                <w:szCs w:val="20"/>
+              </w:rPr>
+              <w:t xml:space="preserve">Codificação por dicionário de termos</w:t>
+            </w:r>
+          </w:p>
+        </w:tc>
+      </w:tr>
+      <w:tr>
+        <w:trPr>
+          <w:cantSplit/>
+          <w:tblHeader w:val="false"/>
+        </w:trPr>
+        <w:tc>
+          <w:tcPr>
+            <w:tcW w:type="dxa" w:w="3573"/>
+            <w:tcBorders>
+              <w:top w:val="single" w:color="000000" w:sz="4"/>
+              <w:left w:val="single" w:color="000000" w:sz="4"/>
+              <w:bottom w:val="single" w:color="000000" w:sz="4"/>
+              <w:right w:val="single" w:color="000000" w:sz="4"/>
+            </w:tcBorders>
+            <w:tcMar>
+              <w:top w:type="dxa" w:w="60"/>
+              <w:left w:type="dxa" w:w="100"/>
+              <w:bottom w:type="dxa" w:w="60"/>
+              <w:right w:type="dxa" w:w="100"/>
+            </w:tcMar>
+          </w:tcPr>
+          <w:p>
+            <w:pPr>
+              <w:spacing w:after="40"/>
+            </w:pPr>
+            <w:r>
+              <w:rPr>
+                <w:rFonts w:ascii="Arial" w:cs="Arial" w:eastAsia="Arial" w:hAnsi="Arial"/>
+                <w:b w:val="false"/>
+                <w:bCs w:val="false"/>
+                <w:sz w:val="20"/>
+                <w:szCs w:val="20"/>
+              </w:rPr>
+              <w:t xml:space="preserve">Data das avaliações</w:t>
+            </w:r>
+          </w:p>
+        </w:tc>
+        <w:tc>
+          <w:tcPr>
+            <w:tcW w:type="dxa" w:w="3848"/>
+            <w:tcBorders>
+              <w:top w:val="single" w:color="000000" w:sz="4"/>
+              <w:left w:val="single" w:color="000000" w:sz="4"/>
+              <w:bottom w:val="single" w:color="000000" w:sz="4"/>
+              <w:right w:val="single" w:color="000000" w:sz="4"/>
+            </w:tcBorders>
+            <w:tcMar>
+              <w:top w:type="dxa" w:w="60"/>
+              <w:left w:type="dxa" w:w="100"/>
+              <w:bottom w:type="dxa" w:w="60"/>
+              <w:right w:type="dxa" w:w="100"/>
+            </w:tcMar>
+          </w:tcPr>
+          <w:p>
+            <w:pPr>
+              <w:spacing w:after="40"/>
+            </w:pPr>
+            <w:r>
+              <w:rPr>
+                <w:rFonts w:ascii="Arial" w:cs="Arial" w:eastAsia="Arial" w:hAnsi="Arial"/>
+                <w:b w:val="false"/>
+                <w:bCs w:val="false"/>
+                <w:sz w:val="20"/>
+                <w:szCs w:val="20"/>
+              </w:rPr>
+              <w:t xml:space="preserve">Estimar o ritmo de novos clientes de cada concorrente</w:t>
+            </w:r>
+          </w:p>
+        </w:tc>
+        <w:tc>
+          <w:tcPr>
+            <w:tcW w:type="dxa" w:w="3573"/>
+            <w:tcBorders>
+              <w:top w:val="single" w:color="000000" w:sz="4"/>
+              <w:left w:val="single" w:color="000000" w:sz="4"/>
+              <w:bottom w:val="single" w:color="000000" w:sz="4"/>
+              <w:right w:val="single" w:color="000000" w:sz="4"/>
+            </w:tcBorders>
+            <w:tcMar>
+              <w:top w:type="dxa" w:w="60"/>
+              <w:left w:type="dxa" w:w="100"/>
+              <w:bottom w:type="dxa" w:w="60"/>
+              <w:right w:type="dxa" w:w="100"/>
+            </w:tcMar>
+          </w:tcPr>
+          <w:p>
+            <w:pPr>
+              <w:spacing w:after="40"/>
+            </w:pPr>
+            <w:r>
+              <w:rPr>
+                <w:rFonts w:ascii="Arial" w:cs="Arial" w:eastAsia="Arial" w:hAnsi="Arial"/>
+                <w:b w:val="false"/>
+                <w:bCs w:val="false"/>
+                <w:sz w:val="20"/>
+                <w:szCs w:val="20"/>
+              </w:rPr>
+              <w:t xml:space="preserve">Google Maps</w:t>
+            </w:r>
+          </w:p>
+        </w:tc>
+        <w:tc>
+          <w:tcPr>
+            <w:tcW w:type="dxa" w:w="3576"/>
+            <w:tcBorders>
+              <w:top w:val="single" w:color="000000" w:sz="4"/>
+              <w:left w:val="single" w:color="000000" w:sz="4"/>
+              <w:bottom w:val="single" w:color="000000" w:sz="4"/>
+              <w:right w:val="single" w:color="000000" w:sz="4"/>
+            </w:tcBorders>
+            <w:tcMar>
+              <w:top w:type="dxa" w:w="60"/>
+              <w:left w:type="dxa" w:w="100"/>
+              <w:bottom w:type="dxa" w:w="60"/>
+              <w:right w:type="dxa" w:w="100"/>
+            </w:tcMar>
+          </w:tcPr>
+          <w:p>
+            <w:pPr>
+              <w:spacing w:after="40"/>
+            </w:pPr>
+            <w:r>
+              <w:rPr>
+                <w:rFonts w:ascii="Arial" w:cs="Arial" w:eastAsia="Arial" w:hAnsi="Arial"/>
+                <w:b w:val="false"/>
+                <w:bCs w:val="false"/>
+                <w:sz w:val="20"/>
+                <w:szCs w:val="20"/>
+              </w:rPr>
+              <w:t xml:space="preserve">Cópia das avaliações</w:t>
+            </w:r>
+          </w:p>
+        </w:tc>
+      </w:tr>
+      <w:tr>
+        <w:trPr>
+          <w:cantSplit/>
+          <w:tblHeader w:val="false"/>
+        </w:trPr>
+        <w:tc>
+          <w:tcPr>
+            <w:tcW w:type="dxa" w:w="3573"/>
+            <w:tcBorders>
+              <w:top w:val="single" w:color="000000" w:sz="4"/>
+              <w:left w:val="single" w:color="000000" w:sz="4"/>
+              <w:bottom w:val="single" w:color="000000" w:sz="4"/>
+              <w:right w:val="single" w:color="000000" w:sz="4"/>
+            </w:tcBorders>
+            <w:tcMar>
+              <w:top w:type="dxa" w:w="60"/>
+              <w:left w:type="dxa" w:w="100"/>
+              <w:bottom w:type="dxa" w:w="60"/>
+              <w:right w:type="dxa" w:w="100"/>
+            </w:tcMar>
+          </w:tcPr>
+          <w:p>
+            <w:pPr>
+              <w:spacing w:after="40"/>
+            </w:pPr>
+            <w:r>
+              <w:rPr>
+                <w:rFonts w:ascii="Arial" w:cs="Arial" w:eastAsia="Arial" w:hAnsi="Arial"/>
+                <w:b w:val="false"/>
+                <w:bCs w:val="false"/>
+                <w:sz w:val="20"/>
+                <w:szCs w:val="20"/>
+              </w:rPr>
+              <w:t xml:space="preserve">Histórico de avaliações de cada avaliador</w:t>
+            </w:r>
+          </w:p>
+        </w:tc>
+        <w:tc>
+          <w:tcPr>
+            <w:tcW w:type="dxa" w:w="3848"/>
+            <w:tcBorders>
+              <w:top w:val="single" w:color="000000" w:sz="4"/>
+              <w:left w:val="single" w:color="000000" w:sz="4"/>
+              <w:bottom w:val="single" w:color="000000" w:sz="4"/>
+              <w:right w:val="single" w:color="000000" w:sz="4"/>
+            </w:tcBorders>
+            <w:tcMar>
+              <w:top w:type="dxa" w:w="60"/>
+              <w:left w:type="dxa" w:w="100"/>
+              <w:bottom w:type="dxa" w:w="60"/>
+              <w:right w:type="dxa" w:w="100"/>
+            </w:tcMar>
+          </w:tcPr>
+          <w:p>
+            <w:pPr>
+              <w:spacing w:after="40"/>
+            </w:pPr>
+            <w:r>
+              <w:rPr>
+                <w:rFonts w:ascii="Arial" w:cs="Arial" w:eastAsia="Arial" w:hAnsi="Arial"/>
+                <w:b w:val="false"/>
+                <w:bCs w:val="false"/>
+                <w:sz w:val="20"/>
+                <w:szCs w:val="20"/>
+              </w:rPr>
+              <w:t xml:space="preserve">Calcular a nota centrada e o perfil de consumo do público</w:t>
+            </w:r>
+          </w:p>
+        </w:tc>
+        <w:tc>
+          <w:tcPr>
+            <w:tcW w:type="dxa" w:w="3573"/>
+            <w:tcBorders>
+              <w:top w:val="single" w:color="000000" w:sz="4"/>
+              <w:left w:val="single" w:color="000000" w:sz="4"/>
+              <w:bottom w:val="single" w:color="000000" w:sz="4"/>
+              <w:right w:val="single" w:color="000000" w:sz="4"/>
+            </w:tcBorders>
+            <w:tcMar>
+              <w:top w:type="dxa" w:w="60"/>
+              <w:left w:type="dxa" w:w="100"/>
+              <w:bottom w:type="dxa" w:w="60"/>
+              <w:right w:type="dxa" w:w="100"/>
+            </w:tcMar>
+          </w:tcPr>
+          <w:p>
+            <w:pPr>
+              <w:spacing w:after="40"/>
+            </w:pPr>
+            <w:r>
+              <w:rPr>
+                <w:rFonts w:ascii="Arial" w:cs="Arial" w:eastAsia="Arial" w:hAnsi="Arial"/>
+                <w:b w:val="false"/>
+                <w:bCs w:val="false"/>
+                <w:sz w:val="20"/>
+                <w:szCs w:val="20"/>
+              </w:rPr>
+              <w:t xml:space="preserve">Perfil público do avaliador no Google Maps, com o nome trocado por código</w:t>
+            </w:r>
+          </w:p>
+        </w:tc>
+        <w:tc>
+          <w:tcPr>
+            <w:tcW w:type="dxa" w:w="3576"/>
+            <w:tcBorders>
+              <w:top w:val="single" w:color="000000" w:sz="4"/>
+              <w:left w:val="single" w:color="000000" w:sz="4"/>
+              <w:bottom w:val="single" w:color="000000" w:sz="4"/>
+              <w:right w:val="single" w:color="000000" w:sz="4"/>
+            </w:tcBorders>
+            <w:tcMar>
+              <w:top w:type="dxa" w:w="60"/>
+              <w:left w:type="dxa" w:w="100"/>
+              <w:bottom w:type="dxa" w:w="60"/>
+              <w:right w:type="dxa" w:w="100"/>
+            </w:tcMar>
+          </w:tcPr>
+          <w:p>
+            <w:pPr>
+              <w:spacing w:after="40"/>
+            </w:pPr>
+            <w:r>
+              <w:rPr>
+                <w:rFonts w:ascii="Arial" w:cs="Arial" w:eastAsia="Arial" w:hAnsi="Arial"/>
+                <w:b w:val="false"/>
+                <w:bCs w:val="false"/>
+                <w:sz w:val="20"/>
+                <w:szCs w:val="20"/>
+              </w:rPr>
+              <w:t xml:space="preserve">Cópia do histórico</w:t>
+            </w:r>
+          </w:p>
+        </w:tc>
+      </w:tr>
+      <w:tr>
+        <w:trPr>
+          <w:cantSplit/>
+          <w:tblHeader w:val="false"/>
+        </w:trPr>
+        <w:tc>
+          <w:tcPr>
+            <w:tcW w:type="dxa" w:w="3573"/>
+            <w:tcBorders>
+              <w:top w:val="single" w:color="000000" w:sz="4"/>
+              <w:left w:val="single" w:color="000000" w:sz="4"/>
+              <w:bottom w:val="single" w:color="000000" w:sz="4"/>
+              <w:right w:val="single" w:color="000000" w:sz="4"/>
+            </w:tcBorders>
+            <w:tcMar>
+              <w:top w:type="dxa" w:w="60"/>
+              <w:left w:type="dxa" w:w="100"/>
+              <w:bottom w:type="dxa" w:w="60"/>
+              <w:right w:type="dxa" w:w="100"/>
+            </w:tcMar>
+          </w:tcPr>
+          <w:p>
+            <w:pPr>
+              <w:spacing w:after="40"/>
+            </w:pPr>
+            <w:r>
+              <w:rPr>
+                <w:rFonts w:ascii="Arial" w:cs="Arial" w:eastAsia="Arial" w:hAnsi="Arial"/>
+                <w:b w:val="false"/>
+                <w:bCs w:val="false"/>
+                <w:sz w:val="20"/>
+                <w:szCs w:val="20"/>
+              </w:rPr>
+              <w:t xml:space="preserve">Mesas ocupadas, pessoas presentes e tamanho dos grupos</w:t>
+            </w:r>
+          </w:p>
+        </w:tc>
+        <w:tc>
+          <w:tcPr>
+            <w:tcW w:type="dxa" w:w="3848"/>
+            <w:tcBorders>
+              <w:top w:val="single" w:color="000000" w:sz="4"/>
+              <w:left w:val="single" w:color="000000" w:sz="4"/>
+              <w:bottom w:val="single" w:color="000000" w:sz="4"/>
+              <w:right w:val="single" w:color="000000" w:sz="4"/>
+            </w:tcBorders>
+            <w:tcMar>
+              <w:top w:type="dxa" w:w="60"/>
+              <w:left w:type="dxa" w:w="100"/>
+              <w:bottom w:type="dxa" w:w="60"/>
+              <w:right w:type="dxa" w:w="100"/>
+            </w:tcMar>
+          </w:tcPr>
+          <w:p>
+            <w:pPr>
+              <w:spacing w:after="40"/>
+            </w:pPr>
+            <w:r>
+              <w:rPr>
+                <w:rFonts w:ascii="Arial" w:cs="Arial" w:eastAsia="Arial" w:hAnsi="Arial"/>
+                <w:b w:val="false"/>
+                <w:bCs w:val="false"/>
+                <w:sz w:val="20"/>
+                <w:szCs w:val="20"/>
+              </w:rPr>
+              <w:t xml:space="preserve">Medir a taxa de ocupação e as pessoas por mesa</w:t>
+            </w:r>
+          </w:p>
+        </w:tc>
+        <w:tc>
+          <w:tcPr>
+            <w:tcW w:type="dxa" w:w="3573"/>
+            <w:tcBorders>
+              <w:top w:val="single" w:color="000000" w:sz="4"/>
+              <w:left w:val="single" w:color="000000" w:sz="4"/>
+              <w:bottom w:val="single" w:color="000000" w:sz="4"/>
+              <w:right w:val="single" w:color="000000" w:sz="4"/>
+            </w:tcBorders>
+            <w:tcMar>
+              <w:top w:type="dxa" w:w="60"/>
+              <w:left w:type="dxa" w:w="100"/>
+              <w:bottom w:type="dxa" w:w="60"/>
+              <w:right w:type="dxa" w:w="100"/>
+            </w:tcMar>
+          </w:tcPr>
+          <w:p>
+            <w:pPr>
+              <w:spacing w:after="40"/>
+            </w:pPr>
+            <w:r>
+              <w:rPr>
+                <w:rFonts w:ascii="Arial" w:cs="Arial" w:eastAsia="Arial" w:hAnsi="Arial"/>
+                <w:b w:val="false"/>
+                <w:bCs w:val="false"/>
+                <w:sz w:val="20"/>
+                <w:szCs w:val="20"/>
+              </w:rPr>
+              <w:t xml:space="preserve">São Jogue, as duas unidades em Salvador</w:t>
+            </w:r>
+          </w:p>
+        </w:tc>
+        <w:tc>
+          <w:tcPr>
+            <w:tcW w:type="dxa" w:w="3576"/>
+            <w:tcBorders>
+              <w:top w:val="single" w:color="000000" w:sz="4"/>
+              <w:left w:val="single" w:color="000000" w:sz="4"/>
+              <w:bottom w:val="single" w:color="000000" w:sz="4"/>
+              <w:right w:val="single" w:color="000000" w:sz="4"/>
+            </w:tcBorders>
+            <w:tcMar>
+              <w:top w:type="dxa" w:w="60"/>
+              <w:left w:type="dxa" w:w="100"/>
+              <w:bottom w:type="dxa" w:w="60"/>
+              <w:right w:type="dxa" w:w="100"/>
+            </w:tcMar>
+          </w:tcPr>
+          <w:p>
+            <w:pPr>
+              <w:spacing w:after="40"/>
+            </w:pPr>
+            <w:r>
+              <w:rPr>
+                <w:rFonts w:ascii="Arial" w:cs="Arial" w:eastAsia="Arial" w:hAnsi="Arial"/>
+                <w:b w:val="false"/>
+                <w:bCs w:val="false"/>
+                <w:sz w:val="20"/>
+                <w:szCs w:val="20"/>
+              </w:rPr>
+              <w:t xml:space="preserve">Formulário de observação, com contagem a cada 30 minutos em 4 visitas sorteadas</w:t>
+            </w:r>
+          </w:p>
+        </w:tc>
+      </w:tr>
+      <w:tr>
+        <w:trPr>
+          <w:cantSplit/>
+          <w:tblHeader w:val="false"/>
+        </w:trPr>
+        <w:tc>
+          <w:tcPr>
+            <w:tcW w:type="dxa" w:w="3573"/>
+            <w:tcBorders>
+              <w:top w:val="single" w:color="000000" w:sz="4"/>
+              <w:left w:val="single" w:color="000000" w:sz="4"/>
+              <w:bottom w:val="single" w:color="000000" w:sz="4"/>
+              <w:right w:val="single" w:color="000000" w:sz="4"/>
+            </w:tcBorders>
+            <w:tcMar>
+              <w:top w:type="dxa" w:w="60"/>
+              <w:left w:type="dxa" w:w="100"/>
+              <w:bottom w:type="dxa" w:w="60"/>
+              <w:right w:type="dxa" w:w="100"/>
+            </w:tcMar>
+          </w:tcPr>
+          <w:p>
+            <w:pPr>
+              <w:spacing w:after="40"/>
+            </w:pPr>
+            <w:r>
+              <w:rPr>
+                <w:rFonts w:ascii="Arial" w:cs="Arial" w:eastAsia="Arial" w:hAnsi="Arial"/>
+                <w:b w:val="false"/>
+                <w:bCs w:val="false"/>
+                <w:sz w:val="20"/>
+                <w:szCs w:val="20"/>
+              </w:rPr>
+              <w:t xml:space="preserve">Chegada e saída dos grupos</w:t>
+            </w:r>
+          </w:p>
+        </w:tc>
+        <w:tc>
+          <w:tcPr>
+            <w:tcW w:type="dxa" w:w="3848"/>
+            <w:tcBorders>
+              <w:top w:val="single" w:color="000000" w:sz="4"/>
+              <w:left w:val="single" w:color="000000" w:sz="4"/>
+              <w:bottom w:val="single" w:color="000000" w:sz="4"/>
+              <w:right w:val="single" w:color="000000" w:sz="4"/>
+            </w:tcBorders>
+            <w:tcMar>
+              <w:top w:type="dxa" w:w="60"/>
+              <w:left w:type="dxa" w:w="100"/>
+              <w:bottom w:type="dxa" w:w="60"/>
+              <w:right w:type="dxa" w:w="100"/>
+            </w:tcMar>
+          </w:tcPr>
+          <w:p>
+            <w:pPr>
+              <w:spacing w:after="40"/>
+            </w:pPr>
+            <w:r>
+              <w:rPr>
+                <w:rFonts w:ascii="Arial" w:cs="Arial" w:eastAsia="Arial" w:hAnsi="Arial"/>
+                <w:b w:val="false"/>
+                <w:bCs w:val="false"/>
+                <w:sz w:val="20"/>
+                <w:szCs w:val="20"/>
+              </w:rPr>
+              <w:t xml:space="preserve">Medir o tempo de permanência e o giro de mesas</w:t>
+            </w:r>
+          </w:p>
+        </w:tc>
+        <w:tc>
+          <w:tcPr>
+            <w:tcW w:type="dxa" w:w="3573"/>
+            <w:tcBorders>
+              <w:top w:val="single" w:color="000000" w:sz="4"/>
+              <w:left w:val="single" w:color="000000" w:sz="4"/>
+              <w:bottom w:val="single" w:color="000000" w:sz="4"/>
+              <w:right w:val="single" w:color="000000" w:sz="4"/>
+            </w:tcBorders>
+            <w:tcMar>
+              <w:top w:type="dxa" w:w="60"/>
+              <w:left w:type="dxa" w:w="100"/>
+              <w:bottom w:type="dxa" w:w="60"/>
+              <w:right w:type="dxa" w:w="100"/>
+            </w:tcMar>
+          </w:tcPr>
+          <w:p>
+            <w:pPr>
+              <w:spacing w:after="40"/>
+            </w:pPr>
+            <w:r>
+              <w:rPr>
+                <w:rFonts w:ascii="Arial" w:cs="Arial" w:eastAsia="Arial" w:hAnsi="Arial"/>
+                <w:b w:val="false"/>
+                <w:bCs w:val="false"/>
+                <w:sz w:val="20"/>
+                <w:szCs w:val="20"/>
+              </w:rPr>
+              <w:t xml:space="preserve">São Jogue</w:t>
+            </w:r>
+          </w:p>
+        </w:tc>
+        <w:tc>
+          <w:tcPr>
+            <w:tcW w:type="dxa" w:w="3576"/>
+            <w:tcBorders>
+              <w:top w:val="single" w:color="000000" w:sz="4"/>
+              <w:left w:val="single" w:color="000000" w:sz="4"/>
+              <w:bottom w:val="single" w:color="000000" w:sz="4"/>
+              <w:right w:val="single" w:color="000000" w:sz="4"/>
+            </w:tcBorders>
+            <w:tcMar>
+              <w:top w:type="dxa" w:w="60"/>
+              <w:left w:type="dxa" w:w="100"/>
+              <w:bottom w:type="dxa" w:w="60"/>
+              <w:right w:type="dxa" w:w="100"/>
+            </w:tcMar>
+          </w:tcPr>
+          <w:p>
+            <w:pPr>
+              <w:spacing w:after="40"/>
+            </w:pPr>
+            <w:r>
+              <w:rPr>
+                <w:rFonts w:ascii="Arial" w:cs="Arial" w:eastAsia="Arial" w:hAnsi="Arial"/>
+                <w:b w:val="false"/>
+                <w:bCs w:val="false"/>
+                <w:sz w:val="20"/>
+                <w:szCs w:val="20"/>
+              </w:rPr>
+              <w:t xml:space="preserve">Formulário de observação</w:t>
+            </w:r>
+          </w:p>
+        </w:tc>
+      </w:tr>
+      <w:tr>
+        <w:trPr>
+          <w:cantSplit/>
+          <w:tblHeader w:val="false"/>
+        </w:trPr>
+        <w:tc>
+          <w:tcPr>
+            <w:tcW w:type="dxa" w:w="3573"/>
+            <w:tcBorders>
+              <w:top w:val="single" w:color="000000" w:sz="4"/>
+              <w:left w:val="single" w:color="000000" w:sz="4"/>
+              <w:bottom w:val="single" w:color="000000" w:sz="4"/>
+              <w:right w:val="single" w:color="000000" w:sz="4"/>
+            </w:tcBorders>
+            <w:tcMar>
+              <w:top w:type="dxa" w:w="60"/>
+              <w:left w:type="dxa" w:w="100"/>
+              <w:bottom w:type="dxa" w:w="60"/>
+              <w:right w:type="dxa" w:w="100"/>
+            </w:tcMar>
+          </w:tcPr>
+          <w:p>
+            <w:pPr>
+              <w:spacing w:after="40"/>
+            </w:pPr>
+            <w:r>
+              <w:rPr>
+                <w:rFonts w:ascii="Arial" w:cs="Arial" w:eastAsia="Arial" w:hAnsi="Arial"/>
+                <w:b w:val="false"/>
+                <w:bCs w:val="false"/>
+                <w:sz w:val="20"/>
+                <w:szCs w:val="20"/>
+              </w:rPr>
+              <w:t xml:space="preserve">População e renda por capital e bairro</w:t>
+            </w:r>
+          </w:p>
+        </w:tc>
+        <w:tc>
+          <w:tcPr>
+            <w:tcW w:type="dxa" w:w="3848"/>
+            <w:tcBorders>
+              <w:top w:val="single" w:color="000000" w:sz="4"/>
+              <w:left w:val="single" w:color="000000" w:sz="4"/>
+              <w:bottom w:val="single" w:color="000000" w:sz="4"/>
+              <w:right w:val="single" w:color="000000" w:sz="4"/>
+            </w:tcBorders>
+            <w:tcMar>
+              <w:top w:type="dxa" w:w="60"/>
+              <w:left w:type="dxa" w:w="100"/>
+              <w:bottom w:type="dxa" w:w="60"/>
+              <w:right w:type="dxa" w:w="100"/>
+            </w:tcMar>
+          </w:tcPr>
+          <w:p>
+            <w:pPr>
+              <w:spacing w:after="40"/>
+            </w:pPr>
+            <w:r>
+              <w:rPr>
+                <w:rFonts w:ascii="Arial" w:cs="Arial" w:eastAsia="Arial" w:hAnsi="Arial"/>
+                <w:b w:val="false"/>
+                <w:bCs w:val="false"/>
+                <w:sz w:val="20"/>
+                <w:szCs w:val="20"/>
+              </w:rPr>
+              <w:t xml:space="preserve">Dimensionar o mercado e escolher a praça</w:t>
+            </w:r>
+          </w:p>
+        </w:tc>
+        <w:tc>
+          <w:tcPr>
+            <w:tcW w:type="dxa" w:w="3573"/>
+            <w:tcBorders>
+              <w:top w:val="single" w:color="000000" w:sz="4"/>
+              <w:left w:val="single" w:color="000000" w:sz="4"/>
+              <w:bottom w:val="single" w:color="000000" w:sz="4"/>
+              <w:right w:val="single" w:color="000000" w:sz="4"/>
+            </w:tcBorders>
+            <w:tcMar>
+              <w:top w:type="dxa" w:w="60"/>
+              <w:left w:type="dxa" w:w="100"/>
+              <w:bottom w:type="dxa" w:w="60"/>
+              <w:right w:type="dxa" w:w="100"/>
+            </w:tcMar>
+          </w:tcPr>
+          <w:p>
+            <w:pPr>
+              <w:spacing w:after="40"/>
+            </w:pPr>
+            <w:r>
+              <w:rPr>
+                <w:rFonts w:ascii="Arial" w:cs="Arial" w:eastAsia="Arial" w:hAnsi="Arial"/>
+                <w:b w:val="false"/>
+                <w:bCs w:val="false"/>
+                <w:sz w:val="20"/>
+                <w:szCs w:val="20"/>
+              </w:rPr>
+              <w:t xml:space="preserve">IBGE (Censo 2022 e estimativas populacionais)</w:t>
+            </w:r>
+          </w:p>
+        </w:tc>
+        <w:tc>
+          <w:tcPr>
+            <w:tcW w:type="dxa" w:w="3576"/>
+            <w:tcBorders>
+              <w:top w:val="single" w:color="000000" w:sz="4"/>
+              <w:left w:val="single" w:color="000000" w:sz="4"/>
+              <w:bottom w:val="single" w:color="000000" w:sz="4"/>
+              <w:right w:val="single" w:color="000000" w:sz="4"/>
+            </w:tcBorders>
+            <w:tcMar>
+              <w:top w:type="dxa" w:w="60"/>
+              <w:left w:type="dxa" w:w="100"/>
+              <w:bottom w:type="dxa" w:w="60"/>
+              <w:right w:type="dxa" w:w="100"/>
+            </w:tcMar>
+          </w:tcPr>
+          <w:p>
+            <w:pPr>
+              <w:spacing w:after="40"/>
+            </w:pPr>
+            <w:r>
+              <w:rPr>
+                <w:rFonts w:ascii="Arial" w:cs="Arial" w:eastAsia="Arial" w:hAnsi="Arial"/>
+                <w:b w:val="false"/>
+                <w:bCs w:val="false"/>
+                <w:sz w:val="20"/>
+                <w:szCs w:val="20"/>
+              </w:rPr>
+              <w:t xml:space="preserve">Download das bases públicas</w:t>
+            </w:r>
+          </w:p>
+        </w:tc>
+      </w:tr>
+      <w:tr>
+        <w:trPr>
+          <w:cantSplit/>
+          <w:tblHeader w:val="false"/>
+        </w:trPr>
+        <w:tc>
+          <w:tcPr>
+            <w:tcW w:type="dxa" w:w="3573"/>
+            <w:tcBorders>
+              <w:top w:val="single" w:color="000000" w:sz="4"/>
+              <w:left w:val="single" w:color="000000" w:sz="4"/>
+              <w:bottom w:val="single" w:color="000000" w:sz="4"/>
+              <w:right w:val="single" w:color="000000" w:sz="4"/>
+            </w:tcBorders>
+            <w:tcMar>
+              <w:top w:type="dxa" w:w="60"/>
+              <w:left w:type="dxa" w:w="100"/>
+              <w:bottom w:type="dxa" w:w="60"/>
+              <w:right w:type="dxa" w:w="100"/>
+            </w:tcMar>
+          </w:tcPr>
+          <w:p>
+            <w:pPr>
+              <w:spacing w:after="40"/>
+            </w:pPr>
+            <w:r>
+              <w:rPr>
+                <w:rFonts w:ascii="Arial" w:cs="Arial" w:eastAsia="Arial" w:hAnsi="Arial"/>
+                <w:b w:val="false"/>
+                <w:bCs w:val="false"/>
+                <w:sz w:val="20"/>
+                <w:szCs w:val="20"/>
+              </w:rPr>
+              <w:t xml:space="preserve">Gasto das famílias com alimentação fora de casa</w:t>
+            </w:r>
+          </w:p>
+        </w:tc>
+        <w:tc>
+          <w:tcPr>
+            <w:tcW w:type="dxa" w:w="3848"/>
+            <w:tcBorders>
+              <w:top w:val="single" w:color="000000" w:sz="4"/>
+              <w:left w:val="single" w:color="000000" w:sz="4"/>
+              <w:bottom w:val="single" w:color="000000" w:sz="4"/>
+              <w:right w:val="single" w:color="000000" w:sz="4"/>
+            </w:tcBorders>
+            <w:tcMar>
+              <w:top w:type="dxa" w:w="60"/>
+              <w:left w:type="dxa" w:w="100"/>
+              <w:bottom w:type="dxa" w:w="60"/>
+              <w:right w:type="dxa" w:w="100"/>
+            </w:tcMar>
+          </w:tcPr>
+          <w:p>
+            <w:pPr>
+              <w:spacing w:after="40"/>
+            </w:pPr>
+            <w:r>
+              <w:rPr>
+                <w:rFonts w:ascii="Arial" w:cs="Arial" w:eastAsia="Arial" w:hAnsi="Arial"/>
+                <w:b w:val="false"/>
+                <w:bCs w:val="false"/>
+                <w:sz w:val="20"/>
+                <w:szCs w:val="20"/>
+              </w:rPr>
+              <w:t xml:space="preserve">Conferir o ticket médio</w:t>
+            </w:r>
+          </w:p>
+        </w:tc>
+        <w:tc>
+          <w:tcPr>
+            <w:tcW w:type="dxa" w:w="3573"/>
+            <w:tcBorders>
+              <w:top w:val="single" w:color="000000" w:sz="4"/>
+              <w:left w:val="single" w:color="000000" w:sz="4"/>
+              <w:bottom w:val="single" w:color="000000" w:sz="4"/>
+              <w:right w:val="single" w:color="000000" w:sz="4"/>
+            </w:tcBorders>
+            <w:tcMar>
+              <w:top w:type="dxa" w:w="60"/>
+              <w:left w:type="dxa" w:w="100"/>
+              <w:bottom w:type="dxa" w:w="60"/>
+              <w:right w:type="dxa" w:w="100"/>
+            </w:tcMar>
+          </w:tcPr>
+          <w:p>
+            <w:pPr>
+              <w:spacing w:after="40"/>
+            </w:pPr>
+            <w:r>
+              <w:rPr>
+                <w:rFonts w:ascii="Arial" w:cs="Arial" w:eastAsia="Arial" w:hAnsi="Arial"/>
+                <w:b w:val="false"/>
+                <w:bCs w:val="false"/>
+                <w:sz w:val="20"/>
+                <w:szCs w:val="20"/>
+              </w:rPr>
+              <w:t xml:space="preserve">IBGE (Pesquisa de Orçamentos Familiares)</w:t>
+            </w:r>
+          </w:p>
+        </w:tc>
+        <w:tc>
+          <w:tcPr>
+            <w:tcW w:type="dxa" w:w="3576"/>
+            <w:tcBorders>
+              <w:top w:val="single" w:color="000000" w:sz="4"/>
+              <w:left w:val="single" w:color="000000" w:sz="4"/>
+              <w:bottom w:val="single" w:color="000000" w:sz="4"/>
+              <w:right w:val="single" w:color="000000" w:sz="4"/>
+            </w:tcBorders>
+            <w:tcMar>
+              <w:top w:type="dxa" w:w="60"/>
+              <w:left w:type="dxa" w:w="100"/>
+              <w:bottom w:type="dxa" w:w="60"/>
+              <w:right w:type="dxa" w:w="100"/>
+            </w:tcMar>
+          </w:tcPr>
+          <w:p>
+            <w:pPr>
+              <w:spacing w:after="40"/>
+            </w:pPr>
+            <w:r>
+              <w:rPr>
+                <w:rFonts w:ascii="Arial" w:cs="Arial" w:eastAsia="Arial" w:hAnsi="Arial"/>
+                <w:b w:val="false"/>
+                <w:bCs w:val="false"/>
+                <w:sz w:val="20"/>
+                <w:szCs w:val="20"/>
+              </w:rPr>
+              <w:t xml:space="preserve">Download das bases públicas</w:t>
+            </w:r>
+          </w:p>
+        </w:tc>
+      </w:tr>
+      <w:tr>
+        <w:trPr>
+          <w:cantSplit/>
+          <w:tblHeader w:val="false"/>
+        </w:trPr>
+        <w:tc>
+          <w:tcPr>
+            <w:tcW w:type="dxa" w:w="3573"/>
+            <w:tcBorders>
+              <w:top w:val="single" w:color="000000" w:sz="4"/>
+              <w:left w:val="single" w:color="000000" w:sz="4"/>
+              <w:bottom w:val="single" w:color="000000" w:sz="4"/>
+              <w:right w:val="single" w:color="000000" w:sz="4"/>
+            </w:tcBorders>
+            <w:tcMar>
+              <w:top w:type="dxa" w:w="60"/>
+              <w:left w:type="dxa" w:w="100"/>
+              <w:bottom w:type="dxa" w:w="60"/>
+              <w:right w:type="dxa" w:w="100"/>
+            </w:tcMar>
+          </w:tcPr>
+          <w:p>
+            <w:pPr>
+              <w:spacing w:after="40"/>
+            </w:pPr>
+            <w:r>
+              <w:rPr>
+                <w:rFonts w:ascii="Arial" w:cs="Arial" w:eastAsia="Arial" w:hAnsi="Arial"/>
+                <w:b w:val="false"/>
+                <w:bCs w:val="false"/>
+                <w:sz w:val="20"/>
+                <w:szCs w:val="20"/>
+              </w:rPr>
+              <w:t xml:space="preserve">Salário de admissão por ocupação</w:t>
+            </w:r>
+          </w:p>
+        </w:tc>
+        <w:tc>
+          <w:tcPr>
+            <w:tcW w:type="dxa" w:w="3848"/>
+            <w:tcBorders>
+              <w:top w:val="single" w:color="000000" w:sz="4"/>
+              <w:left w:val="single" w:color="000000" w:sz="4"/>
+              <w:bottom w:val="single" w:color="000000" w:sz="4"/>
+              <w:right w:val="single" w:color="000000" w:sz="4"/>
+            </w:tcBorders>
+            <w:tcMar>
+              <w:top w:type="dxa" w:w="60"/>
+              <w:left w:type="dxa" w:w="100"/>
+              <w:bottom w:type="dxa" w:w="60"/>
+              <w:right w:type="dxa" w:w="100"/>
+            </w:tcMar>
+          </w:tcPr>
+          <w:p>
+            <w:pPr>
+              <w:spacing w:after="40"/>
+            </w:pPr>
+            <w:r>
+              <w:rPr>
+                <w:rFonts w:ascii="Arial" w:cs="Arial" w:eastAsia="Arial" w:hAnsi="Arial"/>
+                <w:b w:val="false"/>
+                <w:bCs w:val="false"/>
+                <w:sz w:val="20"/>
+                <w:szCs w:val="20"/>
+              </w:rPr>
+              <w:t xml:space="preserve">Estimar o custo de pessoal</w:t>
+            </w:r>
+          </w:p>
+        </w:tc>
+        <w:tc>
+          <w:tcPr>
+            <w:tcW w:type="dxa" w:w="3573"/>
+            <w:tcBorders>
+              <w:top w:val="single" w:color="000000" w:sz="4"/>
+              <w:left w:val="single" w:color="000000" w:sz="4"/>
+              <w:bottom w:val="single" w:color="000000" w:sz="4"/>
+              <w:right w:val="single" w:color="000000" w:sz="4"/>
+            </w:tcBorders>
+            <w:tcMar>
+              <w:top w:type="dxa" w:w="60"/>
+              <w:left w:type="dxa" w:w="100"/>
+              <w:bottom w:type="dxa" w:w="60"/>
+              <w:right w:type="dxa" w:w="100"/>
+            </w:tcMar>
+          </w:tcPr>
+          <w:p>
+            <w:pPr>
+              <w:spacing w:after="40"/>
+            </w:pPr>
+            <w:r>
+              <w:rPr>
+                <w:rFonts w:ascii="Arial" w:cs="Arial" w:eastAsia="Arial" w:hAnsi="Arial"/>
+                <w:b w:val="false"/>
+                <w:bCs w:val="false"/>
+                <w:sz w:val="20"/>
+                <w:szCs w:val="20"/>
+              </w:rPr>
+              <w:t xml:space="preserve">Novo CAGED (Ministério do Trabalho)</w:t>
+            </w:r>
+          </w:p>
+        </w:tc>
+        <w:tc>
+          <w:tcPr>
+            <w:tcW w:type="dxa" w:w="3576"/>
+            <w:tcBorders>
+              <w:top w:val="single" w:color="000000" w:sz="4"/>
+              <w:left w:val="single" w:color="000000" w:sz="4"/>
+              <w:bottom w:val="single" w:color="000000" w:sz="4"/>
+              <w:right w:val="single" w:color="000000" w:sz="4"/>
+            </w:tcBorders>
+            <w:tcMar>
+              <w:top w:type="dxa" w:w="60"/>
+              <w:left w:type="dxa" w:w="100"/>
+              <w:bottom w:type="dxa" w:w="60"/>
+              <w:right w:type="dxa" w:w="100"/>
+            </w:tcMar>
+          </w:tcPr>
+          <w:p>
+            <w:pPr>
+              <w:spacing w:after="40"/>
+            </w:pPr>
+            <w:r>
+              <w:rPr>
+                <w:rFonts w:ascii="Arial" w:cs="Arial" w:eastAsia="Arial" w:hAnsi="Arial"/>
+                <w:b w:val="false"/>
+                <w:bCs w:val="false"/>
+                <w:sz w:val="20"/>
+                <w:szCs w:val="20"/>
+              </w:rPr>
+              <w:t xml:space="preserve">Download das bases públicas</w:t>
+            </w:r>
+          </w:p>
+        </w:tc>
+      </w:tr>
+      <w:tr>
+        <w:trPr>
+          <w:cantSplit/>
+          <w:tblHeader w:val="false"/>
+        </w:trPr>
+        <w:tc>
+          <w:tcPr>
+            <w:tcW w:type="dxa" w:w="3573"/>
+            <w:tcBorders>
+              <w:top w:val="single" w:color="000000" w:sz="4"/>
+              <w:left w:val="single" w:color="000000" w:sz="4"/>
+              <w:bottom w:val="single" w:color="000000" w:sz="4"/>
+              <w:right w:val="single" w:color="000000" w:sz="4"/>
+            </w:tcBorders>
+            <w:tcMar>
+              <w:top w:type="dxa" w:w="60"/>
+              <w:left w:type="dxa" w:w="100"/>
+              <w:bottom w:type="dxa" w:w="60"/>
+              <w:right w:type="dxa" w:w="100"/>
+            </w:tcMar>
+          </w:tcPr>
+          <w:p>
+            <w:pPr>
+              <w:spacing w:after="40"/>
+            </w:pPr>
+            <w:r>
+              <w:rPr>
+                <w:rFonts w:ascii="Arial" w:cs="Arial" w:eastAsia="Arial" w:hAnsi="Arial"/>
+                <w:b w:val="false"/>
+                <w:bCs w:val="false"/>
+                <w:sz w:val="20"/>
+                <w:szCs w:val="20"/>
+              </w:rPr>
+              <w:t xml:space="preserve">Aluguel comercial por m²</w:t>
+            </w:r>
+          </w:p>
+        </w:tc>
+        <w:tc>
+          <w:tcPr>
+            <w:tcW w:type="dxa" w:w="3848"/>
+            <w:tcBorders>
+              <w:top w:val="single" w:color="000000" w:sz="4"/>
+              <w:left w:val="single" w:color="000000" w:sz="4"/>
+              <w:bottom w:val="single" w:color="000000" w:sz="4"/>
+              <w:right w:val="single" w:color="000000" w:sz="4"/>
+            </w:tcBorders>
+            <w:tcMar>
+              <w:top w:type="dxa" w:w="60"/>
+              <w:left w:type="dxa" w:w="100"/>
+              <w:bottom w:type="dxa" w:w="60"/>
+              <w:right w:type="dxa" w:w="100"/>
+            </w:tcMar>
+          </w:tcPr>
+          <w:p>
+            <w:pPr>
+              <w:spacing w:after="40"/>
+            </w:pPr>
+            <w:r>
+              <w:rPr>
+                <w:rFonts w:ascii="Arial" w:cs="Arial" w:eastAsia="Arial" w:hAnsi="Arial"/>
+                <w:b w:val="false"/>
+                <w:bCs w:val="false"/>
+                <w:sz w:val="20"/>
+                <w:szCs w:val="20"/>
+              </w:rPr>
+              <w:t xml:space="preserve">Estimar o custo de ocupação do imóvel</w:t>
+            </w:r>
+          </w:p>
+        </w:tc>
+        <w:tc>
+          <w:tcPr>
+            <w:tcW w:type="dxa" w:w="3573"/>
+            <w:tcBorders>
+              <w:top w:val="single" w:color="000000" w:sz="4"/>
+              <w:left w:val="single" w:color="000000" w:sz="4"/>
+              <w:bottom w:val="single" w:color="000000" w:sz="4"/>
+              <w:right w:val="single" w:color="000000" w:sz="4"/>
+            </w:tcBorders>
+            <w:tcMar>
+              <w:top w:type="dxa" w:w="60"/>
+              <w:left w:type="dxa" w:w="100"/>
+              <w:bottom w:type="dxa" w:w="60"/>
+              <w:right w:type="dxa" w:w="100"/>
+            </w:tcMar>
+          </w:tcPr>
+          <w:p>
+            <w:pPr>
+              <w:spacing w:after="40"/>
+            </w:pPr>
+            <w:r>
+              <w:rPr>
+                <w:rFonts w:ascii="Arial" w:cs="Arial" w:eastAsia="Arial" w:hAnsi="Arial"/>
+                <w:b w:val="false"/>
+                <w:bCs w:val="false"/>
+                <w:sz w:val="20"/>
+                <w:szCs w:val="20"/>
+              </w:rPr>
+              <w:t xml:space="preserve">FipeZap</w:t>
+            </w:r>
+          </w:p>
+        </w:tc>
+        <w:tc>
+          <w:tcPr>
+            <w:tcW w:type="dxa" w:w="3576"/>
+            <w:tcBorders>
+              <w:top w:val="single" w:color="000000" w:sz="4"/>
+              <w:left w:val="single" w:color="000000" w:sz="4"/>
+              <w:bottom w:val="single" w:color="000000" w:sz="4"/>
+              <w:right w:val="single" w:color="000000" w:sz="4"/>
+            </w:tcBorders>
+            <w:tcMar>
+              <w:top w:type="dxa" w:w="60"/>
+              <w:left w:type="dxa" w:w="100"/>
+              <w:bottom w:type="dxa" w:w="60"/>
+              <w:right w:type="dxa" w:w="100"/>
+            </w:tcMar>
+          </w:tcPr>
+          <w:p>
+            <w:pPr>
+              <w:spacing w:after="40"/>
+            </w:pPr>
+            <w:r>
+              <w:rPr>
+                <w:rFonts w:ascii="Arial" w:cs="Arial" w:eastAsia="Arial" w:hAnsi="Arial"/>
+                <w:b w:val="false"/>
+                <w:bCs w:val="false"/>
+                <w:sz w:val="20"/>
+                <w:szCs w:val="20"/>
+              </w:rPr>
+              <w:t xml:space="preserve">Download das bases públicas</w:t>
+            </w:r>
+          </w:p>
+        </w:tc>
+      </w:tr>
+      <w:tr>
+        <w:trPr>
+          <w:cantSplit/>
+          <w:tblHeader w:val="false"/>
+        </w:trPr>
+        <w:tc>
+          <w:tcPr>
+            <w:tcW w:type="dxa" w:w="3573"/>
+            <w:tcBorders>
+              <w:top w:val="single" w:color="000000" w:sz="4"/>
+              <w:left w:val="single" w:color="000000" w:sz="4"/>
+              <w:bottom w:val="single" w:color="000000" w:sz="4"/>
+              <w:right w:val="single" w:color="000000" w:sz="4"/>
+            </w:tcBorders>
+            <w:tcMar>
+              <w:top w:type="dxa" w:w="60"/>
+              <w:left w:type="dxa" w:w="100"/>
+              <w:bottom w:type="dxa" w:w="60"/>
+              <w:right w:type="dxa" w:w="100"/>
+            </w:tcMar>
+          </w:tcPr>
+          <w:p>
+            <w:pPr>
+              <w:spacing w:after="40"/>
+            </w:pPr>
+            <w:r>
+              <w:rPr>
+                <w:rFonts w:ascii="Arial" w:cs="Arial" w:eastAsia="Arial" w:hAnsi="Arial"/>
+                <w:b w:val="false"/>
+                <w:bCs w:val="false"/>
+                <w:sz w:val="20"/>
+                <w:szCs w:val="20"/>
+              </w:rPr>
+              <w:t xml:space="preserve">Alíquotas do Simples Nacional</w:t>
+            </w:r>
+          </w:p>
+        </w:tc>
+        <w:tc>
+          <w:tcPr>
+            <w:tcW w:type="dxa" w:w="3848"/>
+            <w:tcBorders>
+              <w:top w:val="single" w:color="000000" w:sz="4"/>
+              <w:left w:val="single" w:color="000000" w:sz="4"/>
+              <w:bottom w:val="single" w:color="000000" w:sz="4"/>
+              <w:right w:val="single" w:color="000000" w:sz="4"/>
+            </w:tcBorders>
+            <w:tcMar>
+              <w:top w:type="dxa" w:w="60"/>
+              <w:left w:type="dxa" w:w="100"/>
+              <w:bottom w:type="dxa" w:w="60"/>
+              <w:right w:type="dxa" w:w="100"/>
+            </w:tcMar>
+          </w:tcPr>
+          <w:p>
+            <w:pPr>
+              <w:spacing w:after="40"/>
+            </w:pPr>
+            <w:r>
+              <w:rPr>
+                <w:rFonts w:ascii="Arial" w:cs="Arial" w:eastAsia="Arial" w:hAnsi="Arial"/>
+                <w:b w:val="false"/>
+                <w:bCs w:val="false"/>
+                <w:sz w:val="20"/>
+                <w:szCs w:val="20"/>
+              </w:rPr>
+              <w:t xml:space="preserve">Estimar os tributos</w:t>
+            </w:r>
+          </w:p>
+        </w:tc>
+        <w:tc>
+          <w:tcPr>
+            <w:tcW w:type="dxa" w:w="3573"/>
+            <w:tcBorders>
+              <w:top w:val="single" w:color="000000" w:sz="4"/>
+              <w:left w:val="single" w:color="000000" w:sz="4"/>
+              <w:bottom w:val="single" w:color="000000" w:sz="4"/>
+              <w:right w:val="single" w:color="000000" w:sz="4"/>
+            </w:tcBorders>
+            <w:tcMar>
+              <w:top w:type="dxa" w:w="60"/>
+              <w:left w:type="dxa" w:w="100"/>
+              <w:bottom w:type="dxa" w:w="60"/>
+              <w:right w:type="dxa" w:w="100"/>
+            </w:tcMar>
+          </w:tcPr>
+          <w:p>
+            <w:pPr>
+              <w:spacing w:after="40"/>
+            </w:pPr>
+            <w:r>
+              <w:rPr>
+                <w:rFonts w:ascii="Arial" w:cs="Arial" w:eastAsia="Arial" w:hAnsi="Arial"/>
+                <w:b w:val="false"/>
+                <w:bCs w:val="false"/>
+                <w:sz w:val="20"/>
+                <w:szCs w:val="20"/>
+              </w:rPr>
+              <w:t xml:space="preserve">Lei Complementar nº 123/2006</w:t>
+            </w:r>
+          </w:p>
+        </w:tc>
+        <w:tc>
+          <w:tcPr>
+            <w:tcW w:type="dxa" w:w="3576"/>
+            <w:tcBorders>
+              <w:top w:val="single" w:color="000000" w:sz="4"/>
+              <w:left w:val="single" w:color="000000" w:sz="4"/>
+              <w:bottom w:val="single" w:color="000000" w:sz="4"/>
+              <w:right w:val="single" w:color="000000" w:sz="4"/>
+            </w:tcBorders>
+            <w:tcMar>
+              <w:top w:type="dxa" w:w="60"/>
+              <w:left w:type="dxa" w:w="100"/>
+              <w:bottom w:type="dxa" w:w="60"/>
+              <w:right w:type="dxa" w:w="100"/>
+            </w:tcMar>
+          </w:tcPr>
+          <w:p>
+            <w:pPr>
+              <w:spacing w:after="40"/>
+            </w:pPr>
+            <w:r>
+              <w:rPr>
+                <w:rFonts w:ascii="Arial" w:cs="Arial" w:eastAsia="Arial" w:hAnsi="Arial"/>
+                <w:b w:val="false"/>
+                <w:bCs w:val="false"/>
+                <w:sz w:val="20"/>
+                <w:szCs w:val="20"/>
+              </w:rPr>
+              <w:t xml:space="preserve">Consulta à legislação</w:t>
+            </w:r>
+          </w:p>
+        </w:tc>
+      </w:tr>
+      <w:tr>
+        <w:trPr>
+          <w:cantSplit/>
+          <w:tblHeader w:val="false"/>
+        </w:trPr>
+        <w:tc>
+          <w:tcPr>
+            <w:tcW w:type="dxa" w:w="3573"/>
+            <w:tcBorders>
+              <w:top w:val="single" w:color="000000" w:sz="4"/>
+              <w:left w:val="single" w:color="000000" w:sz="4"/>
+              <w:bottom w:val="single" w:color="000000" w:sz="4"/>
+              <w:right w:val="single" w:color="000000" w:sz="4"/>
+            </w:tcBorders>
+            <w:tcMar>
+              <w:top w:type="dxa" w:w="60"/>
+              <w:left w:type="dxa" w:w="100"/>
+              <w:bottom w:type="dxa" w:w="60"/>
+              <w:right w:type="dxa" w:w="100"/>
+            </w:tcMar>
+          </w:tcPr>
+          <w:p>
+            <w:pPr>
+              <w:spacing w:after="40"/>
+            </w:pPr>
+            <w:r>
+              <w:rPr>
+                <w:rFonts w:ascii="Arial" w:cs="Arial" w:eastAsia="Arial" w:hAnsi="Arial"/>
+                <w:b w:val="false"/>
+                <w:bCs w:val="false"/>
+                <w:sz w:val="20"/>
+                <w:szCs w:val="20"/>
+              </w:rPr>
+              <w:t xml:space="preserve">Selic e IPCA projetados</w:t>
+            </w:r>
+          </w:p>
+        </w:tc>
+        <w:tc>
+          <w:tcPr>
+            <w:tcW w:type="dxa" w:w="3848"/>
+            <w:tcBorders>
+              <w:top w:val="single" w:color="000000" w:sz="4"/>
+              <w:left w:val="single" w:color="000000" w:sz="4"/>
+              <w:bottom w:val="single" w:color="000000" w:sz="4"/>
+              <w:right w:val="single" w:color="000000" w:sz="4"/>
+            </w:tcBorders>
+            <w:tcMar>
+              <w:top w:type="dxa" w:w="60"/>
+              <w:left w:type="dxa" w:w="100"/>
+              <w:bottom w:type="dxa" w:w="60"/>
+              <w:right w:type="dxa" w:w="100"/>
+            </w:tcMar>
+          </w:tcPr>
+          <w:p>
+            <w:pPr>
+              <w:spacing w:after="40"/>
+            </w:pPr>
+            <w:r>
+              <w:rPr>
+                <w:rFonts w:ascii="Arial" w:cs="Arial" w:eastAsia="Arial" w:hAnsi="Arial"/>
+                <w:b w:val="false"/>
+                <w:bCs w:val="false"/>
+                <w:sz w:val="20"/>
+                <w:szCs w:val="20"/>
+              </w:rPr>
+              <w:t xml:space="preserve">Definir a taxa de desconto e a inflação do modelo financeiro</w:t>
+            </w:r>
+          </w:p>
+        </w:tc>
+        <w:tc>
+          <w:tcPr>
+            <w:tcW w:type="dxa" w:w="3573"/>
+            <w:tcBorders>
+              <w:top w:val="single" w:color="000000" w:sz="4"/>
+              <w:left w:val="single" w:color="000000" w:sz="4"/>
+              <w:bottom w:val="single" w:color="000000" w:sz="4"/>
+              <w:right w:val="single" w:color="000000" w:sz="4"/>
+            </w:tcBorders>
+            <w:tcMar>
+              <w:top w:type="dxa" w:w="60"/>
+              <w:left w:type="dxa" w:w="100"/>
+              <w:bottom w:type="dxa" w:w="60"/>
+              <w:right w:type="dxa" w:w="100"/>
+            </w:tcMar>
+          </w:tcPr>
+          <w:p>
+            <w:pPr>
+              <w:spacing w:after="40"/>
+            </w:pPr>
+            <w:r>
+              <w:rPr>
+                <w:rFonts w:ascii="Arial" w:cs="Arial" w:eastAsia="Arial" w:hAnsi="Arial"/>
+                <w:b w:val="false"/>
+                <w:bCs w:val="false"/>
+                <w:sz w:val="20"/>
+                <w:szCs w:val="20"/>
+              </w:rPr>
+              <w:t xml:space="preserve">Banco Central (SGS e Boletim Focus)</w:t>
+            </w:r>
+          </w:p>
+        </w:tc>
+        <w:tc>
+          <w:tcPr>
+            <w:tcW w:type="dxa" w:w="3576"/>
+            <w:tcBorders>
+              <w:top w:val="single" w:color="000000" w:sz="4"/>
+              <w:left w:val="single" w:color="000000" w:sz="4"/>
+              <w:bottom w:val="single" w:color="000000" w:sz="4"/>
+              <w:right w:val="single" w:color="000000" w:sz="4"/>
+            </w:tcBorders>
+            <w:tcMar>
+              <w:top w:type="dxa" w:w="60"/>
+              <w:left w:type="dxa" w:w="100"/>
+              <w:bottom w:type="dxa" w:w="60"/>
+              <w:right w:type="dxa" w:w="100"/>
+            </w:tcMar>
+          </w:tcPr>
+          <w:p>
+            <w:pPr>
+              <w:spacing w:after="40"/>
+            </w:pPr>
+            <w:r>
+              <w:rPr>
+                <w:rFonts w:ascii="Arial" w:cs="Arial" w:eastAsia="Arial" w:hAnsi="Arial"/>
+                <w:b w:val="false"/>
+                <w:bCs w:val="false"/>
+                <w:sz w:val="20"/>
+                <w:szCs w:val="20"/>
+              </w:rPr>
+              <w:t xml:space="preserve">Download das bases públicas</w:t>
+            </w:r>
+          </w:p>
+        </w:tc>
+      </w:tr>
+    </w:tbl>
+    <w:p>
+      <w:pPr>
+        <w:spacing w:after="120"/>
+      </w:pPr>
     </w:p>
     <w:p>
       <w:pPr>
@@ -934,7 +2875,7 @@
     </w:p>
     <w:tbl>
       <w:tblPr>
-        <w:tblW w:type="dxa" w:w="13130"/>
+        <w:tblW w:type="dxa" w:w="14570"/>
         <w:tblBorders>
           <w:top w:val="single" w:color="auto" w:sz="4"/>
           <w:left w:val="single" w:color="auto" w:sz="4"/>
@@ -945,8 +2886,8 @@
         </w:tblBorders>
       </w:tblPr>
       <w:tblGrid>
-        <w:gridCol w:w="5908"/>
-        <w:gridCol w:w="7222"/>
+        <w:gridCol w:w="6556"/>
+        <w:gridCol w:w="8014"/>
       </w:tblGrid>
       <w:tr>
         <w:trPr>
@@ -955,7 +2896,7 @@
         </w:trPr>
         <w:tc>
           <w:tcPr>
-            <w:tcW w:type="dxa" w:w="5908"/>
+            <w:tcW w:type="dxa" w:w="6556"/>
             <w:tcBorders>
               <w:top w:val="single" w:color="000000" w:sz="4"/>
               <w:left w:val="single" w:color="000000" w:sz="4"/>
@@ -988,7 +2929,7 @@
         </w:tc>
         <w:tc>
           <w:tcPr>
-            <w:tcW w:type="dxa" w:w="7222"/>
+            <w:tcW w:type="dxa" w:w="8014"/>
             <w:tcBorders>
               <w:top w:val="single" w:color="000000" w:sz="4"/>
               <w:left w:val="single" w:color="000000" w:sz="4"/>
@@ -1027,7 +2968,7 @@
         </w:trPr>
         <w:tc>
           <w:tcPr>
-            <w:tcW w:type="dxa" w:w="5908"/>
+            <w:tcW w:type="dxa" w:w="6556"/>
             <w:tcBorders>
               <w:top w:val="single" w:color="000000" w:sz="4"/>
               <w:left w:val="single" w:color="000000" w:sz="4"/>
@@ -1059,7 +3000,7 @@
         </w:tc>
         <w:tc>
           <w:tcPr>
-            <w:tcW w:type="dxa" w:w="7222"/>
+            <w:tcW w:type="dxa" w:w="8014"/>
             <w:tcBorders>
               <w:top w:val="single" w:color="000000" w:sz="4"/>
               <w:left w:val="single" w:color="000000" w:sz="4"/>
@@ -1097,7 +3038,7 @@
         </w:trPr>
         <w:tc>
           <w:tcPr>
-            <w:tcW w:type="dxa" w:w="5908"/>
+            <w:tcW w:type="dxa" w:w="6556"/>
             <w:tcBorders>
               <w:top w:val="single" w:color="000000" w:sz="4"/>
               <w:left w:val="single" w:color="000000" w:sz="4"/>
@@ -1129,7 +3070,7 @@
         </w:tc>
         <w:tc>
           <w:tcPr>
-            <w:tcW w:type="dxa" w:w="7222"/>
+            <w:tcW w:type="dxa" w:w="8014"/>
             <w:tcBorders>
               <w:top w:val="single" w:color="000000" w:sz="4"/>
               <w:left w:val="single" w:color="000000" w:sz="4"/>
@@ -1167,7 +3108,7 @@
         </w:trPr>
         <w:tc>
           <w:tcPr>
-            <w:tcW w:type="dxa" w:w="5908"/>
+            <w:tcW w:type="dxa" w:w="6556"/>
             <w:tcBorders>
               <w:top w:val="single" w:color="000000" w:sz="4"/>
               <w:left w:val="single" w:color="000000" w:sz="4"/>
@@ -1199,7 +3140,7 @@
         </w:tc>
         <w:tc>
           <w:tcPr>
-            <w:tcW w:type="dxa" w:w="7222"/>
+            <w:tcW w:type="dxa" w:w="8014"/>
             <w:tcBorders>
               <w:top w:val="single" w:color="000000" w:sz="4"/>
               <w:left w:val="single" w:color="000000" w:sz="4"/>
@@ -1237,7 +3178,7 @@
         </w:trPr>
         <w:tc>
           <w:tcPr>
-            <w:tcW w:type="dxa" w:w="5908"/>
+            <w:tcW w:type="dxa" w:w="6556"/>
             <w:tcBorders>
               <w:top w:val="single" w:color="000000" w:sz="4"/>
               <w:left w:val="single" w:color="000000" w:sz="4"/>
@@ -1269,7 +3210,7 @@
         </w:tc>
         <w:tc>
           <w:tcPr>
-            <w:tcW w:type="dxa" w:w="7222"/>
+            <w:tcW w:type="dxa" w:w="8014"/>
             <w:tcBorders>
               <w:top w:val="single" w:color="000000" w:sz="4"/>
               <w:left w:val="single" w:color="000000" w:sz="4"/>
@@ -1307,7 +3248,7 @@
         </w:trPr>
         <w:tc>
           <w:tcPr>
-            <w:tcW w:type="dxa" w:w="5908"/>
+            <w:tcW w:type="dxa" w:w="6556"/>
             <w:tcBorders>
               <w:top w:val="single" w:color="000000" w:sz="4"/>
               <w:left w:val="single" w:color="000000" w:sz="4"/>
@@ -1339,7 +3280,7 @@
         </w:tc>
         <w:tc>
           <w:tcPr>
-            <w:tcW w:type="dxa" w:w="7222"/>
+            <w:tcW w:type="dxa" w:w="8014"/>
             <w:tcBorders>
               <w:top w:val="single" w:color="000000" w:sz="4"/>
               <w:left w:val="single" w:color="000000" w:sz="4"/>
@@ -1377,7 +3318,7 @@
         </w:trPr>
         <w:tc>
           <w:tcPr>
-            <w:tcW w:type="dxa" w:w="5908"/>
+            <w:tcW w:type="dxa" w:w="6556"/>
             <w:tcBorders>
               <w:top w:val="single" w:color="000000" w:sz="4"/>
               <w:left w:val="single" w:color="000000" w:sz="4"/>
@@ -1409,7 +3350,7 @@
         </w:tc>
         <w:tc>
           <w:tcPr>
-            <w:tcW w:type="dxa" w:w="7222"/>
+            <w:tcW w:type="dxa" w:w="8014"/>
             <w:tcBorders>
               <w:top w:val="single" w:color="000000" w:sz="4"/>
               <w:left w:val="single" w:color="000000" w:sz="4"/>
@@ -1480,7 +3421,7 @@
         <w:pStyle w:val="ListParagraph"/>
         <w:numPr>
           <w:ilvl w:val="0"/>
-          <w:numId w:val="2"/>
+          <w:numId w:val="4"/>
         </w:numPr>
         <w:spacing w:after="60"/>
       </w:pPr>
@@ -1508,7 +3449,7 @@
         <w:pStyle w:val="ListParagraph"/>
         <w:numPr>
           <w:ilvl w:val="0"/>
-          <w:numId w:val="2"/>
+          <w:numId w:val="4"/>
         </w:numPr>
         <w:spacing w:after="60"/>
       </w:pPr>
@@ -1536,7 +3477,7 @@
         <w:pStyle w:val="ListParagraph"/>
         <w:numPr>
           <w:ilvl w:val="0"/>
-          <w:numId w:val="2"/>
+          <w:numId w:val="4"/>
         </w:numPr>
         <w:spacing w:after="60"/>
       </w:pPr>
@@ -1564,7 +3505,7 @@
         <w:pStyle w:val="ListParagraph"/>
         <w:numPr>
           <w:ilvl w:val="0"/>
-          <w:numId w:val="2"/>
+          <w:numId w:val="4"/>
         </w:numPr>
         <w:spacing w:after="60"/>
       </w:pPr>
@@ -1592,7 +3533,7 @@
         <w:pStyle w:val="ListParagraph"/>
         <w:numPr>
           <w:ilvl w:val="0"/>
-          <w:numId w:val="2"/>
+          <w:numId w:val="4"/>
         </w:numPr>
         <w:spacing w:after="60"/>
       </w:pPr>
@@ -1849,9 +3790,22 @@
         <w:t xml:space="preserve">Cronograma semanal</w:t>
       </w:r>
     </w:p>
+    <w:p>
+      <w:pPr>
+        <w:spacing w:after="120"/>
+      </w:pPr>
+      <w:r>
+        <w:rPr>
+          <w:rFonts w:ascii="Arial" w:cs="Arial" w:eastAsia="Arial" w:hAnsi="Arial"/>
+          <w:sz w:val="20"/>
+          <w:szCs w:val="20"/>
+        </w:rPr>
+        <w:t xml:space="preserve">As semanas vão de sábado a sexta-feira. Assim, cada entrega definida pela orientação (18/09, 02/10, 16/10, 30/10 e 06/11) cai no último dia de uma semana. A versão final para a banca tem 16/11 como data de referência, e a defesa ocorre no final de novembro. Feriados nacionais no período: 12/10, 02/11 e 20/11.</w:t>
+      </w:r>
+    </w:p>
     <w:tbl>
       <w:tblPr>
-        <w:tblW w:type="dxa" w:w="13130"/>
+        <w:tblW w:type="dxa" w:w="14570"/>
         <w:tblBorders>
           <w:top w:val="single" w:color="auto" w:sz="4"/>
           <w:left w:val="single" w:color="auto" w:sz="4"/>
@@ -1862,11 +3816,11 @@
         </w:tblBorders>
       </w:tblPr>
       <w:tblGrid>
-        <w:gridCol w:w="1029"/>
-        <w:gridCol w:w="1287"/>
-        <w:gridCol w:w="5663"/>
-        <w:gridCol w:w="3089"/>
-        <w:gridCol w:w="2062"/>
+        <w:gridCol w:w="1142"/>
+        <w:gridCol w:w="1428"/>
+        <w:gridCol w:w="6285"/>
+        <w:gridCol w:w="3428"/>
+        <w:gridCol w:w="2287"/>
       </w:tblGrid>
       <w:tr>
         <w:trPr>
@@ -1875,7 +3829,7 @@
         </w:trPr>
         <w:tc>
           <w:tcPr>
-            <w:tcW w:type="dxa" w:w="1029"/>
+            <w:tcW w:type="dxa" w:w="1142"/>
             <w:tcBorders>
               <w:top w:val="single" w:color="000000" w:sz="4"/>
               <w:left w:val="single" w:color="000000" w:sz="4"/>
@@ -1908,7 +3862,7 @@
         </w:tc>
         <w:tc>
           <w:tcPr>
-            <w:tcW w:type="dxa" w:w="1287"/>
+            <w:tcW w:type="dxa" w:w="1428"/>
             <w:tcBorders>
               <w:top w:val="single" w:color="000000" w:sz="4"/>
               <w:left w:val="single" w:color="000000" w:sz="4"/>
@@ -1941,7 +3895,7 @@
         </w:tc>
         <w:tc>
           <w:tcPr>
-            <w:tcW w:type="dxa" w:w="5663"/>
+            <w:tcW w:type="dxa" w:w="6285"/>
             <w:tcBorders>
               <w:top w:val="single" w:color="000000" w:sz="4"/>
               <w:left w:val="single" w:color="000000" w:sz="4"/>
@@ -1974,7 +3928,7 @@
         </w:tc>
         <w:tc>
           <w:tcPr>
-            <w:tcW w:type="dxa" w:w="3089"/>
+            <w:tcW w:type="dxa" w:w="3428"/>
             <w:tcBorders>
               <w:top w:val="single" w:color="000000" w:sz="4"/>
               <w:left w:val="single" w:color="000000" w:sz="4"/>
@@ -2007,7 +3961,7 @@
         </w:tc>
         <w:tc>
           <w:tcPr>
-            <w:tcW w:type="dxa" w:w="2062"/>
+            <w:tcW w:type="dxa" w:w="2287"/>
             <w:tcBorders>
               <w:top w:val="single" w:color="000000" w:sz="4"/>
               <w:left w:val="single" w:color="000000" w:sz="4"/>
@@ -2046,7 +4000,7 @@
         </w:trPr>
         <w:tc>
           <w:tcPr>
-            <w:tcW w:type="dxa" w:w="1029"/>
+            <w:tcW w:type="dxa" w:w="1142"/>
             <w:tcBorders>
               <w:top w:val="single" w:color="000000" w:sz="4"/>
               <w:left w:val="single" w:color="000000" w:sz="4"/>
@@ -2078,7 +4032,7 @@
         </w:tc>
         <w:tc>
           <w:tcPr>
-            <w:tcW w:type="dxa" w:w="1287"/>
+            <w:tcW w:type="dxa" w:w="1428"/>
             <w:tcBorders>
               <w:top w:val="single" w:color="000000" w:sz="4"/>
               <w:left w:val="single" w:color="000000" w:sz="4"/>
@@ -2110,7 +4064,7 @@
         </w:tc>
         <w:tc>
           <w:tcPr>
-            <w:tcW w:type="dxa" w:w="5663"/>
+            <w:tcW w:type="dxa" w:w="6285"/>
             <w:tcBorders>
               <w:top w:val="single" w:color="000000" w:sz="4"/>
               <w:left w:val="single" w:color="000000" w:sz="4"/>
@@ -2199,7 +4153,7 @@
         </w:tc>
         <w:tc>
           <w:tcPr>
-            <w:tcW w:type="dxa" w:w="3089"/>
+            <w:tcW w:type="dxa" w:w="3428"/>
             <w:tcBorders>
               <w:top w:val="single" w:color="000000" w:sz="4"/>
               <w:left w:val="single" w:color="000000" w:sz="4"/>
@@ -2270,7 +4224,7 @@
         </w:tc>
         <w:tc>
           <w:tcPr>
-            <w:tcW w:type="dxa" w:w="2062"/>
+            <w:tcW w:type="dxa" w:w="2287"/>
             <w:tcBorders>
               <w:top w:val="single" w:color="000000" w:sz="4"/>
               <w:left w:val="single" w:color="000000" w:sz="4"/>
@@ -2308,7 +4262,7 @@
         </w:trPr>
         <w:tc>
           <w:tcPr>
-            <w:tcW w:type="dxa" w:w="1029"/>
+            <w:tcW w:type="dxa" w:w="1142"/>
             <w:tcBorders>
               <w:top w:val="single" w:color="000000" w:sz="4"/>
               <w:left w:val="single" w:color="000000" w:sz="4"/>
@@ -2340,7 +4294,7 @@
         </w:tc>
         <w:tc>
           <w:tcPr>
-            <w:tcW w:type="dxa" w:w="1287"/>
+            <w:tcW w:type="dxa" w:w="1428"/>
             <w:tcBorders>
               <w:top w:val="single" w:color="000000" w:sz="4"/>
               <w:left w:val="single" w:color="000000" w:sz="4"/>
@@ -2372,7 +4326,7 @@
         </w:tc>
         <w:tc>
           <w:tcPr>
-            <w:tcW w:type="dxa" w:w="5663"/>
+            <w:tcW w:type="dxa" w:w="6285"/>
             <w:tcBorders>
               <w:top w:val="single" w:color="000000" w:sz="4"/>
               <w:left w:val="single" w:color="000000" w:sz="4"/>
@@ -2497,7 +4451,7 @@
         </w:tc>
         <w:tc>
           <w:tcPr>
-            <w:tcW w:type="dxa" w:w="3089"/>
+            <w:tcW w:type="dxa" w:w="3428"/>
             <w:tcBorders>
               <w:top w:val="single" w:color="000000" w:sz="4"/>
               <w:left w:val="single" w:color="000000" w:sz="4"/>
@@ -2550,7 +4504,7 @@
         </w:tc>
         <w:tc>
           <w:tcPr>
-            <w:tcW w:type="dxa" w:w="2062"/>
+            <w:tcW w:type="dxa" w:w="2287"/>
             <w:tcBorders>
               <w:top w:val="single" w:color="000000" w:sz="4"/>
               <w:left w:val="single" w:color="000000" w:sz="4"/>
@@ -2588,7 +4542,7 @@
         </w:trPr>
         <w:tc>
           <w:tcPr>
-            <w:tcW w:type="dxa" w:w="1029"/>
+            <w:tcW w:type="dxa" w:w="1142"/>
             <w:tcBorders>
               <w:top w:val="single" w:color="000000" w:sz="4"/>
               <w:left w:val="single" w:color="000000" w:sz="4"/>
@@ -2620,7 +4574,7 @@
         </w:tc>
         <w:tc>
           <w:tcPr>
-            <w:tcW w:type="dxa" w:w="1287"/>
+            <w:tcW w:type="dxa" w:w="1428"/>
             <w:tcBorders>
               <w:top w:val="single" w:color="000000" w:sz="4"/>
               <w:left w:val="single" w:color="000000" w:sz="4"/>
@@ -2652,7 +4606,7 @@
         </w:tc>
         <w:tc>
           <w:tcPr>
-            <w:tcW w:type="dxa" w:w="5663"/>
+            <w:tcW w:type="dxa" w:w="6285"/>
             <w:tcBorders>
               <w:top w:val="single" w:color="000000" w:sz="4"/>
               <w:left w:val="single" w:color="000000" w:sz="4"/>
@@ -2777,7 +4731,7 @@
         </w:tc>
         <w:tc>
           <w:tcPr>
-            <w:tcW w:type="dxa" w:w="3089"/>
+            <w:tcW w:type="dxa" w:w="3428"/>
             <w:tcBorders>
               <w:top w:val="single" w:color="000000" w:sz="4"/>
               <w:left w:val="single" w:color="000000" w:sz="4"/>
@@ -2830,7 +4784,7 @@
         </w:tc>
         <w:tc>
           <w:tcPr>
-            <w:tcW w:type="dxa" w:w="2062"/>
+            <w:tcW w:type="dxa" w:w="2287"/>
             <w:tcBorders>
               <w:top w:val="single" w:color="000000" w:sz="4"/>
               <w:left w:val="single" w:color="000000" w:sz="4"/>
@@ -2868,7 +4822,7 @@
         </w:trPr>
         <w:tc>
           <w:tcPr>
-            <w:tcW w:type="dxa" w:w="1029"/>
+            <w:tcW w:type="dxa" w:w="1142"/>
             <w:tcBorders>
               <w:top w:val="single" w:color="000000" w:sz="4"/>
               <w:left w:val="single" w:color="000000" w:sz="4"/>
@@ -2900,7 +4854,7 @@
         </w:tc>
         <w:tc>
           <w:tcPr>
-            <w:tcW w:type="dxa" w:w="1287"/>
+            <w:tcW w:type="dxa" w:w="1428"/>
             <w:tcBorders>
               <w:top w:val="single" w:color="000000" w:sz="4"/>
               <w:left w:val="single" w:color="000000" w:sz="4"/>
@@ -2932,7 +4886,7 @@
         </w:tc>
         <w:tc>
           <w:tcPr>
-            <w:tcW w:type="dxa" w:w="5663"/>
+            <w:tcW w:type="dxa" w:w="6285"/>
             <w:tcBorders>
               <w:top w:val="single" w:color="000000" w:sz="4"/>
               <w:left w:val="single" w:color="000000" w:sz="4"/>
@@ -3003,7 +4957,7 @@
         </w:tc>
         <w:tc>
           <w:tcPr>
-            <w:tcW w:type="dxa" w:w="3089"/>
+            <w:tcW w:type="dxa" w:w="3428"/>
             <w:tcBorders>
               <w:top w:val="single" w:color="000000" w:sz="4"/>
               <w:left w:val="single" w:color="000000" w:sz="4"/>
@@ -3035,7 +4989,7 @@
         </w:tc>
         <w:tc>
           <w:tcPr>
-            <w:tcW w:type="dxa" w:w="2062"/>
+            <w:tcW w:type="dxa" w:w="2287"/>
             <w:tcBorders>
               <w:top w:val="single" w:color="000000" w:sz="4"/>
               <w:left w:val="single" w:color="000000" w:sz="4"/>
@@ -3073,7 +5027,7 @@
         </w:trPr>
         <w:tc>
           <w:tcPr>
-            <w:tcW w:type="dxa" w:w="1029"/>
+            <w:tcW w:type="dxa" w:w="1142"/>
             <w:tcBorders>
               <w:top w:val="single" w:color="000000" w:sz="4"/>
               <w:left w:val="single" w:color="000000" w:sz="4"/>
@@ -3105,7 +5059,7 @@
         </w:tc>
         <w:tc>
           <w:tcPr>
-            <w:tcW w:type="dxa" w:w="1287"/>
+            <w:tcW w:type="dxa" w:w="1428"/>
             <w:tcBorders>
               <w:top w:val="single" w:color="000000" w:sz="4"/>
               <w:left w:val="single" w:color="000000" w:sz="4"/>
@@ -3137,7 +5091,7 @@
         </w:tc>
         <w:tc>
           <w:tcPr>
-            <w:tcW w:type="dxa" w:w="5663"/>
+            <w:tcW w:type="dxa" w:w="6285"/>
             <w:tcBorders>
               <w:top w:val="single" w:color="000000" w:sz="4"/>
               <w:left w:val="single" w:color="000000" w:sz="4"/>
@@ -3244,7 +5198,7 @@
         </w:tc>
         <w:tc>
           <w:tcPr>
-            <w:tcW w:type="dxa" w:w="3089"/>
+            <w:tcW w:type="dxa" w:w="3428"/>
             <w:tcBorders>
               <w:top w:val="single" w:color="000000" w:sz="4"/>
               <w:left w:val="single" w:color="000000" w:sz="4"/>
@@ -3276,7 +5230,7 @@
         </w:tc>
         <w:tc>
           <w:tcPr>
-            <w:tcW w:type="dxa" w:w="2062"/>
+            <w:tcW w:type="dxa" w:w="2287"/>
             <w:tcBorders>
               <w:top w:val="single" w:color="000000" w:sz="4"/>
               <w:left w:val="single" w:color="000000" w:sz="4"/>
@@ -3314,7 +5268,7 @@
         </w:trPr>
         <w:tc>
           <w:tcPr>
-            <w:tcW w:type="dxa" w:w="1029"/>
+            <w:tcW w:type="dxa" w:w="1142"/>
             <w:tcBorders>
               <w:top w:val="single" w:color="000000" w:sz="4"/>
               <w:left w:val="single" w:color="000000" w:sz="4"/>
@@ -3346,7 +5300,7 @@
         </w:tc>
         <w:tc>
           <w:tcPr>
-            <w:tcW w:type="dxa" w:w="1287"/>
+            <w:tcW w:type="dxa" w:w="1428"/>
             <w:tcBorders>
               <w:top w:val="single" w:color="000000" w:sz="4"/>
               <w:left w:val="single" w:color="000000" w:sz="4"/>
@@ -3378,7 +5332,7 @@
         </w:tc>
         <w:tc>
           <w:tcPr>
-            <w:tcW w:type="dxa" w:w="5663"/>
+            <w:tcW w:type="dxa" w:w="6285"/>
             <w:tcBorders>
               <w:top w:val="single" w:color="000000" w:sz="4"/>
               <w:left w:val="single" w:color="000000" w:sz="4"/>
@@ -3485,7 +5439,7 @@
         </w:tc>
         <w:tc>
           <w:tcPr>
-            <w:tcW w:type="dxa" w:w="3089"/>
+            <w:tcW w:type="dxa" w:w="3428"/>
             <w:tcBorders>
               <w:top w:val="single" w:color="000000" w:sz="4"/>
               <w:left w:val="single" w:color="000000" w:sz="4"/>
@@ -3517,7 +5471,7 @@
         </w:tc>
         <w:tc>
           <w:tcPr>
-            <w:tcW w:type="dxa" w:w="2062"/>
+            <w:tcW w:type="dxa" w:w="2287"/>
             <w:tcBorders>
               <w:top w:val="single" w:color="000000" w:sz="4"/>
               <w:left w:val="single" w:color="000000" w:sz="4"/>
@@ -3555,7 +5509,7 @@
         </w:trPr>
         <w:tc>
           <w:tcPr>
-            <w:tcW w:type="dxa" w:w="1029"/>
+            <w:tcW w:type="dxa" w:w="1142"/>
             <w:tcBorders>
               <w:top w:val="single" w:color="000000" w:sz="4"/>
               <w:left w:val="single" w:color="000000" w:sz="4"/>
@@ -3587,7 +5541,7 @@
         </w:tc>
         <w:tc>
           <w:tcPr>
-            <w:tcW w:type="dxa" w:w="1287"/>
+            <w:tcW w:type="dxa" w:w="1428"/>
             <w:tcBorders>
               <w:top w:val="single" w:color="000000" w:sz="4"/>
               <w:left w:val="single" w:color="000000" w:sz="4"/>
@@ -3619,7 +5573,7 @@
         </w:tc>
         <w:tc>
           <w:tcPr>
-            <w:tcW w:type="dxa" w:w="5663"/>
+            <w:tcW w:type="dxa" w:w="6285"/>
             <w:tcBorders>
               <w:top w:val="single" w:color="000000" w:sz="4"/>
               <w:left w:val="single" w:color="000000" w:sz="4"/>
@@ -3744,7 +5698,7 @@
         </w:tc>
         <w:tc>
           <w:tcPr>
-            <w:tcW w:type="dxa" w:w="3089"/>
+            <w:tcW w:type="dxa" w:w="3428"/>
             <w:tcBorders>
               <w:top w:val="single" w:color="000000" w:sz="4"/>
               <w:left w:val="single" w:color="000000" w:sz="4"/>
@@ -3797,7 +5751,7 @@
         </w:tc>
         <w:tc>
           <w:tcPr>
-            <w:tcW w:type="dxa" w:w="2062"/>
+            <w:tcW w:type="dxa" w:w="2287"/>
             <w:tcBorders>
               <w:top w:val="single" w:color="000000" w:sz="4"/>
               <w:left w:val="single" w:color="000000" w:sz="4"/>
@@ -3835,7 +5789,7 @@
         </w:trPr>
         <w:tc>
           <w:tcPr>
-            <w:tcW w:type="dxa" w:w="1029"/>
+            <w:tcW w:type="dxa" w:w="1142"/>
             <w:tcBorders>
               <w:top w:val="single" w:color="000000" w:sz="4"/>
               <w:left w:val="single" w:color="000000" w:sz="4"/>
@@ -3867,7 +5821,7 @@
         </w:tc>
         <w:tc>
           <w:tcPr>
-            <w:tcW w:type="dxa" w:w="1287"/>
+            <w:tcW w:type="dxa" w:w="1428"/>
             <w:tcBorders>
               <w:top w:val="single" w:color="000000" w:sz="4"/>
               <w:left w:val="single" w:color="000000" w:sz="4"/>
@@ -3899,7 +5853,7 @@
         </w:tc>
         <w:tc>
           <w:tcPr>
-            <w:tcW w:type="dxa" w:w="5663"/>
+            <w:tcW w:type="dxa" w:w="6285"/>
             <w:tcBorders>
               <w:top w:val="single" w:color="000000" w:sz="4"/>
               <w:left w:val="single" w:color="000000" w:sz="4"/>
@@ -3970,7 +5924,7 @@
         </w:tc>
         <w:tc>
           <w:tcPr>
-            <w:tcW w:type="dxa" w:w="3089"/>
+            <w:tcW w:type="dxa" w:w="3428"/>
             <w:tcBorders>
               <w:top w:val="single" w:color="000000" w:sz="4"/>
               <w:left w:val="single" w:color="000000" w:sz="4"/>
@@ -4077,7 +6031,7 @@
         </w:tc>
         <w:tc>
           <w:tcPr>
-            <w:tcW w:type="dxa" w:w="2062"/>
+            <w:tcW w:type="dxa" w:w="2287"/>
             <w:tcBorders>
               <w:top w:val="single" w:color="000000" w:sz="4"/>
               <w:left w:val="single" w:color="000000" w:sz="4"/>
@@ -4115,7 +6069,7 @@
         </w:trPr>
         <w:tc>
           <w:tcPr>
-            <w:tcW w:type="dxa" w:w="1029"/>
+            <w:tcW w:type="dxa" w:w="1142"/>
             <w:tcBorders>
               <w:top w:val="single" w:color="000000" w:sz="4"/>
               <w:left w:val="single" w:color="000000" w:sz="4"/>
@@ -4147,7 +6101,7 @@
         </w:tc>
         <w:tc>
           <w:tcPr>
-            <w:tcW w:type="dxa" w:w="1287"/>
+            <w:tcW w:type="dxa" w:w="1428"/>
             <w:tcBorders>
               <w:top w:val="single" w:color="000000" w:sz="4"/>
               <w:left w:val="single" w:color="000000" w:sz="4"/>
@@ -4179,7 +6133,7 @@
         </w:tc>
         <w:tc>
           <w:tcPr>
-            <w:tcW w:type="dxa" w:w="5663"/>
+            <w:tcW w:type="dxa" w:w="6285"/>
             <w:tcBorders>
               <w:top w:val="single" w:color="000000" w:sz="4"/>
               <w:left w:val="single" w:color="000000" w:sz="4"/>
@@ -4211,7 +6165,7 @@
         </w:tc>
         <w:tc>
           <w:tcPr>
-            <w:tcW w:type="dxa" w:w="3089"/>
+            <w:tcW w:type="dxa" w:w="3428"/>
             <w:tcBorders>
               <w:top w:val="single" w:color="000000" w:sz="4"/>
               <w:left w:val="single" w:color="000000" w:sz="4"/>
@@ -4282,7 +6236,7 @@
         </w:tc>
         <w:tc>
           <w:tcPr>
-            <w:tcW w:type="dxa" w:w="2062"/>
+            <w:tcW w:type="dxa" w:w="2287"/>
             <w:tcBorders>
               <w:top w:val="single" w:color="000000" w:sz="4"/>
               <w:left w:val="single" w:color="000000" w:sz="4"/>
@@ -4320,7 +6274,7 @@
         </w:trPr>
         <w:tc>
           <w:tcPr>
-            <w:tcW w:type="dxa" w:w="1029"/>
+            <w:tcW w:type="dxa" w:w="1142"/>
             <w:tcBorders>
               <w:top w:val="single" w:color="000000" w:sz="4"/>
               <w:left w:val="single" w:color="000000" w:sz="4"/>
@@ -4352,7 +6306,7 @@
         </w:tc>
         <w:tc>
           <w:tcPr>
-            <w:tcW w:type="dxa" w:w="1287"/>
+            <w:tcW w:type="dxa" w:w="1428"/>
             <w:tcBorders>
               <w:top w:val="single" w:color="000000" w:sz="4"/>
               <w:left w:val="single" w:color="000000" w:sz="4"/>
@@ -4384,7 +6338,7 @@
         </w:tc>
         <w:tc>
           <w:tcPr>
-            <w:tcW w:type="dxa" w:w="5663"/>
+            <w:tcW w:type="dxa" w:w="6285"/>
             <w:tcBorders>
               <w:top w:val="single" w:color="000000" w:sz="4"/>
               <w:left w:val="single" w:color="000000" w:sz="4"/>
@@ -4416,7 +6370,7 @@
         </w:tc>
         <w:tc>
           <w:tcPr>
-            <w:tcW w:type="dxa" w:w="3089"/>
+            <w:tcW w:type="dxa" w:w="3428"/>
             <w:tcBorders>
               <w:top w:val="single" w:color="000000" w:sz="4"/>
               <w:left w:val="single" w:color="000000" w:sz="4"/>
@@ -4448,7 +6402,7 @@
         </w:tc>
         <w:tc>
           <w:tcPr>
-            <w:tcW w:type="dxa" w:w="2062"/>
+            <w:tcW w:type="dxa" w:w="2287"/>
             <w:tcBorders>
               <w:top w:val="single" w:color="000000" w:sz="4"/>
               <w:left w:val="single" w:color="000000" w:sz="4"/>
@@ -4486,7 +6440,7 @@
         </w:trPr>
         <w:tc>
           <w:tcPr>
-            <w:tcW w:type="dxa" w:w="1029"/>
+            <w:tcW w:type="dxa" w:w="1142"/>
             <w:tcBorders>
               <w:top w:val="single" w:color="000000" w:sz="4"/>
               <w:left w:val="single" w:color="000000" w:sz="4"/>
@@ -4518,7 +6472,7 @@
         </w:tc>
         <w:tc>
           <w:tcPr>
-            <w:tcW w:type="dxa" w:w="1287"/>
+            <w:tcW w:type="dxa" w:w="1428"/>
             <w:tcBorders>
               <w:top w:val="single" w:color="000000" w:sz="4"/>
               <w:left w:val="single" w:color="000000" w:sz="4"/>
@@ -4550,7 +6504,7 @@
         </w:tc>
         <w:tc>
           <w:tcPr>
-            <w:tcW w:type="dxa" w:w="5663"/>
+            <w:tcW w:type="dxa" w:w="6285"/>
             <w:tcBorders>
               <w:top w:val="single" w:color="000000" w:sz="4"/>
               <w:left w:val="single" w:color="000000" w:sz="4"/>
@@ -4582,7 +6536,7 @@
         </w:tc>
         <w:tc>
           <w:tcPr>
-            <w:tcW w:type="dxa" w:w="3089"/>
+            <w:tcW w:type="dxa" w:w="3428"/>
             <w:tcBorders>
               <w:top w:val="single" w:color="000000" w:sz="4"/>
               <w:left w:val="single" w:color="000000" w:sz="4"/>
@@ -4614,7 +6568,7 @@
         </w:tc>
         <w:tc>
           <w:tcPr>
-            <w:tcW w:type="dxa" w:w="2062"/>
+            <w:tcW w:type="dxa" w:w="2287"/>
             <w:tcBorders>
               <w:top w:val="single" w:color="000000" w:sz="4"/>
               <w:left w:val="single" w:color="000000" w:sz="4"/>
@@ -4669,7 +6623,7 @@
     </w:p>
     <w:tbl>
       <w:tblPr>
-        <w:tblW w:type="dxa" w:w="13130"/>
+        <w:tblW w:type="dxa" w:w="14570"/>
         <w:tblBorders>
           <w:top w:val="single" w:color="auto" w:sz="4"/>
           <w:left w:val="single" w:color="auto" w:sz="4"/>
@@ -4680,9 +6634,9 @@
         </w:tblBorders>
       </w:tblPr>
       <w:tblGrid>
-        <w:gridCol w:w="5252"/>
-        <w:gridCol w:w="3939"/>
-        <w:gridCol w:w="3939"/>
+        <w:gridCol w:w="5828"/>
+        <w:gridCol w:w="4371"/>
+        <w:gridCol w:w="4371"/>
       </w:tblGrid>
       <w:tr>
         <w:trPr>
@@ -4691,7 +6645,7 @@
         </w:trPr>
         <w:tc>
           <w:tcPr>
-            <w:tcW w:type="dxa" w:w="5252"/>
+            <w:tcW w:type="dxa" w:w="5828"/>
             <w:tcBorders>
               <w:top w:val="single" w:color="000000" w:sz="4"/>
               <w:left w:val="single" w:color="000000" w:sz="4"/>
@@ -4724,7 +6678,7 @@
         </w:tc>
         <w:tc>
           <w:tcPr>
-            <w:tcW w:type="dxa" w:w="3939"/>
+            <w:tcW w:type="dxa" w:w="4371"/>
             <w:tcBorders>
               <w:top w:val="single" w:color="000000" w:sz="4"/>
               <w:left w:val="single" w:color="000000" w:sz="4"/>
@@ -4757,7 +6711,7 @@
         </w:tc>
         <w:tc>
           <w:tcPr>
-            <w:tcW w:type="dxa" w:w="3939"/>
+            <w:tcW w:type="dxa" w:w="4371"/>
             <w:tcBorders>
               <w:top w:val="single" w:color="000000" w:sz="4"/>
               <w:left w:val="single" w:color="000000" w:sz="4"/>
@@ -4796,7 +6750,7 @@
         </w:trPr>
         <w:tc>
           <w:tcPr>
-            <w:tcW w:type="dxa" w:w="5252"/>
+            <w:tcW w:type="dxa" w:w="5828"/>
             <w:tcBorders>
               <w:top w:val="single" w:color="000000" w:sz="4"/>
               <w:left w:val="single" w:color="000000" w:sz="4"/>
@@ -4828,7 +6782,7 @@
         </w:tc>
         <w:tc>
           <w:tcPr>
-            <w:tcW w:type="dxa" w:w="3939"/>
+            <w:tcW w:type="dxa" w:w="4371"/>
             <w:tcBorders>
               <w:top w:val="single" w:color="000000" w:sz="4"/>
               <w:left w:val="single" w:color="000000" w:sz="4"/>
@@ -4860,7 +6814,7 @@
         </w:tc>
         <w:tc>
           <w:tcPr>
-            <w:tcW w:type="dxa" w:w="3939"/>
+            <w:tcW w:type="dxa" w:w="4371"/>
             <w:tcBorders>
               <w:top w:val="single" w:color="000000" w:sz="4"/>
               <w:left w:val="single" w:color="000000" w:sz="4"/>
@@ -4898,7 +6852,7 @@
         </w:trPr>
         <w:tc>
           <w:tcPr>
-            <w:tcW w:type="dxa" w:w="5252"/>
+            <w:tcW w:type="dxa" w:w="5828"/>
             <w:tcBorders>
               <w:top w:val="single" w:color="000000" w:sz="4"/>
               <w:left w:val="single" w:color="000000" w:sz="4"/>
@@ -4930,7 +6884,7 @@
         </w:tc>
         <w:tc>
           <w:tcPr>
-            <w:tcW w:type="dxa" w:w="3939"/>
+            <w:tcW w:type="dxa" w:w="4371"/>
             <w:tcBorders>
               <w:top w:val="single" w:color="000000" w:sz="4"/>
               <w:left w:val="single" w:color="000000" w:sz="4"/>
@@ -4962,7 +6916,7 @@
         </w:tc>
         <w:tc>
           <w:tcPr>
-            <w:tcW w:type="dxa" w:w="3939"/>
+            <w:tcW w:type="dxa" w:w="4371"/>
             <w:tcBorders>
               <w:top w:val="single" w:color="000000" w:sz="4"/>
               <w:left w:val="single" w:color="000000" w:sz="4"/>
@@ -5000,7 +6954,7 @@
         </w:trPr>
         <w:tc>
           <w:tcPr>
-            <w:tcW w:type="dxa" w:w="5252"/>
+            <w:tcW w:type="dxa" w:w="5828"/>
             <w:tcBorders>
               <w:top w:val="single" w:color="000000" w:sz="4"/>
               <w:left w:val="single" w:color="000000" w:sz="4"/>
@@ -5032,7 +6986,7 @@
         </w:tc>
         <w:tc>
           <w:tcPr>
-            <w:tcW w:type="dxa" w:w="3939"/>
+            <w:tcW w:type="dxa" w:w="4371"/>
             <w:tcBorders>
               <w:top w:val="single" w:color="000000" w:sz="4"/>
               <w:left w:val="single" w:color="000000" w:sz="4"/>
@@ -5064,7 +7018,7 @@
         </w:tc>
         <w:tc>
           <w:tcPr>
-            <w:tcW w:type="dxa" w:w="3939"/>
+            <w:tcW w:type="dxa" w:w="4371"/>
             <w:tcBorders>
               <w:top w:val="single" w:color="000000" w:sz="4"/>
               <w:left w:val="single" w:color="000000" w:sz="4"/>
@@ -5102,7 +7056,7 @@
         </w:trPr>
         <w:tc>
           <w:tcPr>
-            <w:tcW w:type="dxa" w:w="5252"/>
+            <w:tcW w:type="dxa" w:w="5828"/>
             <w:tcBorders>
               <w:top w:val="single" w:color="000000" w:sz="4"/>
               <w:left w:val="single" w:color="000000" w:sz="4"/>
@@ -5134,7 +7088,7 @@
         </w:tc>
         <w:tc>
           <w:tcPr>
-            <w:tcW w:type="dxa" w:w="3939"/>
+            <w:tcW w:type="dxa" w:w="4371"/>
             <w:tcBorders>
               <w:top w:val="single" w:color="000000" w:sz="4"/>
               <w:left w:val="single" w:color="000000" w:sz="4"/>
@@ -5166,7 +7120,7 @@
         </w:tc>
         <w:tc>
           <w:tcPr>
-            <w:tcW w:type="dxa" w:w="3939"/>
+            <w:tcW w:type="dxa" w:w="4371"/>
             <w:tcBorders>
               <w:top w:val="single" w:color="000000" w:sz="4"/>
               <w:left w:val="single" w:color="000000" w:sz="4"/>
@@ -5204,7 +7158,7 @@
         </w:trPr>
         <w:tc>
           <w:tcPr>
-            <w:tcW w:type="dxa" w:w="5252"/>
+            <w:tcW w:type="dxa" w:w="5828"/>
             <w:tcBorders>
               <w:top w:val="single" w:color="000000" w:sz="4"/>
               <w:left w:val="single" w:color="000000" w:sz="4"/>
@@ -5236,7 +7190,7 @@
         </w:tc>
         <w:tc>
           <w:tcPr>
-            <w:tcW w:type="dxa" w:w="3939"/>
+            <w:tcW w:type="dxa" w:w="4371"/>
             <w:tcBorders>
               <w:top w:val="single" w:color="000000" w:sz="4"/>
               <w:left w:val="single" w:color="000000" w:sz="4"/>
@@ -5268,7 +7222,7 @@
         </w:tc>
         <w:tc>
           <w:tcPr>
-            <w:tcW w:type="dxa" w:w="3939"/>
+            <w:tcW w:type="dxa" w:w="4371"/>
             <w:tcBorders>
               <w:top w:val="single" w:color="000000" w:sz="4"/>
               <w:left w:val="single" w:color="000000" w:sz="4"/>
@@ -5306,7 +7260,7 @@
         </w:trPr>
         <w:tc>
           <w:tcPr>
-            <w:tcW w:type="dxa" w:w="5252"/>
+            <w:tcW w:type="dxa" w:w="5828"/>
             <w:tcBorders>
               <w:top w:val="single" w:color="000000" w:sz="4"/>
               <w:left w:val="single" w:color="000000" w:sz="4"/>
@@ -5338,7 +7292,7 @@
         </w:tc>
         <w:tc>
           <w:tcPr>
-            <w:tcW w:type="dxa" w:w="3939"/>
+            <w:tcW w:type="dxa" w:w="4371"/>
             <w:tcBorders>
               <w:top w:val="single" w:color="000000" w:sz="4"/>
               <w:left w:val="single" w:color="000000" w:sz="4"/>
@@ -5370,7 +7324,7 @@
         </w:tc>
         <w:tc>
           <w:tcPr>
-            <w:tcW w:type="dxa" w:w="3939"/>
+            <w:tcW w:type="dxa" w:w="4371"/>
             <w:tcBorders>
               <w:top w:val="single" w:color="000000" w:sz="4"/>
               <w:left w:val="single" w:color="000000" w:sz="4"/>
@@ -5408,7 +7362,7 @@
         </w:trPr>
         <w:tc>
           <w:tcPr>
-            <w:tcW w:type="dxa" w:w="5252"/>
+            <w:tcW w:type="dxa" w:w="5828"/>
             <w:tcBorders>
               <w:top w:val="single" w:color="000000" w:sz="4"/>
               <w:left w:val="single" w:color="000000" w:sz="4"/>
@@ -5440,7 +7394,7 @@
         </w:tc>
         <w:tc>
           <w:tcPr>
-            <w:tcW w:type="dxa" w:w="3939"/>
+            <w:tcW w:type="dxa" w:w="4371"/>
             <w:tcBorders>
               <w:top w:val="single" w:color="000000" w:sz="4"/>
               <w:left w:val="single" w:color="000000" w:sz="4"/>
@@ -5472,7 +7426,7 @@
         </w:tc>
         <w:tc>
           <w:tcPr>
-            <w:tcW w:type="dxa" w:w="3939"/>
+            <w:tcW w:type="dxa" w:w="4371"/>
             <w:tcBorders>
               <w:top w:val="single" w:color="000000" w:sz="4"/>
               <w:left w:val="single" w:color="000000" w:sz="4"/>
@@ -5510,7 +7464,7 @@
         </w:trPr>
         <w:tc>
           <w:tcPr>
-            <w:tcW w:type="dxa" w:w="5252"/>
+            <w:tcW w:type="dxa" w:w="5828"/>
             <w:tcBorders>
               <w:top w:val="single" w:color="000000" w:sz="4"/>
               <w:left w:val="single" w:color="000000" w:sz="4"/>
@@ -5542,7 +7496,7 @@
         </w:tc>
         <w:tc>
           <w:tcPr>
-            <w:tcW w:type="dxa" w:w="3939"/>
+            <w:tcW w:type="dxa" w:w="4371"/>
             <w:tcBorders>
               <w:top w:val="single" w:color="000000" w:sz="4"/>
               <w:left w:val="single" w:color="000000" w:sz="4"/>
@@ -5574,7 +7528,7 @@
         </w:tc>
         <w:tc>
           <w:tcPr>
-            <w:tcW w:type="dxa" w:w="3939"/>
+            <w:tcW w:type="dxa" w:w="4371"/>
             <w:tcBorders>
               <w:top w:val="single" w:color="000000" w:sz="4"/>
               <w:left w:val="single" w:color="000000" w:sz="4"/>
@@ -5612,7 +7566,7 @@
         </w:trPr>
         <w:tc>
           <w:tcPr>
-            <w:tcW w:type="dxa" w:w="5252"/>
+            <w:tcW w:type="dxa" w:w="5828"/>
             <w:tcBorders>
               <w:top w:val="single" w:color="000000" w:sz="4"/>
               <w:left w:val="single" w:color="000000" w:sz="4"/>
@@ -5644,7 +7598,7 @@
         </w:tc>
         <w:tc>
           <w:tcPr>
-            <w:tcW w:type="dxa" w:w="3939"/>
+            <w:tcW w:type="dxa" w:w="4371"/>
             <w:tcBorders>
               <w:top w:val="single" w:color="000000" w:sz="4"/>
               <w:left w:val="single" w:color="000000" w:sz="4"/>
@@ -5676,7 +7630,7 @@
         </w:tc>
         <w:tc>
           <w:tcPr>
-            <w:tcW w:type="dxa" w:w="3939"/>
+            <w:tcW w:type="dxa" w:w="4371"/>
             <w:tcBorders>
               <w:top w:val="single" w:color="000000" w:sz="4"/>
               <w:left w:val="single" w:color="000000" w:sz="4"/>
@@ -5714,7 +7668,7 @@
         </w:trPr>
         <w:tc>
           <w:tcPr>
-            <w:tcW w:type="dxa" w:w="5252"/>
+            <w:tcW w:type="dxa" w:w="5828"/>
             <w:tcBorders>
               <w:top w:val="single" w:color="000000" w:sz="4"/>
               <w:left w:val="single" w:color="000000" w:sz="4"/>
@@ -5746,7 +7700,7 @@
         </w:tc>
         <w:tc>
           <w:tcPr>
-            <w:tcW w:type="dxa" w:w="3939"/>
+            <w:tcW w:type="dxa" w:w="4371"/>
             <w:tcBorders>
               <w:top w:val="single" w:color="000000" w:sz="4"/>
               <w:left w:val="single" w:color="000000" w:sz="4"/>
@@ -5778,7 +7732,7 @@
         </w:tc>
         <w:tc>
           <w:tcPr>
-            <w:tcW w:type="dxa" w:w="3939"/>
+            <w:tcW w:type="dxa" w:w="4371"/>
             <w:tcBorders>
               <w:top w:val="single" w:color="000000" w:sz="4"/>
               <w:left w:val="single" w:color="000000" w:sz="4"/>
@@ -5816,7 +7770,7 @@
         </w:trPr>
         <w:tc>
           <w:tcPr>
-            <w:tcW w:type="dxa" w:w="5252"/>
+            <w:tcW w:type="dxa" w:w="5828"/>
             <w:tcBorders>
               <w:top w:val="single" w:color="000000" w:sz="4"/>
               <w:left w:val="single" w:color="000000" w:sz="4"/>
@@ -5848,7 +7802,7 @@
         </w:tc>
         <w:tc>
           <w:tcPr>
-            <w:tcW w:type="dxa" w:w="3939"/>
+            <w:tcW w:type="dxa" w:w="4371"/>
             <w:tcBorders>
               <w:top w:val="single" w:color="000000" w:sz="4"/>
               <w:left w:val="single" w:color="000000" w:sz="4"/>
@@ -5880,7 +7834,7 @@
         </w:tc>
         <w:tc>
           <w:tcPr>
-            <w:tcW w:type="dxa" w:w="3939"/>
+            <w:tcW w:type="dxa" w:w="4371"/>
             <w:tcBorders>
               <w:top w:val="single" w:color="000000" w:sz="4"/>
               <w:left w:val="single" w:color="000000" w:sz="4"/>
@@ -5918,7 +7872,7 @@
         </w:trPr>
         <w:tc>
           <w:tcPr>
-            <w:tcW w:type="dxa" w:w="5252"/>
+            <w:tcW w:type="dxa" w:w="5828"/>
             <w:tcBorders>
               <w:top w:val="single" w:color="000000" w:sz="4"/>
               <w:left w:val="single" w:color="000000" w:sz="4"/>
@@ -5950,7 +7904,7 @@
         </w:tc>
         <w:tc>
           <w:tcPr>
-            <w:tcW w:type="dxa" w:w="3939"/>
+            <w:tcW w:type="dxa" w:w="4371"/>
             <w:tcBorders>
               <w:top w:val="single" w:color="000000" w:sz="4"/>
               <w:left w:val="single" w:color="000000" w:sz="4"/>
@@ -5982,7 +7936,7 @@
         </w:tc>
         <w:tc>
           <w:tcPr>
-            <w:tcW w:type="dxa" w:w="3939"/>
+            <w:tcW w:type="dxa" w:w="4371"/>
             <w:tcBorders>
               <w:top w:val="single" w:color="000000" w:sz="4"/>
               <w:left w:val="single" w:color="000000" w:sz="4"/>
@@ -6053,7 +8007,7 @@
         <w:pStyle w:val="ListParagraph"/>
         <w:numPr>
           <w:ilvl w:val="0"/>
-          <w:numId w:val="4"/>
+          <w:numId w:val="5"/>
         </w:numPr>
         <w:spacing w:after="60"/>
       </w:pPr>
@@ -6071,7 +8025,7 @@
         <w:pStyle w:val="ListParagraph"/>
         <w:numPr>
           <w:ilvl w:val="0"/>
-          <w:numId w:val="4"/>
+          <w:numId w:val="5"/>
         </w:numPr>
         <w:spacing w:after="60"/>
       </w:pPr>
@@ -6089,7 +8043,7 @@
         <w:pStyle w:val="ListParagraph"/>
         <w:numPr>
           <w:ilvl w:val="0"/>
-          <w:numId w:val="4"/>
+          <w:numId w:val="5"/>
         </w:numPr>
         <w:spacing w:after="60"/>
       </w:pPr>
@@ -6107,7 +8061,7 @@
         <w:pStyle w:val="ListParagraph"/>
         <w:numPr>
           <w:ilvl w:val="0"/>
-          <w:numId w:val="4"/>
+          <w:numId w:val="5"/>
         </w:numPr>
         <w:spacing w:after="60"/>
       </w:pPr>
@@ -6125,7 +8079,7 @@
         <w:pStyle w:val="ListParagraph"/>
         <w:numPr>
           <w:ilvl w:val="0"/>
-          <w:numId w:val="4"/>
+          <w:numId w:val="5"/>
         </w:numPr>
         <w:spacing w:after="60"/>
       </w:pPr>
@@ -6143,7 +8097,7 @@
         <w:pStyle w:val="ListParagraph"/>
         <w:numPr>
           <w:ilvl w:val="0"/>
-          <w:numId w:val="4"/>
+          <w:numId w:val="5"/>
         </w:numPr>
         <w:spacing w:after="60"/>
       </w:pPr>
@@ -6410,6 +8364,12 @@
       <w:startOverride w:val="1"/>
     </w:lvlOverride>
   </w:num>
+  <w:num w:numId="5">
+    <w:abstractNumId w:val="3"/>
+    <w:lvlOverride w:ilvl="0">
+      <w:startOverride w:val="1"/>
+    </w:lvlOverride>
+  </w:num>
 </w:numbering>
 </file>
 

</xml_diff>

<commit_message>
Reduz o escopo, foca o plano em Salvador e redesenha a contagem direta
- Plano de negócios para Salvador; concorrentes das 14 metrópoles da REGIC
  com mais de 100 avaliações servem de referência.
- Bloco B passa a coletar todas as avaliações com texto até "um mês atrás".
- Bloco C (histórico dos avaliadores) e comparação de modelos de A&B saem do
  escopo; emenda 2 ao registro prévio retira H2 e H4 e redefine H1
  (atendimento e ambiente × comida e bebida), conforme edição do autor no
  cronograma.
- Contagem direta: 2 visitas sorteadas e 2 de retorno 15 dias depois, do lado
  de fora, sem duração fixa, com leitura do número da NFC-e; script e
  planilha de sorteio refeitos com a mesma semente.
- Cronograma: cap. 5 em etapas (secundários primeiro, 5.3 após o Bloco A,
  5.2 após o fim da análise do Bloco B); cotações em Salvador na semana 4.
- Instruções, projeto, introdução e quadro de itens alinhados.

Co-Authored-By: Claude Opus 5 <noreply@anthropic.com>
</commit_message>
<xml_diff>
--- a/textos/cronograma_luderia.docx
+++ b/textos/cronograma_luderia.docx
@@ -71,7 +71,7 @@
           <w:sz w:val="20"/>
           <w:szCs w:val="20"/>
         </w:rPr>
-        <w:t xml:space="preserve">O negócio analisado é uma luderia, estabelecimento que combina comida, bebida e um acervo de jogos de tabuleiro. O plano mira o público casual: pessoas que usam o jogo como forma de socializar, e não como hobby.</w:t>
+        <w:t xml:space="preserve">O negócio analisado é uma luderia em Salvador, estabelecimento que combina comida, bebida e um acervo de jogos de tabuleiro. O plano mira o público casual: pessoas que usam o jogo como forma de socializar, e não como hobby. As luderias das 14 metrópoles brasileiras servem de referência de preço, satisfação e movimento.</w:t>
       </w:r>
     </w:p>
     <w:p>
@@ -94,7 +94,7 @@
           <w:sz w:val="20"/>
           <w:szCs w:val="20"/>
         </w:rPr>
-        <w:t xml:space="preserve"> avaliar se uma luderia voltada ao público casual é viável do ponto de vista de mercado, de operação e financeiro, com premissas sustentadas por dados públicos e por observação direta.</w:t>
+        <w:t xml:space="preserve"> avaliar se uma luderia em Salvador voltada ao público casual é viável do ponto de vista de mercado, de operação e financeiro, com premissas sustentadas por dados públicos e por observação direta.</w:t>
       </w:r>
     </w:p>
     <w:p>
@@ -127,7 +127,7 @@
           <w:sz w:val="20"/>
           <w:szCs w:val="20"/>
         </w:rPr>
-        <w:t xml:space="preserve">Analisar o mercado e a concorrência de luderias nas 27 capitais: avaliação dos clientes, preço, cardápio e modelo de comida e bebida.</w:t>
+        <w:t xml:space="preserve">Analisar o mercado e a concorrência de luderias nas 14 metrópoles brasileiras, com destaque para Salvador: avaliação dos clientes, preço e cardápio.</w:t>
       </w:r>
     </w:p>
     <w:p>
@@ -366,7 +366,7 @@
           <w:sz w:val="20"/>
           <w:szCs w:val="20"/>
         </w:rPr>
-        <w:t xml:space="preserve"> o ritmo de novas avaliações no Google, calibrado pela contagem de ocupação, estima o fluxo de clientes dos concorrentes com margem de erro aceitável para a decisão.</w:t>
+        <w:t xml:space="preserve"> o ritmo de novas avaliações no Google, calibrado pela contagem de ocupação e pelas notas fiscais, estima o fluxo de clientes dos concorrentes com margem de erro aceitável para a decisão.</w:t>
       </w:r>
     </w:p>
     <w:p>
@@ -379,7 +379,7 @@
           <w:sz w:val="20"/>
           <w:szCs w:val="20"/>
         </w:rPr>
-        <w:t xml:space="preserve">As hipóteses foram registradas em 14/09/2026, antes da coleta das avaliações. Elas são testadas uma única vez, em uma parte da base separada para esse fim:</w:t>
+        <w:t xml:space="preserve">As hipóteses foram registradas em 14/09/2026 e ajustadas em 18/09/2026 (emenda 2), antes da coleta das avaliações. Elas são testadas uma única vez, em uma parte da base separada para esse fim. Os códigos seguem o registro prévio:</w:t>
       </w:r>
     </w:p>
     <w:p>
@@ -407,35 +407,7 @@
           <w:sz w:val="20"/>
           <w:szCs w:val="20"/>
         </w:rPr>
-        <w:t xml:space="preserve"> reclamações sobre atendimento e sobre a explicação dos jogos reduzem mais a nota do cliente do que reclamações sobre comida e bebida.</w:t>
-      </w:r>
-    </w:p>
-    <w:p>
-      <w:pPr>
-        <w:pStyle w:val="ListParagraph"/>
-        <w:numPr>
-          <w:ilvl w:val="0"/>
-          <w:numId w:val="3"/>
-        </w:numPr>
-        <w:spacing w:after="60"/>
-      </w:pPr>
-      <w:r>
-        <w:rPr>
-          <w:rFonts w:ascii="Arial" w:cs="Arial" w:eastAsia="Arial" w:hAnsi="Arial"/>
-          <w:b/>
-          <w:bCs/>
-          <w:sz w:val="20"/>
-          <w:szCs w:val="20"/>
-        </w:rPr>
-        <w:t xml:space="preserve">H2 - Comida:</w:t>
-      </w:r>
-      <w:r>
-        <w:rPr>
-          <w:rFonts w:ascii="Arial" w:cs="Arial" w:eastAsia="Arial" w:hAnsi="Arial"/>
-          <w:sz w:val="20"/>
-          <w:szCs w:val="20"/>
-        </w:rPr>
-        <w:t xml:space="preserve"> elogios à comida estão associados a notas mais altas, na comparação dentro de um mesmo estabelecimento.</w:t>
+        <w:t xml:space="preserve"> reclamações sobre o atendimento e o ambiente reduzem mais a nota do cliente do que reclamações sobre comida e bebida.</w:t>
       </w:r>
     </w:p>
     <w:p>
@@ -483,34 +455,6 @@
           <w:sz w:val="20"/>
           <w:szCs w:val="20"/>
         </w:rPr>
-        <w:t xml:space="preserve">H4 - Roteiro da saída:</w:t>
-      </w:r>
-      <w:r>
-        <w:rPr>
-          <w:rFonts w:ascii="Arial" w:cs="Arial" w:eastAsia="Arial" w:hAnsi="Arial"/>
-          <w:sz w:val="20"/>
-          <w:szCs w:val="20"/>
-        </w:rPr>
-        <w:t xml:space="preserve"> nas luderias sem cozinha própria, é mais comum que o cliente avalie também um restaurante no mesmo dia.</w:t>
-      </w:r>
-    </w:p>
-    <w:p>
-      <w:pPr>
-        <w:pStyle w:val="ListParagraph"/>
-        <w:numPr>
-          <w:ilvl w:val="0"/>
-          <w:numId w:val="3"/>
-        </w:numPr>
-        <w:spacing w:after="60"/>
-      </w:pPr>
-      <w:r>
-        <w:rPr>
-          <w:rFonts w:ascii="Arial" w:cs="Arial" w:eastAsia="Arial" w:hAnsi="Arial"/>
-          <w:b/>
-          <w:bCs/>
-          <w:sz w:val="20"/>
-          <w:szCs w:val="20"/>
-        </w:rPr>
         <w:t xml:space="preserve">H5 - Ticket:</w:t>
       </w:r>
       <w:r>
@@ -519,7 +463,7 @@
           <w:sz w:val="20"/>
           <w:szCs w:val="20"/>
         </w:rPr>
-        <w:t xml:space="preserve"> o gasto por pessoa citado nas avaliações fica dentro da faixa calculada a partir dos cardápios da mesma capital.</w:t>
+        <w:t xml:space="preserve"> o gasto por pessoa citado nas avaliações fica dentro da faixa calculada a partir dos cardápios do mesmo estabelecimento.</w:t>
       </w:r>
     </w:p>
     <w:p>
@@ -532,7 +476,7 @@
           <w:sz w:val="20"/>
           <w:szCs w:val="20"/>
         </w:rPr>
-        <w:t xml:space="preserve">A nota usada nas hipóteses é a nota centrada no avaliador: a nota dada à luderia menos a média das notas que a mesma pessoa dá a todos os lugares. Isso separa a experiência na luderia do grau de exigência de quem avalia.</w:t>
+        <w:t xml:space="preserve">As notas são comparadas dentro de cada estabelecimento. Assim, a diferença de nível entre as luderias não interfere no teste.</w:t>
       </w:r>
     </w:p>
     <w:p>
@@ -874,7 +818,7 @@
                 <w:sz w:val="20"/>
                 <w:szCs w:val="20"/>
               </w:rPr>
-              <w:t xml:space="preserve">Forma de cobrança, modelo de comida e bebida e acervo de jogos</w:t>
+              <w:t xml:space="preserve">Forma de cobrança e acervo de jogos</w:t>
             </w:r>
           </w:p>
         </w:tc>
@@ -1008,7 +952,7 @@
                 <w:sz w:val="20"/>
                 <w:szCs w:val="20"/>
               </w:rPr>
-              <w:t xml:space="preserve">Pontos de fluxo no entorno (parques e praias, shoppings, estações de metrô)</w:t>
+              <w:t xml:space="preserve">Pontos de fluxo no entorno (parques e praias, shoppings e estações de metrô)</w:t>
             </w:r>
           </w:p>
         </w:tc>
@@ -1142,7 +1086,7 @@
                 <w:sz w:val="20"/>
                 <w:szCs w:val="20"/>
               </w:rPr>
-              <w:t xml:space="preserve">Itens e preços do cardápio</w:t>
+              <w:t xml:space="preserve">Preços do cardápio</w:t>
             </w:r>
           </w:p>
         </w:tc>
@@ -1276,7 +1220,7 @@
                 <w:sz w:val="20"/>
                 <w:szCs w:val="20"/>
               </w:rPr>
-              <w:t xml:space="preserve">Nota e texto de cada avaliação</w:t>
+              <w:t xml:space="preserve">Número de itens do cardápio que precisam de preparo (sem contar itens prontos, como balas, refrigerantes e água)</w:t>
             </w:r>
           </w:p>
         </w:tc>
@@ -1308,7 +1252,7 @@
                 <w:sz w:val="20"/>
                 <w:szCs w:val="20"/>
               </w:rPr>
-              <w:t xml:space="preserve">Identificar o que pesa na satisfação e as principais reclamações</w:t>
+              <w:t xml:space="preserve">Medir a complexidade da cozinha dos concorrentes</w:t>
             </w:r>
           </w:p>
         </w:tc>
@@ -1340,7 +1284,7 @@
                 <w:sz w:val="20"/>
                 <w:szCs w:val="20"/>
               </w:rPr>
-              <w:t xml:space="preserve">Google Maps (30 a 50 avaliações mais recentes com texto por estabelecimento)</w:t>
+              <w:t xml:space="preserve">Cardápio digital de cada estabelecimento</w:t>
             </w:r>
           </w:p>
         </w:tc>
@@ -1372,7 +1316,7 @@
                 <w:sz w:val="20"/>
                 <w:szCs w:val="20"/>
               </w:rPr>
-              <w:t xml:space="preserve">Cópia das avaliações e codificação por dicionário de termos validado</w:t>
+              <w:t xml:space="preserve">Registro manual em planilha</w:t>
             </w:r>
           </w:p>
         </w:tc>
@@ -1410,7 +1354,7 @@
                 <w:sz w:val="20"/>
                 <w:szCs w:val="20"/>
               </w:rPr>
-              <w:t xml:space="preserve">Tamanho do grupo e valores em R$ citados nas avaliações</w:t>
+              <w:t xml:space="preserve">Nota e texto de cada avaliação</w:t>
             </w:r>
           </w:p>
         </w:tc>
@@ -1442,7 +1386,7 @@
                 <w:sz w:val="20"/>
                 <w:szCs w:val="20"/>
               </w:rPr>
-              <w:t xml:space="preserve">Estimar pessoas por mesa e gasto por pessoa</w:t>
+              <w:t xml:space="preserve">Identificar o que pesa na satisfação e as principais reclamações</w:t>
             </w:r>
           </w:p>
         </w:tc>
@@ -1474,7 +1418,7 @@
                 <w:sz w:val="20"/>
                 <w:szCs w:val="20"/>
               </w:rPr>
-              <w:t xml:space="preserve">Texto das avaliações</w:t>
+              <w:t xml:space="preserve">Google Maps (todas as avaliações com texto publicadas até "um mês atrás")</w:t>
             </w:r>
           </w:p>
         </w:tc>
@@ -1506,7 +1450,7 @@
                 <w:sz w:val="20"/>
                 <w:szCs w:val="20"/>
               </w:rPr>
-              <w:t xml:space="preserve">Codificação por dicionário de termos</w:t>
+              <w:t xml:space="preserve">Cópia das avaliações e codificação por dicionário de termos validado</w:t>
             </w:r>
           </w:p>
         </w:tc>
@@ -1544,7 +1488,7 @@
                 <w:sz w:val="20"/>
                 <w:szCs w:val="20"/>
               </w:rPr>
-              <w:t xml:space="preserve">Data das avaliações</w:t>
+              <w:t xml:space="preserve">Tamanho do grupo e valores em R$ citados nas avaliações</w:t>
             </w:r>
           </w:p>
         </w:tc>
@@ -1576,7 +1520,7 @@
                 <w:sz w:val="20"/>
                 <w:szCs w:val="20"/>
               </w:rPr>
-              <w:t xml:space="preserve">Estimar o ritmo de novos clientes de cada concorrente</w:t>
+              <w:t xml:space="preserve">Estimar pessoas por mesa e gasto por pessoa</w:t>
             </w:r>
           </w:p>
         </w:tc>
@@ -1608,7 +1552,7 @@
                 <w:sz w:val="20"/>
                 <w:szCs w:val="20"/>
               </w:rPr>
-              <w:t xml:space="preserve">Google Maps</w:t>
+              <w:t xml:space="preserve">Texto das avaliações</w:t>
             </w:r>
           </w:p>
         </w:tc>
@@ -1640,7 +1584,7 @@
                 <w:sz w:val="20"/>
                 <w:szCs w:val="20"/>
               </w:rPr>
-              <w:t xml:space="preserve">Cópia das avaliações</w:t>
+              <w:t xml:space="preserve">Codificação por dicionário de termos</w:t>
             </w:r>
           </w:p>
         </w:tc>
@@ -1678,7 +1622,7 @@
                 <w:sz w:val="20"/>
                 <w:szCs w:val="20"/>
               </w:rPr>
-              <w:t xml:space="preserve">Histórico de avaliações de cada avaliador</w:t>
+              <w:t xml:space="preserve">Data das avaliações</w:t>
             </w:r>
           </w:p>
         </w:tc>
@@ -1710,7 +1654,7 @@
                 <w:sz w:val="20"/>
                 <w:szCs w:val="20"/>
               </w:rPr>
-              <w:t xml:space="preserve">Calcular a nota centrada e o perfil de consumo do público</w:t>
+              <w:t xml:space="preserve">Estimar o ritmo de novos clientes de cada concorrente</w:t>
             </w:r>
           </w:p>
         </w:tc>
@@ -1742,7 +1686,7 @@
                 <w:sz w:val="20"/>
                 <w:szCs w:val="20"/>
               </w:rPr>
-              <w:t xml:space="preserve">Perfil público do avaliador no Google Maps, com o nome trocado por código</w:t>
+              <w:t xml:space="preserve">Google Maps</w:t>
             </w:r>
           </w:p>
         </w:tc>
@@ -1774,7 +1718,7 @@
                 <w:sz w:val="20"/>
                 <w:szCs w:val="20"/>
               </w:rPr>
-              <w:t xml:space="preserve">Cópia do histórico</w:t>
+              <w:t xml:space="preserve">Cópia das avaliações, com registro da data da coleta</w:t>
             </w:r>
           </w:p>
         </w:tc>
@@ -1812,7 +1756,7 @@
                 <w:sz w:val="20"/>
                 <w:szCs w:val="20"/>
               </w:rPr>
-              <w:t xml:space="preserve">Mesas ocupadas, pessoas presentes e tamanho dos grupos</w:t>
+              <w:t xml:space="preserve">Entrada e saída dos grupos e tamanho de cada grupo</w:t>
             </w:r>
           </w:p>
         </w:tc>
@@ -1844,7 +1788,7 @@
                 <w:sz w:val="20"/>
                 <w:szCs w:val="20"/>
               </w:rPr>
-              <w:t xml:space="preserve">Medir a taxa de ocupação e as pessoas por mesa</w:t>
+              <w:t xml:space="preserve">Medir o fluxo de pessoas, as pessoas por mesa e o tempo de permanência</w:t>
             </w:r>
           </w:p>
         </w:tc>
@@ -1908,7 +1852,7 @@
                 <w:sz w:val="20"/>
                 <w:szCs w:val="20"/>
               </w:rPr>
-              <w:t xml:space="preserve">Formulário de observação, com contagem a cada 30 minutos em 4 visitas sorteadas</w:t>
+              <w:t xml:space="preserve">Formulário de observação, do lado de fora, em 4 visitas (2 sorteadas e 2 de retorno)</w:t>
             </w:r>
           </w:p>
         </w:tc>
@@ -1946,7 +1890,7 @@
                 <w:sz w:val="20"/>
                 <w:szCs w:val="20"/>
               </w:rPr>
-              <w:t xml:space="preserve">Chegada e saída dos grupos</w:t>
+              <w:t xml:space="preserve">Pessoas no interior e mesas ocupadas</w:t>
             </w:r>
           </w:p>
         </w:tc>
@@ -1978,7 +1922,7 @@
                 <w:sz w:val="20"/>
                 <w:szCs w:val="20"/>
               </w:rPr>
-              <w:t xml:space="preserve">Medir o tempo de permanência e o giro de mesas</w:t>
+              <w:t xml:space="preserve">Medir a ocupação em cada horário</w:t>
             </w:r>
           </w:p>
         </w:tc>
@@ -2042,7 +1986,7 @@
                 <w:sz w:val="20"/>
                 <w:szCs w:val="20"/>
               </w:rPr>
-              <w:t xml:space="preserve">Formulário de observação</w:t>
+              <w:t xml:space="preserve">Formulário de observação, com contagem a cada 30 minutos</w:t>
             </w:r>
           </w:p>
         </w:tc>
@@ -2080,7 +2024,7 @@
                 <w:sz w:val="20"/>
                 <w:szCs w:val="20"/>
               </w:rPr>
-              <w:t xml:space="preserve">População e renda por capital e bairro</w:t>
+              <w:t xml:space="preserve">Número da nota fiscal (NFC-e) no início e no fim de cada visita</w:t>
             </w:r>
           </w:p>
         </w:tc>
@@ -2112,7 +2056,7 @@
                 <w:sz w:val="20"/>
                 <w:szCs w:val="20"/>
               </w:rPr>
-              <w:t xml:space="preserve">Dimensionar o mercado e escolher a praça</w:t>
+              <w:t xml:space="preserve">Medir as vendas entre a visita sorteada e a de retorno e as pessoas por nota</w:t>
             </w:r>
           </w:p>
         </w:tc>
@@ -2144,7 +2088,7 @@
                 <w:sz w:val="20"/>
                 <w:szCs w:val="20"/>
               </w:rPr>
-              <w:t xml:space="preserve">IBGE (Censo 2022 e estimativas populacionais)</w:t>
+              <w:t xml:space="preserve">São Jogue</w:t>
             </w:r>
           </w:p>
         </w:tc>
@@ -2176,7 +2120,7 @@
                 <w:sz w:val="20"/>
                 <w:szCs w:val="20"/>
               </w:rPr>
-              <w:t xml:space="preserve">Download das bases públicas</w:t>
+              <w:t xml:space="preserve">Registro da nota emitida em compra própria</w:t>
             </w:r>
           </w:p>
         </w:tc>
@@ -2214,7 +2158,7 @@
                 <w:sz w:val="20"/>
                 <w:szCs w:val="20"/>
               </w:rPr>
-              <w:t xml:space="preserve">Gasto das famílias com alimentação fora de casa</w:t>
+              <w:t xml:space="preserve">População e renda de Salvador, por bairro quando disponível</w:t>
             </w:r>
           </w:p>
         </w:tc>
@@ -2246,7 +2190,7 @@
                 <w:sz w:val="20"/>
                 <w:szCs w:val="20"/>
               </w:rPr>
-              <w:t xml:space="preserve">Conferir o ticket médio</w:t>
+              <w:t xml:space="preserve">Dimensionar o mercado e escolher o bairro</w:t>
             </w:r>
           </w:p>
         </w:tc>
@@ -2278,7 +2222,7 @@
                 <w:sz w:val="20"/>
                 <w:szCs w:val="20"/>
               </w:rPr>
-              <w:t xml:space="preserve">IBGE (Pesquisa de Orçamentos Familiares)</w:t>
+              <w:t xml:space="preserve">IBGE (Censo 2022, estimativas populacionais e PNAD Contínua)</w:t>
             </w:r>
           </w:p>
         </w:tc>
@@ -2348,7 +2292,7 @@
                 <w:sz w:val="20"/>
                 <w:szCs w:val="20"/>
               </w:rPr>
-              <w:t xml:space="preserve">Salário de admissão por ocupação</w:t>
+              <w:t xml:space="preserve">Gasto das famílias com alimentação fora de casa</w:t>
             </w:r>
           </w:p>
         </w:tc>
@@ -2380,7 +2324,7 @@
                 <w:sz w:val="20"/>
                 <w:szCs w:val="20"/>
               </w:rPr>
-              <w:t xml:space="preserve">Estimar o custo de pessoal</w:t>
+              <w:t xml:space="preserve">Conferir o ticket médio</w:t>
             </w:r>
           </w:p>
         </w:tc>
@@ -2412,7 +2356,7 @@
                 <w:sz w:val="20"/>
                 <w:szCs w:val="20"/>
               </w:rPr>
-              <w:t xml:space="preserve">Novo CAGED (Ministério do Trabalho)</w:t>
+              <w:t xml:space="preserve">IBGE (Pesquisa de Orçamentos Familiares)</w:t>
             </w:r>
           </w:p>
         </w:tc>
@@ -2482,7 +2426,141 @@
                 <w:sz w:val="20"/>
                 <w:szCs w:val="20"/>
               </w:rPr>
-              <w:t xml:space="preserve">Aluguel comercial por m²</w:t>
+              <w:t xml:space="preserve">Salário de admissão por ocupação em Salvador</w:t>
+            </w:r>
+          </w:p>
+        </w:tc>
+        <w:tc>
+          <w:tcPr>
+            <w:tcW w:type="dxa" w:w="3848"/>
+            <w:tcBorders>
+              <w:top w:val="single" w:color="000000" w:sz="4"/>
+              <w:left w:val="single" w:color="000000" w:sz="4"/>
+              <w:bottom w:val="single" w:color="000000" w:sz="4"/>
+              <w:right w:val="single" w:color="000000" w:sz="4"/>
+            </w:tcBorders>
+            <w:tcMar>
+              <w:top w:type="dxa" w:w="60"/>
+              <w:left w:type="dxa" w:w="100"/>
+              <w:bottom w:type="dxa" w:w="60"/>
+              <w:right w:type="dxa" w:w="100"/>
+            </w:tcMar>
+          </w:tcPr>
+          <w:p>
+            <w:pPr>
+              <w:spacing w:after="40"/>
+            </w:pPr>
+            <w:r>
+              <w:rPr>
+                <w:rFonts w:ascii="Arial" w:cs="Arial" w:eastAsia="Arial" w:hAnsi="Arial"/>
+                <w:b w:val="false"/>
+                <w:bCs w:val="false"/>
+                <w:sz w:val="20"/>
+                <w:szCs w:val="20"/>
+              </w:rPr>
+              <w:t xml:space="preserve">Estimar o custo de pessoal</w:t>
+            </w:r>
+          </w:p>
+        </w:tc>
+        <w:tc>
+          <w:tcPr>
+            <w:tcW w:type="dxa" w:w="3573"/>
+            <w:tcBorders>
+              <w:top w:val="single" w:color="000000" w:sz="4"/>
+              <w:left w:val="single" w:color="000000" w:sz="4"/>
+              <w:bottom w:val="single" w:color="000000" w:sz="4"/>
+              <w:right w:val="single" w:color="000000" w:sz="4"/>
+            </w:tcBorders>
+            <w:tcMar>
+              <w:top w:type="dxa" w:w="60"/>
+              <w:left w:type="dxa" w:w="100"/>
+              <w:bottom w:type="dxa" w:w="60"/>
+              <w:right w:type="dxa" w:w="100"/>
+            </w:tcMar>
+          </w:tcPr>
+          <w:p>
+            <w:pPr>
+              <w:spacing w:after="40"/>
+            </w:pPr>
+            <w:r>
+              <w:rPr>
+                <w:rFonts w:ascii="Arial" w:cs="Arial" w:eastAsia="Arial" w:hAnsi="Arial"/>
+                <w:b w:val="false"/>
+                <w:bCs w:val="false"/>
+                <w:sz w:val="20"/>
+                <w:szCs w:val="20"/>
+              </w:rPr>
+              <w:t xml:space="preserve">Novo CAGED (Ministério do Trabalho)</w:t>
+            </w:r>
+          </w:p>
+        </w:tc>
+        <w:tc>
+          <w:tcPr>
+            <w:tcW w:type="dxa" w:w="3576"/>
+            <w:tcBorders>
+              <w:top w:val="single" w:color="000000" w:sz="4"/>
+              <w:left w:val="single" w:color="000000" w:sz="4"/>
+              <w:bottom w:val="single" w:color="000000" w:sz="4"/>
+              <w:right w:val="single" w:color="000000" w:sz="4"/>
+            </w:tcBorders>
+            <w:tcMar>
+              <w:top w:type="dxa" w:w="60"/>
+              <w:left w:type="dxa" w:w="100"/>
+              <w:bottom w:type="dxa" w:w="60"/>
+              <w:right w:type="dxa" w:w="100"/>
+            </w:tcMar>
+          </w:tcPr>
+          <w:p>
+            <w:pPr>
+              <w:spacing w:after="40"/>
+            </w:pPr>
+            <w:r>
+              <w:rPr>
+                <w:rFonts w:ascii="Arial" w:cs="Arial" w:eastAsia="Arial" w:hAnsi="Arial"/>
+                <w:b w:val="false"/>
+                <w:bCs w:val="false"/>
+                <w:sz w:val="20"/>
+                <w:szCs w:val="20"/>
+              </w:rPr>
+              <w:t xml:space="preserve">Download das bases públicas</w:t>
+            </w:r>
+          </w:p>
+        </w:tc>
+      </w:tr>
+      <w:tr>
+        <w:trPr>
+          <w:cantSplit/>
+          <w:tblHeader w:val="false"/>
+        </w:trPr>
+        <w:tc>
+          <w:tcPr>
+            <w:tcW w:type="dxa" w:w="3573"/>
+            <w:tcBorders>
+              <w:top w:val="single" w:color="000000" w:sz="4"/>
+              <w:left w:val="single" w:color="000000" w:sz="4"/>
+              <w:bottom w:val="single" w:color="000000" w:sz="4"/>
+              <w:right w:val="single" w:color="000000" w:sz="4"/>
+            </w:tcBorders>
+            <w:tcMar>
+              <w:top w:type="dxa" w:w="60"/>
+              <w:left w:type="dxa" w:w="100"/>
+              <w:bottom w:type="dxa" w:w="60"/>
+              <w:right w:type="dxa" w:w="100"/>
+            </w:tcMar>
+          </w:tcPr>
+          <w:p>
+            <w:pPr>
+              <w:spacing w:after="40"/>
+            </w:pPr>
+            <w:r>
+              <w:rPr>
+                <w:rFonts w:ascii="Arial" w:cs="Arial" w:eastAsia="Arial" w:hAnsi="Arial"/>
+                <w:b w:val="false"/>
+                <w:bCs w:val="false"/>
+                <w:sz w:val="20"/>
+                <w:szCs w:val="20"/>
+              </w:rPr>
+              <w:t xml:space="preserve">Aluguel comercial por m² em Salvador</w:t>
             </w:r>
           </w:p>
         </w:tc>
@@ -2870,7 +2948,7 @@
           <w:sz w:val="24"/>
           <w:szCs w:val="24"/>
         </w:rPr>
-        <w:t xml:space="preserve">Situação em 17/09/2026</w:t>
+        <w:t xml:space="preserve">Situação em 18/09/2026</w:t>
       </w:r>
     </w:p>
     <w:tbl>
@@ -3086,17 +3164,38 @@
           </w:tcPr>
           <w:p>
             <w:pPr>
-              <w:spacing w:after="40"/>
-            </w:pPr>
-            <w:r>
-              <w:rPr>
-                <w:rFonts w:ascii="Arial" w:cs="Arial" w:eastAsia="Arial" w:hAnsi="Arial"/>
-                <w:b w:val="false"/>
-                <w:bCs w:val="false"/>
-                <w:sz w:val="20"/>
-                <w:szCs w:val="20"/>
-              </w:rPr>
-              <w:t xml:space="preserve">Concluído e datado em 14/09</w:t>
+              <w:pStyle w:val="ListParagraph"/>
+              <w:numPr>
+                <w:ilvl w:val="0"/>
+                <w:numId w:val="3"/>
+              </w:numPr>
+              <w:spacing w:after="40"/>
+            </w:pPr>
+            <w:r>
+              <w:rPr>
+                <w:rFonts w:ascii="Arial" w:cs="Arial" w:eastAsia="Arial" w:hAnsi="Arial"/>
+                <w:sz w:val="20"/>
+                <w:szCs w:val="20"/>
+              </w:rPr>
+              <w:t xml:space="preserve">Concluído em 14/09</w:t>
+            </w:r>
+          </w:p>
+          <w:p>
+            <w:pPr>
+              <w:pStyle w:val="ListParagraph"/>
+              <w:numPr>
+                <w:ilvl w:val="0"/>
+                <w:numId w:val="3"/>
+              </w:numPr>
+              <w:spacing w:after="40"/>
+            </w:pPr>
+            <w:r>
+              <w:rPr>
+                <w:rFonts w:ascii="Arial" w:cs="Arial" w:eastAsia="Arial" w:hAnsi="Arial"/>
+                <w:sz w:val="20"/>
+                <w:szCs w:val="20"/>
+              </w:rPr>
+              <w:t xml:space="preserve">Emenda 2 em 18/09</w:t>
             </w:r>
           </w:p>
         </w:tc>
@@ -3204,7 +3303,7 @@
                 <w:sz w:val="20"/>
                 <w:szCs w:val="20"/>
               </w:rPr>
-              <w:t xml:space="preserve">Busca dos estabelecimentos concorrentes nas 27 capitais</w:t>
+              <w:t xml:space="preserve">Busca dos estabelecimentos concorrentes</w:t>
             </w:r>
           </w:p>
         </w:tc>
@@ -3296,17 +3395,38 @@
           </w:tcPr>
           <w:p>
             <w:pPr>
-              <w:spacing w:after="40"/>
-            </w:pPr>
-            <w:r>
-              <w:rPr>
-                <w:rFonts w:ascii="Arial" w:cs="Arial" w:eastAsia="Arial" w:hAnsi="Arial"/>
-                <w:b w:val="false"/>
-                <w:bCs w:val="false"/>
-                <w:sz w:val="20"/>
-                <w:szCs w:val="20"/>
-              </w:rPr>
-              <w:t xml:space="preserve">Em andamento: falta definir o número mínimo de avaliações e confirmar quais são espaços de jogo</w:t>
+              <w:pStyle w:val="ListParagraph"/>
+              <w:numPr>
+                <w:ilvl w:val="0"/>
+                <w:numId w:val="3"/>
+              </w:numPr>
+              <w:spacing w:after="40"/>
+            </w:pPr>
+            <w:r>
+              <w:rPr>
+                <w:rFonts w:ascii="Arial" w:cs="Arial" w:eastAsia="Arial" w:hAnsi="Arial"/>
+                <w:sz w:val="20"/>
+                <w:szCs w:val="20"/>
+              </w:rPr>
+              <w:t xml:space="preserve">Em andamento: recorte de 164 candidatos com mais de 100 avaliações nas 14 metrópoles</w:t>
+            </w:r>
+          </w:p>
+          <w:p>
+            <w:pPr>
+              <w:pStyle w:val="ListParagraph"/>
+              <w:numPr>
+                <w:ilvl w:val="0"/>
+                <w:numId w:val="3"/>
+              </w:numPr>
+              <w:spacing w:after="40"/>
+            </w:pPr>
+            <w:r>
+              <w:rPr>
+                <w:rFonts w:ascii="Arial" w:cs="Arial" w:eastAsia="Arial" w:hAnsi="Arial"/>
+                <w:sz w:val="20"/>
+                <w:szCs w:val="20"/>
+              </w:rPr>
+              <w:t xml:space="preserve">Falta a curadoria manual (100 a 150 esperados)</w:t>
             </w:r>
           </w:p>
         </w:tc>
@@ -3344,7 +3464,7 @@
                 <w:sz w:val="20"/>
                 <w:szCs w:val="20"/>
               </w:rPr>
-              <w:t xml:space="preserve">Avaliações, perfis dos avaliadores, cardápios e contagem de ocupação</w:t>
+              <w:t xml:space="preserve">Avaliações, cardápios e contagem de ocupação</w:t>
             </w:r>
           </w:p>
         </w:tc>
@@ -3433,7 +3553,7 @@
           <w:sz w:val="20"/>
           <w:szCs w:val="20"/>
         </w:rPr>
-        <w:t xml:space="preserve">Perfis dos avaliadores.</w:t>
+        <w:t xml:space="preserve">Coleta das avaliações do último mês.</w:t>
       </w:r>
       <w:r>
         <w:rPr>
@@ -3441,7 +3561,7 @@
           <w:sz w:val="20"/>
           <w:szCs w:val="20"/>
         </w:rPr>
-        <w:t xml:space="preserve"> É a coleta mais longa. Começa quando as primeiras avaliações estiverem copiadas e termina até 14/10.</w:t>
+        <w:t xml:space="preserve"> Todos os estabelecimentos são coletados no menor intervalo possível, para que a janela de um mês seja a mesma para todos. Termina até 27/09.</w:t>
       </w:r>
     </w:p>
     <w:p>
@@ -3525,7 +3645,7 @@
           <w:sz w:val="20"/>
           <w:szCs w:val="20"/>
         </w:rPr>
-        <w:t xml:space="preserve"> São quatro visitas entre 29/09 e 28/10. A estimativa de ocupação depende delas.</w:t>
+        <w:t xml:space="preserve"> Visitas sorteadas entre 29/09 e 13/10; visitas de retorno até 28/10. A estimativa de ocupação depende delas.</w:t>
       </w:r>
     </w:p>
     <w:p>
@@ -3582,7 +3702,7 @@
           <w:sz w:val="20"/>
           <w:szCs w:val="20"/>
         </w:rPr>
-        <w:t xml:space="preserve">A contagem é a única coleta presencial do trabalho. Ela mede quantas mesas e pessoas ocupam a luderia em cada horário.</w:t>
+        <w:t xml:space="preserve">A contagem é a única coleta presencial do trabalho. Ela mede quantas pessoas entram na luderia, quanto tempo ficam e quantas notas fiscais são emitidas.</w:t>
       </w:r>
     </w:p>
     <w:p>
@@ -3610,7 +3730,7 @@
           <w:sz w:val="20"/>
           <w:szCs w:val="20"/>
         </w:rPr>
-        <w:t xml:space="preserve">, duas em cada unidade da São Jogue.</w:t>
+        <w:t xml:space="preserve">, duas em cada unidade da São Jogue: uma sorteada e uma de retorno.</w:t>
       </w:r>
     </w:p>
     <w:p>
@@ -3630,7 +3750,7 @@
           <w:sz w:val="20"/>
           <w:szCs w:val="20"/>
         </w:rPr>
-        <w:t xml:space="preserve">Dois períodos</w:t>
+        <w:t xml:space="preserve">Visitas sorteadas</w:t>
       </w:r>
       <w:r>
         <w:rPr>
@@ -3638,43 +3758,7 @@
           <w:sz w:val="20"/>
           <w:szCs w:val="20"/>
         </w:rPr>
-        <w:t xml:space="preserve">, definidos pelo pagamento dos servidores estaduais da Bahia (29/09 para inativos e pensionistas; 30/09 para ativos):</w:t>
-      </w:r>
-    </w:p>
-    <w:p>
-      <w:pPr>
-        <w:pStyle w:val="ListParagraph"/>
-        <w:numPr>
-          <w:ilvl w:val="1"/>
-          <w:numId w:val="3"/>
-        </w:numPr>
-        <w:spacing w:after="60"/>
-      </w:pPr>
-      <w:r>
-        <w:rPr>
-          <w:rFonts w:ascii="Arial" w:cs="Arial" w:eastAsia="Arial" w:hAnsi="Arial"/>
-          <w:sz w:val="20"/>
-          <w:szCs w:val="20"/>
-        </w:rPr>
-        <w:t xml:space="preserve">quinzena após o pagamento: 29/09 a 13/10;</w:t>
-      </w:r>
-    </w:p>
-    <w:p>
-      <w:pPr>
-        <w:pStyle w:val="ListParagraph"/>
-        <w:numPr>
-          <w:ilvl w:val="1"/>
-          <w:numId w:val="3"/>
-        </w:numPr>
-        <w:spacing w:after="60"/>
-      </w:pPr>
-      <w:r>
-        <w:rPr>
-          <w:rFonts w:ascii="Arial" w:cs="Arial" w:eastAsia="Arial" w:hAnsi="Arial"/>
-          <w:sz w:val="20"/>
-          <w:szCs w:val="20"/>
-        </w:rPr>
-        <w:t xml:space="preserve">quinzena antes do pagamento seguinte: 14/10 a 28/10.</w:t>
+        <w:t xml:space="preserve"> na quinzena após o pagamento dos servidores estaduais da Bahia (29/09 a 13/10; o pagamento começa em 29/09 para inativos e pensionistas e em 30/09 para ativos). Uma visita cai em dia útil (segunda a quinta) e a outra no fim de semana (sexta a domingo). Um sorteio define qual unidade fica com o dia útil.</w:t>
       </w:r>
     </w:p>
     <w:p>
@@ -3694,7 +3778,7 @@
           <w:sz w:val="20"/>
           <w:szCs w:val="20"/>
         </w:rPr>
-        <w:t xml:space="preserve">Em cada quinzena</w:t>
+        <w:t xml:space="preserve">Visitas de retorno</w:t>
       </w:r>
       <w:r>
         <w:rPr>
@@ -3702,7 +3786,7 @@
           <w:sz w:val="20"/>
           <w:szCs w:val="20"/>
         </w:rPr>
-        <w:t xml:space="preserve">, uma visita em dia útil (segunda a quinta) e uma no fim de semana (sexta a domingo). Cada unidade recebe uma visita por quinzena e uma de cada tipo de dia.</w:t>
+        <w:t xml:space="preserve"> 15 dias depois de cada visita sorteada, na mesma unidade. Caem na quinzena anterior ao pagamento seguinte (14/10 a 28/10). Como 15 dias não fecham semanas inteiras, o retorno cai no dia da semana seguinte ao da visita sorteada.</w:t>
       </w:r>
     </w:p>
     <w:p>
@@ -3722,7 +3806,7 @@
           <w:sz w:val="20"/>
           <w:szCs w:val="20"/>
         </w:rPr>
-        <w:t xml:space="preserve">Horário:</w:t>
+        <w:t xml:space="preserve">Nota fiscal:</w:t>
       </w:r>
       <w:r>
         <w:rPr>
@@ -3730,7 +3814,35 @@
           <w:sz w:val="20"/>
           <w:szCs w:val="20"/>
         </w:rPr>
-        <w:t xml:space="preserve"> a São Jogue funciona das 12h00 às 22h00. Cada visita dura 3 horas, em um de três turnos (12h00-15h00, 15h30-18h30 ou 19h00-22h00), com uma contagem a cada 30 minutos.</w:t>
+        <w:t xml:space="preserve"> em cada visita, o número da NFC-e é registrado no início e no fim, com uma compra própria. A diferença entre a visita sorteada e a de retorno dá as notas emitidas em 15 dias. A diferença dentro da mesma visita, comparada às entradas contadas, dá as pessoas por nota.</w:t>
+      </w:r>
+    </w:p>
+    <w:p>
+      <w:pPr>
+        <w:pStyle w:val="ListParagraph"/>
+        <w:numPr>
+          <w:ilvl w:val="0"/>
+          <w:numId w:val="3"/>
+        </w:numPr>
+        <w:spacing w:after="60"/>
+      </w:pPr>
+      <w:r>
+        <w:rPr>
+          <w:rFonts w:ascii="Arial" w:cs="Arial" w:eastAsia="Arial" w:hAnsi="Arial"/>
+          <w:b/>
+          <w:bCs/>
+          <w:sz w:val="20"/>
+          <w:szCs w:val="20"/>
+        </w:rPr>
+        <w:t xml:space="preserve">Observação do lado de fora</w:t>
+      </w:r>
+      <w:r>
+        <w:rPr>
+          <w:rFonts w:ascii="Arial" w:cs="Arial" w:eastAsia="Arial" w:hAnsi="Arial"/>
+          <w:sz w:val="20"/>
+          <w:szCs w:val="20"/>
+        </w:rPr>
+        <w:t xml:space="preserve">, sem duração fixa. O início e o fim de cada visita são registrados, e os resultados são calculados por hora observada. Entradas e saídas dos grupos são registradas continuamente; pessoas no interior e mesas ocupadas, a cada 30 minutos.</w:t>
       </w:r>
     </w:p>
     <w:p>
@@ -3758,7 +3870,7 @@
           <w:sz w:val="20"/>
           <w:szCs w:val="20"/>
         </w:rPr>
-        <w:t xml:space="preserve"> os dias e turnos são sorteados na planilha contagem_sorteio_visitas.xlsx antes da primeira visita. Feriados e dias sem funcionamento ficam de fora.</w:t>
+        <w:t xml:space="preserve"> feito na planilha contagem_sorteio_visitas.xlsx antes da primeira visita. Feriados e dias sem funcionamento ficam de fora.</w:t>
       </w:r>
     </w:p>
     <w:p>
@@ -3800,7 +3912,7 @@
           <w:sz w:val="20"/>
           <w:szCs w:val="20"/>
         </w:rPr>
-        <w:t xml:space="preserve">As semanas vão de sábado a sexta-feira. Assim, cada entrega definida pela orientação (18/09, 02/10, 16/10, 30/10 e 06/11) cai no último dia de uma semana. A versão final para a banca tem 16/11 como data de referência, e a defesa ocorre no final de novembro. Feriados nacionais no período: 12/10, 02/11 e 20/11.</w:t>
+        <w:t xml:space="preserve">As semanas vão de sábado a sexta-feira. A versão final para a banca tem 16/11 como data de referência, e a defesa ocorre no final de novembro. Feriados nacionais no período: 12/10, 02/11 e 20/11.</w:t>
       </w:r>
     </w:p>
     <w:tbl>
@@ -4093,7 +4205,7 @@
                 <w:sz w:val="20"/>
                 <w:szCs w:val="20"/>
               </w:rPr>
-              <w:t xml:space="preserve">Coleta e tratamento das bases públicas (14/09)</w:t>
+              <w:t xml:space="preserve">Busca de trabalhos acadêmicos com temas e recortes similares</w:t>
             </w:r>
           </w:p>
           <w:p>
@@ -4111,7 +4223,7 @@
                 <w:sz w:val="20"/>
                 <w:szCs w:val="20"/>
               </w:rPr>
-              <w:t xml:space="preserve">Busca e triagem dos estabelecimentos concorrentes</w:t>
+              <w:t xml:space="preserve">Definição das variáveis de interesse</w:t>
             </w:r>
           </w:p>
           <w:p>
@@ -4129,7 +4241,7 @@
                 <w:sz w:val="20"/>
                 <w:szCs w:val="20"/>
               </w:rPr>
-              <w:t xml:space="preserve">Recorte pelas regiões metropolitanas das capitais</w:t>
+              <w:t xml:space="preserve">Coleta das bases públicas (IBGE, CAGED, FipeZap, Simples Nacional, Banco Central) em 14/09</w:t>
             </w:r>
           </w:p>
           <w:p>
@@ -4147,26 +4259,9 @@
                 <w:sz w:val="20"/>
                 <w:szCs w:val="20"/>
               </w:rPr>
-              <w:t xml:space="preserve">Datas de pagamento dos servidores e planilha de sorteio da contagem</w:t>
-            </w:r>
-          </w:p>
-        </w:tc>
-        <w:tc>
-          <w:tcPr>
-            <w:tcW w:type="dxa" w:w="3428"/>
-            <w:tcBorders>
-              <w:top w:val="single" w:color="000000" w:sz="4"/>
-              <w:left w:val="single" w:color="000000" w:sz="4"/>
-              <w:bottom w:val="single" w:color="000000" w:sz="4"/>
-              <w:right w:val="single" w:color="000000" w:sz="4"/>
-            </w:tcBorders>
-            <w:tcMar>
-              <w:top w:type="dxa" w:w="60"/>
-              <w:left w:type="dxa" w:w="100"/>
-              <w:bottom w:type="dxa" w:w="60"/>
-              <w:right w:type="dxa" w:w="100"/>
-            </w:tcMar>
-          </w:tcPr>
+              <w:t xml:space="preserve">Busca dos estabelecimentos nas capitais pelo Google Maps e definição dos critérios de filtragem</w:t>
+            </w:r>
+          </w:p>
           <w:p>
             <w:pPr>
               <w:pStyle w:val="ListParagraph"/>
@@ -4182,9 +4277,26 @@
                 <w:sz w:val="20"/>
                 <w:szCs w:val="20"/>
               </w:rPr>
-              <w:t xml:space="preserve">Registro prévio (14/09)</w:t>
-            </w:r>
-          </w:p>
+              <w:t xml:space="preserve">Recorte dos estabelecimentos com mais de 100 avaliações nas 14 metrópoles</w:t>
+            </w:r>
+          </w:p>
+        </w:tc>
+        <w:tc>
+          <w:tcPr>
+            <w:tcW w:type="dxa" w:w="3428"/>
+            <w:tcBorders>
+              <w:top w:val="single" w:color="000000" w:sz="4"/>
+              <w:left w:val="single" w:color="000000" w:sz="4"/>
+              <w:bottom w:val="single" w:color="000000" w:sz="4"/>
+              <w:right w:val="single" w:color="000000" w:sz="4"/>
+            </w:tcBorders>
+            <w:tcMar>
+              <w:top w:type="dxa" w:w="60"/>
+              <w:left w:type="dxa" w:w="100"/>
+              <w:bottom w:type="dxa" w:w="60"/>
+              <w:right w:type="dxa" w:w="100"/>
+            </w:tcMar>
+          </w:tcPr>
           <w:p>
             <w:pPr>
               <w:pStyle w:val="ListParagraph"/>
@@ -4200,7 +4312,7 @@
                 <w:sz w:val="20"/>
                 <w:szCs w:val="20"/>
               </w:rPr>
-              <w:t xml:space="preserve">Leitura das cinco referências essenciais</w:t>
+              <w:t xml:space="preserve">Registro prévio (14/09) e emenda 2 (18/09)</w:t>
             </w:r>
           </w:p>
           <w:p>
@@ -4355,7 +4467,7 @@
                 <w:sz w:val="20"/>
                 <w:szCs w:val="20"/>
               </w:rPr>
-              <w:t xml:space="preserve">Definição do número mínimo de avaliações por estabelecimento (teste em amostra)</w:t>
+              <w:t xml:space="preserve">Curadoria manual e lista final de estabelecimentos</w:t>
             </w:r>
           </w:p>
           <w:p>
@@ -4373,7 +4485,7 @@
                 <w:sz w:val="20"/>
                 <w:szCs w:val="20"/>
               </w:rPr>
-              <w:t xml:space="preserve">Lista final de estabelecimentos</w:t>
+              <w:t xml:space="preserve">Teste da coleta das avaliações do último mês em uma amostra</w:t>
             </w:r>
           </w:p>
           <w:p>
@@ -4391,7 +4503,7 @@
                 <w:sz w:val="20"/>
                 <w:szCs w:val="20"/>
               </w:rPr>
-              <w:t xml:space="preserve">Início da cópia das avaliações</w:t>
+              <w:t xml:space="preserve">Início da coleta das avaliações com texto</w:t>
             </w:r>
           </w:p>
           <w:p>
@@ -4409,7 +4521,7 @@
                 <w:sz w:val="20"/>
                 <w:szCs w:val="20"/>
               </w:rPr>
-              <w:t xml:space="preserve">Início da coleta dos cardápios</w:t>
+              <w:t xml:space="preserve">Elaboração do manual de codificação das avaliações</w:t>
             </w:r>
           </w:p>
           <w:p>
@@ -4427,7 +4539,7 @@
                 <w:sz w:val="20"/>
                 <w:szCs w:val="20"/>
               </w:rPr>
-              <w:t xml:space="preserve">Sorteio das visitas e formulário de observação da contagem</w:t>
+              <w:t xml:space="preserve">Início da coleta dos cardápios (preços e itens com preparo)</w:t>
             </w:r>
           </w:p>
           <w:p>
@@ -4445,7 +4557,7 @@
                 <w:sz w:val="20"/>
                 <w:szCs w:val="20"/>
               </w:rPr>
-              <w:t xml:space="preserve">Manual de codificação das avaliações</w:t>
+              <w:t xml:space="preserve">Sorteio das visitas e formulário de observação da contagem</w:t>
             </w:r>
           </w:p>
         </w:tc>
@@ -4498,7 +4610,7 @@
                 <w:sz w:val="20"/>
                 <w:szCs w:val="20"/>
               </w:rPr>
-              <w:t xml:space="preserve">Rascunho do cap. 2</w:t>
+              <w:t xml:space="preserve">Rascunho do cap. 2 (Referencial teórico)</w:t>
             </w:r>
           </w:p>
         </w:tc>
@@ -4635,7 +4747,7 @@
                 <w:sz w:val="20"/>
                 <w:szCs w:val="20"/>
               </w:rPr>
-              <w:t xml:space="preserve">Conclusão da cópia das avaliações (27/09)</w:t>
+              <w:t xml:space="preserve">Conclusão da coleta das avaliações (27/09)</w:t>
             </w:r>
           </w:p>
           <w:p>
@@ -4653,7 +4765,7 @@
                 <w:sz w:val="20"/>
                 <w:szCs w:val="20"/>
               </w:rPr>
-              <w:t xml:space="preserve">Início da coleta dos perfis dos avaliadores</w:t>
+              <w:t xml:space="preserve">Divisão da base em parte exploratória e parte confirmatória (28/09)</w:t>
             </w:r>
           </w:p>
           <w:p>
@@ -4671,7 +4783,7 @@
                 <w:sz w:val="20"/>
                 <w:szCs w:val="20"/>
               </w:rPr>
-              <w:t xml:space="preserve">Divisão da base em parte exploratória e parte confirmatória (28/09)</w:t>
+              <w:t xml:space="preserve">Primeira codificação das 200 avaliações da amostra (até 02/10)</w:t>
             </w:r>
           </w:p>
           <w:p>
@@ -4689,7 +4801,7 @@
                 <w:sz w:val="20"/>
                 <w:szCs w:val="20"/>
               </w:rPr>
-              <w:t xml:space="preserve">Primeira codificação das 200 avaliações da amostra (até 02/10)</w:t>
+              <w:t xml:space="preserve">Conclusão dos cardápios (30/09)</w:t>
             </w:r>
           </w:p>
           <w:p>
@@ -4707,9 +4819,26 @@
                 <w:sz w:val="20"/>
                 <w:szCs w:val="20"/>
               </w:rPr>
-              <w:t xml:space="preserve">Conclusão dos cardápios (30/09)</w:t>
-            </w:r>
-          </w:p>
+              <w:t xml:space="preserve">Visitas sorteadas, conforme sorteio (a partir de 29/09)</w:t>
+            </w:r>
+          </w:p>
+        </w:tc>
+        <w:tc>
+          <w:tcPr>
+            <w:tcW w:type="dxa" w:w="3428"/>
+            <w:tcBorders>
+              <w:top w:val="single" w:color="000000" w:sz="4"/>
+              <w:left w:val="single" w:color="000000" w:sz="4"/>
+              <w:bottom w:val="single" w:color="000000" w:sz="4"/>
+              <w:right w:val="single" w:color="000000" w:sz="4"/>
+            </w:tcBorders>
+            <w:tcMar>
+              <w:top w:type="dxa" w:w="60"/>
+              <w:left w:type="dxa" w:w="100"/>
+              <w:bottom w:type="dxa" w:w="60"/>
+              <w:right w:type="dxa" w:w="100"/>
+            </w:tcMar>
+          </w:tcPr>
           <w:p>
             <w:pPr>
               <w:pStyle w:val="ListParagraph"/>
@@ -4725,26 +4854,9 @@
                 <w:sz w:val="20"/>
                 <w:szCs w:val="20"/>
               </w:rPr>
-              <w:t xml:space="preserve">Visitas da contagem, conforme sorteio (quinzena pós-pagamento a partir de 29/09)</w:t>
-            </w:r>
-          </w:p>
-        </w:tc>
-        <w:tc>
-          <w:tcPr>
-            <w:tcW w:type="dxa" w:w="3428"/>
-            <w:tcBorders>
-              <w:top w:val="single" w:color="000000" w:sz="4"/>
-              <w:left w:val="single" w:color="000000" w:sz="4"/>
-              <w:bottom w:val="single" w:color="000000" w:sz="4"/>
-              <w:right w:val="single" w:color="000000" w:sz="4"/>
-            </w:tcBorders>
-            <w:tcMar>
-              <w:top w:type="dxa" w:w="60"/>
-              <w:left w:type="dxa" w:w="100"/>
-              <w:bottom w:type="dxa" w:w="60"/>
-              <w:right w:type="dxa" w:w="100"/>
-            </w:tcMar>
-          </w:tcPr>
+              <w:t xml:space="preserve">Revisão final do projeto</w:t>
+            </w:r>
+          </w:p>
           <w:p>
             <w:pPr>
               <w:pStyle w:val="ListParagraph"/>
@@ -4760,25 +4872,7 @@
                 <w:sz w:val="20"/>
                 <w:szCs w:val="20"/>
               </w:rPr>
-              <w:t xml:space="preserve">Revisão final do projeto</w:t>
-            </w:r>
-          </w:p>
-          <w:p>
-            <w:pPr>
-              <w:pStyle w:val="ListParagraph"/>
-              <w:numPr>
-                <w:ilvl w:val="0"/>
-                <w:numId w:val="3"/>
-              </w:numPr>
-              <w:spacing w:after="40"/>
-            </w:pPr>
-            <w:r>
-              <w:rPr>
-                <w:rFonts w:ascii="Arial" w:cs="Arial" w:eastAsia="Arial" w:hAnsi="Arial"/>
-                <w:sz w:val="20"/>
-                <w:szCs w:val="20"/>
-              </w:rPr>
-              <w:t xml:space="preserve">Rascunho do cap. 3</w:t>
+              <w:t xml:space="preserve">Rascunho do cap. 3 (Metodologia)</w:t>
             </w:r>
           </w:p>
         </w:tc>
@@ -4915,7 +5009,7 @@
                 <w:sz w:val="20"/>
                 <w:szCs w:val="20"/>
               </w:rPr>
-              <w:t xml:space="preserve">Coleta dos perfis</w:t>
+              <w:t xml:space="preserve">Visitas sorteadas, conforme sorteio (até 13/10)</w:t>
             </w:r>
           </w:p>
           <w:p>
@@ -4933,7 +5027,7 @@
                 <w:sz w:val="20"/>
                 <w:szCs w:val="20"/>
               </w:rPr>
-              <w:t xml:space="preserve">Visitas da contagem, conforme sorteio</w:t>
+              <w:t xml:space="preserve">Busca de dados secundários sobre o setor de bares, lanchonetes e espaços de jogos</w:t>
             </w:r>
           </w:p>
           <w:p>
@@ -4951,6 +5045,42 @@
                 <w:sz w:val="20"/>
                 <w:szCs w:val="20"/>
               </w:rPr>
+              <w:t xml:space="preserve">Estatística descritiva dos concorrentes (preço, cardápio e avaliação por metrópole)</w:t>
+            </w:r>
+          </w:p>
+          <w:p>
+            <w:pPr>
+              <w:pStyle w:val="ListParagraph"/>
+              <w:numPr>
+                <w:ilvl w:val="0"/>
+                <w:numId w:val="3"/>
+              </w:numPr>
+              <w:spacing w:after="40"/>
+            </w:pPr>
+            <w:r>
+              <w:rPr>
+                <w:rFonts w:ascii="Arial" w:cs="Arial" w:eastAsia="Arial" w:hAnsi="Arial"/>
+                <w:sz w:val="20"/>
+                <w:szCs w:val="20"/>
+              </w:rPr>
+              <w:t xml:space="preserve">Cotações em Salvador (ponto, mobiliário e acervo)</w:t>
+            </w:r>
+          </w:p>
+          <w:p>
+            <w:pPr>
+              <w:pStyle w:val="ListParagraph"/>
+              <w:numPr>
+                <w:ilvl w:val="0"/>
+                <w:numId w:val="3"/>
+              </w:numPr>
+              <w:spacing w:after="40"/>
+            </w:pPr>
+            <w:r>
+              <w:rPr>
+                <w:rFonts w:ascii="Arial" w:cs="Arial" w:eastAsia="Arial" w:hAnsi="Arial"/>
+                <w:sz w:val="20"/>
+                <w:szCs w:val="20"/>
+              </w:rPr>
               <w:t xml:space="preserve">Estrutura do modelo financeiro (premissas, cálculos e cenários)</w:t>
             </w:r>
           </w:p>
@@ -4973,17 +5103,38 @@
           </w:tcPr>
           <w:p>
             <w:pPr>
-              <w:spacing w:after="40"/>
-            </w:pPr>
-            <w:r>
-              <w:rPr>
-                <w:rFonts w:ascii="Arial" w:cs="Arial" w:eastAsia="Arial" w:hAnsi="Arial"/>
-                <w:b w:val="false"/>
-                <w:bCs w:val="false"/>
-                <w:sz w:val="20"/>
-                <w:szCs w:val="20"/>
-              </w:rPr>
-              <w:t xml:space="preserve">Rascunho do cap. 5</w:t>
+              <w:pStyle w:val="ListParagraph"/>
+              <w:numPr>
+                <w:ilvl w:val="0"/>
+                <w:numId w:val="3"/>
+              </w:numPr>
+              <w:spacing w:after="40"/>
+            </w:pPr>
+            <w:r>
+              <w:rPr>
+                <w:rFonts w:ascii="Arial" w:cs="Arial" w:eastAsia="Arial" w:hAnsi="Arial"/>
+                <w:sz w:val="20"/>
+                <w:szCs w:val="20"/>
+              </w:rPr>
+              <w:t xml:space="preserve">Cap. 5: seções 5.1 (setor), 5.4 (fornecedores) e 5.5 (PESTEL) e esboço das cinco forças</w:t>
+            </w:r>
+          </w:p>
+          <w:p>
+            <w:pPr>
+              <w:pStyle w:val="ListParagraph"/>
+              <w:numPr>
+                <w:ilvl w:val="0"/>
+                <w:numId w:val="3"/>
+              </w:numPr>
+              <w:spacing w:after="40"/>
+            </w:pPr>
+            <w:r>
+              <w:rPr>
+                <w:rFonts w:ascii="Arial" w:cs="Arial" w:eastAsia="Arial" w:hAnsi="Arial"/>
+                <w:sz w:val="20"/>
+                <w:szCs w:val="20"/>
+              </w:rPr>
+              <w:t xml:space="preserve">Rascunho do cap. 8 (Aspectos jurídicos)</w:t>
             </w:r>
           </w:p>
         </w:tc>
@@ -5120,7 +5271,7 @@
                 <w:sz w:val="20"/>
                 <w:szCs w:val="20"/>
               </w:rPr>
-              <w:t xml:space="preserve">Fim da quinzena pós-pagamento (13/10) e início da pré-pagamento (14/10)</w:t>
+              <w:t xml:space="preserve">Fim das visitas sorteadas (13/10) e início das visitas de retorno (a partir de 14/10)</w:t>
             </w:r>
           </w:p>
           <w:p>
@@ -5138,7 +5289,7 @@
                 <w:sz w:val="20"/>
                 <w:szCs w:val="20"/>
               </w:rPr>
-              <w:t xml:space="preserve">Conclusão dos perfis (14/10)</w:t>
+              <w:t xml:space="preserve">Organização das bases e do dicionário de dados</w:t>
             </w:r>
           </w:p>
           <w:p>
@@ -5156,7 +5307,7 @@
                 <w:sz w:val="20"/>
                 <w:szCs w:val="20"/>
               </w:rPr>
-              <w:t xml:space="preserve">Organização das bases e do dicionário de dados</w:t>
+              <w:t xml:space="preserve">Segunda codificação das 200 avaliações (a partir de 16/10)</w:t>
             </w:r>
           </w:p>
           <w:p>
@@ -5174,9 +5325,26 @@
                 <w:sz w:val="20"/>
                 <w:szCs w:val="20"/>
               </w:rPr>
-              <w:t xml:space="preserve">Segunda codificação das 200 avaliações (a partir de 16/10)</w:t>
-            </w:r>
-          </w:p>
+              <w:t xml:space="preserve">Primeira versão do registro de premissas</w:t>
+            </w:r>
+          </w:p>
+        </w:tc>
+        <w:tc>
+          <w:tcPr>
+            <w:tcW w:type="dxa" w:w="3428"/>
+            <w:tcBorders>
+              <w:top w:val="single" w:color="000000" w:sz="4"/>
+              <w:left w:val="single" w:color="000000" w:sz="4"/>
+              <w:bottom w:val="single" w:color="000000" w:sz="4"/>
+              <w:right w:val="single" w:color="000000" w:sz="4"/>
+            </w:tcBorders>
+            <w:tcMar>
+              <w:top w:type="dxa" w:w="60"/>
+              <w:left w:type="dxa" w:w="100"/>
+              <w:bottom w:type="dxa" w:w="60"/>
+              <w:right w:type="dxa" w:w="100"/>
+            </w:tcMar>
+          </w:tcPr>
           <w:p>
             <w:pPr>
               <w:pStyle w:val="ListParagraph"/>
@@ -5192,39 +5360,25 @@
                 <w:sz w:val="20"/>
                 <w:szCs w:val="20"/>
               </w:rPr>
-              <w:t xml:space="preserve">Primeira versão do registro de premissas</w:t>
-            </w:r>
-          </w:p>
-        </w:tc>
-        <w:tc>
-          <w:tcPr>
-            <w:tcW w:type="dxa" w:w="3428"/>
-            <w:tcBorders>
-              <w:top w:val="single" w:color="000000" w:sz="4"/>
-              <w:left w:val="single" w:color="000000" w:sz="4"/>
-              <w:bottom w:val="single" w:color="000000" w:sz="4"/>
-              <w:right w:val="single" w:color="000000" w:sz="4"/>
-            </w:tcBorders>
-            <w:tcMar>
-              <w:top w:type="dxa" w:w="60"/>
-              <w:left w:type="dxa" w:w="100"/>
-              <w:bottom w:type="dxa" w:w="60"/>
-              <w:right w:type="dxa" w:w="100"/>
-            </w:tcMar>
-          </w:tcPr>
-          <w:p>
-            <w:pPr>
-              <w:spacing w:after="40"/>
-            </w:pPr>
-            <w:r>
-              <w:rPr>
-                <w:rFonts w:ascii="Arial" w:cs="Arial" w:eastAsia="Arial" w:hAnsi="Arial"/>
-                <w:b w:val="false"/>
-                <w:bCs w:val="false"/>
-                <w:sz w:val="20"/>
-                <w:szCs w:val="20"/>
-              </w:rPr>
-              <w:t xml:space="preserve">Rascunho do cap. 6</w:t>
+              <w:t xml:space="preserve">Cap. 5: seção 5.3 (concorrência)</w:t>
+            </w:r>
+          </w:p>
+          <w:p>
+            <w:pPr>
+              <w:pStyle w:val="ListParagraph"/>
+              <w:numPr>
+                <w:ilvl w:val="0"/>
+                <w:numId w:val="3"/>
+              </w:numPr>
+              <w:spacing w:after="40"/>
+            </w:pPr>
+            <w:r>
+              <w:rPr>
+                <w:rFonts w:ascii="Arial" w:cs="Arial" w:eastAsia="Arial" w:hAnsi="Arial"/>
+                <w:sz w:val="20"/>
+                <w:szCs w:val="20"/>
+              </w:rPr>
+              <w:t xml:space="preserve">Cap. 6: rascunho das seções 6.3 (preço) e 6.4 (bairro e ponto em Salvador)</w:t>
             </w:r>
           </w:p>
         </w:tc>
@@ -5361,7 +5515,7 @@
                 <w:sz w:val="20"/>
                 <w:szCs w:val="20"/>
               </w:rPr>
-              <w:t xml:space="preserve">Concordância entre as duas codificações e revisão do dicionário</w:t>
+              <w:t xml:space="preserve">Visitas de retorno, conforme sorteio</w:t>
             </w:r>
           </w:p>
           <w:p>
@@ -5379,7 +5533,7 @@
                 <w:sz w:val="20"/>
                 <w:szCs w:val="20"/>
               </w:rPr>
-              <w:t xml:space="preserve">Análises da parte exploratória</w:t>
+              <w:t xml:space="preserve">Concordância entre as duas codificações e revisão do dicionário</w:t>
             </w:r>
           </w:p>
           <w:p>
@@ -5397,7 +5551,7 @@
                 <w:sz w:val="20"/>
                 <w:szCs w:val="20"/>
               </w:rPr>
-              <w:t xml:space="preserve">Emenda ao registro prévio (até 23/10)</w:t>
+              <w:t xml:space="preserve">Análises da parte exploratória</w:t>
             </w:r>
           </w:p>
           <w:p>
@@ -5415,7 +5569,7 @@
                 <w:sz w:val="20"/>
                 <w:szCs w:val="20"/>
               </w:rPr>
-              <w:t xml:space="preserve">Modelo financeiro versão 1</w:t>
+              <w:t xml:space="preserve">Emenda ao registro prévio (até 23/10)</w:t>
             </w:r>
           </w:p>
           <w:p>
@@ -5433,7 +5587,7 @@
                 <w:sz w:val="20"/>
                 <w:szCs w:val="20"/>
               </w:rPr>
-              <w:t xml:space="preserve">Visitas da contagem, conforme sorteio</w:t>
+              <w:t xml:space="preserve">Modelo financeiro versão 1</w:t>
             </w:r>
           </w:p>
         </w:tc>
@@ -5455,17 +5609,38 @@
           </w:tcPr>
           <w:p>
             <w:pPr>
-              <w:spacing w:after="40"/>
-            </w:pPr>
-            <w:r>
-              <w:rPr>
-                <w:rFonts w:ascii="Arial" w:cs="Arial" w:eastAsia="Arial" w:hAnsi="Arial"/>
-                <w:b w:val="false"/>
-                <w:bCs w:val="false"/>
-                <w:sz w:val="20"/>
-                <w:szCs w:val="20"/>
-              </w:rPr>
-              <w:t xml:space="preserve">Rascunhos dos caps. 7 e 8</w:t>
+              <w:pStyle w:val="ListParagraph"/>
+              <w:numPr>
+                <w:ilvl w:val="0"/>
+                <w:numId w:val="3"/>
+              </w:numPr>
+              <w:spacing w:after="40"/>
+            </w:pPr>
+            <w:r>
+              <w:rPr>
+                <w:rFonts w:ascii="Arial" w:cs="Arial" w:eastAsia="Arial" w:hAnsi="Arial"/>
+                <w:sz w:val="20"/>
+                <w:szCs w:val="20"/>
+              </w:rPr>
+              <w:t xml:space="preserve">Rascunho do cap. 7 (Plano operacional)</w:t>
+            </w:r>
+          </w:p>
+          <w:p>
+            <w:pPr>
+              <w:pStyle w:val="ListParagraph"/>
+              <w:numPr>
+                <w:ilvl w:val="0"/>
+                <w:numId w:val="3"/>
+              </w:numPr>
+              <w:spacing w:after="40"/>
+            </w:pPr>
+            <w:r>
+              <w:rPr>
+                <w:rFonts w:ascii="Arial" w:cs="Arial" w:eastAsia="Arial" w:hAnsi="Arial"/>
+                <w:sz w:val="20"/>
+                <w:szCs w:val="20"/>
+              </w:rPr>
+              <w:t xml:space="preserve">Esboço do cap. 9 (Plano financeiro)</w:t>
             </w:r>
           </w:p>
         </w:tc>
@@ -5602,7 +5777,7 @@
                 <w:sz w:val="20"/>
                 <w:szCs w:val="20"/>
               </w:rPr>
-              <w:t xml:space="preserve">Última visita da contagem (até 28/10)</w:t>
+              <w:t xml:space="preserve">Última visita de retorno (até 28/10)</w:t>
             </w:r>
           </w:p>
           <w:p>
@@ -5620,7 +5795,7 @@
                 <w:sz w:val="20"/>
                 <w:szCs w:val="20"/>
               </w:rPr>
-              <w:t xml:space="preserve">Estimativa de ocupação e fluxo, em faixa</w:t>
+              <w:t xml:space="preserve">Estimativa de ocupação e fluxo, em faixa, pelas notas fiscais e pela contagem</w:t>
             </w:r>
           </w:p>
           <w:p>
@@ -5656,7 +5831,7 @@
                 <w:sz w:val="20"/>
                 <w:szCs w:val="20"/>
               </w:rPr>
-              <w:t xml:space="preserve">Estatísticas descritivas</w:t>
+              <w:t xml:space="preserve">Estatísticas descritivas das avaliações</w:t>
             </w:r>
           </w:p>
           <w:p>
@@ -5727,7 +5902,7 @@
                 <w:sz w:val="20"/>
                 <w:szCs w:val="20"/>
               </w:rPr>
-              <w:t xml:space="preserve">Caps. 5, 6 e 9 completos</w:t>
+              <w:t xml:space="preserve">Cap. 5: seção 5.2 (público-alvo), depois do fim da análise das avaliações</w:t>
             </w:r>
           </w:p>
           <w:p>
@@ -5745,7 +5920,43 @@
                 <w:sz w:val="20"/>
                 <w:szCs w:val="20"/>
               </w:rPr>
-              <w:t xml:space="preserve">Rascunho do cap. 10</w:t>
+              <w:t xml:space="preserve">Cap. 6: seções 6.1, 6.2 e 6.6</w:t>
+            </w:r>
+          </w:p>
+          <w:p>
+            <w:pPr>
+              <w:pStyle w:val="ListParagraph"/>
+              <w:numPr>
+                <w:ilvl w:val="0"/>
+                <w:numId w:val="3"/>
+              </w:numPr>
+              <w:spacing w:after="40"/>
+            </w:pPr>
+            <w:r>
+              <w:rPr>
+                <w:rFonts w:ascii="Arial" w:cs="Arial" w:eastAsia="Arial" w:hAnsi="Arial"/>
+                <w:sz w:val="20"/>
+                <w:szCs w:val="20"/>
+              </w:rPr>
+              <w:t xml:space="preserve">Cap. 9 completo</w:t>
+            </w:r>
+          </w:p>
+          <w:p>
+            <w:pPr>
+              <w:pStyle w:val="ListParagraph"/>
+              <w:numPr>
+                <w:ilvl w:val="0"/>
+                <w:numId w:val="3"/>
+              </w:numPr>
+              <w:spacing w:after="40"/>
+            </w:pPr>
+            <w:r>
+              <w:rPr>
+                <w:rFonts w:ascii="Arial" w:cs="Arial" w:eastAsia="Arial" w:hAnsi="Arial"/>
+                <w:sz w:val="20"/>
+                <w:szCs w:val="20"/>
+              </w:rPr>
+              <w:t xml:space="preserve">Rascunho do cap. 10 (Análise de riscos)</w:t>
             </w:r>
           </w:p>
         </w:tc>
@@ -5953,7 +6164,7 @@
                 <w:sz w:val="20"/>
                 <w:szCs w:val="20"/>
               </w:rPr>
-              <w:t xml:space="preserve">Cap. 10 completo</w:t>
+              <w:t xml:space="preserve">Caps. 5, 6 e 10 completos</w:t>
             </w:r>
           </w:p>
           <w:p>
@@ -5971,7 +6182,7 @@
                 <w:sz w:val="20"/>
                 <w:szCs w:val="20"/>
               </w:rPr>
-              <w:t xml:space="preserve">Caps. 4 e 11</w:t>
+              <w:t xml:space="preserve">Caps. 4 (Sumário executivo) e 11 (Considerações finais)</w:t>
             </w:r>
           </w:p>
           <w:p>
@@ -6231,6 +6442,24 @@
                 <w:szCs w:val="20"/>
               </w:rPr>
               <w:t xml:space="preserve">Conferência das referências pendentes</w:t>
+            </w:r>
+          </w:p>
+          <w:p>
+            <w:pPr>
+              <w:pStyle w:val="ListParagraph"/>
+              <w:numPr>
+                <w:ilvl w:val="0"/>
+                <w:numId w:val="3"/>
+              </w:numPr>
+              <w:spacing w:after="40"/>
+            </w:pPr>
+            <w:r>
+              <w:rPr>
+                <w:rFonts w:ascii="Arial" w:cs="Arial" w:eastAsia="Arial" w:hAnsi="Arial"/>
+                <w:sz w:val="20"/>
+                <w:szCs w:val="20"/>
+              </w:rPr>
+              <w:t xml:space="preserve">Roteiro e slides da apresentação</w:t>
             </w:r>
           </w:p>
         </w:tc>
@@ -7206,17 +7435,56 @@
           </w:tcPr>
           <w:p>
             <w:pPr>
-              <w:spacing w:after="40"/>
-            </w:pPr>
-            <w:r>
-              <w:rPr>
-                <w:rFonts w:ascii="Arial" w:cs="Arial" w:eastAsia="Arial" w:hAnsi="Arial"/>
-                <w:b w:val="false"/>
-                <w:bCs w:val="false"/>
-                <w:sz w:val="20"/>
-                <w:szCs w:val="20"/>
-              </w:rPr>
-              <w:t xml:space="preserve">09/10</w:t>
+              <w:pStyle w:val="ListParagraph"/>
+              <w:numPr>
+                <w:ilvl w:val="0"/>
+                <w:numId w:val="3"/>
+              </w:numPr>
+              <w:spacing w:after="40"/>
+            </w:pPr>
+            <w:r>
+              <w:rPr>
+                <w:rFonts w:ascii="Arial" w:cs="Arial" w:eastAsia="Arial" w:hAnsi="Arial"/>
+                <w:sz w:val="20"/>
+                <w:szCs w:val="20"/>
+              </w:rPr>
+              <w:t xml:space="preserve">09/10 (5.1, 5.4, 5.5)</w:t>
+            </w:r>
+          </w:p>
+          <w:p>
+            <w:pPr>
+              <w:pStyle w:val="ListParagraph"/>
+              <w:numPr>
+                <w:ilvl w:val="0"/>
+                <w:numId w:val="3"/>
+              </w:numPr>
+              <w:spacing w:after="40"/>
+            </w:pPr>
+            <w:r>
+              <w:rPr>
+                <w:rFonts w:ascii="Arial" w:cs="Arial" w:eastAsia="Arial" w:hAnsi="Arial"/>
+                <w:sz w:val="20"/>
+                <w:szCs w:val="20"/>
+              </w:rPr>
+              <w:t xml:space="preserve">16/10 (5.3)</w:t>
+            </w:r>
+          </w:p>
+          <w:p>
+            <w:pPr>
+              <w:pStyle w:val="ListParagraph"/>
+              <w:numPr>
+                <w:ilvl w:val="0"/>
+                <w:numId w:val="3"/>
+              </w:numPr>
+              <w:spacing w:after="40"/>
+            </w:pPr>
+            <w:r>
+              <w:rPr>
+                <w:rFonts w:ascii="Arial" w:cs="Arial" w:eastAsia="Arial" w:hAnsi="Arial"/>
+                <w:sz w:val="20"/>
+                <w:szCs w:val="20"/>
+              </w:rPr>
+              <w:t xml:space="preserve">30/10 (5.2)</w:t>
             </w:r>
           </w:p>
         </w:tc>
@@ -7248,7 +7516,7 @@
                 <w:sz w:val="20"/>
                 <w:szCs w:val="20"/>
               </w:rPr>
-              <w:t xml:space="preserve">30/10</w:t>
+              <w:t xml:space="preserve">06/11</w:t>
             </w:r>
           </w:p>
         </w:tc>
@@ -7308,17 +7576,38 @@
           </w:tcPr>
           <w:p>
             <w:pPr>
-              <w:spacing w:after="40"/>
-            </w:pPr>
-            <w:r>
-              <w:rPr>
-                <w:rFonts w:ascii="Arial" w:cs="Arial" w:eastAsia="Arial" w:hAnsi="Arial"/>
-                <w:b w:val="false"/>
-                <w:bCs w:val="false"/>
-                <w:sz w:val="20"/>
-                <w:szCs w:val="20"/>
-              </w:rPr>
-              <w:t xml:space="preserve">16/10</w:t>
+              <w:pStyle w:val="ListParagraph"/>
+              <w:numPr>
+                <w:ilvl w:val="0"/>
+                <w:numId w:val="3"/>
+              </w:numPr>
+              <w:spacing w:after="40"/>
+            </w:pPr>
+            <w:r>
+              <w:rPr>
+                <w:rFonts w:ascii="Arial" w:cs="Arial" w:eastAsia="Arial" w:hAnsi="Arial"/>
+                <w:sz w:val="20"/>
+                <w:szCs w:val="20"/>
+              </w:rPr>
+              <w:t xml:space="preserve">16/10 (6.3, 6.4)</w:t>
+            </w:r>
+          </w:p>
+          <w:p>
+            <w:pPr>
+              <w:pStyle w:val="ListParagraph"/>
+              <w:numPr>
+                <w:ilvl w:val="0"/>
+                <w:numId w:val="3"/>
+              </w:numPr>
+              <w:spacing w:after="40"/>
+            </w:pPr>
+            <w:r>
+              <w:rPr>
+                <w:rFonts w:ascii="Arial" w:cs="Arial" w:eastAsia="Arial" w:hAnsi="Arial"/>
+                <w:sz w:val="20"/>
+                <w:szCs w:val="20"/>
+              </w:rPr>
+              <w:t xml:space="preserve">30/10 (6.1, 6.2, 6.5, 6.6)</w:t>
             </w:r>
           </w:p>
         </w:tc>
@@ -7350,7 +7639,7 @@
                 <w:sz w:val="20"/>
                 <w:szCs w:val="20"/>
               </w:rPr>
-              <w:t xml:space="preserve">30/10</w:t>
+              <w:t xml:space="preserve">06/11</w:t>
             </w:r>
           </w:p>
         </w:tc>
@@ -7522,7 +7811,7 @@
                 <w:sz w:val="20"/>
                 <w:szCs w:val="20"/>
               </w:rPr>
-              <w:t xml:space="preserve">23/10</w:t>
+              <w:t xml:space="preserve">09/10</w:t>
             </w:r>
           </w:p>
         </w:tc>
@@ -8035,24 +8324,6 @@
           <w:sz w:val="20"/>
           <w:szCs w:val="20"/>
         </w:rPr>
-        <w:t xml:space="preserve">Comparação de avaliadores em comum entre luderias.</w:t>
-      </w:r>
-    </w:p>
-    <w:p>
-      <w:pPr>
-        <w:pStyle w:val="ListParagraph"/>
-        <w:numPr>
-          <w:ilvl w:val="0"/>
-          <w:numId w:val="5"/>
-        </w:numPr>
-        <w:spacing w:after="60"/>
-      </w:pPr>
-      <w:r>
-        <w:rPr>
-          <w:rFonts w:ascii="Arial" w:cs="Arial" w:eastAsia="Arial" w:hAnsi="Arial"/>
-          <w:sz w:val="20"/>
-          <w:szCs w:val="20"/>
-        </w:rPr>
         <w:t xml:space="preserve">Base de jogos (Ludopedia e BoardGameGeek).</w:t>
       </w:r>
     </w:p>
@@ -8089,25 +8360,7 @@
           <w:sz w:val="20"/>
           <w:szCs w:val="20"/>
         </w:rPr>
-        <w:t xml:space="preserve">Perfis dos avaliadores reduzidos a uma amostra de 20 avaliadores por estabelecimento.</w:t>
-      </w:r>
-    </w:p>
-    <w:p>
-      <w:pPr>
-        <w:pStyle w:val="ListParagraph"/>
-        <w:numPr>
-          <w:ilvl w:val="0"/>
-          <w:numId w:val="5"/>
-        </w:numPr>
-        <w:spacing w:after="60"/>
-      </w:pPr>
-      <w:r>
-        <w:rPr>
-          <w:rFonts w:ascii="Arial" w:cs="Arial" w:eastAsia="Arial" w:hAnsi="Arial"/>
-          <w:sz w:val="20"/>
-          <w:szCs w:val="20"/>
-        </w:rPr>
-        <w:t xml:space="preserve">Contagem de ocupação reduzida a duas visitas, uma por quinzena, ambas no fim de semana.</w:t>
+        <w:t xml:space="preserve">Contagem de ocupação reduzida a uma unidade (visita sorteada e visita de retorno).</w:t>
       </w:r>
     </w:p>
     <w:p>

</xml_diff>

<commit_message>
Antecipa as visitas da contagem e gera o cronograma resumido
- Contagem direta: visitas sorteadas entre 02/10 e 04/10, com dia e hora de
  início (12h00 a 19h00) sorteados, unidades em dias diferentes; retorno 15
  dias depois, na mesma unidade e hora (17/10 a 19/10). Script e planilha de
  sorteio refeitos; emenda 3 ao registro prévio; metodologia e projeto
  ajustados.
- Estimativa de ocupação passa para a semana 6, logo após os retornos.
- Cronograma: tabela de variáveis tirada do quadro de itens; datas pontuais
  retiradas da coluna de coleta e análise (mantidas as "a partir de" e "até").
- Gerador do .docx ganha a opção --resumo, que produz
  cronograma_luderia_atual.docx só com as tabelas de variáveis, cronograma
  semanal e capítulos.

Co-Authored-By: Claude Opus 5 <noreply@anthropic.com>
</commit_message>
<xml_diff>
--- a/textos/cronograma_luderia.docx
+++ b/textos/cronograma_luderia.docx
@@ -684,7 +684,7 @@
                 <w:sz w:val="20"/>
                 <w:szCs w:val="20"/>
               </w:rPr>
-              <w:t xml:space="preserve">Avaliação média e número de avaliações</w:t>
+              <w:t xml:space="preserve">Número de avaliações</w:t>
             </w:r>
           </w:p>
         </w:tc>
@@ -716,7 +716,7 @@
                 <w:sz w:val="20"/>
                 <w:szCs w:val="20"/>
               </w:rPr>
-              <w:t xml:space="preserve">Medir a satisfação e o porte dos concorrentes</w:t>
+              <w:t xml:space="preserve">Estimar o porte dos estabelecimentos concorrentes</w:t>
             </w:r>
           </w:p>
         </w:tc>
@@ -818,7 +818,7 @@
                 <w:sz w:val="20"/>
                 <w:szCs w:val="20"/>
               </w:rPr>
-              <w:t xml:space="preserve">Forma de cobrança e acervo de jogos</w:t>
+              <w:t xml:space="preserve">Avaliação média geral</w:t>
             </w:r>
           </w:p>
         </w:tc>
@@ -850,7 +850,7 @@
                 <w:sz w:val="20"/>
                 <w:szCs w:val="20"/>
               </w:rPr>
-              <w:t xml:space="preserve">Comparar os formatos de negócio dos concorrentes</w:t>
+              <w:t xml:space="preserve">Medir a satisfação dos clientes dos estabelecimentos concorrentes</w:t>
             </w:r>
           </w:p>
         </w:tc>
@@ -882,7 +882,7 @@
                 <w:sz w:val="20"/>
                 <w:szCs w:val="20"/>
               </w:rPr>
-              <w:t xml:space="preserve">Site, Instagram e cardápio de cada estabelecimento</w:t>
+              <w:t xml:space="preserve">Google Maps</w:t>
             </w:r>
           </w:p>
         </w:tc>
@@ -914,7 +914,7 @@
                 <w:sz w:val="20"/>
                 <w:szCs w:val="20"/>
               </w:rPr>
-              <w:t xml:space="preserve">Registro manual em planilha</w:t>
+              <w:t xml:space="preserve">Google Places API</w:t>
             </w:r>
           </w:p>
         </w:tc>
@@ -952,7 +952,7 @@
                 <w:sz w:val="20"/>
                 <w:szCs w:val="20"/>
               </w:rPr>
-              <w:t xml:space="preserve">Pontos de fluxo no entorno (parques e praias, shoppings e estações de metrô)</w:t>
+              <w:t xml:space="preserve">Avaliação média para comida</w:t>
             </w:r>
           </w:p>
         </w:tc>
@@ -984,7 +984,7 @@
                 <w:sz w:val="20"/>
                 <w:szCs w:val="20"/>
               </w:rPr>
-              <w:t xml:space="preserve">Avaliar a localização dos concorrentes</w:t>
+              <w:t xml:space="preserve">Medir o peso da comida na avaliação geral</w:t>
             </w:r>
           </w:p>
         </w:tc>
@@ -1016,7 +1016,7 @@
                 <w:sz w:val="20"/>
                 <w:szCs w:val="20"/>
               </w:rPr>
-              <w:t xml:space="preserve">OpenStreetMap</w:t>
+              <w:t xml:space="preserve">Google Maps (notas por aspecto nas avaliações)</w:t>
             </w:r>
           </w:p>
         </w:tc>
@@ -1048,7 +1048,7 @@
                 <w:sz w:val="20"/>
                 <w:szCs w:val="20"/>
               </w:rPr>
-              <w:t xml:space="preserve">Contagem automática em raios de 500 m e 1.000 m</w:t>
+              <w:t xml:space="preserve">Extração manual no Google Maps</w:t>
             </w:r>
           </w:p>
         </w:tc>
@@ -1086,7 +1086,7 @@
                 <w:sz w:val="20"/>
                 <w:szCs w:val="20"/>
               </w:rPr>
-              <w:t xml:space="preserve">Preços do cardápio</w:t>
+              <w:t xml:space="preserve">Avaliação média para ambiente</w:t>
             </w:r>
           </w:p>
         </w:tc>
@@ -1118,7 +1118,7 @@
                 <w:sz w:val="20"/>
                 <w:szCs w:val="20"/>
               </w:rPr>
-              <w:t xml:space="preserve">Definir o preço e estimar o ticket médio</w:t>
+              <w:t xml:space="preserve">Medir o peso do ambiente na avaliação geral</w:t>
             </w:r>
           </w:p>
         </w:tc>
@@ -1150,7 +1150,7 @@
                 <w:sz w:val="20"/>
                 <w:szCs w:val="20"/>
               </w:rPr>
-              <w:t xml:space="preserve">Cardápio digital de cada estabelecimento</w:t>
+              <w:t xml:space="preserve">Google Maps (notas por aspecto nas avaliações)</w:t>
             </w:r>
           </w:p>
         </w:tc>
@@ -1182,7 +1182,7 @@
                 <w:sz w:val="20"/>
                 <w:szCs w:val="20"/>
               </w:rPr>
-              <w:t xml:space="preserve">Registro manual em planilha</w:t>
+              <w:t xml:space="preserve">Extração manual no Google Maps</w:t>
             </w:r>
           </w:p>
         </w:tc>
@@ -1220,7 +1220,7 @@
                 <w:sz w:val="20"/>
                 <w:szCs w:val="20"/>
               </w:rPr>
-              <w:t xml:space="preserve">Número de itens do cardápio que precisam de preparo (sem contar itens prontos, como balas, refrigerantes e água)</w:t>
+              <w:t xml:space="preserve">Avaliação média para serviço</w:t>
             </w:r>
           </w:p>
         </w:tc>
@@ -1252,7 +1252,7 @@
                 <w:sz w:val="20"/>
                 <w:szCs w:val="20"/>
               </w:rPr>
-              <w:t xml:space="preserve">Medir a complexidade da cozinha dos concorrentes</w:t>
+              <w:t xml:space="preserve">Medir o peso do atendimento na avaliação geral</w:t>
             </w:r>
           </w:p>
         </w:tc>
@@ -1284,7 +1284,7 @@
                 <w:sz w:val="20"/>
                 <w:szCs w:val="20"/>
               </w:rPr>
-              <w:t xml:space="preserve">Cardápio digital de cada estabelecimento</w:t>
+              <w:t xml:space="preserve">Google Maps (notas por aspecto nas avaliações)</w:t>
             </w:r>
           </w:p>
         </w:tc>
@@ -1316,7 +1316,7 @@
                 <w:sz w:val="20"/>
                 <w:szCs w:val="20"/>
               </w:rPr>
-              <w:t xml:space="preserve">Registro manual em planilha</w:t>
+              <w:t xml:space="preserve">Extração manual no Google Maps</w:t>
             </w:r>
           </w:p>
         </w:tc>
@@ -1354,7 +1354,7 @@
                 <w:sz w:val="20"/>
                 <w:szCs w:val="20"/>
               </w:rPr>
-              <w:t xml:space="preserve">Nota e texto de cada avaliação</w:t>
+              <w:t xml:space="preserve">Itens do cardápio que precisam de preparo (sem contar itens prontos, como balas, refrigerantes e água)</w:t>
             </w:r>
           </w:p>
         </w:tc>
@@ -1386,7 +1386,7 @@
                 <w:sz w:val="20"/>
                 <w:szCs w:val="20"/>
               </w:rPr>
-              <w:t xml:space="preserve">Identificar o que pesa na satisfação e as principais reclamações</w:t>
+              <w:t xml:space="preserve">Medir a complexidade da cozinha dos concorrentes</w:t>
             </w:r>
           </w:p>
         </w:tc>
@@ -1418,7 +1418,7 @@
                 <w:sz w:val="20"/>
                 <w:szCs w:val="20"/>
               </w:rPr>
-              <w:t xml:space="preserve">Google Maps (todas as avaliações com texto publicadas até "um mês atrás")</w:t>
+              <w:t xml:space="preserve">Cardápio digital, site e Instagram de cada estabelecimento</w:t>
             </w:r>
           </w:p>
         </w:tc>
@@ -1450,7 +1450,7 @@
                 <w:sz w:val="20"/>
                 <w:szCs w:val="20"/>
               </w:rPr>
-              <w:t xml:space="preserve">Cópia das avaliações e codificação por dicionário de termos validado</w:t>
+              <w:t xml:space="preserve">Registro manual em planilha</w:t>
             </w:r>
           </w:p>
         </w:tc>
@@ -1488,7 +1488,7 @@
                 <w:sz w:val="20"/>
                 <w:szCs w:val="20"/>
               </w:rPr>
-              <w:t xml:space="preserve">Tamanho do grupo e valores em R$ citados nas avaliações</w:t>
+              <w:t xml:space="preserve">Aspectos mencionados nas avaliações e sua polaridade</w:t>
             </w:r>
           </w:p>
         </w:tc>
@@ -1520,7 +1520,7 @@
                 <w:sz w:val="20"/>
                 <w:szCs w:val="20"/>
               </w:rPr>
-              <w:t xml:space="preserve">Estimar pessoas por mesa e gasto por pessoa</w:t>
+              <w:t xml:space="preserve">Identificar o que pesa na satisfação e as principais reclamações</w:t>
             </w:r>
           </w:p>
         </w:tc>
@@ -1552,7 +1552,7 @@
                 <w:sz w:val="20"/>
                 <w:szCs w:val="20"/>
               </w:rPr>
-              <w:t xml:space="preserve">Texto das avaliações</w:t>
+              <w:t xml:space="preserve">Google Maps: todas as avaliações com texto publicadas até "um mês atrás", por estabelecimento</w:t>
             </w:r>
           </w:p>
         </w:tc>
@@ -1584,7 +1584,7 @@
                 <w:sz w:val="20"/>
                 <w:szCs w:val="20"/>
               </w:rPr>
-              <w:t xml:space="preserve">Codificação por dicionário de termos</w:t>
+              <w:t xml:space="preserve">Cópia das avaliações e codificação por dicionário de termos validado</w:t>
             </w:r>
           </w:p>
         </w:tc>
@@ -1622,7 +1622,7 @@
                 <w:sz w:val="20"/>
                 <w:szCs w:val="20"/>
               </w:rPr>
-              <w:t xml:space="preserve">Data das avaliações</w:t>
+              <w:t xml:space="preserve">Valores em R$ citados nas avaliações</w:t>
             </w:r>
           </w:p>
         </w:tc>
@@ -1654,7 +1654,7 @@
                 <w:sz w:val="20"/>
                 <w:szCs w:val="20"/>
               </w:rPr>
-              <w:t xml:space="preserve">Estimar o ritmo de novos clientes de cada concorrente</w:t>
+              <w:t xml:space="preserve">Estimar o gasto por pessoa e o ticket médio</w:t>
             </w:r>
           </w:p>
         </w:tc>
@@ -1686,7 +1686,7 @@
                 <w:sz w:val="20"/>
                 <w:szCs w:val="20"/>
               </w:rPr>
-              <w:t xml:space="preserve">Google Maps</w:t>
+              <w:t xml:space="preserve">Google Maps: todas as avaliações com texto publicadas até "um mês atrás", por estabelecimento</w:t>
             </w:r>
           </w:p>
         </w:tc>
@@ -1718,7 +1718,7 @@
                 <w:sz w:val="20"/>
                 <w:szCs w:val="20"/>
               </w:rPr>
-              <w:t xml:space="preserve">Cópia das avaliações, com registro da data da coleta</w:t>
+              <w:t xml:space="preserve">Codificação por dicionário de termos validado</w:t>
             </w:r>
           </w:p>
         </w:tc>
@@ -1756,7 +1756,7 @@
                 <w:sz w:val="20"/>
                 <w:szCs w:val="20"/>
               </w:rPr>
-              <w:t xml:space="preserve">Entrada e saída dos grupos e tamanho de cada grupo</w:t>
+              <w:t xml:space="preserve">Tamanho do grupo citado nas avaliações</w:t>
             </w:r>
           </w:p>
         </w:tc>
@@ -1788,7 +1788,7 @@
                 <w:sz w:val="20"/>
                 <w:szCs w:val="20"/>
               </w:rPr>
-              <w:t xml:space="preserve">Medir o fluxo de pessoas, as pessoas por mesa e o tempo de permanência</w:t>
+              <w:t xml:space="preserve">Estimar as pessoas por mesa nos concorrentes</w:t>
             </w:r>
           </w:p>
         </w:tc>
@@ -1820,7 +1820,7 @@
                 <w:sz w:val="20"/>
                 <w:szCs w:val="20"/>
               </w:rPr>
-              <w:t xml:space="preserve">São Jogue, as duas unidades em Salvador</w:t>
+              <w:t xml:space="preserve">Google Maps: todas as avaliações com texto publicadas até "um mês atrás", por estabelecimento</w:t>
             </w:r>
           </w:p>
         </w:tc>
@@ -1852,7 +1852,7 @@
                 <w:sz w:val="20"/>
                 <w:szCs w:val="20"/>
               </w:rPr>
-              <w:t xml:space="preserve">Formulário de observação, do lado de fora, em 4 visitas (2 sorteadas e 2 de retorno)</w:t>
+              <w:t xml:space="preserve">Codificação por dicionário de termos validado</w:t>
             </w:r>
           </w:p>
         </w:tc>
@@ -1890,7 +1890,7 @@
                 <w:sz w:val="20"/>
                 <w:szCs w:val="20"/>
               </w:rPr>
-              <w:t xml:space="preserve">Pessoas no interior e mesas ocupadas</w:t>
+              <w:t xml:space="preserve">Velocidade de avaliações (avaliações com texto por mês)</w:t>
             </w:r>
           </w:p>
         </w:tc>
@@ -1922,7 +1922,7 @@
                 <w:sz w:val="20"/>
                 <w:szCs w:val="20"/>
               </w:rPr>
-              <w:t xml:space="preserve">Medir a ocupação em cada horário</w:t>
+              <w:t xml:space="preserve">Estimar o fluxo de clientes dos concorrentes, calibrado pela contagem na São Jogue</w:t>
             </w:r>
           </w:p>
         </w:tc>
@@ -1954,7 +1954,7 @@
                 <w:sz w:val="20"/>
                 <w:szCs w:val="20"/>
               </w:rPr>
-              <w:t xml:space="preserve">São Jogue</w:t>
+              <w:t xml:space="preserve">Google Maps: todas as avaliações com texto publicadas até "um mês atrás", por estabelecimento</w:t>
             </w:r>
           </w:p>
         </w:tc>
@@ -1986,7 +1986,7 @@
                 <w:sz w:val="20"/>
                 <w:szCs w:val="20"/>
               </w:rPr>
-              <w:t xml:space="preserve">Formulário de observação, com contagem a cada 30 minutos</w:t>
+              <w:t xml:space="preserve">Cálculo: avaliações com texto do recorte ÷ duração da janela, a partir da data da coleta</w:t>
             </w:r>
           </w:p>
         </w:tc>
@@ -2024,7 +2024,7 @@
                 <w:sz w:val="20"/>
                 <w:szCs w:val="20"/>
               </w:rPr>
-              <w:t xml:space="preserve">Número da nota fiscal (NFC-e) no início e no fim de cada visita</w:t>
+              <w:t xml:space="preserve">Entradas e saídas dos grupos</w:t>
             </w:r>
           </w:p>
         </w:tc>
@@ -2056,7 +2056,7 @@
                 <w:sz w:val="20"/>
                 <w:szCs w:val="20"/>
               </w:rPr>
-              <w:t xml:space="preserve">Medir as vendas entre a visita sorteada e a de retorno e as pessoas por nota</w:t>
+              <w:t xml:space="preserve">Medir o fluxo de pessoas por hora</w:t>
             </w:r>
           </w:p>
         </w:tc>
@@ -2088,7 +2088,7 @@
                 <w:sz w:val="20"/>
                 <w:szCs w:val="20"/>
               </w:rPr>
-              <w:t xml:space="preserve">São Jogue</w:t>
+              <w:t xml:space="preserve">São Jogue, as duas unidades em Salvador</w:t>
             </w:r>
           </w:p>
         </w:tc>
@@ -2120,7 +2120,7 @@
                 <w:sz w:val="20"/>
                 <w:szCs w:val="20"/>
               </w:rPr>
-              <w:t xml:space="preserve">Registro da nota emitida em compra própria</w:t>
+              <w:t xml:space="preserve">Formulário de observação, do lado de fora: 2 visitas sorteadas e 2 de retorno 15 dias depois, com registro contínuo na porta</w:t>
             </w:r>
           </w:p>
         </w:tc>
@@ -2158,7 +2158,7 @@
                 <w:sz w:val="20"/>
                 <w:szCs w:val="20"/>
               </w:rPr>
-              <w:t xml:space="preserve">População e renda de Salvador, por bairro quando disponível</w:t>
+              <w:t xml:space="preserve">Número da nota fiscal (NFC-e) no início e no fim de cada visita</w:t>
             </w:r>
           </w:p>
         </w:tc>
@@ -2190,7 +2190,7 @@
                 <w:sz w:val="20"/>
                 <w:szCs w:val="20"/>
               </w:rPr>
-              <w:t xml:space="preserve">Dimensionar o mercado e escolher o bairro</w:t>
+              <w:t xml:space="preserve">Medir as vendas entre a visita sorteada e a de retorno e as pessoas por nota</w:t>
             </w:r>
           </w:p>
         </w:tc>
@@ -2222,7 +2222,7 @@
                 <w:sz w:val="20"/>
                 <w:szCs w:val="20"/>
               </w:rPr>
-              <w:t xml:space="preserve">IBGE (Censo 2022, estimativas populacionais e PNAD Contínua)</w:t>
+              <w:t xml:space="preserve">São Jogue, as duas unidades em Salvador</w:t>
             </w:r>
           </w:p>
         </w:tc>
@@ -2254,7 +2254,7 @@
                 <w:sz w:val="20"/>
                 <w:szCs w:val="20"/>
               </w:rPr>
-              <w:t xml:space="preserve">Download das bases públicas</w:t>
+              <w:t xml:space="preserve">Registro da nota emitida em compra própria</w:t>
             </w:r>
           </w:p>
         </w:tc>
@@ -2292,7 +2292,7 @@
                 <w:sz w:val="20"/>
                 <w:szCs w:val="20"/>
               </w:rPr>
-              <w:t xml:space="preserve">Gasto das famílias com alimentação fora de casa</w:t>
+              <w:t xml:space="preserve">Mesas disponíveis</w:t>
             </w:r>
           </w:p>
         </w:tc>
@@ -2324,7 +2324,7 @@
                 <w:sz w:val="20"/>
                 <w:szCs w:val="20"/>
               </w:rPr>
-              <w:t xml:space="preserve">Conferir o ticket médio</w:t>
+              <w:t xml:space="preserve">Calcular a taxa de ocupação</w:t>
             </w:r>
           </w:p>
         </w:tc>
@@ -2356,7 +2356,7 @@
                 <w:sz w:val="20"/>
                 <w:szCs w:val="20"/>
               </w:rPr>
-              <w:t xml:space="preserve">IBGE (Pesquisa de Orçamentos Familiares)</w:t>
+              <w:t xml:space="preserve">São Jogue, as duas unidades em Salvador</w:t>
             </w:r>
           </w:p>
         </w:tc>
@@ -2388,7 +2388,7 @@
                 <w:sz w:val="20"/>
                 <w:szCs w:val="20"/>
               </w:rPr>
-              <w:t xml:space="preserve">Download das bases públicas</w:t>
+              <w:t xml:space="preserve">Contagem única por unidade</w:t>
             </w:r>
           </w:p>
         </w:tc>
@@ -2426,7 +2426,7 @@
                 <w:sz w:val="20"/>
                 <w:szCs w:val="20"/>
               </w:rPr>
-              <w:t xml:space="preserve">Salário de admissão por ocupação em Salvador</w:t>
+              <w:t xml:space="preserve">Mesas ocupadas (quando visíveis de fora)</w:t>
             </w:r>
           </w:p>
         </w:tc>
@@ -2458,7 +2458,7 @@
                 <w:sz w:val="20"/>
                 <w:szCs w:val="20"/>
               </w:rPr>
-              <w:t xml:space="preserve">Estimar o custo de pessoal</w:t>
+              <w:t xml:space="preserve">Medir a taxa de ocupação</w:t>
             </w:r>
           </w:p>
         </w:tc>
@@ -2490,7 +2490,7 @@
                 <w:sz w:val="20"/>
                 <w:szCs w:val="20"/>
               </w:rPr>
-              <w:t xml:space="preserve">Novo CAGED (Ministério do Trabalho)</w:t>
+              <w:t xml:space="preserve">São Jogue, as duas unidades em Salvador</w:t>
             </w:r>
           </w:p>
         </w:tc>
@@ -2522,7 +2522,7 @@
                 <w:sz w:val="20"/>
                 <w:szCs w:val="20"/>
               </w:rPr>
-              <w:t xml:space="preserve">Download das bases públicas</w:t>
+              <w:t xml:space="preserve">Formulário de observação, do lado de fora: 2 visitas sorteadas e 2 de retorno 15 dias depois, com contagem a cada 30 minutos</w:t>
             </w:r>
           </w:p>
         </w:tc>
@@ -2560,7 +2560,7 @@
                 <w:sz w:val="20"/>
                 <w:szCs w:val="20"/>
               </w:rPr>
-              <w:t xml:space="preserve">Aluguel comercial por m² em Salvador</w:t>
+              <w:t xml:space="preserve">Tamanho dos grupos</w:t>
             </w:r>
           </w:p>
         </w:tc>
@@ -2592,7 +2592,7 @@
                 <w:sz w:val="20"/>
                 <w:szCs w:val="20"/>
               </w:rPr>
-              <w:t xml:space="preserve">Estimar o custo de ocupação do imóvel</w:t>
+              <w:t xml:space="preserve">Medir as pessoas por mesa</w:t>
             </w:r>
           </w:p>
         </w:tc>
@@ -2624,7 +2624,7 @@
                 <w:sz w:val="20"/>
                 <w:szCs w:val="20"/>
               </w:rPr>
-              <w:t xml:space="preserve">FipeZap</w:t>
+              <w:t xml:space="preserve">São Jogue, as duas unidades em Salvador</w:t>
             </w:r>
           </w:p>
         </w:tc>
@@ -2656,7 +2656,7 @@
                 <w:sz w:val="20"/>
                 <w:szCs w:val="20"/>
               </w:rPr>
-              <w:t xml:space="preserve">Download das bases públicas</w:t>
+              <w:t xml:space="preserve">Formulário de observação, do lado de fora: 2 visitas sorteadas e 2 de retorno 15 dias depois, no registro de entrada</w:t>
             </w:r>
           </w:p>
         </w:tc>
@@ -2694,6 +2694,2016 @@
                 <w:sz w:val="20"/>
                 <w:szCs w:val="20"/>
               </w:rPr>
+              <w:t xml:space="preserve">Permanência dos grupos</w:t>
+            </w:r>
+          </w:p>
+        </w:tc>
+        <w:tc>
+          <w:tcPr>
+            <w:tcW w:type="dxa" w:w="3848"/>
+            <w:tcBorders>
+              <w:top w:val="single" w:color="000000" w:sz="4"/>
+              <w:left w:val="single" w:color="000000" w:sz="4"/>
+              <w:bottom w:val="single" w:color="000000" w:sz="4"/>
+              <w:right w:val="single" w:color="000000" w:sz="4"/>
+            </w:tcBorders>
+            <w:tcMar>
+              <w:top w:type="dxa" w:w="60"/>
+              <w:left w:type="dxa" w:w="100"/>
+              <w:bottom w:type="dxa" w:w="60"/>
+              <w:right w:type="dxa" w:w="100"/>
+            </w:tcMar>
+          </w:tcPr>
+          <w:p>
+            <w:pPr>
+              <w:spacing w:after="40"/>
+            </w:pPr>
+            <w:r>
+              <w:rPr>
+                <w:rFonts w:ascii="Arial" w:cs="Arial" w:eastAsia="Arial" w:hAnsi="Arial"/>
+                <w:b w:val="false"/>
+                <w:bCs w:val="false"/>
+                <w:sz w:val="20"/>
+                <w:szCs w:val="20"/>
+              </w:rPr>
+              <w:t xml:space="preserve">Medir o giro de mesas</w:t>
+            </w:r>
+          </w:p>
+        </w:tc>
+        <w:tc>
+          <w:tcPr>
+            <w:tcW w:type="dxa" w:w="3573"/>
+            <w:tcBorders>
+              <w:top w:val="single" w:color="000000" w:sz="4"/>
+              <w:left w:val="single" w:color="000000" w:sz="4"/>
+              <w:bottom w:val="single" w:color="000000" w:sz="4"/>
+              <w:right w:val="single" w:color="000000" w:sz="4"/>
+            </w:tcBorders>
+            <w:tcMar>
+              <w:top w:type="dxa" w:w="60"/>
+              <w:left w:type="dxa" w:w="100"/>
+              <w:bottom w:type="dxa" w:w="60"/>
+              <w:right w:type="dxa" w:w="100"/>
+            </w:tcMar>
+          </w:tcPr>
+          <w:p>
+            <w:pPr>
+              <w:spacing w:after="40"/>
+            </w:pPr>
+            <w:r>
+              <w:rPr>
+                <w:rFonts w:ascii="Arial" w:cs="Arial" w:eastAsia="Arial" w:hAnsi="Arial"/>
+                <w:b w:val="false"/>
+                <w:bCs w:val="false"/>
+                <w:sz w:val="20"/>
+                <w:szCs w:val="20"/>
+              </w:rPr>
+              <w:t xml:space="preserve">São Jogue, as duas unidades em Salvador</w:t>
+            </w:r>
+          </w:p>
+        </w:tc>
+        <w:tc>
+          <w:tcPr>
+            <w:tcW w:type="dxa" w:w="3576"/>
+            <w:tcBorders>
+              <w:top w:val="single" w:color="000000" w:sz="4"/>
+              <w:left w:val="single" w:color="000000" w:sz="4"/>
+              <w:bottom w:val="single" w:color="000000" w:sz="4"/>
+              <w:right w:val="single" w:color="000000" w:sz="4"/>
+            </w:tcBorders>
+            <w:tcMar>
+              <w:top w:type="dxa" w:w="60"/>
+              <w:left w:type="dxa" w:w="100"/>
+              <w:bottom w:type="dxa" w:w="60"/>
+              <w:right w:type="dxa" w:w="100"/>
+            </w:tcMar>
+          </w:tcPr>
+          <w:p>
+            <w:pPr>
+              <w:spacing w:after="40"/>
+            </w:pPr>
+            <w:r>
+              <w:rPr>
+                <w:rFonts w:ascii="Arial" w:cs="Arial" w:eastAsia="Arial" w:hAnsi="Arial"/>
+                <w:b w:val="false"/>
+                <w:bCs w:val="false"/>
+                <w:sz w:val="20"/>
+                <w:szCs w:val="20"/>
+              </w:rPr>
+              <w:t xml:space="preserve">Formulário de observação, do lado de fora: 2 visitas sorteadas e 2 de retorno 15 dias depois: horário de entrada e saída de cada grupo</w:t>
+            </w:r>
+          </w:p>
+        </w:tc>
+      </w:tr>
+      <w:tr>
+        <w:trPr>
+          <w:cantSplit/>
+          <w:tblHeader w:val="false"/>
+        </w:trPr>
+        <w:tc>
+          <w:tcPr>
+            <w:tcW w:type="dxa" w:w="3573"/>
+            <w:tcBorders>
+              <w:top w:val="single" w:color="000000" w:sz="4"/>
+              <w:left w:val="single" w:color="000000" w:sz="4"/>
+              <w:bottom w:val="single" w:color="000000" w:sz="4"/>
+              <w:right w:val="single" w:color="000000" w:sz="4"/>
+            </w:tcBorders>
+            <w:tcMar>
+              <w:top w:type="dxa" w:w="60"/>
+              <w:left w:type="dxa" w:w="100"/>
+              <w:bottom w:type="dxa" w:w="60"/>
+              <w:right w:type="dxa" w:w="100"/>
+            </w:tcMar>
+          </w:tcPr>
+          <w:p>
+            <w:pPr>
+              <w:spacing w:after="40"/>
+            </w:pPr>
+            <w:r>
+              <w:rPr>
+                <w:rFonts w:ascii="Arial" w:cs="Arial" w:eastAsia="Arial" w:hAnsi="Arial"/>
+                <w:b w:val="false"/>
+                <w:bCs w:val="false"/>
+                <w:sz w:val="20"/>
+                <w:szCs w:val="20"/>
+              </w:rPr>
+              <w:t xml:space="preserve">População de Salvador, por bairro</w:t>
+            </w:r>
+          </w:p>
+        </w:tc>
+        <w:tc>
+          <w:tcPr>
+            <w:tcW w:type="dxa" w:w="3848"/>
+            <w:tcBorders>
+              <w:top w:val="single" w:color="000000" w:sz="4"/>
+              <w:left w:val="single" w:color="000000" w:sz="4"/>
+              <w:bottom w:val="single" w:color="000000" w:sz="4"/>
+              <w:right w:val="single" w:color="000000" w:sz="4"/>
+            </w:tcBorders>
+            <w:tcMar>
+              <w:top w:type="dxa" w:w="60"/>
+              <w:left w:type="dxa" w:w="100"/>
+              <w:bottom w:type="dxa" w:w="60"/>
+              <w:right w:type="dxa" w:w="100"/>
+            </w:tcMar>
+          </w:tcPr>
+          <w:p>
+            <w:pPr>
+              <w:spacing w:after="40"/>
+            </w:pPr>
+            <w:r>
+              <w:rPr>
+                <w:rFonts w:ascii="Arial" w:cs="Arial" w:eastAsia="Arial" w:hAnsi="Arial"/>
+                <w:b w:val="false"/>
+                <w:bCs w:val="false"/>
+                <w:sz w:val="20"/>
+                <w:szCs w:val="20"/>
+              </w:rPr>
+              <w:t xml:space="preserve">Dimensionar o público potencial e escolher o bairro</w:t>
+            </w:r>
+          </w:p>
+        </w:tc>
+        <w:tc>
+          <w:tcPr>
+            <w:tcW w:type="dxa" w:w="3573"/>
+            <w:tcBorders>
+              <w:top w:val="single" w:color="000000" w:sz="4"/>
+              <w:left w:val="single" w:color="000000" w:sz="4"/>
+              <w:bottom w:val="single" w:color="000000" w:sz="4"/>
+              <w:right w:val="single" w:color="000000" w:sz="4"/>
+            </w:tcBorders>
+            <w:tcMar>
+              <w:top w:type="dxa" w:w="60"/>
+              <w:left w:type="dxa" w:w="100"/>
+              <w:bottom w:type="dxa" w:w="60"/>
+              <w:right w:type="dxa" w:w="100"/>
+            </w:tcMar>
+          </w:tcPr>
+          <w:p>
+            <w:pPr>
+              <w:spacing w:after="40"/>
+            </w:pPr>
+            <w:r>
+              <w:rPr>
+                <w:rFonts w:ascii="Arial" w:cs="Arial" w:eastAsia="Arial" w:hAnsi="Arial"/>
+                <w:b w:val="false"/>
+                <w:bCs w:val="false"/>
+                <w:sz w:val="20"/>
+                <w:szCs w:val="20"/>
+              </w:rPr>
+              <w:t xml:space="preserve">IBGE (Censo 2022 e estimativas populacionais)</w:t>
+            </w:r>
+          </w:p>
+        </w:tc>
+        <w:tc>
+          <w:tcPr>
+            <w:tcW w:type="dxa" w:w="3576"/>
+            <w:tcBorders>
+              <w:top w:val="single" w:color="000000" w:sz="4"/>
+              <w:left w:val="single" w:color="000000" w:sz="4"/>
+              <w:bottom w:val="single" w:color="000000" w:sz="4"/>
+              <w:right w:val="single" w:color="000000" w:sz="4"/>
+            </w:tcBorders>
+            <w:tcMar>
+              <w:top w:type="dxa" w:w="60"/>
+              <w:left w:type="dxa" w:w="100"/>
+              <w:bottom w:type="dxa" w:w="60"/>
+              <w:right w:type="dxa" w:w="100"/>
+            </w:tcMar>
+          </w:tcPr>
+          <w:p>
+            <w:pPr>
+              <w:spacing w:after="40"/>
+            </w:pPr>
+            <w:r>
+              <w:rPr>
+                <w:rFonts w:ascii="Arial" w:cs="Arial" w:eastAsia="Arial" w:hAnsi="Arial"/>
+                <w:b w:val="false"/>
+                <w:bCs w:val="false"/>
+                <w:sz w:val="20"/>
+                <w:szCs w:val="20"/>
+              </w:rPr>
+              <w:t xml:space="preserve">Download das bases públicas</w:t>
+            </w:r>
+          </w:p>
+        </w:tc>
+      </w:tr>
+      <w:tr>
+        <w:trPr>
+          <w:cantSplit/>
+          <w:tblHeader w:val="false"/>
+        </w:trPr>
+        <w:tc>
+          <w:tcPr>
+            <w:tcW w:type="dxa" w:w="3573"/>
+            <w:tcBorders>
+              <w:top w:val="single" w:color="000000" w:sz="4"/>
+              <w:left w:val="single" w:color="000000" w:sz="4"/>
+              <w:bottom w:val="single" w:color="000000" w:sz="4"/>
+              <w:right w:val="single" w:color="000000" w:sz="4"/>
+            </w:tcBorders>
+            <w:tcMar>
+              <w:top w:type="dxa" w:w="60"/>
+              <w:left w:type="dxa" w:w="100"/>
+              <w:bottom w:type="dxa" w:w="60"/>
+              <w:right w:type="dxa" w:w="100"/>
+            </w:tcMar>
+          </w:tcPr>
+          <w:p>
+            <w:pPr>
+              <w:spacing w:after="40"/>
+            </w:pPr>
+            <w:r>
+              <w:rPr>
+                <w:rFonts w:ascii="Arial" w:cs="Arial" w:eastAsia="Arial" w:hAnsi="Arial"/>
+                <w:b w:val="false"/>
+                <w:bCs w:val="false"/>
+                <w:sz w:val="20"/>
+                <w:szCs w:val="20"/>
+              </w:rPr>
+              <w:t xml:space="preserve">Renda em Salvador</w:t>
+            </w:r>
+          </w:p>
+        </w:tc>
+        <w:tc>
+          <w:tcPr>
+            <w:tcW w:type="dxa" w:w="3848"/>
+            <w:tcBorders>
+              <w:top w:val="single" w:color="000000" w:sz="4"/>
+              <w:left w:val="single" w:color="000000" w:sz="4"/>
+              <w:bottom w:val="single" w:color="000000" w:sz="4"/>
+              <w:right w:val="single" w:color="000000" w:sz="4"/>
+            </w:tcBorders>
+            <w:tcMar>
+              <w:top w:type="dxa" w:w="60"/>
+              <w:left w:type="dxa" w:w="100"/>
+              <w:bottom w:type="dxa" w:w="60"/>
+              <w:right w:type="dxa" w:w="100"/>
+            </w:tcMar>
+          </w:tcPr>
+          <w:p>
+            <w:pPr>
+              <w:spacing w:after="40"/>
+            </w:pPr>
+            <w:r>
+              <w:rPr>
+                <w:rFonts w:ascii="Arial" w:cs="Arial" w:eastAsia="Arial" w:hAnsi="Arial"/>
+                <w:b w:val="false"/>
+                <w:bCs w:val="false"/>
+                <w:sz w:val="20"/>
+                <w:szCs w:val="20"/>
+              </w:rPr>
+              <w:t xml:space="preserve">Dimensionar o mercado e comparar o poder de compra com as demais metrópoles</w:t>
+            </w:r>
+          </w:p>
+        </w:tc>
+        <w:tc>
+          <w:tcPr>
+            <w:tcW w:type="dxa" w:w="3573"/>
+            <w:tcBorders>
+              <w:top w:val="single" w:color="000000" w:sz="4"/>
+              <w:left w:val="single" w:color="000000" w:sz="4"/>
+              <w:bottom w:val="single" w:color="000000" w:sz="4"/>
+              <w:right w:val="single" w:color="000000" w:sz="4"/>
+            </w:tcBorders>
+            <w:tcMar>
+              <w:top w:type="dxa" w:w="60"/>
+              <w:left w:type="dxa" w:w="100"/>
+              <w:bottom w:type="dxa" w:w="60"/>
+              <w:right w:type="dxa" w:w="100"/>
+            </w:tcMar>
+          </w:tcPr>
+          <w:p>
+            <w:pPr>
+              <w:spacing w:after="40"/>
+            </w:pPr>
+            <w:r>
+              <w:rPr>
+                <w:rFonts w:ascii="Arial" w:cs="Arial" w:eastAsia="Arial" w:hAnsi="Arial"/>
+                <w:b w:val="false"/>
+                <w:bCs w:val="false"/>
+                <w:sz w:val="20"/>
+                <w:szCs w:val="20"/>
+              </w:rPr>
+              <w:t xml:space="preserve">IBGE (Censo 2022 e PNAD Contínua)</w:t>
+            </w:r>
+          </w:p>
+        </w:tc>
+        <w:tc>
+          <w:tcPr>
+            <w:tcW w:type="dxa" w:w="3576"/>
+            <w:tcBorders>
+              <w:top w:val="single" w:color="000000" w:sz="4"/>
+              <w:left w:val="single" w:color="000000" w:sz="4"/>
+              <w:bottom w:val="single" w:color="000000" w:sz="4"/>
+              <w:right w:val="single" w:color="000000" w:sz="4"/>
+            </w:tcBorders>
+            <w:tcMar>
+              <w:top w:type="dxa" w:w="60"/>
+              <w:left w:type="dxa" w:w="100"/>
+              <w:bottom w:type="dxa" w:w="60"/>
+              <w:right w:type="dxa" w:w="100"/>
+            </w:tcMar>
+          </w:tcPr>
+          <w:p>
+            <w:pPr>
+              <w:spacing w:after="40"/>
+            </w:pPr>
+            <w:r>
+              <w:rPr>
+                <w:rFonts w:ascii="Arial" w:cs="Arial" w:eastAsia="Arial" w:hAnsi="Arial"/>
+                <w:b w:val="false"/>
+                <w:bCs w:val="false"/>
+                <w:sz w:val="20"/>
+                <w:szCs w:val="20"/>
+              </w:rPr>
+              <w:t xml:space="preserve">Download das bases públicas</w:t>
+            </w:r>
+          </w:p>
+        </w:tc>
+      </w:tr>
+      <w:tr>
+        <w:trPr>
+          <w:cantSplit/>
+          <w:tblHeader w:val="false"/>
+        </w:trPr>
+        <w:tc>
+          <w:tcPr>
+            <w:tcW w:type="dxa" w:w="3573"/>
+            <w:tcBorders>
+              <w:top w:val="single" w:color="000000" w:sz="4"/>
+              <w:left w:val="single" w:color="000000" w:sz="4"/>
+              <w:bottom w:val="single" w:color="000000" w:sz="4"/>
+              <w:right w:val="single" w:color="000000" w:sz="4"/>
+            </w:tcBorders>
+            <w:tcMar>
+              <w:top w:type="dxa" w:w="60"/>
+              <w:left w:type="dxa" w:w="100"/>
+              <w:bottom w:type="dxa" w:w="60"/>
+              <w:right w:type="dxa" w:w="100"/>
+            </w:tcMar>
+          </w:tcPr>
+          <w:p>
+            <w:pPr>
+              <w:spacing w:after="40"/>
+            </w:pPr>
+            <w:r>
+              <w:rPr>
+                <w:rFonts w:ascii="Arial" w:cs="Arial" w:eastAsia="Arial" w:hAnsi="Arial"/>
+                <w:b w:val="false"/>
+                <w:bCs w:val="false"/>
+                <w:sz w:val="20"/>
+                <w:szCs w:val="20"/>
+              </w:rPr>
+              <w:t xml:space="preserve">Gasto das famílias com alimentação fora de casa</w:t>
+            </w:r>
+          </w:p>
+        </w:tc>
+        <w:tc>
+          <w:tcPr>
+            <w:tcW w:type="dxa" w:w="3848"/>
+            <w:tcBorders>
+              <w:top w:val="single" w:color="000000" w:sz="4"/>
+              <w:left w:val="single" w:color="000000" w:sz="4"/>
+              <w:bottom w:val="single" w:color="000000" w:sz="4"/>
+              <w:right w:val="single" w:color="000000" w:sz="4"/>
+            </w:tcBorders>
+            <w:tcMar>
+              <w:top w:type="dxa" w:w="60"/>
+              <w:left w:type="dxa" w:w="100"/>
+              <w:bottom w:type="dxa" w:w="60"/>
+              <w:right w:type="dxa" w:w="100"/>
+            </w:tcMar>
+          </w:tcPr>
+          <w:p>
+            <w:pPr>
+              <w:spacing w:after="40"/>
+            </w:pPr>
+            <w:r>
+              <w:rPr>
+                <w:rFonts w:ascii="Arial" w:cs="Arial" w:eastAsia="Arial" w:hAnsi="Arial"/>
+                <w:b w:val="false"/>
+                <w:bCs w:val="false"/>
+                <w:sz w:val="20"/>
+                <w:szCs w:val="20"/>
+              </w:rPr>
+              <w:t xml:space="preserve">Conferir o ticket médio</w:t>
+            </w:r>
+          </w:p>
+        </w:tc>
+        <w:tc>
+          <w:tcPr>
+            <w:tcW w:type="dxa" w:w="3573"/>
+            <w:tcBorders>
+              <w:top w:val="single" w:color="000000" w:sz="4"/>
+              <w:left w:val="single" w:color="000000" w:sz="4"/>
+              <w:bottom w:val="single" w:color="000000" w:sz="4"/>
+              <w:right w:val="single" w:color="000000" w:sz="4"/>
+            </w:tcBorders>
+            <w:tcMar>
+              <w:top w:type="dxa" w:w="60"/>
+              <w:left w:type="dxa" w:w="100"/>
+              <w:bottom w:type="dxa" w:w="60"/>
+              <w:right w:type="dxa" w:w="100"/>
+            </w:tcMar>
+          </w:tcPr>
+          <w:p>
+            <w:pPr>
+              <w:spacing w:after="40"/>
+            </w:pPr>
+            <w:r>
+              <w:rPr>
+                <w:rFonts w:ascii="Arial" w:cs="Arial" w:eastAsia="Arial" w:hAnsi="Arial"/>
+                <w:b w:val="false"/>
+                <w:bCs w:val="false"/>
+                <w:sz w:val="20"/>
+                <w:szCs w:val="20"/>
+              </w:rPr>
+              <w:t xml:space="preserve">IBGE (Pesquisa de Orçamentos Familiares 2017–2018), corrigido pelo IPCA</w:t>
+            </w:r>
+          </w:p>
+        </w:tc>
+        <w:tc>
+          <w:tcPr>
+            <w:tcW w:type="dxa" w:w="3576"/>
+            <w:tcBorders>
+              <w:top w:val="single" w:color="000000" w:sz="4"/>
+              <w:left w:val="single" w:color="000000" w:sz="4"/>
+              <w:bottom w:val="single" w:color="000000" w:sz="4"/>
+              <w:right w:val="single" w:color="000000" w:sz="4"/>
+            </w:tcBorders>
+            <w:tcMar>
+              <w:top w:type="dxa" w:w="60"/>
+              <w:left w:type="dxa" w:w="100"/>
+              <w:bottom w:type="dxa" w:w="60"/>
+              <w:right w:type="dxa" w:w="100"/>
+            </w:tcMar>
+          </w:tcPr>
+          <w:p>
+            <w:pPr>
+              <w:spacing w:after="40"/>
+            </w:pPr>
+            <w:r>
+              <w:rPr>
+                <w:rFonts w:ascii="Arial" w:cs="Arial" w:eastAsia="Arial" w:hAnsi="Arial"/>
+                <w:b w:val="false"/>
+                <w:bCs w:val="false"/>
+                <w:sz w:val="20"/>
+                <w:szCs w:val="20"/>
+              </w:rPr>
+              <w:t xml:space="preserve">Download das bases públicas</w:t>
+            </w:r>
+          </w:p>
+        </w:tc>
+      </w:tr>
+      <w:tr>
+        <w:trPr>
+          <w:cantSplit/>
+          <w:tblHeader w:val="false"/>
+        </w:trPr>
+        <w:tc>
+          <w:tcPr>
+            <w:tcW w:type="dxa" w:w="3573"/>
+            <w:tcBorders>
+              <w:top w:val="single" w:color="000000" w:sz="4"/>
+              <w:left w:val="single" w:color="000000" w:sz="4"/>
+              <w:bottom w:val="single" w:color="000000" w:sz="4"/>
+              <w:right w:val="single" w:color="000000" w:sz="4"/>
+            </w:tcBorders>
+            <w:tcMar>
+              <w:top w:type="dxa" w:w="60"/>
+              <w:left w:type="dxa" w:w="100"/>
+              <w:bottom w:type="dxa" w:w="60"/>
+              <w:right w:type="dxa" w:w="100"/>
+            </w:tcMar>
+          </w:tcPr>
+          <w:p>
+            <w:pPr>
+              <w:spacing w:after="40"/>
+            </w:pPr>
+            <w:r>
+              <w:rPr>
+                <w:rFonts w:ascii="Arial" w:cs="Arial" w:eastAsia="Arial" w:hAnsi="Arial"/>
+                <w:b w:val="false"/>
+                <w:bCs w:val="false"/>
+                <w:sz w:val="20"/>
+                <w:szCs w:val="20"/>
+              </w:rPr>
+              <w:t xml:space="preserve">Forma de cobrança</w:t>
+            </w:r>
+          </w:p>
+        </w:tc>
+        <w:tc>
+          <w:tcPr>
+            <w:tcW w:type="dxa" w:w="3848"/>
+            <w:tcBorders>
+              <w:top w:val="single" w:color="000000" w:sz="4"/>
+              <w:left w:val="single" w:color="000000" w:sz="4"/>
+              <w:bottom w:val="single" w:color="000000" w:sz="4"/>
+              <w:right w:val="single" w:color="000000" w:sz="4"/>
+            </w:tcBorders>
+            <w:tcMar>
+              <w:top w:type="dxa" w:w="60"/>
+              <w:left w:type="dxa" w:w="100"/>
+              <w:bottom w:type="dxa" w:w="60"/>
+              <w:right w:type="dxa" w:w="100"/>
+            </w:tcMar>
+          </w:tcPr>
+          <w:p>
+            <w:pPr>
+              <w:spacing w:after="40"/>
+            </w:pPr>
+            <w:r>
+              <w:rPr>
+                <w:rFonts w:ascii="Arial" w:cs="Arial" w:eastAsia="Arial" w:hAnsi="Arial"/>
+                <w:b w:val="false"/>
+                <w:bCs w:val="false"/>
+                <w:sz w:val="20"/>
+                <w:szCs w:val="20"/>
+              </w:rPr>
+              <w:t xml:space="preserve">Comparar os formatos de cobrança dos concorrentes</w:t>
+            </w:r>
+          </w:p>
+        </w:tc>
+        <w:tc>
+          <w:tcPr>
+            <w:tcW w:type="dxa" w:w="3573"/>
+            <w:tcBorders>
+              <w:top w:val="single" w:color="000000" w:sz="4"/>
+              <w:left w:val="single" w:color="000000" w:sz="4"/>
+              <w:bottom w:val="single" w:color="000000" w:sz="4"/>
+              <w:right w:val="single" w:color="000000" w:sz="4"/>
+            </w:tcBorders>
+            <w:tcMar>
+              <w:top w:type="dxa" w:w="60"/>
+              <w:left w:type="dxa" w:w="100"/>
+              <w:bottom w:type="dxa" w:w="60"/>
+              <w:right w:type="dxa" w:w="100"/>
+            </w:tcMar>
+          </w:tcPr>
+          <w:p>
+            <w:pPr>
+              <w:spacing w:after="40"/>
+            </w:pPr>
+            <w:r>
+              <w:rPr>
+                <w:rFonts w:ascii="Arial" w:cs="Arial" w:eastAsia="Arial" w:hAnsi="Arial"/>
+                <w:b w:val="false"/>
+                <w:bCs w:val="false"/>
+                <w:sz w:val="20"/>
+                <w:szCs w:val="20"/>
+              </w:rPr>
+              <w:t xml:space="preserve">Site, Instagram e cardápio digital de cada estabelecimento</w:t>
+            </w:r>
+          </w:p>
+        </w:tc>
+        <w:tc>
+          <w:tcPr>
+            <w:tcW w:type="dxa" w:w="3576"/>
+            <w:tcBorders>
+              <w:top w:val="single" w:color="000000" w:sz="4"/>
+              <w:left w:val="single" w:color="000000" w:sz="4"/>
+              <w:bottom w:val="single" w:color="000000" w:sz="4"/>
+              <w:right w:val="single" w:color="000000" w:sz="4"/>
+            </w:tcBorders>
+            <w:tcMar>
+              <w:top w:type="dxa" w:w="60"/>
+              <w:left w:type="dxa" w:w="100"/>
+              <w:bottom w:type="dxa" w:w="60"/>
+              <w:right w:type="dxa" w:w="100"/>
+            </w:tcMar>
+          </w:tcPr>
+          <w:p>
+            <w:pPr>
+              <w:spacing w:after="40"/>
+            </w:pPr>
+            <w:r>
+              <w:rPr>
+                <w:rFonts w:ascii="Arial" w:cs="Arial" w:eastAsia="Arial" w:hAnsi="Arial"/>
+                <w:b w:val="false"/>
+                <w:bCs w:val="false"/>
+                <w:sz w:val="20"/>
+                <w:szCs w:val="20"/>
+              </w:rPr>
+              <w:t xml:space="preserve">Registro manual em planilha</w:t>
+            </w:r>
+          </w:p>
+        </w:tc>
+      </w:tr>
+      <w:tr>
+        <w:trPr>
+          <w:cantSplit/>
+          <w:tblHeader w:val="false"/>
+        </w:trPr>
+        <w:tc>
+          <w:tcPr>
+            <w:tcW w:type="dxa" w:w="3573"/>
+            <w:tcBorders>
+              <w:top w:val="single" w:color="000000" w:sz="4"/>
+              <w:left w:val="single" w:color="000000" w:sz="4"/>
+              <w:bottom w:val="single" w:color="000000" w:sz="4"/>
+              <w:right w:val="single" w:color="000000" w:sz="4"/>
+            </w:tcBorders>
+            <w:tcMar>
+              <w:top w:type="dxa" w:w="60"/>
+              <w:left w:type="dxa" w:w="100"/>
+              <w:bottom w:type="dxa" w:w="60"/>
+              <w:right w:type="dxa" w:w="100"/>
+            </w:tcMar>
+          </w:tcPr>
+          <w:p>
+            <w:pPr>
+              <w:spacing w:after="40"/>
+            </w:pPr>
+            <w:r>
+              <w:rPr>
+                <w:rFonts w:ascii="Arial" w:cs="Arial" w:eastAsia="Arial" w:hAnsi="Arial"/>
+                <w:b w:val="false"/>
+                <w:bCs w:val="false"/>
+                <w:sz w:val="20"/>
+                <w:szCs w:val="20"/>
+              </w:rPr>
+              <w:t xml:space="preserve">Preço do couvert ou da taxa de jogo</w:t>
+            </w:r>
+          </w:p>
+        </w:tc>
+        <w:tc>
+          <w:tcPr>
+            <w:tcW w:type="dxa" w:w="3848"/>
+            <w:tcBorders>
+              <w:top w:val="single" w:color="000000" w:sz="4"/>
+              <w:left w:val="single" w:color="000000" w:sz="4"/>
+              <w:bottom w:val="single" w:color="000000" w:sz="4"/>
+              <w:right w:val="single" w:color="000000" w:sz="4"/>
+            </w:tcBorders>
+            <w:tcMar>
+              <w:top w:type="dxa" w:w="60"/>
+              <w:left w:type="dxa" w:w="100"/>
+              <w:bottom w:type="dxa" w:w="60"/>
+              <w:right w:type="dxa" w:w="100"/>
+            </w:tcMar>
+          </w:tcPr>
+          <w:p>
+            <w:pPr>
+              <w:spacing w:after="40"/>
+            </w:pPr>
+            <w:r>
+              <w:rPr>
+                <w:rFonts w:ascii="Arial" w:cs="Arial" w:eastAsia="Arial" w:hAnsi="Arial"/>
+                <w:b w:val="false"/>
+                <w:bCs w:val="false"/>
+                <w:sz w:val="20"/>
+                <w:szCs w:val="20"/>
+              </w:rPr>
+              <w:t xml:space="preserve">Definir o preço de entrada</w:t>
+            </w:r>
+          </w:p>
+        </w:tc>
+        <w:tc>
+          <w:tcPr>
+            <w:tcW w:type="dxa" w:w="3573"/>
+            <w:tcBorders>
+              <w:top w:val="single" w:color="000000" w:sz="4"/>
+              <w:left w:val="single" w:color="000000" w:sz="4"/>
+              <w:bottom w:val="single" w:color="000000" w:sz="4"/>
+              <w:right w:val="single" w:color="000000" w:sz="4"/>
+            </w:tcBorders>
+            <w:tcMar>
+              <w:top w:type="dxa" w:w="60"/>
+              <w:left w:type="dxa" w:w="100"/>
+              <w:bottom w:type="dxa" w:w="60"/>
+              <w:right w:type="dxa" w:w="100"/>
+            </w:tcMar>
+          </w:tcPr>
+          <w:p>
+            <w:pPr>
+              <w:spacing w:after="40"/>
+            </w:pPr>
+            <w:r>
+              <w:rPr>
+                <w:rFonts w:ascii="Arial" w:cs="Arial" w:eastAsia="Arial" w:hAnsi="Arial"/>
+                <w:b w:val="false"/>
+                <w:bCs w:val="false"/>
+                <w:sz w:val="20"/>
+                <w:szCs w:val="20"/>
+              </w:rPr>
+              <w:t xml:space="preserve">Site, Instagram e cardápio digital de cada estabelecimento</w:t>
+            </w:r>
+          </w:p>
+        </w:tc>
+        <w:tc>
+          <w:tcPr>
+            <w:tcW w:type="dxa" w:w="3576"/>
+            <w:tcBorders>
+              <w:top w:val="single" w:color="000000" w:sz="4"/>
+              <w:left w:val="single" w:color="000000" w:sz="4"/>
+              <w:bottom w:val="single" w:color="000000" w:sz="4"/>
+              <w:right w:val="single" w:color="000000" w:sz="4"/>
+            </w:tcBorders>
+            <w:tcMar>
+              <w:top w:type="dxa" w:w="60"/>
+              <w:left w:type="dxa" w:w="100"/>
+              <w:bottom w:type="dxa" w:w="60"/>
+              <w:right w:type="dxa" w:w="100"/>
+            </w:tcMar>
+          </w:tcPr>
+          <w:p>
+            <w:pPr>
+              <w:spacing w:after="40"/>
+            </w:pPr>
+            <w:r>
+              <w:rPr>
+                <w:rFonts w:ascii="Arial" w:cs="Arial" w:eastAsia="Arial" w:hAnsi="Arial"/>
+                <w:b w:val="false"/>
+                <w:bCs w:val="false"/>
+                <w:sz w:val="20"/>
+                <w:szCs w:val="20"/>
+              </w:rPr>
+              <w:t xml:space="preserve">Registro manual em planilha</w:t>
+            </w:r>
+          </w:p>
+        </w:tc>
+      </w:tr>
+      <w:tr>
+        <w:trPr>
+          <w:cantSplit/>
+          <w:tblHeader w:val="false"/>
+        </w:trPr>
+        <w:tc>
+          <w:tcPr>
+            <w:tcW w:type="dxa" w:w="3573"/>
+            <w:tcBorders>
+              <w:top w:val="single" w:color="000000" w:sz="4"/>
+              <w:left w:val="single" w:color="000000" w:sz="4"/>
+              <w:bottom w:val="single" w:color="000000" w:sz="4"/>
+              <w:right w:val="single" w:color="000000" w:sz="4"/>
+            </w:tcBorders>
+            <w:tcMar>
+              <w:top w:type="dxa" w:w="60"/>
+              <w:left w:type="dxa" w:w="100"/>
+              <w:bottom w:type="dxa" w:w="60"/>
+              <w:right w:type="dxa" w:w="100"/>
+            </w:tcMar>
+          </w:tcPr>
+          <w:p>
+            <w:pPr>
+              <w:spacing w:after="40"/>
+            </w:pPr>
+            <w:r>
+              <w:rPr>
+                <w:rFonts w:ascii="Arial" w:cs="Arial" w:eastAsia="Arial" w:hAnsi="Arial"/>
+                <w:b w:val="false"/>
+                <w:bCs w:val="false"/>
+                <w:sz w:val="20"/>
+                <w:szCs w:val="20"/>
+              </w:rPr>
+              <w:t xml:space="preserve">Preços da cesta fixa (bebida, lanche e sobremesa)</w:t>
+            </w:r>
+          </w:p>
+        </w:tc>
+        <w:tc>
+          <w:tcPr>
+            <w:tcW w:type="dxa" w:w="3848"/>
+            <w:tcBorders>
+              <w:top w:val="single" w:color="000000" w:sz="4"/>
+              <w:left w:val="single" w:color="000000" w:sz="4"/>
+              <w:bottom w:val="single" w:color="000000" w:sz="4"/>
+              <w:right w:val="single" w:color="000000" w:sz="4"/>
+            </w:tcBorders>
+            <w:tcMar>
+              <w:top w:type="dxa" w:w="60"/>
+              <w:left w:type="dxa" w:w="100"/>
+              <w:bottom w:type="dxa" w:w="60"/>
+              <w:right w:type="dxa" w:w="100"/>
+            </w:tcMar>
+          </w:tcPr>
+          <w:p>
+            <w:pPr>
+              <w:spacing w:after="40"/>
+            </w:pPr>
+            <w:r>
+              <w:rPr>
+                <w:rFonts w:ascii="Arial" w:cs="Arial" w:eastAsia="Arial" w:hAnsi="Arial"/>
+                <w:b w:val="false"/>
+                <w:bCs w:val="false"/>
+                <w:sz w:val="20"/>
+                <w:szCs w:val="20"/>
+              </w:rPr>
+              <w:t xml:space="preserve">Definir os preços e estimar o ticket médio</w:t>
+            </w:r>
+          </w:p>
+        </w:tc>
+        <w:tc>
+          <w:tcPr>
+            <w:tcW w:type="dxa" w:w="3573"/>
+            <w:tcBorders>
+              <w:top w:val="single" w:color="000000" w:sz="4"/>
+              <w:left w:val="single" w:color="000000" w:sz="4"/>
+              <w:bottom w:val="single" w:color="000000" w:sz="4"/>
+              <w:right w:val="single" w:color="000000" w:sz="4"/>
+            </w:tcBorders>
+            <w:tcMar>
+              <w:top w:type="dxa" w:w="60"/>
+              <w:left w:type="dxa" w:w="100"/>
+              <w:bottom w:type="dxa" w:w="60"/>
+              <w:right w:type="dxa" w:w="100"/>
+            </w:tcMar>
+          </w:tcPr>
+          <w:p>
+            <w:pPr>
+              <w:spacing w:after="40"/>
+            </w:pPr>
+            <w:r>
+              <w:rPr>
+                <w:rFonts w:ascii="Arial" w:cs="Arial" w:eastAsia="Arial" w:hAnsi="Arial"/>
+                <w:b w:val="false"/>
+                <w:bCs w:val="false"/>
+                <w:sz w:val="20"/>
+                <w:szCs w:val="20"/>
+              </w:rPr>
+              <w:t xml:space="preserve">Cardápio digital, site, Instagram e fotos do cardápio no Google Maps</w:t>
+            </w:r>
+          </w:p>
+        </w:tc>
+        <w:tc>
+          <w:tcPr>
+            <w:tcW w:type="dxa" w:w="3576"/>
+            <w:tcBorders>
+              <w:top w:val="single" w:color="000000" w:sz="4"/>
+              <w:left w:val="single" w:color="000000" w:sz="4"/>
+              <w:bottom w:val="single" w:color="000000" w:sz="4"/>
+              <w:right w:val="single" w:color="000000" w:sz="4"/>
+            </w:tcBorders>
+            <w:tcMar>
+              <w:top w:type="dxa" w:w="60"/>
+              <w:left w:type="dxa" w:w="100"/>
+              <w:bottom w:type="dxa" w:w="60"/>
+              <w:right w:type="dxa" w:w="100"/>
+            </w:tcMar>
+          </w:tcPr>
+          <w:p>
+            <w:pPr>
+              <w:spacing w:after="40"/>
+            </w:pPr>
+            <w:r>
+              <w:rPr>
+                <w:rFonts w:ascii="Arial" w:cs="Arial" w:eastAsia="Arial" w:hAnsi="Arial"/>
+                <w:b w:val="false"/>
+                <w:bCs w:val="false"/>
+                <w:sz w:val="20"/>
+                <w:szCs w:val="20"/>
+              </w:rPr>
+              <w:t xml:space="preserve">Registro manual em planilha</w:t>
+            </w:r>
+          </w:p>
+        </w:tc>
+      </w:tr>
+      <w:tr>
+        <w:trPr>
+          <w:cantSplit/>
+          <w:tblHeader w:val="false"/>
+        </w:trPr>
+        <w:tc>
+          <w:tcPr>
+            <w:tcW w:type="dxa" w:w="3573"/>
+            <w:tcBorders>
+              <w:top w:val="single" w:color="000000" w:sz="4"/>
+              <w:left w:val="single" w:color="000000" w:sz="4"/>
+              <w:bottom w:val="single" w:color="000000" w:sz="4"/>
+              <w:right w:val="single" w:color="000000" w:sz="4"/>
+            </w:tcBorders>
+            <w:tcMar>
+              <w:top w:type="dxa" w:w="60"/>
+              <w:left w:type="dxa" w:w="100"/>
+              <w:bottom w:type="dxa" w:w="60"/>
+              <w:right w:type="dxa" w:w="100"/>
+            </w:tcMar>
+          </w:tcPr>
+          <w:p>
+            <w:pPr>
+              <w:spacing w:after="40"/>
+            </w:pPr>
+            <w:r>
+              <w:rPr>
+                <w:rFonts w:ascii="Arial" w:cs="Arial" w:eastAsia="Arial" w:hAnsi="Arial"/>
+                <w:b w:val="false"/>
+                <w:bCs w:val="false"/>
+                <w:sz w:val="20"/>
+                <w:szCs w:val="20"/>
+              </w:rPr>
+              <w:t xml:space="preserve">Horários mais movimentados (pessoas por hora)</w:t>
+            </w:r>
+          </w:p>
+        </w:tc>
+        <w:tc>
+          <w:tcPr>
+            <w:tcW w:type="dxa" w:w="3848"/>
+            <w:tcBorders>
+              <w:top w:val="single" w:color="000000" w:sz="4"/>
+              <w:left w:val="single" w:color="000000" w:sz="4"/>
+              <w:bottom w:val="single" w:color="000000" w:sz="4"/>
+              <w:right w:val="single" w:color="000000" w:sz="4"/>
+            </w:tcBorders>
+            <w:tcMar>
+              <w:top w:type="dxa" w:w="60"/>
+              <w:left w:type="dxa" w:w="100"/>
+              <w:bottom w:type="dxa" w:w="60"/>
+              <w:right w:type="dxa" w:w="100"/>
+            </w:tcMar>
+          </w:tcPr>
+          <w:p>
+            <w:pPr>
+              <w:spacing w:after="40"/>
+            </w:pPr>
+            <w:r>
+              <w:rPr>
+                <w:rFonts w:ascii="Arial" w:cs="Arial" w:eastAsia="Arial" w:hAnsi="Arial"/>
+                <w:b w:val="false"/>
+                <w:bCs w:val="false"/>
+                <w:sz w:val="20"/>
+                <w:szCs w:val="20"/>
+              </w:rPr>
+              <w:t xml:space="preserve">Definir o horário de funcionamento e a escala da equipe</w:t>
+            </w:r>
+          </w:p>
+        </w:tc>
+        <w:tc>
+          <w:tcPr>
+            <w:tcW w:type="dxa" w:w="3573"/>
+            <w:tcBorders>
+              <w:top w:val="single" w:color="000000" w:sz="4"/>
+              <w:left w:val="single" w:color="000000" w:sz="4"/>
+              <w:bottom w:val="single" w:color="000000" w:sz="4"/>
+              <w:right w:val="single" w:color="000000" w:sz="4"/>
+            </w:tcBorders>
+            <w:tcMar>
+              <w:top w:type="dxa" w:w="60"/>
+              <w:left w:type="dxa" w:w="100"/>
+              <w:bottom w:type="dxa" w:w="60"/>
+              <w:right w:type="dxa" w:w="100"/>
+            </w:tcMar>
+          </w:tcPr>
+          <w:p>
+            <w:pPr>
+              <w:spacing w:after="40"/>
+            </w:pPr>
+            <w:r>
+              <w:rPr>
+                <w:rFonts w:ascii="Arial" w:cs="Arial" w:eastAsia="Arial" w:hAnsi="Arial"/>
+                <w:b w:val="false"/>
+                <w:bCs w:val="false"/>
+                <w:sz w:val="20"/>
+                <w:szCs w:val="20"/>
+              </w:rPr>
+              <w:t xml:space="preserve">São Jogue, as duas unidades em Salvador</w:t>
+            </w:r>
+          </w:p>
+        </w:tc>
+        <w:tc>
+          <w:tcPr>
+            <w:tcW w:type="dxa" w:w="3576"/>
+            <w:tcBorders>
+              <w:top w:val="single" w:color="000000" w:sz="4"/>
+              <w:left w:val="single" w:color="000000" w:sz="4"/>
+              <w:bottom w:val="single" w:color="000000" w:sz="4"/>
+              <w:right w:val="single" w:color="000000" w:sz="4"/>
+            </w:tcBorders>
+            <w:tcMar>
+              <w:top w:type="dxa" w:w="60"/>
+              <w:left w:type="dxa" w:w="100"/>
+              <w:bottom w:type="dxa" w:w="60"/>
+              <w:right w:type="dxa" w:w="100"/>
+            </w:tcMar>
+          </w:tcPr>
+          <w:p>
+            <w:pPr>
+              <w:spacing w:after="40"/>
+            </w:pPr>
+            <w:r>
+              <w:rPr>
+                <w:rFonts w:ascii="Arial" w:cs="Arial" w:eastAsia="Arial" w:hAnsi="Arial"/>
+                <w:b w:val="false"/>
+                <w:bCs w:val="false"/>
+                <w:sz w:val="20"/>
+                <w:szCs w:val="20"/>
+              </w:rPr>
+              <w:t xml:space="preserve">Formulário de observação, do lado de fora: 2 visitas sorteadas e 2 de retorno 15 dias depois</w:t>
+            </w:r>
+          </w:p>
+        </w:tc>
+      </w:tr>
+      <w:tr>
+        <w:trPr>
+          <w:cantSplit/>
+          <w:tblHeader w:val="false"/>
+        </w:trPr>
+        <w:tc>
+          <w:tcPr>
+            <w:tcW w:type="dxa" w:w="3573"/>
+            <w:tcBorders>
+              <w:top w:val="single" w:color="000000" w:sz="4"/>
+              <w:left w:val="single" w:color="000000" w:sz="4"/>
+              <w:bottom w:val="single" w:color="000000" w:sz="4"/>
+              <w:right w:val="single" w:color="000000" w:sz="4"/>
+            </w:tcBorders>
+            <w:tcMar>
+              <w:top w:type="dxa" w:w="60"/>
+              <w:left w:type="dxa" w:w="100"/>
+              <w:bottom w:type="dxa" w:w="60"/>
+              <w:right w:type="dxa" w:w="100"/>
+            </w:tcMar>
+          </w:tcPr>
+          <w:p>
+            <w:pPr>
+              <w:spacing w:after="40"/>
+            </w:pPr>
+            <w:r>
+              <w:rPr>
+                <w:rFonts w:ascii="Arial" w:cs="Arial" w:eastAsia="Arial" w:hAnsi="Arial"/>
+                <w:b w:val="false"/>
+                <w:bCs w:val="false"/>
+                <w:sz w:val="20"/>
+                <w:szCs w:val="20"/>
+              </w:rPr>
+              <w:t xml:space="preserve">Horário de funcionamento (horas por semana)</w:t>
+            </w:r>
+          </w:p>
+        </w:tc>
+        <w:tc>
+          <w:tcPr>
+            <w:tcW w:type="dxa" w:w="3848"/>
+            <w:tcBorders>
+              <w:top w:val="single" w:color="000000" w:sz="4"/>
+              <w:left w:val="single" w:color="000000" w:sz="4"/>
+              <w:bottom w:val="single" w:color="000000" w:sz="4"/>
+              <w:right w:val="single" w:color="000000" w:sz="4"/>
+            </w:tcBorders>
+            <w:tcMar>
+              <w:top w:type="dxa" w:w="60"/>
+              <w:left w:type="dxa" w:w="100"/>
+              <w:bottom w:type="dxa" w:w="60"/>
+              <w:right w:type="dxa" w:w="100"/>
+            </w:tcMar>
+          </w:tcPr>
+          <w:p>
+            <w:pPr>
+              <w:spacing w:after="40"/>
+            </w:pPr>
+            <w:r>
+              <w:rPr>
+                <w:rFonts w:ascii="Arial" w:cs="Arial" w:eastAsia="Arial" w:hAnsi="Arial"/>
+                <w:b w:val="false"/>
+                <w:bCs w:val="false"/>
+                <w:sz w:val="20"/>
+                <w:szCs w:val="20"/>
+              </w:rPr>
+              <w:t xml:space="preserve">Comparar dias e horários de funcionamento dos concorrentes</w:t>
+            </w:r>
+          </w:p>
+        </w:tc>
+        <w:tc>
+          <w:tcPr>
+            <w:tcW w:type="dxa" w:w="3573"/>
+            <w:tcBorders>
+              <w:top w:val="single" w:color="000000" w:sz="4"/>
+              <w:left w:val="single" w:color="000000" w:sz="4"/>
+              <w:bottom w:val="single" w:color="000000" w:sz="4"/>
+              <w:right w:val="single" w:color="000000" w:sz="4"/>
+            </w:tcBorders>
+            <w:tcMar>
+              <w:top w:type="dxa" w:w="60"/>
+              <w:left w:type="dxa" w:w="100"/>
+              <w:bottom w:type="dxa" w:w="60"/>
+              <w:right w:type="dxa" w:w="100"/>
+            </w:tcMar>
+          </w:tcPr>
+          <w:p>
+            <w:pPr>
+              <w:spacing w:after="40"/>
+            </w:pPr>
+            <w:r>
+              <w:rPr>
+                <w:rFonts w:ascii="Arial" w:cs="Arial" w:eastAsia="Arial" w:hAnsi="Arial"/>
+                <w:b w:val="false"/>
+                <w:bCs w:val="false"/>
+                <w:sz w:val="20"/>
+                <w:szCs w:val="20"/>
+              </w:rPr>
+              <w:t xml:space="preserve">Google Maps</w:t>
+            </w:r>
+          </w:p>
+        </w:tc>
+        <w:tc>
+          <w:tcPr>
+            <w:tcW w:type="dxa" w:w="3576"/>
+            <w:tcBorders>
+              <w:top w:val="single" w:color="000000" w:sz="4"/>
+              <w:left w:val="single" w:color="000000" w:sz="4"/>
+              <w:bottom w:val="single" w:color="000000" w:sz="4"/>
+              <w:right w:val="single" w:color="000000" w:sz="4"/>
+            </w:tcBorders>
+            <w:tcMar>
+              <w:top w:type="dxa" w:w="60"/>
+              <w:left w:type="dxa" w:w="100"/>
+              <w:bottom w:type="dxa" w:w="60"/>
+              <w:right w:type="dxa" w:w="100"/>
+            </w:tcMar>
+          </w:tcPr>
+          <w:p>
+            <w:pPr>
+              <w:spacing w:after="40"/>
+            </w:pPr>
+            <w:r>
+              <w:rPr>
+                <w:rFonts w:ascii="Arial" w:cs="Arial" w:eastAsia="Arial" w:hAnsi="Arial"/>
+                <w:b w:val="false"/>
+                <w:bCs w:val="false"/>
+                <w:sz w:val="20"/>
+                <w:szCs w:val="20"/>
+              </w:rPr>
+              <w:t xml:space="preserve">Google Places API</w:t>
+            </w:r>
+          </w:p>
+        </w:tc>
+      </w:tr>
+      <w:tr>
+        <w:trPr>
+          <w:cantSplit/>
+          <w:tblHeader w:val="false"/>
+        </w:trPr>
+        <w:tc>
+          <w:tcPr>
+            <w:tcW w:type="dxa" w:w="3573"/>
+            <w:tcBorders>
+              <w:top w:val="single" w:color="000000" w:sz="4"/>
+              <w:left w:val="single" w:color="000000" w:sz="4"/>
+              <w:bottom w:val="single" w:color="000000" w:sz="4"/>
+              <w:right w:val="single" w:color="000000" w:sz="4"/>
+            </w:tcBorders>
+            <w:tcMar>
+              <w:top w:type="dxa" w:w="60"/>
+              <w:left w:type="dxa" w:w="100"/>
+              <w:bottom w:type="dxa" w:w="60"/>
+              <w:right w:type="dxa" w:w="100"/>
+            </w:tcMar>
+          </w:tcPr>
+          <w:p>
+            <w:pPr>
+              <w:spacing w:after="40"/>
+            </w:pPr>
+            <w:r>
+              <w:rPr>
+                <w:rFonts w:ascii="Arial" w:cs="Arial" w:eastAsia="Arial" w:hAnsi="Arial"/>
+                <w:b w:val="false"/>
+                <w:bCs w:val="false"/>
+                <w:sz w:val="20"/>
+                <w:szCs w:val="20"/>
+              </w:rPr>
+              <w:t xml:space="preserve">Endereço</w:t>
+            </w:r>
+          </w:p>
+        </w:tc>
+        <w:tc>
+          <w:tcPr>
+            <w:tcW w:type="dxa" w:w="3848"/>
+            <w:tcBorders>
+              <w:top w:val="single" w:color="000000" w:sz="4"/>
+              <w:left w:val="single" w:color="000000" w:sz="4"/>
+              <w:bottom w:val="single" w:color="000000" w:sz="4"/>
+              <w:right w:val="single" w:color="000000" w:sz="4"/>
+            </w:tcBorders>
+            <w:tcMar>
+              <w:top w:type="dxa" w:w="60"/>
+              <w:left w:type="dxa" w:w="100"/>
+              <w:bottom w:type="dxa" w:w="60"/>
+              <w:right w:type="dxa" w:w="100"/>
+            </w:tcMar>
+          </w:tcPr>
+          <w:p>
+            <w:pPr>
+              <w:spacing w:after="40"/>
+            </w:pPr>
+            <w:r>
+              <w:rPr>
+                <w:rFonts w:ascii="Arial" w:cs="Arial" w:eastAsia="Arial" w:hAnsi="Arial"/>
+                <w:b w:val="false"/>
+                <w:bCs w:val="false"/>
+                <w:sz w:val="20"/>
+                <w:szCs w:val="20"/>
+              </w:rPr>
+              <w:t xml:space="preserve">Localizar os concorrentes e atribuir metrópole e bairro</w:t>
+            </w:r>
+          </w:p>
+        </w:tc>
+        <w:tc>
+          <w:tcPr>
+            <w:tcW w:type="dxa" w:w="3573"/>
+            <w:tcBorders>
+              <w:top w:val="single" w:color="000000" w:sz="4"/>
+              <w:left w:val="single" w:color="000000" w:sz="4"/>
+              <w:bottom w:val="single" w:color="000000" w:sz="4"/>
+              <w:right w:val="single" w:color="000000" w:sz="4"/>
+            </w:tcBorders>
+            <w:tcMar>
+              <w:top w:type="dxa" w:w="60"/>
+              <w:left w:type="dxa" w:w="100"/>
+              <w:bottom w:type="dxa" w:w="60"/>
+              <w:right w:type="dxa" w:w="100"/>
+            </w:tcMar>
+          </w:tcPr>
+          <w:p>
+            <w:pPr>
+              <w:spacing w:after="40"/>
+            </w:pPr>
+            <w:r>
+              <w:rPr>
+                <w:rFonts w:ascii="Arial" w:cs="Arial" w:eastAsia="Arial" w:hAnsi="Arial"/>
+                <w:b w:val="false"/>
+                <w:bCs w:val="false"/>
+                <w:sz w:val="20"/>
+                <w:szCs w:val="20"/>
+              </w:rPr>
+              <w:t xml:space="preserve">Google Maps</w:t>
+            </w:r>
+          </w:p>
+        </w:tc>
+        <w:tc>
+          <w:tcPr>
+            <w:tcW w:type="dxa" w:w="3576"/>
+            <w:tcBorders>
+              <w:top w:val="single" w:color="000000" w:sz="4"/>
+              <w:left w:val="single" w:color="000000" w:sz="4"/>
+              <w:bottom w:val="single" w:color="000000" w:sz="4"/>
+              <w:right w:val="single" w:color="000000" w:sz="4"/>
+            </w:tcBorders>
+            <w:tcMar>
+              <w:top w:type="dxa" w:w="60"/>
+              <w:left w:type="dxa" w:w="100"/>
+              <w:bottom w:type="dxa" w:w="60"/>
+              <w:right w:type="dxa" w:w="100"/>
+            </w:tcMar>
+          </w:tcPr>
+          <w:p>
+            <w:pPr>
+              <w:spacing w:after="40"/>
+            </w:pPr>
+            <w:r>
+              <w:rPr>
+                <w:rFonts w:ascii="Arial" w:cs="Arial" w:eastAsia="Arial" w:hAnsi="Arial"/>
+                <w:b w:val="false"/>
+                <w:bCs w:val="false"/>
+                <w:sz w:val="20"/>
+                <w:szCs w:val="20"/>
+              </w:rPr>
+              <w:t xml:space="preserve">Google Places API</w:t>
+            </w:r>
+          </w:p>
+        </w:tc>
+      </w:tr>
+      <w:tr>
+        <w:trPr>
+          <w:cantSplit/>
+          <w:tblHeader w:val="false"/>
+        </w:trPr>
+        <w:tc>
+          <w:tcPr>
+            <w:tcW w:type="dxa" w:w="3573"/>
+            <w:tcBorders>
+              <w:top w:val="single" w:color="000000" w:sz="4"/>
+              <w:left w:val="single" w:color="000000" w:sz="4"/>
+              <w:bottom w:val="single" w:color="000000" w:sz="4"/>
+              <w:right w:val="single" w:color="000000" w:sz="4"/>
+            </w:tcBorders>
+            <w:tcMar>
+              <w:top w:type="dxa" w:w="60"/>
+              <w:left w:type="dxa" w:w="100"/>
+              <w:bottom w:type="dxa" w:w="60"/>
+              <w:right w:type="dxa" w:w="100"/>
+            </w:tcMar>
+          </w:tcPr>
+          <w:p>
+            <w:pPr>
+              <w:spacing w:after="40"/>
+            </w:pPr>
+            <w:r>
+              <w:rPr>
+                <w:rFonts w:ascii="Arial" w:cs="Arial" w:eastAsia="Arial" w:hAnsi="Arial"/>
+                <w:b w:val="false"/>
+                <w:bCs w:val="false"/>
+                <w:sz w:val="20"/>
+                <w:szCs w:val="20"/>
+              </w:rPr>
+              <w:t xml:space="preserve">Dentro de shopping (sim ou não)</w:t>
+            </w:r>
+          </w:p>
+        </w:tc>
+        <w:tc>
+          <w:tcPr>
+            <w:tcW w:type="dxa" w:w="3848"/>
+            <w:tcBorders>
+              <w:top w:val="single" w:color="000000" w:sz="4"/>
+              <w:left w:val="single" w:color="000000" w:sz="4"/>
+              <w:bottom w:val="single" w:color="000000" w:sz="4"/>
+              <w:right w:val="single" w:color="000000" w:sz="4"/>
+            </w:tcBorders>
+            <w:tcMar>
+              <w:top w:type="dxa" w:w="60"/>
+              <w:left w:type="dxa" w:w="100"/>
+              <w:bottom w:type="dxa" w:w="60"/>
+              <w:right w:type="dxa" w:w="100"/>
+            </w:tcMar>
+          </w:tcPr>
+          <w:p>
+            <w:pPr>
+              <w:spacing w:after="40"/>
+            </w:pPr>
+            <w:r>
+              <w:rPr>
+                <w:rFonts w:ascii="Arial" w:cs="Arial" w:eastAsia="Arial" w:hAnsi="Arial"/>
+                <w:b w:val="false"/>
+                <w:bCs w:val="false"/>
+                <w:sz w:val="20"/>
+                <w:szCs w:val="20"/>
+              </w:rPr>
+              <w:t xml:space="preserve">Comparar os tipos de ponto (shopping ou rua)</w:t>
+            </w:r>
+          </w:p>
+        </w:tc>
+        <w:tc>
+          <w:tcPr>
+            <w:tcW w:type="dxa" w:w="3573"/>
+            <w:tcBorders>
+              <w:top w:val="single" w:color="000000" w:sz="4"/>
+              <w:left w:val="single" w:color="000000" w:sz="4"/>
+              <w:bottom w:val="single" w:color="000000" w:sz="4"/>
+              <w:right w:val="single" w:color="000000" w:sz="4"/>
+            </w:tcBorders>
+            <w:tcMar>
+              <w:top w:type="dxa" w:w="60"/>
+              <w:left w:type="dxa" w:w="100"/>
+              <w:bottom w:type="dxa" w:w="60"/>
+              <w:right w:type="dxa" w:w="100"/>
+            </w:tcMar>
+          </w:tcPr>
+          <w:p>
+            <w:pPr>
+              <w:spacing w:after="40"/>
+            </w:pPr>
+            <w:r>
+              <w:rPr>
+                <w:rFonts w:ascii="Arial" w:cs="Arial" w:eastAsia="Arial" w:hAnsi="Arial"/>
+                <w:b w:val="false"/>
+                <w:bCs w:val="false"/>
+                <w:sz w:val="20"/>
+                <w:szCs w:val="20"/>
+              </w:rPr>
+              <w:t xml:space="preserve">Google Maps</w:t>
+            </w:r>
+          </w:p>
+        </w:tc>
+        <w:tc>
+          <w:tcPr>
+            <w:tcW w:type="dxa" w:w="3576"/>
+            <w:tcBorders>
+              <w:top w:val="single" w:color="000000" w:sz="4"/>
+              <w:left w:val="single" w:color="000000" w:sz="4"/>
+              <w:bottom w:val="single" w:color="000000" w:sz="4"/>
+              <w:right w:val="single" w:color="000000" w:sz="4"/>
+            </w:tcBorders>
+            <w:tcMar>
+              <w:top w:type="dxa" w:w="60"/>
+              <w:left w:type="dxa" w:w="100"/>
+              <w:bottom w:type="dxa" w:w="60"/>
+              <w:right w:type="dxa" w:w="100"/>
+            </w:tcMar>
+          </w:tcPr>
+          <w:p>
+            <w:pPr>
+              <w:spacing w:after="40"/>
+            </w:pPr>
+            <w:r>
+              <w:rPr>
+                <w:rFonts w:ascii="Arial" w:cs="Arial" w:eastAsia="Arial" w:hAnsi="Arial"/>
+                <w:b w:val="false"/>
+                <w:bCs w:val="false"/>
+                <w:sz w:val="20"/>
+                <w:szCs w:val="20"/>
+              </w:rPr>
+              <w:t xml:space="preserve">Extração manual no Google Maps</w:t>
+            </w:r>
+          </w:p>
+        </w:tc>
+      </w:tr>
+      <w:tr>
+        <w:trPr>
+          <w:cantSplit/>
+          <w:tblHeader w:val="false"/>
+        </w:trPr>
+        <w:tc>
+          <w:tcPr>
+            <w:tcW w:type="dxa" w:w="3573"/>
+            <w:tcBorders>
+              <w:top w:val="single" w:color="000000" w:sz="4"/>
+              <w:left w:val="single" w:color="000000" w:sz="4"/>
+              <w:bottom w:val="single" w:color="000000" w:sz="4"/>
+              <w:right w:val="single" w:color="000000" w:sz="4"/>
+            </w:tcBorders>
+            <w:tcMar>
+              <w:top w:type="dxa" w:w="60"/>
+              <w:left w:type="dxa" w:w="100"/>
+              <w:bottom w:type="dxa" w:w="60"/>
+              <w:right w:type="dxa" w:w="100"/>
+            </w:tcMar>
+          </w:tcPr>
+          <w:p>
+            <w:pPr>
+              <w:spacing w:after="40"/>
+            </w:pPr>
+            <w:r>
+              <w:rPr>
+                <w:rFonts w:ascii="Arial" w:cs="Arial" w:eastAsia="Arial" w:hAnsi="Arial"/>
+                <w:b w:val="false"/>
+                <w:bCs w:val="false"/>
+                <w:sz w:val="20"/>
+                <w:szCs w:val="20"/>
+              </w:rPr>
+              <w:t xml:space="preserve">Shoppings nas proximidades</w:t>
+            </w:r>
+          </w:p>
+        </w:tc>
+        <w:tc>
+          <w:tcPr>
+            <w:tcW w:type="dxa" w:w="3848"/>
+            <w:tcBorders>
+              <w:top w:val="single" w:color="000000" w:sz="4"/>
+              <w:left w:val="single" w:color="000000" w:sz="4"/>
+              <w:bottom w:val="single" w:color="000000" w:sz="4"/>
+              <w:right w:val="single" w:color="000000" w:sz="4"/>
+            </w:tcBorders>
+            <w:tcMar>
+              <w:top w:type="dxa" w:w="60"/>
+              <w:left w:type="dxa" w:w="100"/>
+              <w:bottom w:type="dxa" w:w="60"/>
+              <w:right w:type="dxa" w:w="100"/>
+            </w:tcMar>
+          </w:tcPr>
+          <w:p>
+            <w:pPr>
+              <w:spacing w:after="40"/>
+            </w:pPr>
+            <w:r>
+              <w:rPr>
+                <w:rFonts w:ascii="Arial" w:cs="Arial" w:eastAsia="Arial" w:hAnsi="Arial"/>
+                <w:b w:val="false"/>
+                <w:bCs w:val="false"/>
+                <w:sz w:val="20"/>
+                <w:szCs w:val="20"/>
+              </w:rPr>
+              <w:t xml:space="preserve">Avaliar a localização dos concorrentes</w:t>
+            </w:r>
+          </w:p>
+        </w:tc>
+        <w:tc>
+          <w:tcPr>
+            <w:tcW w:type="dxa" w:w="3573"/>
+            <w:tcBorders>
+              <w:top w:val="single" w:color="000000" w:sz="4"/>
+              <w:left w:val="single" w:color="000000" w:sz="4"/>
+              <w:bottom w:val="single" w:color="000000" w:sz="4"/>
+              <w:right w:val="single" w:color="000000" w:sz="4"/>
+            </w:tcBorders>
+            <w:tcMar>
+              <w:top w:type="dxa" w:w="60"/>
+              <w:left w:type="dxa" w:w="100"/>
+              <w:bottom w:type="dxa" w:w="60"/>
+              <w:right w:type="dxa" w:w="100"/>
+            </w:tcMar>
+          </w:tcPr>
+          <w:p>
+            <w:pPr>
+              <w:spacing w:after="40"/>
+            </w:pPr>
+            <w:r>
+              <w:rPr>
+                <w:rFonts w:ascii="Arial" w:cs="Arial" w:eastAsia="Arial" w:hAnsi="Arial"/>
+                <w:b w:val="false"/>
+                <w:bCs w:val="false"/>
+                <w:sz w:val="20"/>
+                <w:szCs w:val="20"/>
+              </w:rPr>
+              <w:t xml:space="preserve">OpenStreetMap</w:t>
+            </w:r>
+          </w:p>
+        </w:tc>
+        <w:tc>
+          <w:tcPr>
+            <w:tcW w:type="dxa" w:w="3576"/>
+            <w:tcBorders>
+              <w:top w:val="single" w:color="000000" w:sz="4"/>
+              <w:left w:val="single" w:color="000000" w:sz="4"/>
+              <w:bottom w:val="single" w:color="000000" w:sz="4"/>
+              <w:right w:val="single" w:color="000000" w:sz="4"/>
+            </w:tcBorders>
+            <w:tcMar>
+              <w:top w:type="dxa" w:w="60"/>
+              <w:left w:type="dxa" w:w="100"/>
+              <w:bottom w:type="dxa" w:w="60"/>
+              <w:right w:type="dxa" w:w="100"/>
+            </w:tcMar>
+          </w:tcPr>
+          <w:p>
+            <w:pPr>
+              <w:spacing w:after="40"/>
+            </w:pPr>
+            <w:r>
+              <w:rPr>
+                <w:rFonts w:ascii="Arial" w:cs="Arial" w:eastAsia="Arial" w:hAnsi="Arial"/>
+                <w:b w:val="false"/>
+                <w:bCs w:val="false"/>
+                <w:sz w:val="20"/>
+                <w:szCs w:val="20"/>
+              </w:rPr>
+              <w:t xml:space="preserve">Contagem automática em raios de 500 m e 1.000 m</w:t>
+            </w:r>
+          </w:p>
+        </w:tc>
+      </w:tr>
+      <w:tr>
+        <w:trPr>
+          <w:cantSplit/>
+          <w:tblHeader w:val="false"/>
+        </w:trPr>
+        <w:tc>
+          <w:tcPr>
+            <w:tcW w:type="dxa" w:w="3573"/>
+            <w:tcBorders>
+              <w:top w:val="single" w:color="000000" w:sz="4"/>
+              <w:left w:val="single" w:color="000000" w:sz="4"/>
+              <w:bottom w:val="single" w:color="000000" w:sz="4"/>
+              <w:right w:val="single" w:color="000000" w:sz="4"/>
+            </w:tcBorders>
+            <w:tcMar>
+              <w:top w:type="dxa" w:w="60"/>
+              <w:left w:type="dxa" w:w="100"/>
+              <w:bottom w:type="dxa" w:w="60"/>
+              <w:right w:type="dxa" w:w="100"/>
+            </w:tcMar>
+          </w:tcPr>
+          <w:p>
+            <w:pPr>
+              <w:spacing w:after="40"/>
+            </w:pPr>
+            <w:r>
+              <w:rPr>
+                <w:rFonts w:ascii="Arial" w:cs="Arial" w:eastAsia="Arial" w:hAnsi="Arial"/>
+                <w:b w:val="false"/>
+                <w:bCs w:val="false"/>
+                <w:sz w:val="20"/>
+                <w:szCs w:val="20"/>
+              </w:rPr>
+              <w:t xml:space="preserve">Estações de metrô nas proximidades</w:t>
+            </w:r>
+          </w:p>
+        </w:tc>
+        <w:tc>
+          <w:tcPr>
+            <w:tcW w:type="dxa" w:w="3848"/>
+            <w:tcBorders>
+              <w:top w:val="single" w:color="000000" w:sz="4"/>
+              <w:left w:val="single" w:color="000000" w:sz="4"/>
+              <w:bottom w:val="single" w:color="000000" w:sz="4"/>
+              <w:right w:val="single" w:color="000000" w:sz="4"/>
+            </w:tcBorders>
+            <w:tcMar>
+              <w:top w:type="dxa" w:w="60"/>
+              <w:left w:type="dxa" w:w="100"/>
+              <w:bottom w:type="dxa" w:w="60"/>
+              <w:right w:type="dxa" w:w="100"/>
+            </w:tcMar>
+          </w:tcPr>
+          <w:p>
+            <w:pPr>
+              <w:spacing w:after="40"/>
+            </w:pPr>
+            <w:r>
+              <w:rPr>
+                <w:rFonts w:ascii="Arial" w:cs="Arial" w:eastAsia="Arial" w:hAnsi="Arial"/>
+                <w:b w:val="false"/>
+                <w:bCs w:val="false"/>
+                <w:sz w:val="20"/>
+                <w:szCs w:val="20"/>
+              </w:rPr>
+              <w:t xml:space="preserve">Avaliar a localização dos concorrentes</w:t>
+            </w:r>
+          </w:p>
+        </w:tc>
+        <w:tc>
+          <w:tcPr>
+            <w:tcW w:type="dxa" w:w="3573"/>
+            <w:tcBorders>
+              <w:top w:val="single" w:color="000000" w:sz="4"/>
+              <w:left w:val="single" w:color="000000" w:sz="4"/>
+              <w:bottom w:val="single" w:color="000000" w:sz="4"/>
+              <w:right w:val="single" w:color="000000" w:sz="4"/>
+            </w:tcBorders>
+            <w:tcMar>
+              <w:top w:type="dxa" w:w="60"/>
+              <w:left w:type="dxa" w:w="100"/>
+              <w:bottom w:type="dxa" w:w="60"/>
+              <w:right w:type="dxa" w:w="100"/>
+            </w:tcMar>
+          </w:tcPr>
+          <w:p>
+            <w:pPr>
+              <w:spacing w:after="40"/>
+            </w:pPr>
+            <w:r>
+              <w:rPr>
+                <w:rFonts w:ascii="Arial" w:cs="Arial" w:eastAsia="Arial" w:hAnsi="Arial"/>
+                <w:b w:val="false"/>
+                <w:bCs w:val="false"/>
+                <w:sz w:val="20"/>
+                <w:szCs w:val="20"/>
+              </w:rPr>
+              <w:t xml:space="preserve">OpenStreetMap</w:t>
+            </w:r>
+          </w:p>
+        </w:tc>
+        <w:tc>
+          <w:tcPr>
+            <w:tcW w:type="dxa" w:w="3576"/>
+            <w:tcBorders>
+              <w:top w:val="single" w:color="000000" w:sz="4"/>
+              <w:left w:val="single" w:color="000000" w:sz="4"/>
+              <w:bottom w:val="single" w:color="000000" w:sz="4"/>
+              <w:right w:val="single" w:color="000000" w:sz="4"/>
+            </w:tcBorders>
+            <w:tcMar>
+              <w:top w:type="dxa" w:w="60"/>
+              <w:left w:type="dxa" w:w="100"/>
+              <w:bottom w:type="dxa" w:w="60"/>
+              <w:right w:type="dxa" w:w="100"/>
+            </w:tcMar>
+          </w:tcPr>
+          <w:p>
+            <w:pPr>
+              <w:spacing w:after="40"/>
+            </w:pPr>
+            <w:r>
+              <w:rPr>
+                <w:rFonts w:ascii="Arial" w:cs="Arial" w:eastAsia="Arial" w:hAnsi="Arial"/>
+                <w:b w:val="false"/>
+                <w:bCs w:val="false"/>
+                <w:sz w:val="20"/>
+                <w:szCs w:val="20"/>
+              </w:rPr>
+              <w:t xml:space="preserve">Contagem automática em raios de 500 m e 1.000 m</w:t>
+            </w:r>
+          </w:p>
+        </w:tc>
+      </w:tr>
+      <w:tr>
+        <w:trPr>
+          <w:cantSplit/>
+          <w:tblHeader w:val="false"/>
+        </w:trPr>
+        <w:tc>
+          <w:tcPr>
+            <w:tcW w:type="dxa" w:w="3573"/>
+            <w:tcBorders>
+              <w:top w:val="single" w:color="000000" w:sz="4"/>
+              <w:left w:val="single" w:color="000000" w:sz="4"/>
+              <w:bottom w:val="single" w:color="000000" w:sz="4"/>
+              <w:right w:val="single" w:color="000000" w:sz="4"/>
+            </w:tcBorders>
+            <w:tcMar>
+              <w:top w:type="dxa" w:w="60"/>
+              <w:left w:type="dxa" w:w="100"/>
+              <w:bottom w:type="dxa" w:w="60"/>
+              <w:right w:type="dxa" w:w="100"/>
+            </w:tcMar>
+          </w:tcPr>
+          <w:p>
+            <w:pPr>
+              <w:spacing w:after="40"/>
+            </w:pPr>
+            <w:r>
+              <w:rPr>
+                <w:rFonts w:ascii="Arial" w:cs="Arial" w:eastAsia="Arial" w:hAnsi="Arial"/>
+                <w:b w:val="false"/>
+                <w:bCs w:val="false"/>
+                <w:sz w:val="20"/>
+                <w:szCs w:val="20"/>
+              </w:rPr>
+              <w:t xml:space="preserve">Salário de admissão por ocupação em Salvador</w:t>
+            </w:r>
+          </w:p>
+        </w:tc>
+        <w:tc>
+          <w:tcPr>
+            <w:tcW w:type="dxa" w:w="3848"/>
+            <w:tcBorders>
+              <w:top w:val="single" w:color="000000" w:sz="4"/>
+              <w:left w:val="single" w:color="000000" w:sz="4"/>
+              <w:bottom w:val="single" w:color="000000" w:sz="4"/>
+              <w:right w:val="single" w:color="000000" w:sz="4"/>
+            </w:tcBorders>
+            <w:tcMar>
+              <w:top w:type="dxa" w:w="60"/>
+              <w:left w:type="dxa" w:w="100"/>
+              <w:bottom w:type="dxa" w:w="60"/>
+              <w:right w:type="dxa" w:w="100"/>
+            </w:tcMar>
+          </w:tcPr>
+          <w:p>
+            <w:pPr>
+              <w:spacing w:after="40"/>
+            </w:pPr>
+            <w:r>
+              <w:rPr>
+                <w:rFonts w:ascii="Arial" w:cs="Arial" w:eastAsia="Arial" w:hAnsi="Arial"/>
+                <w:b w:val="false"/>
+                <w:bCs w:val="false"/>
+                <w:sz w:val="20"/>
+                <w:szCs w:val="20"/>
+              </w:rPr>
+              <w:t xml:space="preserve">Estimar o custo de pessoal</w:t>
+            </w:r>
+          </w:p>
+        </w:tc>
+        <w:tc>
+          <w:tcPr>
+            <w:tcW w:type="dxa" w:w="3573"/>
+            <w:tcBorders>
+              <w:top w:val="single" w:color="000000" w:sz="4"/>
+              <w:left w:val="single" w:color="000000" w:sz="4"/>
+              <w:bottom w:val="single" w:color="000000" w:sz="4"/>
+              <w:right w:val="single" w:color="000000" w:sz="4"/>
+            </w:tcBorders>
+            <w:tcMar>
+              <w:top w:type="dxa" w:w="60"/>
+              <w:left w:type="dxa" w:w="100"/>
+              <w:bottom w:type="dxa" w:w="60"/>
+              <w:right w:type="dxa" w:w="100"/>
+            </w:tcMar>
+          </w:tcPr>
+          <w:p>
+            <w:pPr>
+              <w:spacing w:after="40"/>
+            </w:pPr>
+            <w:r>
+              <w:rPr>
+                <w:rFonts w:ascii="Arial" w:cs="Arial" w:eastAsia="Arial" w:hAnsi="Arial"/>
+                <w:b w:val="false"/>
+                <w:bCs w:val="false"/>
+                <w:sz w:val="20"/>
+                <w:szCs w:val="20"/>
+              </w:rPr>
+              <w:t xml:space="preserve">Novo CAGED (Ministério do Trabalho e Emprego)</w:t>
+            </w:r>
+          </w:p>
+        </w:tc>
+        <w:tc>
+          <w:tcPr>
+            <w:tcW w:type="dxa" w:w="3576"/>
+            <w:tcBorders>
+              <w:top w:val="single" w:color="000000" w:sz="4"/>
+              <w:left w:val="single" w:color="000000" w:sz="4"/>
+              <w:bottom w:val="single" w:color="000000" w:sz="4"/>
+              <w:right w:val="single" w:color="000000" w:sz="4"/>
+            </w:tcBorders>
+            <w:tcMar>
+              <w:top w:type="dxa" w:w="60"/>
+              <w:left w:type="dxa" w:w="100"/>
+              <w:bottom w:type="dxa" w:w="60"/>
+              <w:right w:type="dxa" w:w="100"/>
+            </w:tcMar>
+          </w:tcPr>
+          <w:p>
+            <w:pPr>
+              <w:spacing w:after="40"/>
+            </w:pPr>
+            <w:r>
+              <w:rPr>
+                <w:rFonts w:ascii="Arial" w:cs="Arial" w:eastAsia="Arial" w:hAnsi="Arial"/>
+                <w:b w:val="false"/>
+                <w:bCs w:val="false"/>
+                <w:sz w:val="20"/>
+                <w:szCs w:val="20"/>
+              </w:rPr>
+              <w:t xml:space="preserve">Download das bases públicas</w:t>
+            </w:r>
+          </w:p>
+        </w:tc>
+      </w:tr>
+      <w:tr>
+        <w:trPr>
+          <w:cantSplit/>
+          <w:tblHeader w:val="false"/>
+        </w:trPr>
+        <w:tc>
+          <w:tcPr>
+            <w:tcW w:type="dxa" w:w="3573"/>
+            <w:tcBorders>
+              <w:top w:val="single" w:color="000000" w:sz="4"/>
+              <w:left w:val="single" w:color="000000" w:sz="4"/>
+              <w:bottom w:val="single" w:color="000000" w:sz="4"/>
+              <w:right w:val="single" w:color="000000" w:sz="4"/>
+            </w:tcBorders>
+            <w:tcMar>
+              <w:top w:type="dxa" w:w="60"/>
+              <w:left w:type="dxa" w:w="100"/>
+              <w:bottom w:type="dxa" w:w="60"/>
+              <w:right w:type="dxa" w:w="100"/>
+            </w:tcMar>
+          </w:tcPr>
+          <w:p>
+            <w:pPr>
+              <w:spacing w:after="40"/>
+            </w:pPr>
+            <w:r>
+              <w:rPr>
+                <w:rFonts w:ascii="Arial" w:cs="Arial" w:eastAsia="Arial" w:hAnsi="Arial"/>
+                <w:b w:val="false"/>
+                <w:bCs w:val="false"/>
+                <w:sz w:val="20"/>
+                <w:szCs w:val="20"/>
+              </w:rPr>
+              <w:t xml:space="preserve">Aluguel comercial por m² em Salvador</w:t>
+            </w:r>
+          </w:p>
+        </w:tc>
+        <w:tc>
+          <w:tcPr>
+            <w:tcW w:type="dxa" w:w="3848"/>
+            <w:tcBorders>
+              <w:top w:val="single" w:color="000000" w:sz="4"/>
+              <w:left w:val="single" w:color="000000" w:sz="4"/>
+              <w:bottom w:val="single" w:color="000000" w:sz="4"/>
+              <w:right w:val="single" w:color="000000" w:sz="4"/>
+            </w:tcBorders>
+            <w:tcMar>
+              <w:top w:type="dxa" w:w="60"/>
+              <w:left w:type="dxa" w:w="100"/>
+              <w:bottom w:type="dxa" w:w="60"/>
+              <w:right w:type="dxa" w:w="100"/>
+            </w:tcMar>
+          </w:tcPr>
+          <w:p>
+            <w:pPr>
+              <w:spacing w:after="40"/>
+            </w:pPr>
+            <w:r>
+              <w:rPr>
+                <w:rFonts w:ascii="Arial" w:cs="Arial" w:eastAsia="Arial" w:hAnsi="Arial"/>
+                <w:b w:val="false"/>
+                <w:bCs w:val="false"/>
+                <w:sz w:val="20"/>
+                <w:szCs w:val="20"/>
+              </w:rPr>
+              <w:t xml:space="preserve">Estimar o custo de ocupação do imóvel</w:t>
+            </w:r>
+          </w:p>
+        </w:tc>
+        <w:tc>
+          <w:tcPr>
+            <w:tcW w:type="dxa" w:w="3573"/>
+            <w:tcBorders>
+              <w:top w:val="single" w:color="000000" w:sz="4"/>
+              <w:left w:val="single" w:color="000000" w:sz="4"/>
+              <w:bottom w:val="single" w:color="000000" w:sz="4"/>
+              <w:right w:val="single" w:color="000000" w:sz="4"/>
+            </w:tcBorders>
+            <w:tcMar>
+              <w:top w:type="dxa" w:w="60"/>
+              <w:left w:type="dxa" w:w="100"/>
+              <w:bottom w:type="dxa" w:w="60"/>
+              <w:right w:type="dxa" w:w="100"/>
+            </w:tcMar>
+          </w:tcPr>
+          <w:p>
+            <w:pPr>
+              <w:spacing w:after="40"/>
+            </w:pPr>
+            <w:r>
+              <w:rPr>
+                <w:rFonts w:ascii="Arial" w:cs="Arial" w:eastAsia="Arial" w:hAnsi="Arial"/>
+                <w:b w:val="false"/>
+                <w:bCs w:val="false"/>
+                <w:sz w:val="20"/>
+                <w:szCs w:val="20"/>
+              </w:rPr>
+              <w:t xml:space="preserve">Índice FipeZap de locação comercial</w:t>
+            </w:r>
+          </w:p>
+        </w:tc>
+        <w:tc>
+          <w:tcPr>
+            <w:tcW w:type="dxa" w:w="3576"/>
+            <w:tcBorders>
+              <w:top w:val="single" w:color="000000" w:sz="4"/>
+              <w:left w:val="single" w:color="000000" w:sz="4"/>
+              <w:bottom w:val="single" w:color="000000" w:sz="4"/>
+              <w:right w:val="single" w:color="000000" w:sz="4"/>
+            </w:tcBorders>
+            <w:tcMar>
+              <w:top w:type="dxa" w:w="60"/>
+              <w:left w:type="dxa" w:w="100"/>
+              <w:bottom w:type="dxa" w:w="60"/>
+              <w:right w:type="dxa" w:w="100"/>
+            </w:tcMar>
+          </w:tcPr>
+          <w:p>
+            <w:pPr>
+              <w:spacing w:after="40"/>
+            </w:pPr>
+            <w:r>
+              <w:rPr>
+                <w:rFonts w:ascii="Arial" w:cs="Arial" w:eastAsia="Arial" w:hAnsi="Arial"/>
+                <w:b w:val="false"/>
+                <w:bCs w:val="false"/>
+                <w:sz w:val="20"/>
+                <w:szCs w:val="20"/>
+              </w:rPr>
+              <w:t xml:space="preserve">Download das bases públicas</w:t>
+            </w:r>
+          </w:p>
+        </w:tc>
+      </w:tr>
+      <w:tr>
+        <w:trPr>
+          <w:cantSplit/>
+          <w:tblHeader w:val="false"/>
+        </w:trPr>
+        <w:tc>
+          <w:tcPr>
+            <w:tcW w:type="dxa" w:w="3573"/>
+            <w:tcBorders>
+              <w:top w:val="single" w:color="000000" w:sz="4"/>
+              <w:left w:val="single" w:color="000000" w:sz="4"/>
+              <w:bottom w:val="single" w:color="000000" w:sz="4"/>
+              <w:right w:val="single" w:color="000000" w:sz="4"/>
+            </w:tcBorders>
+            <w:tcMar>
+              <w:top w:type="dxa" w:w="60"/>
+              <w:left w:type="dxa" w:w="100"/>
+              <w:bottom w:type="dxa" w:w="60"/>
+              <w:right w:type="dxa" w:w="100"/>
+            </w:tcMar>
+          </w:tcPr>
+          <w:p>
+            <w:pPr>
+              <w:spacing w:after="40"/>
+            </w:pPr>
+            <w:r>
+              <w:rPr>
+                <w:rFonts w:ascii="Arial" w:cs="Arial" w:eastAsia="Arial" w:hAnsi="Arial"/>
+                <w:b w:val="false"/>
+                <w:bCs w:val="false"/>
+                <w:sz w:val="20"/>
+                <w:szCs w:val="20"/>
+              </w:rPr>
               <w:t xml:space="preserve">Alíquotas do Simples Nacional</w:t>
             </w:r>
           </w:p>
@@ -2758,7 +4768,7 @@
                 <w:sz w:val="20"/>
                 <w:szCs w:val="20"/>
               </w:rPr>
-              <w:t xml:space="preserve">Lei Complementar nº 123/2006</w:t>
+              <w:t xml:space="preserve">Lei Complementar nº 123/2006 e anexos</w:t>
             </w:r>
           </w:p>
         </w:tc>
@@ -3645,7 +5655,7 @@
           <w:sz w:val="20"/>
           <w:szCs w:val="20"/>
         </w:rPr>
-        <w:t xml:space="preserve"> Visitas sorteadas entre 29/09 e 13/10; visitas de retorno até 28/10. A estimativa de ocupação depende delas.</w:t>
+        <w:t xml:space="preserve"> Visitas sorteadas entre 02/10 e 04/10; visitas de retorno entre 17/10 e 19/10. A estimativa de ocupação depende delas.</w:t>
       </w:r>
     </w:p>
     <w:p>
@@ -3758,7 +5768,7 @@
           <w:sz w:val="20"/>
           <w:szCs w:val="20"/>
         </w:rPr>
-        <w:t xml:space="preserve"> na quinzena após o pagamento dos servidores estaduais da Bahia (29/09 a 13/10; o pagamento começa em 29/09 para inativos e pensionistas e em 30/09 para ativos). Uma visita cai em dia útil (segunda a quinta) e a outra no fim de semana (sexta a domingo). Um sorteio define qual unidade fica com o dia útil.</w:t>
+        <w:t xml:space="preserve"> entre 02/10 e 04/10 (sexta a domingo), na quinzena após o pagamento dos servidores estaduais da Bahia (29/09 para inativos e pensionistas; 30/09 para ativos). O sorteio escolhe o dia e a hora de início de cada visita: cada hora cheia entre 12h00 e 19h00 é uma possibilidade. As duas unidades ficam em dias diferentes.</w:t>
       </w:r>
     </w:p>
     <w:p>
@@ -3786,7 +5796,7 @@
           <w:sz w:val="20"/>
           <w:szCs w:val="20"/>
         </w:rPr>
-        <w:t xml:space="preserve"> 15 dias depois de cada visita sorteada, na mesma unidade. Caem na quinzena anterior ao pagamento seguinte (14/10 a 28/10). Como 15 dias não fecham semanas inteiras, o retorno cai no dia da semana seguinte ao da visita sorteada.</w:t>
+        <w:t xml:space="preserve"> 15 dias depois de cada visita sorteada, na mesma unidade e na mesma hora de início, entre 17/10 e 19/10.</w:t>
       </w:r>
     </w:p>
     <w:p>
@@ -3870,7 +5880,7 @@
           <w:sz w:val="20"/>
           <w:szCs w:val="20"/>
         </w:rPr>
-        <w:t xml:space="preserve"> feito na planilha contagem_sorteio_visitas.xlsx antes da primeira visita. Feriados e dias sem funcionamento ficam de fora.</w:t>
+        <w:t xml:space="preserve"> feito na planilha contagem_sorteio_visitas.xlsx antes da primeira visita. Dias e horários sem funcionamento ficam de fora.</w:t>
       </w:r>
     </w:p>
     <w:p>
@@ -3928,9 +5938,9 @@
         </w:tblBorders>
       </w:tblPr>
       <w:tblGrid>
-        <w:gridCol w:w="1142"/>
+        <w:gridCol w:w="1714"/>
         <w:gridCol w:w="1428"/>
-        <w:gridCol w:w="6285"/>
+        <w:gridCol w:w="5713"/>
         <w:gridCol w:w="3428"/>
         <w:gridCol w:w="2287"/>
       </w:tblGrid>
@@ -3941,7 +5951,7 @@
         </w:trPr>
         <w:tc>
           <w:tcPr>
-            <w:tcW w:type="dxa" w:w="1142"/>
+            <w:tcW w:type="dxa" w:w="1714"/>
             <w:tcBorders>
               <w:top w:val="single" w:color="000000" w:sz="4"/>
               <w:left w:val="single" w:color="000000" w:sz="4"/>
@@ -4007,7 +6017,7 @@
         </w:tc>
         <w:tc>
           <w:tcPr>
-            <w:tcW w:type="dxa" w:w="6285"/>
+            <w:tcW w:type="dxa" w:w="5713"/>
             <w:tcBorders>
               <w:top w:val="single" w:color="000000" w:sz="4"/>
               <w:left w:val="single" w:color="000000" w:sz="4"/>
@@ -4112,7 +6122,7 @@
         </w:trPr>
         <w:tc>
           <w:tcPr>
-            <w:tcW w:type="dxa" w:w="1142"/>
+            <w:tcW w:type="dxa" w:w="1714"/>
             <w:tcBorders>
               <w:top w:val="single" w:color="000000" w:sz="4"/>
               <w:left w:val="single" w:color="000000" w:sz="4"/>
@@ -4176,7 +6186,7 @@
         </w:tc>
         <w:tc>
           <w:tcPr>
-            <w:tcW w:type="dxa" w:w="6285"/>
+            <w:tcW w:type="dxa" w:w="5713"/>
             <w:tcBorders>
               <w:top w:val="single" w:color="000000" w:sz="4"/>
               <w:left w:val="single" w:color="000000" w:sz="4"/>
@@ -4241,7 +6251,7 @@
                 <w:sz w:val="20"/>
                 <w:szCs w:val="20"/>
               </w:rPr>
-              <w:t xml:space="preserve">Coleta das bases públicas (IBGE, CAGED, FipeZap, Simples Nacional, Banco Central) em 14/09</w:t>
+              <w:t xml:space="preserve">Coleta das bases públicas (IBGE, CAGED, FipeZap, Simples Nacional, Banco Central)</w:t>
             </w:r>
           </w:p>
           <w:p>
@@ -4374,7 +6384,7 @@
         </w:trPr>
         <w:tc>
           <w:tcPr>
-            <w:tcW w:type="dxa" w:w="1142"/>
+            <w:tcW w:type="dxa" w:w="1714"/>
             <w:tcBorders>
               <w:top w:val="single" w:color="000000" w:sz="4"/>
               <w:left w:val="single" w:color="000000" w:sz="4"/>
@@ -4438,7 +6448,7 @@
         </w:tc>
         <w:tc>
           <w:tcPr>
-            <w:tcW w:type="dxa" w:w="6285"/>
+            <w:tcW w:type="dxa" w:w="5713"/>
             <w:tcBorders>
               <w:top w:val="single" w:color="000000" w:sz="4"/>
               <w:left w:val="single" w:color="000000" w:sz="4"/>
@@ -4654,7 +6664,7 @@
         </w:trPr>
         <w:tc>
           <w:tcPr>
-            <w:tcW w:type="dxa" w:w="1142"/>
+            <w:tcW w:type="dxa" w:w="1714"/>
             <w:tcBorders>
               <w:top w:val="single" w:color="000000" w:sz="4"/>
               <w:left w:val="single" w:color="000000" w:sz="4"/>
@@ -4718,7 +6728,7 @@
         </w:tc>
         <w:tc>
           <w:tcPr>
-            <w:tcW w:type="dxa" w:w="6285"/>
+            <w:tcW w:type="dxa" w:w="5713"/>
             <w:tcBorders>
               <w:top w:val="single" w:color="000000" w:sz="4"/>
               <w:left w:val="single" w:color="000000" w:sz="4"/>
@@ -4747,7 +6757,7 @@
                 <w:sz w:val="20"/>
                 <w:szCs w:val="20"/>
               </w:rPr>
-              <w:t xml:space="preserve">Conclusão da coleta das avaliações (27/09)</w:t>
+              <w:t xml:space="preserve">Conclusão da coleta das avaliações</w:t>
             </w:r>
           </w:p>
           <w:p>
@@ -4765,7 +6775,7 @@
                 <w:sz w:val="20"/>
                 <w:szCs w:val="20"/>
               </w:rPr>
-              <w:t xml:space="preserve">Divisão da base em parte exploratória e parte confirmatória (28/09)</w:t>
+              <w:t xml:space="preserve">Divisão da base em parte exploratória e parte confirmatória</w:t>
             </w:r>
           </w:p>
           <w:p>
@@ -4801,7 +6811,7 @@
                 <w:sz w:val="20"/>
                 <w:szCs w:val="20"/>
               </w:rPr>
-              <w:t xml:space="preserve">Conclusão dos cardápios (30/09)</w:t>
+              <w:t xml:space="preserve">Conclusão dos cardápios</w:t>
             </w:r>
           </w:p>
           <w:p>
@@ -4819,7 +6829,7 @@
                 <w:sz w:val="20"/>
                 <w:szCs w:val="20"/>
               </w:rPr>
-              <w:t xml:space="preserve">Visitas sorteadas, conforme sorteio (a partir de 29/09)</w:t>
+              <w:t xml:space="preserve">Visitas sorteadas, conforme sorteio (a partir de 02/10)</w:t>
             </w:r>
           </w:p>
         </w:tc>
@@ -4916,7 +6926,7 @@
         </w:trPr>
         <w:tc>
           <w:tcPr>
-            <w:tcW w:type="dxa" w:w="1142"/>
+            <w:tcW w:type="dxa" w:w="1714"/>
             <w:tcBorders>
               <w:top w:val="single" w:color="000000" w:sz="4"/>
               <w:left w:val="single" w:color="000000" w:sz="4"/>
@@ -4980,7 +6990,7 @@
         </w:tc>
         <w:tc>
           <w:tcPr>
-            <w:tcW w:type="dxa" w:w="6285"/>
+            <w:tcW w:type="dxa" w:w="5713"/>
             <w:tcBorders>
               <w:top w:val="single" w:color="000000" w:sz="4"/>
               <w:left w:val="single" w:color="000000" w:sz="4"/>
@@ -5009,7 +7019,7 @@
                 <w:sz w:val="20"/>
                 <w:szCs w:val="20"/>
               </w:rPr>
-              <w:t xml:space="preserve">Visitas sorteadas, conforme sorteio (até 13/10)</w:t>
+              <w:t xml:space="preserve">Visitas sorteadas, conforme sorteio (até 04/10)</w:t>
             </w:r>
           </w:p>
           <w:p>
@@ -5178,7 +7188,7 @@
         </w:trPr>
         <w:tc>
           <w:tcPr>
-            <w:tcW w:type="dxa" w:w="1142"/>
+            <w:tcW w:type="dxa" w:w="1714"/>
             <w:tcBorders>
               <w:top w:val="single" w:color="000000" w:sz="4"/>
               <w:left w:val="single" w:color="000000" w:sz="4"/>
@@ -5242,38 +7252,20 @@
         </w:tc>
         <w:tc>
           <w:tcPr>
-            <w:tcW w:type="dxa" w:w="6285"/>
-            <w:tcBorders>
-              <w:top w:val="single" w:color="000000" w:sz="4"/>
-              <w:left w:val="single" w:color="000000" w:sz="4"/>
-              <w:bottom w:val="single" w:color="000000" w:sz="4"/>
-              <w:right w:val="single" w:color="000000" w:sz="4"/>
-            </w:tcBorders>
-            <w:tcMar>
-              <w:top w:type="dxa" w:w="60"/>
-              <w:left w:type="dxa" w:w="100"/>
-              <w:bottom w:type="dxa" w:w="60"/>
-              <w:right w:type="dxa" w:w="100"/>
-            </w:tcMar>
-          </w:tcPr>
-          <w:p>
-            <w:pPr>
-              <w:pStyle w:val="ListParagraph"/>
-              <w:numPr>
-                <w:ilvl w:val="0"/>
-                <w:numId w:val="3"/>
-              </w:numPr>
-              <w:spacing w:after="40"/>
-            </w:pPr>
-            <w:r>
-              <w:rPr>
-                <w:rFonts w:ascii="Arial" w:cs="Arial" w:eastAsia="Arial" w:hAnsi="Arial"/>
-                <w:sz w:val="20"/>
-                <w:szCs w:val="20"/>
-              </w:rPr>
-              <w:t xml:space="preserve">Fim das visitas sorteadas (13/10) e início das visitas de retorno (a partir de 14/10)</w:t>
-            </w:r>
-          </w:p>
+            <w:tcW w:type="dxa" w:w="5713"/>
+            <w:tcBorders>
+              <w:top w:val="single" w:color="000000" w:sz="4"/>
+              <w:left w:val="single" w:color="000000" w:sz="4"/>
+              <w:bottom w:val="single" w:color="000000" w:sz="4"/>
+              <w:right w:val="single" w:color="000000" w:sz="4"/>
+            </w:tcBorders>
+            <w:tcMar>
+              <w:top w:type="dxa" w:w="60"/>
+              <w:left w:type="dxa" w:w="100"/>
+              <w:bottom w:type="dxa" w:w="60"/>
+              <w:right w:type="dxa" w:w="100"/>
+            </w:tcMar>
+          </w:tcPr>
           <w:p>
             <w:pPr>
               <w:pStyle w:val="ListParagraph"/>
@@ -5422,7 +7414,7 @@
         </w:trPr>
         <w:tc>
           <w:tcPr>
-            <w:tcW w:type="dxa" w:w="1142"/>
+            <w:tcW w:type="dxa" w:w="1714"/>
             <w:tcBorders>
               <w:top w:val="single" w:color="000000" w:sz="4"/>
               <w:left w:val="single" w:color="000000" w:sz="4"/>
@@ -5486,7 +7478,7 @@
         </w:tc>
         <w:tc>
           <w:tcPr>
-            <w:tcW w:type="dxa" w:w="6285"/>
+            <w:tcW w:type="dxa" w:w="5713"/>
             <w:tcBorders>
               <w:top w:val="single" w:color="000000" w:sz="4"/>
               <w:left w:val="single" w:color="000000" w:sz="4"/>
@@ -5515,7 +7507,25 @@
                 <w:sz w:val="20"/>
                 <w:szCs w:val="20"/>
               </w:rPr>
-              <w:t xml:space="preserve">Visitas de retorno, conforme sorteio</w:t>
+              <w:t xml:space="preserve">Visitas de retorno, conforme sorteio (até 19/10)</w:t>
+            </w:r>
+          </w:p>
+          <w:p>
+            <w:pPr>
+              <w:pStyle w:val="ListParagraph"/>
+              <w:numPr>
+                <w:ilvl w:val="0"/>
+                <w:numId w:val="3"/>
+              </w:numPr>
+              <w:spacing w:after="40"/>
+            </w:pPr>
+            <w:r>
+              <w:rPr>
+                <w:rFonts w:ascii="Arial" w:cs="Arial" w:eastAsia="Arial" w:hAnsi="Arial"/>
+                <w:sz w:val="20"/>
+                <w:szCs w:val="20"/>
+              </w:rPr>
+              <w:t xml:space="preserve">Estimativa de ocupação e fluxo, em faixa, pelas notas fiscais e pela contagem</w:t>
             </w:r>
           </w:p>
           <w:p>
@@ -5684,7 +7694,7 @@
         </w:trPr>
         <w:tc>
           <w:tcPr>
-            <w:tcW w:type="dxa" w:w="1142"/>
+            <w:tcW w:type="dxa" w:w="1714"/>
             <w:tcBorders>
               <w:top w:val="single" w:color="000000" w:sz="4"/>
               <w:left w:val="single" w:color="000000" w:sz="4"/>
@@ -5748,56 +7758,20 @@
         </w:tc>
         <w:tc>
           <w:tcPr>
-            <w:tcW w:type="dxa" w:w="6285"/>
-            <w:tcBorders>
-              <w:top w:val="single" w:color="000000" w:sz="4"/>
-              <w:left w:val="single" w:color="000000" w:sz="4"/>
-              <w:bottom w:val="single" w:color="000000" w:sz="4"/>
-              <w:right w:val="single" w:color="000000" w:sz="4"/>
-            </w:tcBorders>
-            <w:tcMar>
-              <w:top w:type="dxa" w:w="60"/>
-              <w:left w:type="dxa" w:w="100"/>
-              <w:bottom w:type="dxa" w:w="60"/>
-              <w:right w:type="dxa" w:w="100"/>
-            </w:tcMar>
-          </w:tcPr>
-          <w:p>
-            <w:pPr>
-              <w:pStyle w:val="ListParagraph"/>
-              <w:numPr>
-                <w:ilvl w:val="0"/>
-                <w:numId w:val="3"/>
-              </w:numPr>
-              <w:spacing w:after="40"/>
-            </w:pPr>
-            <w:r>
-              <w:rPr>
-                <w:rFonts w:ascii="Arial" w:cs="Arial" w:eastAsia="Arial" w:hAnsi="Arial"/>
-                <w:sz w:val="20"/>
-                <w:szCs w:val="20"/>
-              </w:rPr>
-              <w:t xml:space="preserve">Última visita de retorno (até 28/10)</w:t>
-            </w:r>
-          </w:p>
-          <w:p>
-            <w:pPr>
-              <w:pStyle w:val="ListParagraph"/>
-              <w:numPr>
-                <w:ilvl w:val="0"/>
-                <w:numId w:val="3"/>
-              </w:numPr>
-              <w:spacing w:after="40"/>
-            </w:pPr>
-            <w:r>
-              <w:rPr>
-                <w:rFonts w:ascii="Arial" w:cs="Arial" w:eastAsia="Arial" w:hAnsi="Arial"/>
-                <w:sz w:val="20"/>
-                <w:szCs w:val="20"/>
-              </w:rPr>
-              <w:t xml:space="preserve">Estimativa de ocupação e fluxo, em faixa, pelas notas fiscais e pela contagem</w:t>
-            </w:r>
-          </w:p>
+            <w:tcW w:type="dxa" w:w="5713"/>
+            <w:tcBorders>
+              <w:top w:val="single" w:color="000000" w:sz="4"/>
+              <w:left w:val="single" w:color="000000" w:sz="4"/>
+              <w:bottom w:val="single" w:color="000000" w:sz="4"/>
+              <w:right w:val="single" w:color="000000" w:sz="4"/>
+            </w:tcBorders>
+            <w:tcMar>
+              <w:top w:type="dxa" w:w="60"/>
+              <w:left w:type="dxa" w:w="100"/>
+              <w:bottom w:type="dxa" w:w="60"/>
+              <w:right w:type="dxa" w:w="100"/>
+            </w:tcMar>
+          </w:tcPr>
           <w:p>
             <w:pPr>
               <w:pStyle w:val="ListParagraph"/>
@@ -6000,7 +7974,7 @@
         </w:trPr>
         <w:tc>
           <w:tcPr>
-            <w:tcW w:type="dxa" w:w="1142"/>
+            <w:tcW w:type="dxa" w:w="1714"/>
             <w:tcBorders>
               <w:top w:val="single" w:color="000000" w:sz="4"/>
               <w:left w:val="single" w:color="000000" w:sz="4"/>
@@ -6064,7 +8038,7 @@
         </w:tc>
         <w:tc>
           <w:tcPr>
-            <w:tcW w:type="dxa" w:w="6285"/>
+            <w:tcW w:type="dxa" w:w="5713"/>
             <w:tcBorders>
               <w:top w:val="single" w:color="000000" w:sz="4"/>
               <w:left w:val="single" w:color="000000" w:sz="4"/>
@@ -6280,7 +8254,7 @@
         </w:trPr>
         <w:tc>
           <w:tcPr>
-            <w:tcW w:type="dxa" w:w="1142"/>
+            <w:tcW w:type="dxa" w:w="1714"/>
             <w:tcBorders>
               <w:top w:val="single" w:color="000000" w:sz="4"/>
               <w:left w:val="single" w:color="000000" w:sz="4"/>
@@ -6344,7 +8318,7 @@
         </w:tc>
         <w:tc>
           <w:tcPr>
-            <w:tcW w:type="dxa" w:w="6285"/>
+            <w:tcW w:type="dxa" w:w="5713"/>
             <w:tcBorders>
               <w:top w:val="single" w:color="000000" w:sz="4"/>
               <w:left w:val="single" w:color="000000" w:sz="4"/>
@@ -6503,7 +8477,7 @@
         </w:trPr>
         <w:tc>
           <w:tcPr>
-            <w:tcW w:type="dxa" w:w="1142"/>
+            <w:tcW w:type="dxa" w:w="1714"/>
             <w:tcBorders>
               <w:top w:val="single" w:color="000000" w:sz="4"/>
               <w:left w:val="single" w:color="000000" w:sz="4"/>
@@ -6567,7 +8541,7 @@
         </w:tc>
         <w:tc>
           <w:tcPr>
-            <w:tcW w:type="dxa" w:w="6285"/>
+            <w:tcW w:type="dxa" w:w="5713"/>
             <w:tcBorders>
               <w:top w:val="single" w:color="000000" w:sz="4"/>
               <w:left w:val="single" w:color="000000" w:sz="4"/>
@@ -6669,7 +8643,7 @@
         </w:trPr>
         <w:tc>
           <w:tcPr>
-            <w:tcW w:type="dxa" w:w="1142"/>
+            <w:tcW w:type="dxa" w:w="1714"/>
             <w:tcBorders>
               <w:top w:val="single" w:color="000000" w:sz="4"/>
               <w:left w:val="single" w:color="000000" w:sz="4"/>
@@ -6733,7 +8707,7 @@
         </w:tc>
         <w:tc>
           <w:tcPr>
-            <w:tcW w:type="dxa" w:w="6285"/>
+            <w:tcW w:type="dxa" w:w="5713"/>
             <w:tcBorders>
               <w:top w:val="single" w:color="000000" w:sz="4"/>
               <w:left w:val="single" w:color="000000" w:sz="4"/>

</xml_diff>

<commit_message>
Concentra as visitas sorteadas em 03/10 e sincroniza o projeto com o registro prévio
Emenda 4 do registro prévio: as duas unidades da São Jogue são visitadas
no sábado, 03/10, com hora de início sorteada, duração fixa de 3 horas e
no mínimo 2 horas entre os inícios; retorno no domingo, 18/10. Script e
planilha do sorteio refeitos (mesma semente), metodologia e cronogramas
atualizados.

Projeto de pesquisa: H5 passa a comparar com a cesta do próprio
estabelecimento e a validação da codificação segue o registro prévio
(segunda pessoa ou recodificação após 14 dias); quadro de itens ganha as
notas por aspecto, horário de funcionamento e localização em shopping.

Co-Authored-By: Claude Opus 5.5 <noreply@anthropic.com>
</commit_message>
<xml_diff>
--- a/textos/cronograma_luderia.docx
+++ b/textos/cronograma_luderia.docx
@@ -29,7 +29,7 @@
           <w:sz w:val="20"/>
           <w:szCs w:val="20"/>
         </w:rPr>
-        <w:t xml:space="preserve">Atualizado em 18/09/2026.</w:t>
+        <w:t xml:space="preserve">Atualizado em 02/10/2026.</w:t>
       </w:r>
     </w:p>
     <w:p>
@@ -5655,7 +5655,7 @@
           <w:sz w:val="20"/>
           <w:szCs w:val="20"/>
         </w:rPr>
-        <w:t xml:space="preserve"> Visitas sorteadas entre 02/10 e 04/10; visitas de retorno entre 17/10 e 19/10. A estimativa de ocupação depende delas.</w:t>
+        <w:t xml:space="preserve"> Visitas sorteadas no sábado, 03/10; visitas de retorno no domingo, 18/10. A estimativa de ocupação depende delas.</w:t>
       </w:r>
     </w:p>
     <w:p>
@@ -5768,7 +5768,7 @@
           <w:sz w:val="20"/>
           <w:szCs w:val="20"/>
         </w:rPr>
-        <w:t xml:space="preserve"> entre 02/10 e 04/10 (sexta a domingo), na quinzena após o pagamento dos servidores estaduais da Bahia (29/09 para inativos e pensionistas; 30/09 para ativos). O sorteio escolhe o dia e a hora de início de cada visita: cada hora cheia entre 12h00 e 19h00 é uma possibilidade. As duas unidades ficam em dias diferentes.</w:t>
+        <w:t xml:space="preserve"> no sábado, 03/10, as duas unidades no mesmo dia, na quinzena após o pagamento dos servidores estaduais da Bahia (29/09 para inativos e pensionistas; 30/09 para ativos). O sorteio escolhe só a hora de início de cada visita: cada hora cheia entre 12h00 e 19h00 é uma possibilidade. As horas de início das duas unidades distam no mínimo 2 horas.</w:t>
       </w:r>
     </w:p>
     <w:p>
@@ -5796,7 +5796,7 @@
           <w:sz w:val="20"/>
           <w:szCs w:val="20"/>
         </w:rPr>
-        <w:t xml:space="preserve"> 15 dias depois de cada visita sorteada, na mesma unidade e na mesma hora de início, entre 17/10 e 19/10.</w:t>
+        <w:t xml:space="preserve"> 15 dias depois de cada visita sorteada, na mesma unidade e na mesma hora de início: domingo, 18/10.</w:t>
       </w:r>
     </w:p>
     <w:p>
@@ -5852,7 +5852,7 @@
           <w:sz w:val="20"/>
           <w:szCs w:val="20"/>
         </w:rPr>
-        <w:t xml:space="preserve">, sem duração fixa. O início e o fim de cada visita são registrados, e os resultados são calculados por hora observada. Entradas e saídas dos grupos são registradas continuamente; pessoas no interior e mesas ocupadas, a cada 30 minutos.</w:t>
+        <w:t xml:space="preserve">, com duração fixa de 3 horas. O início e o fim de cada visita são registrados, e os resultados são calculados por hora observada. Entradas e saídas dos grupos são registradas continuamente; pessoas no interior e mesas ocupadas, a cada 30 minutos.</w:t>
       </w:r>
     </w:p>
     <w:p>
@@ -6829,7 +6829,7 @@
                 <w:sz w:val="20"/>
                 <w:szCs w:val="20"/>
               </w:rPr>
-              <w:t xml:space="preserve">Visitas sorteadas, conforme sorteio (a partir de 02/10)</w:t>
+              <w:t xml:space="preserve">Sorteio das horas das visitas</w:t>
             </w:r>
           </w:p>
         </w:tc>
@@ -7019,7 +7019,7 @@
                 <w:sz w:val="20"/>
                 <w:szCs w:val="20"/>
               </w:rPr>
-              <w:t xml:space="preserve">Visitas sorteadas, conforme sorteio (até 04/10)</w:t>
+              <w:t xml:space="preserve">Visitas sorteadas (03/10)</w:t>
             </w:r>
           </w:p>
           <w:p>
@@ -7507,7 +7507,7 @@
                 <w:sz w:val="20"/>
                 <w:szCs w:val="20"/>
               </w:rPr>
-              <w:t xml:space="preserve">Visitas de retorno, conforme sorteio (até 19/10)</w:t>
+              <w:t xml:space="preserve">Visitas de retorno (18/10)</w:t>
             </w:r>
           </w:p>
           <w:p>

</xml_diff>